<commit_message>
Adding location moving during the day
</commit_message>
<xml_diff>
--- a/docs/Vili-An_Doneva_Diploma_Thesis.docx
+++ b/docs/Vili-An_Doneva_Diploma_Thesis.docx
@@ -12486,6 +12486,18 @@
           <w:rFonts w:ascii="Arial" w:hAnsi="Arial" w:cs="Arial"/>
         </w:rPr>
       </w:pPr>
+      <w:r>
+        <w:rPr>
+          <w:rFonts w:ascii="Arial" w:hAnsi="Arial" w:cs="Arial"/>
+        </w:rPr>
+        <w:t>How well does it work, what is working</w:t>
+      </w:r>
+      <w:r>
+        <w:rPr>
+          <w:rFonts w:ascii="Arial" w:hAnsi="Arial" w:cs="Arial"/>
+        </w:rPr>
+        <w:t xml:space="preserve">, time complexity, </w:t>
+      </w:r>
     </w:p>
     <w:sectPr>
       <w:footerReference w:type="default" r:id="rId26"/>

</xml_diff>

<commit_message>
SSGS + RCPSP pages added (might add more later)
</commit_message>
<xml_diff>
--- a/docs/Vili-An_Doneva_Diploma_Thesis.docx
+++ b/docs/Vili-An_Doneva_Diploma_Thesis.docx
@@ -8638,6 +8638,7 @@
     <w:p>
       <w:pPr>
         <w:pStyle w:val="Heading4"/>
+        <w:spacing w:line="360" w:lineRule="auto"/>
         <w:rPr>
           <w:rFonts w:ascii="Arial" w:hAnsi="Arial" w:cs="Arial"/>
           <w:b/>
@@ -8652,28 +8653,1747 @@
           <w:bCs/>
           <w:color w:val="auto"/>
         </w:rPr>
-        <w:t>Serial Schedule Generation Scheme + Resource Constraint Scheduling Problem</w:t>
-      </w:r>
-    </w:p>
-    <w:p>
-      <w:pPr>
-        <w:jc w:val="both"/>
+        <w:t xml:space="preserve">Serial Schedule Generation Scheme + Resource Constraint </w:t>
+      </w:r>
+      <w:r>
         <w:rPr>
           <w:rFonts w:ascii="Arial" w:hAnsi="Arial" w:cs="Arial"/>
           <w:b/>
           <w:bCs/>
-        </w:rPr>
-      </w:pPr>
-    </w:p>
-    <w:p>
-      <w:pPr>
-        <w:jc w:val="both"/>
+          <w:color w:val="auto"/>
+        </w:rPr>
+        <w:t xml:space="preserve">Project </w:t>
+      </w:r>
+      <w:r>
         <w:rPr>
           <w:rFonts w:ascii="Arial" w:hAnsi="Arial" w:cs="Arial"/>
           <w:b/>
           <w:bCs/>
-        </w:rPr>
-      </w:pPr>
+          <w:color w:val="auto"/>
+        </w:rPr>
+        <w:t>Scheduling Problem</w:t>
+      </w:r>
+    </w:p>
+    <w:p>
+      <w:pPr>
+        <w:spacing w:line="360" w:lineRule="auto"/>
+        <w:jc w:val="both"/>
+        <w:rPr>
+          <w:rFonts w:ascii="Arial" w:hAnsi="Arial" w:cs="Arial"/>
+          <w:b/>
+          <w:bCs/>
+        </w:rPr>
+      </w:pPr>
+    </w:p>
+    <w:p>
+      <w:pPr>
+        <w:spacing w:line="360" w:lineRule="auto"/>
+        <w:jc w:val="both"/>
+        <w:rPr>
+          <w:rFonts w:ascii="Arial" w:hAnsi="Arial" w:cs="Arial"/>
+        </w:rPr>
+      </w:pPr>
+      <w:r>
+        <w:rPr>
+          <w:rFonts w:ascii="Arial" w:hAnsi="Arial" w:cs="Arial"/>
+          <w:i/>
+          <w:iCs/>
+        </w:rPr>
+        <w:t>Big Break!</w:t>
+      </w:r>
+      <w:r>
+        <w:rPr>
+          <w:rFonts w:ascii="Arial" w:hAnsi="Arial" w:cs="Arial"/>
+        </w:rPr>
+        <w:t xml:space="preserve"> uses location-blocked, activity-list-based Serial Schedule Generation Scheme (SSGS) with </w:t>
+      </w:r>
+      <w:r>
+        <w:rPr>
+          <w:rFonts w:ascii="Arial" w:hAnsi="Arial" w:cs="Arial"/>
+        </w:rPr>
+        <w:t xml:space="preserve">a </w:t>
+      </w:r>
+      <w:r>
+        <w:rPr>
+          <w:rFonts w:ascii="Arial" w:hAnsi="Arial" w:cs="Arial"/>
+        </w:rPr>
+        <w:t>domain-specific priority rule. It implements this algorithmic framework to solve the Resource Constraint Project Scheduling Problem (RCPSP).</w:t>
+      </w:r>
+    </w:p>
+    <w:p>
+      <w:pPr>
+        <w:spacing w:line="360" w:lineRule="auto"/>
+        <w:jc w:val="both"/>
+        <w:rPr>
+          <w:rFonts w:ascii="Arial" w:hAnsi="Arial" w:cs="Arial"/>
+        </w:rPr>
+      </w:pPr>
+    </w:p>
+    <w:p>
+      <w:pPr>
+        <w:pStyle w:val="Heading5"/>
+        <w:rPr>
+          <w:rFonts w:ascii="Arial" w:hAnsi="Arial" w:cs="Arial"/>
+          <w:b/>
+          <w:bCs/>
+          <w:color w:val="auto"/>
+        </w:rPr>
+      </w:pPr>
+      <w:r>
+        <w:rPr>
+          <w:rFonts w:ascii="Arial" w:hAnsi="Arial" w:cs="Arial"/>
+          <w:b/>
+          <w:bCs/>
+          <w:color w:val="auto"/>
+        </w:rPr>
+        <w:t>Resource Constraint Project Scheduling Problem</w:t>
+      </w:r>
+      <w:r>
+        <w:rPr>
+          <w:rFonts w:ascii="Arial" w:hAnsi="Arial" w:cs="Arial"/>
+          <w:b/>
+          <w:bCs/>
+          <w:color w:val="auto"/>
+        </w:rPr>
+        <w:t xml:space="preserve"> (RCPSP)</w:t>
+      </w:r>
+    </w:p>
+    <w:p>
+      <w:pPr>
+        <w:spacing w:line="360" w:lineRule="auto"/>
+        <w:jc w:val="both"/>
+        <w:rPr>
+          <w:rFonts w:ascii="Arial" w:hAnsi="Arial" w:cs="Arial"/>
+        </w:rPr>
+      </w:pPr>
+    </w:p>
+    <w:p>
+      <w:pPr>
+        <w:spacing w:line="360" w:lineRule="auto"/>
+        <w:jc w:val="both"/>
+        <w:rPr>
+          <w:rFonts w:ascii="Arial" w:hAnsi="Arial" w:cs="Arial"/>
+        </w:rPr>
+      </w:pPr>
+      <w:r>
+        <w:rPr>
+          <w:rFonts w:ascii="Arial" w:hAnsi="Arial" w:cs="Arial"/>
+        </w:rPr>
+        <w:t>The RCPSP regards problems consisting of a network of activities, resource constraints, and precedence relationships. They belong to the class of Non-deterministic Polynomial-time (NP) hard problems. NP-hard problems have no efficient polynomial-time algorithm that is known to solve them</w:t>
+      </w:r>
+      <w:r>
+        <w:rPr>
+          <w:rFonts w:ascii="Arial" w:hAnsi="Arial" w:cs="Arial"/>
+        </w:rPr>
+        <w:t>. They often require heuristics or approximation methods.</w:t>
+      </w:r>
+    </w:p>
+    <w:p>
+      <w:pPr>
+        <w:spacing w:line="360" w:lineRule="auto"/>
+        <w:jc w:val="both"/>
+        <w:rPr>
+          <w:rFonts w:ascii="Arial" w:hAnsi="Arial" w:cs="Arial"/>
+        </w:rPr>
+      </w:pPr>
+    </w:p>
+    <w:p>
+      <w:pPr>
+        <w:spacing w:line="360" w:lineRule="auto"/>
+        <w:jc w:val="both"/>
+        <w:rPr>
+          <w:rFonts w:ascii="Arial" w:hAnsi="Arial" w:cs="Arial"/>
+        </w:rPr>
+      </w:pPr>
+      <w:r>
+        <w:rPr>
+          <w:rFonts w:ascii="Arial" w:hAnsi="Arial" w:cs="Arial"/>
+        </w:rPr>
+        <w:t xml:space="preserve">In </w:t>
+      </w:r>
+      <w:r>
+        <w:rPr>
+          <w:rFonts w:ascii="Arial" w:hAnsi="Arial" w:cs="Arial"/>
+        </w:rPr>
+        <w:t>RCPSP, the project consists of a list of activities that need to be completed to finish the project.</w:t>
+      </w:r>
+      <w:r>
+        <w:rPr>
+          <w:rFonts w:ascii="Arial" w:hAnsi="Arial" w:cs="Arial"/>
+        </w:rPr>
+        <w:t xml:space="preserve"> In the case of </w:t>
+      </w:r>
+      <w:r>
+        <w:rPr>
+          <w:rFonts w:ascii="Arial" w:hAnsi="Arial" w:cs="Arial"/>
+          <w:i/>
+          <w:iCs/>
+        </w:rPr>
+        <w:t xml:space="preserve">Big </w:t>
+      </w:r>
+      <w:proofErr w:type="gramStart"/>
+      <w:r>
+        <w:rPr>
+          <w:rFonts w:ascii="Arial" w:hAnsi="Arial" w:cs="Arial"/>
+          <w:i/>
+          <w:iCs/>
+        </w:rPr>
+        <w:t>Break!</w:t>
+      </w:r>
+      <w:r>
+        <w:rPr>
+          <w:rFonts w:ascii="Arial" w:hAnsi="Arial" w:cs="Arial"/>
+        </w:rPr>
+        <w:t>,</w:t>
+      </w:r>
+      <w:proofErr w:type="gramEnd"/>
+      <w:r>
+        <w:rPr>
+          <w:rFonts w:ascii="Arial" w:hAnsi="Arial" w:cs="Arial"/>
+        </w:rPr>
+        <w:t xml:space="preserve"> the</w:t>
+      </w:r>
+      <w:r>
+        <w:rPr>
+          <w:rFonts w:ascii="Arial" w:hAnsi="Arial" w:cs="Arial"/>
+        </w:rPr>
+        <w:t xml:space="preserve"> activity</w:t>
+      </w:r>
+      <w:r>
+        <w:rPr>
+          <w:rFonts w:ascii="Arial" w:hAnsi="Arial" w:cs="Arial"/>
+        </w:rPr>
+        <w:t xml:space="preserve"> list </w:t>
+      </w:r>
+      <w:r>
+        <w:rPr>
+          <w:rFonts w:ascii="Arial" w:hAnsi="Arial" w:cs="Arial"/>
+        </w:rPr>
+        <w:t>comprises all scenes in the</w:t>
+      </w:r>
+      <w:r>
+        <w:rPr>
+          <w:rFonts w:ascii="Arial" w:hAnsi="Arial" w:cs="Arial"/>
+        </w:rPr>
+        <w:t xml:space="preserve"> film script. Every activity</w:t>
+      </w:r>
+      <w:r>
+        <w:rPr>
+          <w:rFonts w:ascii="Arial" w:hAnsi="Arial" w:cs="Arial"/>
+        </w:rPr>
+        <w:t xml:space="preserve"> (scene) </w:t>
+      </w:r>
+      <m:oMath>
+        <m:r>
+          <w:rPr>
+            <w:rFonts w:ascii="Cambria Math" w:hAnsi="Cambria Math" w:cs="Arial"/>
+          </w:rPr>
+          <m:t>j</m:t>
+        </m:r>
+      </m:oMath>
+      <w:r>
+        <w:rPr>
+          <w:rFonts w:ascii="Arial" w:hAnsi="Arial" w:cs="Arial"/>
+        </w:rPr>
+        <w:t xml:space="preserve"> has a certain duration</w:t>
+      </w:r>
+      <w:r>
+        <w:rPr>
+          <w:rFonts w:ascii="Arial" w:hAnsi="Arial" w:cs="Arial"/>
+        </w:rPr>
+        <w:t xml:space="preserve"> </w:t>
+      </w:r>
+      <m:oMath>
+        <m:sSub>
+          <m:sSubPr>
+            <m:ctrlPr>
+              <w:rPr>
+                <w:rFonts w:ascii="Cambria Math" w:hAnsi="Cambria Math" w:cs="Arial"/>
+                <w:i/>
+              </w:rPr>
+            </m:ctrlPr>
+          </m:sSubPr>
+          <m:e>
+            <m:r>
+              <w:rPr>
+                <w:rFonts w:ascii="Cambria Math" w:hAnsi="Cambria Math" w:cs="Arial"/>
+              </w:rPr>
+              <m:t>d</m:t>
+            </m:r>
+          </m:e>
+          <m:sub>
+            <m:r>
+              <w:rPr>
+                <w:rFonts w:ascii="Cambria Math" w:hAnsi="Cambria Math" w:cs="Arial"/>
+              </w:rPr>
+              <m:t>j</m:t>
+            </m:r>
+          </m:sub>
+        </m:sSub>
+      </m:oMath>
+      <w:r>
+        <w:rPr>
+          <w:rFonts w:ascii="Arial" w:hAnsi="Arial" w:cs="Arial"/>
+        </w:rPr>
+        <w:t>, which corresponds to the scene length.</w:t>
+      </w:r>
+    </w:p>
+    <w:p>
+      <w:pPr>
+        <w:spacing w:line="360" w:lineRule="auto"/>
+        <w:jc w:val="both"/>
+        <w:rPr>
+          <w:rFonts w:ascii="Arial" w:hAnsi="Arial" w:cs="Arial"/>
+        </w:rPr>
+      </w:pPr>
+    </w:p>
+    <w:p>
+      <w:pPr>
+        <w:spacing w:line="360" w:lineRule="auto"/>
+        <w:jc w:val="both"/>
+        <w:rPr>
+          <w:rFonts w:ascii="Arial" w:hAnsi="Arial" w:cs="Arial"/>
+        </w:rPr>
+      </w:pPr>
+      <w:r>
+        <w:rPr>
+          <w:rFonts w:ascii="Arial" w:hAnsi="Arial" w:cs="Arial"/>
+        </w:rPr>
+        <w:lastRenderedPageBreak/>
+        <w:t>The amount of space the scene takes up on a page is often used as a measure of time in the film industry.</w:t>
+      </w:r>
+      <w:r>
+        <w:rPr>
+          <w:rFonts w:ascii="Arial" w:hAnsi="Arial" w:cs="Arial"/>
+        </w:rPr>
+        <w:t xml:space="preserve"> Each page is relatively divided into 1/8 sections, making the whole page 8/8.</w:t>
+      </w:r>
+      <w:r>
+        <w:rPr>
+          <w:rFonts w:ascii="Arial" w:hAnsi="Arial" w:cs="Arial"/>
+        </w:rPr>
+        <w:t xml:space="preserve"> One page is about 55 lines, divided into 8 sections. In </w:t>
+      </w:r>
+      <w:r>
+        <w:rPr>
+          <w:rFonts w:ascii="Arial" w:hAnsi="Arial" w:cs="Arial"/>
+          <w:i/>
+          <w:iCs/>
+        </w:rPr>
+        <w:t xml:space="preserve">Big </w:t>
+      </w:r>
+      <w:proofErr w:type="gramStart"/>
+      <w:r>
+        <w:rPr>
+          <w:rFonts w:ascii="Arial" w:hAnsi="Arial" w:cs="Arial"/>
+          <w:i/>
+          <w:iCs/>
+        </w:rPr>
+        <w:t>Break!,</w:t>
+      </w:r>
+      <w:proofErr w:type="gramEnd"/>
+      <w:r>
+        <w:rPr>
+          <w:rFonts w:ascii="Arial" w:hAnsi="Arial" w:cs="Arial"/>
+          <w:i/>
+          <w:iCs/>
+        </w:rPr>
+        <w:t xml:space="preserve"> </w:t>
+      </w:r>
+      <w:r>
+        <w:rPr>
+          <w:rFonts w:ascii="Arial" w:hAnsi="Arial" w:cs="Arial"/>
+        </w:rPr>
+        <w:t>the</w:t>
+      </w:r>
+      <w:r>
+        <w:rPr>
+          <w:rFonts w:ascii="Arial" w:hAnsi="Arial" w:cs="Arial"/>
+        </w:rPr>
+        <w:t xml:space="preserve"> shooting days are 12-hour days, and around 5 pages are shot per day. This equates to around 40 eighths per day.</w:t>
+      </w:r>
+      <w:r>
+        <w:rPr>
+          <w:rFonts w:ascii="Arial" w:hAnsi="Arial" w:cs="Arial"/>
+        </w:rPr>
+        <w:t xml:space="preserve"> With the understanding that overtime is occasionally useful for </w:t>
+      </w:r>
+      <w:proofErr w:type="gramStart"/>
+      <w:r>
+        <w:rPr>
+          <w:rFonts w:ascii="Arial" w:hAnsi="Arial" w:cs="Arial"/>
+        </w:rPr>
+        <w:t>a production</w:t>
+      </w:r>
+      <w:proofErr w:type="gramEnd"/>
+      <w:r>
+        <w:rPr>
+          <w:rFonts w:ascii="Arial" w:hAnsi="Arial" w:cs="Arial"/>
+        </w:rPr>
+        <w:t xml:space="preserve">, </w:t>
+      </w:r>
+      <w:r>
+        <w:rPr>
+          <w:rFonts w:ascii="Arial" w:hAnsi="Arial" w:cs="Arial"/>
+          <w:i/>
+          <w:iCs/>
+        </w:rPr>
+        <w:t xml:space="preserve">Big Break! </w:t>
+      </w:r>
+      <w:r>
+        <w:rPr>
+          <w:rFonts w:ascii="Arial" w:hAnsi="Arial" w:cs="Arial"/>
+        </w:rPr>
+        <w:t>allows up to 45 eighths per day</w:t>
+      </w:r>
+      <w:r>
+        <w:rPr>
+          <w:rFonts w:ascii="Arial" w:hAnsi="Arial" w:cs="Arial"/>
+        </w:rPr>
+        <w:t>.</w:t>
+      </w:r>
+    </w:p>
+    <w:p>
+      <w:pPr>
+        <w:spacing w:line="360" w:lineRule="auto"/>
+        <w:jc w:val="both"/>
+        <w:rPr>
+          <w:rFonts w:ascii="Arial" w:hAnsi="Arial" w:cs="Arial"/>
+        </w:rPr>
+      </w:pPr>
+    </w:p>
+    <w:p>
+      <w:pPr>
+        <w:spacing w:line="360" w:lineRule="auto"/>
+        <w:jc w:val="both"/>
+        <w:rPr>
+          <w:rFonts w:ascii="Arial" w:hAnsi="Arial" w:cs="Arial"/>
+        </w:rPr>
+      </w:pPr>
+      <w:r>
+        <w:rPr>
+          <w:rFonts w:ascii="Arial" w:hAnsi="Arial" w:cs="Arial"/>
+        </w:rPr>
+        <w:t>M</w:t>
+      </w:r>
+      <w:r>
+        <w:rPr>
+          <w:rFonts w:ascii="Arial" w:hAnsi="Arial" w:cs="Arial"/>
+        </w:rPr>
+        <w:t>oving times are also taken into consideration</w:t>
+      </w:r>
+      <w:r>
+        <w:rPr>
+          <w:rFonts w:ascii="Arial" w:hAnsi="Arial" w:cs="Arial"/>
+        </w:rPr>
+        <w:t>,</w:t>
+      </w:r>
+      <w:r>
+        <w:rPr>
+          <w:rFonts w:ascii="Arial" w:hAnsi="Arial" w:cs="Arial"/>
+        </w:rPr>
+        <w:t xml:space="preserve"> and each location move during the day takes 8 eighths or 1 page. This is not reflected in the final page count for the day, so it is more easily digestible by the user. However, it is </w:t>
+      </w:r>
+      <w:proofErr w:type="gramStart"/>
+      <w:r>
+        <w:rPr>
+          <w:rFonts w:ascii="Arial" w:hAnsi="Arial" w:cs="Arial"/>
+        </w:rPr>
+        <w:t>taken into account</w:t>
+      </w:r>
+      <w:proofErr w:type="gramEnd"/>
+      <w:r>
+        <w:rPr>
+          <w:rFonts w:ascii="Arial" w:hAnsi="Arial" w:cs="Arial"/>
+        </w:rPr>
+        <w:t xml:space="preserve"> when computing time limits per day.</w:t>
+      </w:r>
+    </w:p>
+    <w:p>
+      <w:pPr>
+        <w:spacing w:line="360" w:lineRule="auto"/>
+        <w:jc w:val="both"/>
+        <w:rPr>
+          <w:rFonts w:ascii="Arial" w:hAnsi="Arial" w:cs="Arial"/>
+        </w:rPr>
+      </w:pPr>
+    </w:p>
+    <w:p>
+      <w:pPr>
+        <w:spacing w:line="360" w:lineRule="auto"/>
+        <w:jc w:val="both"/>
+        <w:rPr>
+          <w:rFonts w:ascii="Arial" w:eastAsiaTheme="minorEastAsia" w:hAnsi="Arial" w:cs="Arial"/>
+        </w:rPr>
+      </w:pPr>
+      <w:r>
+        <w:rPr>
+          <w:rFonts w:ascii="Arial" w:hAnsi="Arial" w:cs="Arial"/>
+        </w:rPr>
+        <w:t>I</w:t>
+      </w:r>
+      <w:r>
+        <w:rPr>
+          <w:rFonts w:ascii="Arial" w:hAnsi="Arial" w:cs="Arial"/>
+        </w:rPr>
+        <w:t>n the context of RCPSP</w:t>
+      </w:r>
+      <w:r>
+        <w:rPr>
+          <w:rFonts w:ascii="Arial" w:hAnsi="Arial" w:cs="Arial"/>
+        </w:rPr>
+        <w:t xml:space="preserve">, the renewable resource is the daily shooting time with capacity </w:t>
+      </w:r>
+      <m:oMath>
+        <m:sSub>
+          <m:sSubPr>
+            <m:ctrlPr>
+              <w:rPr>
+                <w:rFonts w:ascii="Cambria Math" w:hAnsi="Cambria Math" w:cs="Arial"/>
+                <w:i/>
+              </w:rPr>
+            </m:ctrlPr>
+          </m:sSubPr>
+          <m:e>
+            <m:r>
+              <w:rPr>
+                <w:rFonts w:ascii="Cambria Math" w:hAnsi="Cambria Math" w:cs="Arial"/>
+              </w:rPr>
+              <m:t>R</m:t>
+            </m:r>
+          </m:e>
+          <m:sub>
+            <m:r>
+              <w:rPr>
+                <w:rFonts w:ascii="Cambria Math" w:hAnsi="Cambria Math" w:cs="Arial"/>
+              </w:rPr>
+              <m:t>k</m:t>
+            </m:r>
+          </m:sub>
+        </m:sSub>
+        <m:r>
+          <w:rPr>
+            <w:rFonts w:ascii="Cambria Math" w:hAnsi="Cambria Math" w:cs="Arial"/>
+          </w:rPr>
+          <m:t xml:space="preserve"> = MAX_EIGHTS_PER_DAY</m:t>
+        </m:r>
+      </m:oMath>
+      <w:r>
+        <w:rPr>
+          <w:rFonts w:ascii="Arial" w:eastAsiaTheme="minorEastAsia" w:hAnsi="Arial" w:cs="Arial"/>
+        </w:rPr>
+        <w:t xml:space="preserve"> (currently 45)</w:t>
+      </w:r>
+      <w:r>
+        <w:rPr>
+          <w:rFonts w:ascii="Arial" w:eastAsiaTheme="minorEastAsia" w:hAnsi="Arial" w:cs="Arial"/>
+        </w:rPr>
+        <w:t xml:space="preserve"> and the number of </w:t>
+      </w:r>
+      <w:proofErr w:type="gramStart"/>
+      <w:r>
+        <w:rPr>
+          <w:rFonts w:ascii="Arial" w:eastAsiaTheme="minorEastAsia" w:hAnsi="Arial" w:cs="Arial"/>
+        </w:rPr>
+        <w:t>location</w:t>
+      </w:r>
+      <w:proofErr w:type="gramEnd"/>
+      <w:r>
+        <w:rPr>
+          <w:rFonts w:ascii="Arial" w:eastAsiaTheme="minorEastAsia" w:hAnsi="Arial" w:cs="Arial"/>
+        </w:rPr>
+        <w:t xml:space="preserve"> moves allowed per day, which is currently three</w:t>
+      </w:r>
+      <w:r>
+        <w:rPr>
+          <w:rFonts w:ascii="Arial" w:eastAsiaTheme="minorEastAsia" w:hAnsi="Arial" w:cs="Arial"/>
+        </w:rPr>
+        <w:t xml:space="preserve">. </w:t>
+      </w:r>
+      <w:r>
+        <w:rPr>
+          <w:rFonts w:ascii="Arial" w:eastAsiaTheme="minorEastAsia" w:hAnsi="Arial" w:cs="Arial"/>
+        </w:rPr>
+        <w:t>They are both</w:t>
+      </w:r>
+      <w:r>
+        <w:rPr>
+          <w:rFonts w:ascii="Arial" w:eastAsiaTheme="minorEastAsia" w:hAnsi="Arial" w:cs="Arial"/>
+        </w:rPr>
+        <w:t xml:space="preserve"> regenerated </w:t>
+      </w:r>
+      <w:r>
+        <w:rPr>
+          <w:rFonts w:ascii="Arial" w:eastAsiaTheme="minorEastAsia" w:hAnsi="Arial" w:cs="Arial"/>
+        </w:rPr>
+        <w:t>at</w:t>
+      </w:r>
+      <w:r>
+        <w:rPr>
+          <w:rFonts w:ascii="Arial" w:eastAsiaTheme="minorEastAsia" w:hAnsi="Arial" w:cs="Arial"/>
+        </w:rPr>
+        <w:t xml:space="preserve"> the beginning of each new shooting day.</w:t>
+      </w:r>
+    </w:p>
+    <w:p>
+      <w:pPr>
+        <w:spacing w:line="360" w:lineRule="auto"/>
+        <w:jc w:val="both"/>
+        <w:rPr>
+          <w:rFonts w:ascii="Arial" w:hAnsi="Arial" w:cs="Arial"/>
+        </w:rPr>
+      </w:pPr>
+    </w:p>
+    <w:p>
+      <w:pPr>
+        <w:spacing w:line="360" w:lineRule="auto"/>
+        <w:jc w:val="both"/>
+        <w:rPr>
+          <w:rFonts w:ascii="Arial" w:eastAsiaTheme="minorEastAsia" w:hAnsi="Arial" w:cs="Arial"/>
+        </w:rPr>
+      </w:pPr>
+      <w:r>
+        <w:rPr>
+          <w:rFonts w:ascii="Arial" w:hAnsi="Arial" w:cs="Arial"/>
+        </w:rPr>
+        <w:t xml:space="preserve">When it comes to precedence </w:t>
+      </w:r>
+      <m:oMath>
+        <m:r>
+          <w:rPr>
+            <w:rFonts w:ascii="Cambria Math" w:hAnsi="Cambria Math" w:cs="Arial"/>
+          </w:rPr>
+          <m:t>Pj</m:t>
+        </m:r>
+      </m:oMath>
+      <w:r>
+        <w:rPr>
+          <w:rFonts w:ascii="Arial" w:eastAsiaTheme="minorEastAsia" w:hAnsi="Arial" w:cs="Arial"/>
+        </w:rPr>
+        <w:t>, it follows the script order of the grouped locations, which are sorted from day to night.</w:t>
+      </w:r>
+      <w:r>
+        <w:rPr>
+          <w:rFonts w:ascii="Arial" w:eastAsiaTheme="minorEastAsia" w:hAnsi="Arial" w:cs="Arial"/>
+        </w:rPr>
+        <w:t xml:space="preserve"> The RCPSP includes optimization functions to select the best among all possible schedules. In </w:t>
+      </w:r>
+      <w:r>
+        <w:rPr>
+          <w:rFonts w:ascii="Arial" w:eastAsiaTheme="minorEastAsia" w:hAnsi="Arial" w:cs="Arial"/>
+          <w:i/>
+          <w:iCs/>
+        </w:rPr>
+        <w:t xml:space="preserve">Big </w:t>
+      </w:r>
+      <w:proofErr w:type="gramStart"/>
+      <w:r>
+        <w:rPr>
+          <w:rFonts w:ascii="Arial" w:eastAsiaTheme="minorEastAsia" w:hAnsi="Arial" w:cs="Arial"/>
+          <w:i/>
+          <w:iCs/>
+        </w:rPr>
+        <w:t>Break!</w:t>
+      </w:r>
+      <w:r>
+        <w:rPr>
+          <w:rFonts w:ascii="Arial" w:eastAsiaTheme="minorEastAsia" w:hAnsi="Arial" w:cs="Arial"/>
+        </w:rPr>
+        <w:t>,</w:t>
+      </w:r>
+      <w:proofErr w:type="gramEnd"/>
+      <w:r>
+        <w:rPr>
+          <w:rFonts w:ascii="Arial" w:eastAsiaTheme="minorEastAsia" w:hAnsi="Arial" w:cs="Arial"/>
+        </w:rPr>
+        <w:t xml:space="preserve"> </w:t>
+      </w:r>
+      <w:r>
+        <w:rPr>
+          <w:rFonts w:ascii="Arial" w:eastAsiaTheme="minorEastAsia" w:hAnsi="Arial" w:cs="Arial"/>
+        </w:rPr>
+        <w:t xml:space="preserve">if a scene can be scheduled in an already created day, </w:t>
+      </w:r>
+      <w:r>
+        <w:rPr>
+          <w:rFonts w:ascii="Arial" w:eastAsiaTheme="minorEastAsia" w:hAnsi="Arial" w:cs="Arial"/>
+        </w:rPr>
+        <w:t xml:space="preserve">these functions calculate a total score for placing </w:t>
+      </w:r>
+      <w:r>
+        <w:rPr>
+          <w:rFonts w:ascii="Arial" w:eastAsiaTheme="minorEastAsia" w:hAnsi="Arial" w:cs="Arial"/>
+        </w:rPr>
+        <w:t>the</w:t>
+      </w:r>
+      <w:r>
+        <w:rPr>
+          <w:rFonts w:ascii="Arial" w:eastAsiaTheme="minorEastAsia" w:hAnsi="Arial" w:cs="Arial"/>
+        </w:rPr>
+        <w:t xml:space="preserve"> scene </w:t>
+      </w:r>
+      <w:r>
+        <w:rPr>
+          <w:rFonts w:ascii="Arial" w:eastAsiaTheme="minorEastAsia" w:hAnsi="Arial" w:cs="Arial"/>
+        </w:rPr>
+        <w:t>on</w:t>
+      </w:r>
+      <w:r>
+        <w:rPr>
+          <w:rFonts w:ascii="Arial" w:eastAsiaTheme="minorEastAsia" w:hAnsi="Arial" w:cs="Arial"/>
+        </w:rPr>
+        <w:t xml:space="preserve"> a particular day</w:t>
+      </w:r>
+      <w:r>
+        <w:rPr>
+          <w:rFonts w:ascii="Arial" w:eastAsiaTheme="minorEastAsia" w:hAnsi="Arial" w:cs="Arial"/>
+        </w:rPr>
+        <w:t xml:space="preserve">. This </w:t>
+      </w:r>
+      <w:r>
+        <w:rPr>
+          <w:rFonts w:ascii="Arial" w:eastAsiaTheme="minorEastAsia" w:hAnsi="Arial" w:cs="Arial"/>
+        </w:rPr>
+        <w:t>depend</w:t>
+      </w:r>
+      <w:r>
+        <w:rPr>
+          <w:rFonts w:ascii="Arial" w:eastAsiaTheme="minorEastAsia" w:hAnsi="Arial" w:cs="Arial"/>
+        </w:rPr>
+        <w:t>s</w:t>
+      </w:r>
+      <w:r>
+        <w:rPr>
+          <w:rFonts w:ascii="Arial" w:eastAsiaTheme="minorEastAsia" w:hAnsi="Arial" w:cs="Arial"/>
+        </w:rPr>
+        <w:t xml:space="preserve"> on the location, time, cast, and scene order similarity</w:t>
+      </w:r>
+      <w:r>
+        <w:rPr>
+          <w:rFonts w:ascii="Arial" w:eastAsiaTheme="minorEastAsia" w:hAnsi="Arial" w:cs="Arial"/>
+        </w:rPr>
+        <w:t xml:space="preserve"> and the load score of the day so far.</w:t>
+      </w:r>
+      <w:r>
+        <w:rPr>
+          <w:rFonts w:ascii="Arial" w:eastAsiaTheme="minorEastAsia" w:hAnsi="Arial" w:cs="Arial"/>
+        </w:rPr>
+        <w:t xml:space="preserve"> </w:t>
+      </w:r>
+      <w:r>
+        <w:rPr>
+          <w:rFonts w:ascii="Arial" w:eastAsiaTheme="minorEastAsia" w:hAnsi="Arial" w:cs="Arial"/>
+        </w:rPr>
+        <w:t>The best score of all available days is picked, and the scene is scheduled there.</w:t>
+      </w:r>
+      <w:r>
+        <w:rPr>
+          <w:rFonts w:ascii="Arial" w:eastAsiaTheme="minorEastAsia" w:hAnsi="Arial" w:cs="Arial"/>
+        </w:rPr>
+        <w:t xml:space="preserve"> The finish time of the activity </w:t>
+      </w:r>
+      <m:oMath>
+        <m:sSub>
+          <m:sSubPr>
+            <m:ctrlPr>
+              <w:rPr>
+                <w:rFonts w:ascii="Cambria Math" w:eastAsiaTheme="minorEastAsia" w:hAnsi="Cambria Math" w:cs="Arial"/>
+                <w:i/>
+              </w:rPr>
+            </m:ctrlPr>
+          </m:sSubPr>
+          <m:e>
+            <m:r>
+              <w:rPr>
+                <w:rFonts w:ascii="Cambria Math" w:eastAsiaTheme="minorEastAsia" w:hAnsi="Cambria Math" w:cs="Arial"/>
+              </w:rPr>
+              <m:t>F</m:t>
+            </m:r>
+          </m:e>
+          <m:sub>
+            <m:r>
+              <w:rPr>
+                <w:rFonts w:ascii="Cambria Math" w:eastAsiaTheme="minorEastAsia" w:hAnsi="Cambria Math" w:cs="Arial"/>
+              </w:rPr>
+              <m:t>j</m:t>
+            </m:r>
+          </m:sub>
+        </m:sSub>
+      </m:oMath>
+      <w:r>
+        <w:rPr>
+          <w:rFonts w:ascii="Arial" w:eastAsiaTheme="minorEastAsia" w:hAnsi="Arial" w:cs="Arial"/>
+        </w:rPr>
+        <w:t xml:space="preserve"> is when a scene is assigned to a shooting day.</w:t>
+      </w:r>
+    </w:p>
+    <w:p>
+      <w:pPr>
+        <w:spacing w:line="360" w:lineRule="auto"/>
+        <w:jc w:val="both"/>
+        <w:rPr>
+          <w:rFonts w:ascii="Arial" w:eastAsiaTheme="minorEastAsia" w:hAnsi="Arial" w:cs="Arial"/>
+        </w:rPr>
+      </w:pPr>
+    </w:p>
+    <w:p>
+      <w:pPr>
+        <w:pStyle w:val="Heading5"/>
+        <w:spacing w:line="360" w:lineRule="auto"/>
+        <w:rPr>
+          <w:rFonts w:ascii="Arial" w:hAnsi="Arial" w:cs="Arial"/>
+          <w:b/>
+          <w:bCs/>
+          <w:color w:val="auto"/>
+        </w:rPr>
+      </w:pPr>
+      <w:r>
+        <w:rPr>
+          <w:rFonts w:ascii="Arial" w:hAnsi="Arial" w:cs="Arial"/>
+          <w:b/>
+          <w:bCs/>
+          <w:color w:val="auto"/>
+        </w:rPr>
+        <w:t>Serial Schedule Generation Scheme (SSGS)</w:t>
+      </w:r>
+    </w:p>
+    <w:p/>
+    <w:p>
+      <w:pPr>
+        <w:spacing w:line="360" w:lineRule="auto"/>
+        <w:rPr>
+          <w:rFonts w:ascii="Arial" w:hAnsi="Arial" w:cs="Arial"/>
+        </w:rPr>
+      </w:pPr>
+      <w:r>
+        <w:rPr>
+          <w:rFonts w:ascii="Arial" w:hAnsi="Arial" w:cs="Arial"/>
+        </w:rPr>
+        <w:lastRenderedPageBreak/>
+        <w:t xml:space="preserve">The Serial Schedule Generation Scheme is used by most heuristic methods to solve the RCPSP. </w:t>
+      </w:r>
+      <w:r>
+        <w:rPr>
+          <w:rFonts w:ascii="Arial" w:hAnsi="Arial" w:cs="Arial"/>
+        </w:rPr>
+        <w:t>The schedule generation scheme starts from scratch and feasibly schedules a new activity at each step.</w:t>
+      </w:r>
+    </w:p>
+    <w:p>
+      <w:pPr>
+        <w:spacing w:line="360" w:lineRule="auto"/>
+        <w:rPr>
+          <w:rFonts w:ascii="Arial" w:hAnsi="Arial" w:cs="Arial"/>
+        </w:rPr>
+      </w:pPr>
+    </w:p>
+    <w:p>
+      <w:pPr>
+        <w:spacing w:line="360" w:lineRule="auto"/>
+        <w:rPr>
+          <w:rFonts w:ascii="Arial" w:eastAsiaTheme="minorEastAsia" w:hAnsi="Arial" w:cs="Arial"/>
+        </w:rPr>
+      </w:pPr>
+      <w:r>
+        <w:rPr>
+          <w:rFonts w:ascii="Arial" w:hAnsi="Arial" w:cs="Arial"/>
+        </w:rPr>
+        <w:t xml:space="preserve">However, the classical SSGS uses a pure precedence-based activity list, while </w:t>
+      </w:r>
+      <w:r>
+        <w:rPr>
+          <w:rFonts w:ascii="Arial" w:hAnsi="Arial" w:cs="Arial"/>
+          <w:i/>
+          <w:iCs/>
+        </w:rPr>
+        <w:t xml:space="preserve">Big Break! </w:t>
+      </w:r>
+      <w:r>
+        <w:rPr>
+          <w:rFonts w:ascii="Arial" w:hAnsi="Arial" w:cs="Arial"/>
+        </w:rPr>
+        <w:t xml:space="preserve">uses a location-dominant activity list. </w:t>
+      </w:r>
+      <w:r>
+        <w:rPr>
+          <w:rFonts w:ascii="Arial" w:hAnsi="Arial" w:cs="Arial"/>
+        </w:rPr>
+        <w:t xml:space="preserve">This means that in the classical case, at each step </w:t>
+      </w:r>
+      <m:oMath>
+        <m:r>
+          <w:rPr>
+            <w:rFonts w:ascii="Cambria Math" w:hAnsi="Cambria Math" w:cs="Arial"/>
+          </w:rPr>
+          <m:t>g</m:t>
+        </m:r>
+      </m:oMath>
+      <w:r>
+        <w:rPr>
+          <w:rFonts w:ascii="Arial" w:eastAsiaTheme="minorEastAsia" w:hAnsi="Arial" w:cs="Arial"/>
+        </w:rPr>
+        <w:t xml:space="preserve">, </w:t>
+      </w:r>
+      <w:r>
+        <w:rPr>
+          <w:rFonts w:ascii="Arial" w:eastAsiaTheme="minorEastAsia" w:hAnsi="Arial" w:cs="Arial"/>
+        </w:rPr>
+        <w:t xml:space="preserve">the algorithm chooses an activity from the set of eligible activities </w:t>
+      </w:r>
+      <m:oMath>
+        <m:sSub>
+          <m:sSubPr>
+            <m:ctrlPr>
+              <w:rPr>
+                <w:rFonts w:ascii="Cambria Math" w:eastAsiaTheme="minorEastAsia" w:hAnsi="Cambria Math" w:cs="Arial"/>
+                <w:i/>
+              </w:rPr>
+            </m:ctrlPr>
+          </m:sSubPr>
+          <m:e>
+            <m:r>
+              <w:rPr>
+                <w:rFonts w:ascii="Cambria Math" w:eastAsiaTheme="minorEastAsia" w:hAnsi="Cambria Math" w:cs="Arial"/>
+              </w:rPr>
+              <m:t>D</m:t>
+            </m:r>
+          </m:e>
+          <m:sub>
+            <m:r>
+              <w:rPr>
+                <w:rFonts w:ascii="Cambria Math" w:eastAsiaTheme="minorEastAsia" w:hAnsi="Cambria Math" w:cs="Arial"/>
+              </w:rPr>
+              <m:t>g</m:t>
+            </m:r>
+          </m:sub>
+        </m:sSub>
+      </m:oMath>
+      <w:r>
+        <w:rPr>
+          <w:rFonts w:ascii="Arial" w:eastAsiaTheme="minorEastAsia" w:hAnsi="Arial" w:cs="Arial"/>
+        </w:rPr>
+        <w:t xml:space="preserve"> – all activities whose predecessors have already been scheduled.</w:t>
+      </w:r>
+      <w:r>
+        <w:rPr>
+          <w:rFonts w:ascii="Arial" w:eastAsiaTheme="minorEastAsia" w:hAnsi="Arial" w:cs="Arial"/>
+        </w:rPr>
+        <w:t xml:space="preserve"> In the general RCPSP case, many activities can become available at the same time, and the precedence graph can be complex.</w:t>
+      </w:r>
+    </w:p>
+    <w:p>
+      <w:pPr>
+        <w:spacing w:line="360" w:lineRule="auto"/>
+        <w:rPr>
+          <w:rFonts w:ascii="Arial" w:eastAsiaTheme="minorEastAsia" w:hAnsi="Arial" w:cs="Arial"/>
+        </w:rPr>
+      </w:pPr>
+    </w:p>
+    <w:p>
+      <w:pPr>
+        <w:spacing w:line="360" w:lineRule="auto"/>
+        <w:rPr>
+          <w:rFonts w:ascii="Arial" w:eastAsiaTheme="minorEastAsia" w:hAnsi="Arial" w:cs="Arial"/>
+        </w:rPr>
+      </w:pPr>
+      <w:r>
+        <w:rPr>
+          <w:rFonts w:ascii="Arial" w:eastAsiaTheme="minorEastAsia" w:hAnsi="Arial" w:cs="Arial"/>
+        </w:rPr>
+        <w:t xml:space="preserve">Nevertheless, the current state of </w:t>
+      </w:r>
+      <w:r>
+        <w:rPr>
+          <w:rFonts w:ascii="Arial" w:eastAsiaTheme="minorEastAsia" w:hAnsi="Arial" w:cs="Arial"/>
+          <w:i/>
+          <w:iCs/>
+        </w:rPr>
+        <w:t>Big Break!</w:t>
+      </w:r>
+      <w:r>
+        <w:rPr>
+          <w:rFonts w:ascii="Arial" w:eastAsiaTheme="minorEastAsia" w:hAnsi="Arial" w:cs="Arial"/>
+        </w:rPr>
+        <w:t xml:space="preserve"> simplifies the SSGS algorithm</w:t>
+      </w:r>
+      <w:r>
+        <w:rPr>
+          <w:rFonts w:ascii="Arial" w:eastAsiaTheme="minorEastAsia" w:hAnsi="Arial" w:cs="Arial"/>
+        </w:rPr>
+        <w:t>,</w:t>
+      </w:r>
+      <w:r>
+        <w:rPr>
+          <w:rFonts w:ascii="Arial" w:eastAsiaTheme="minorEastAsia" w:hAnsi="Arial" w:cs="Arial"/>
+        </w:rPr>
+        <w:t xml:space="preserve"> and its precedence graph is linear.</w:t>
+      </w:r>
+      <w:r>
+        <w:rPr>
+          <w:rFonts w:ascii="Arial" w:eastAsiaTheme="minorEastAsia" w:hAnsi="Arial" w:cs="Arial"/>
+        </w:rPr>
+        <w:t xml:space="preserve"> It groups the scenes by location while preserving the order of appearance of each location by using </w:t>
+      </w:r>
+      <w:proofErr w:type="gramStart"/>
+      <w:r>
+        <w:rPr>
+          <w:rFonts w:ascii="Arial" w:eastAsiaTheme="minorEastAsia" w:hAnsi="Arial" w:cs="Arial"/>
+        </w:rPr>
+        <w:t xml:space="preserve">a </w:t>
+      </w:r>
+      <w:proofErr w:type="spellStart"/>
+      <w:r>
+        <w:rPr>
+          <w:rFonts w:ascii="Arial" w:eastAsiaTheme="minorEastAsia" w:hAnsi="Arial" w:cs="Arial"/>
+        </w:rPr>
+        <w:t>LinkedHashMap</w:t>
+      </w:r>
+      <w:proofErr w:type="spellEnd"/>
+      <w:proofErr w:type="gramEnd"/>
+      <w:r>
+        <w:rPr>
+          <w:rFonts w:ascii="Arial" w:eastAsiaTheme="minorEastAsia" w:hAnsi="Arial" w:cs="Arial"/>
+        </w:rPr>
+        <w:t>.</w:t>
+      </w:r>
+      <w:r>
+        <w:rPr>
+          <w:rFonts w:ascii="Arial" w:eastAsiaTheme="minorEastAsia" w:hAnsi="Arial" w:cs="Arial"/>
+        </w:rPr>
+        <w:t xml:space="preserve"> Keeping shoots relatively in the same location is important as it considers the availability of the place, and it saves time and money. Preserving the order of appearance also helps with script continuity, as this makes it easier for actors to follow.</w:t>
+      </w:r>
+      <w:r>
+        <w:rPr>
+          <w:rFonts w:ascii="Arial" w:eastAsiaTheme="minorEastAsia" w:hAnsi="Arial" w:cs="Arial"/>
+        </w:rPr>
+        <w:t xml:space="preserve"> Within each location group, the scenes are sorted by the shooting time – all day scenes coming before night scenes.</w:t>
+      </w:r>
+      <w:r>
+        <w:rPr>
+          <w:rFonts w:ascii="Arial" w:eastAsiaTheme="minorEastAsia" w:hAnsi="Arial" w:cs="Arial"/>
+        </w:rPr>
+        <w:t xml:space="preserve"> This creates a sequence of scenes that can be shot at similar times of the day with little change in lighting.</w:t>
+      </w:r>
+      <w:r>
+        <w:rPr>
+          <w:rFonts w:ascii="Arial" w:eastAsiaTheme="minorEastAsia" w:hAnsi="Arial" w:cs="Arial"/>
+        </w:rPr>
+        <w:t xml:space="preserve"> </w:t>
+      </w:r>
+      <w:r>
+        <w:rPr>
+          <w:rFonts w:ascii="Arial" w:eastAsiaTheme="minorEastAsia" w:hAnsi="Arial" w:cs="Arial"/>
+        </w:rPr>
+        <w:t xml:space="preserve">This creates a predefined precedence-feasible list where the next scene in the location-grouped time-sorted </w:t>
+      </w:r>
+      <w:r>
+        <w:rPr>
+          <w:rFonts w:ascii="Arial" w:eastAsiaTheme="minorEastAsia" w:hAnsi="Arial" w:cs="Arial"/>
+        </w:rPr>
+        <w:t>activity list</w:t>
+      </w:r>
+      <w:r>
+        <w:rPr>
+          <w:rFonts w:ascii="Arial" w:eastAsiaTheme="minorEastAsia" w:hAnsi="Arial" w:cs="Arial"/>
+        </w:rPr>
+        <w:t xml:space="preserve"> is taken: </w:t>
+      </w:r>
+      <m:oMath>
+        <m:r>
+          <w:rPr>
+            <w:rFonts w:ascii="Cambria Math" w:eastAsiaTheme="minorEastAsia" w:hAnsi="Cambria Math" w:cs="Arial"/>
+          </w:rPr>
+          <m:t>j = λ[g]</m:t>
+        </m:r>
+      </m:oMath>
+      <w:r>
+        <w:rPr>
+          <w:rFonts w:ascii="Arial" w:eastAsiaTheme="minorEastAsia" w:hAnsi="Arial" w:cs="Arial"/>
+        </w:rPr>
+        <w:t>.</w:t>
+      </w:r>
+      <w:r>
+        <w:rPr>
+          <w:rFonts w:ascii="Arial" w:hAnsi="Arial" w:cs="Arial"/>
+        </w:rPr>
+        <w:t xml:space="preserve"> </w:t>
+      </w:r>
+      <w:r>
+        <w:rPr>
+          <w:rFonts w:ascii="Arial" w:eastAsiaTheme="minorEastAsia" w:hAnsi="Arial" w:cs="Arial"/>
+        </w:rPr>
+        <w:t>To make th</w:t>
+      </w:r>
+      <w:r>
+        <w:rPr>
+          <w:rFonts w:ascii="Arial" w:eastAsiaTheme="minorEastAsia" w:hAnsi="Arial" w:cs="Arial"/>
+        </w:rPr>
+        <w:t xml:space="preserve">is </w:t>
+      </w:r>
+      <w:r>
+        <w:rPr>
+          <w:rFonts w:ascii="Arial" w:eastAsiaTheme="minorEastAsia" w:hAnsi="Arial" w:cs="Arial"/>
+        </w:rPr>
+        <w:t>list (</w:t>
+      </w:r>
+      <m:oMath>
+        <m:r>
+          <w:rPr>
+            <w:rFonts w:ascii="Cambria Math" w:eastAsiaTheme="minorEastAsia" w:hAnsi="Cambria Math" w:cs="Arial"/>
+          </w:rPr>
+          <m:t>λ</m:t>
+        </m:r>
+      </m:oMath>
+      <w:r>
+        <w:rPr>
+          <w:rFonts w:ascii="Arial" w:eastAsiaTheme="minorEastAsia" w:hAnsi="Arial" w:cs="Arial"/>
+        </w:rPr>
+        <w:t>) more visual:</w:t>
+      </w:r>
+    </w:p>
+    <w:p>
+      <w:pPr>
+        <w:spacing w:line="360" w:lineRule="auto"/>
+        <w:rPr>
+          <w:rFonts w:ascii="Arial" w:hAnsi="Arial" w:cs="Arial"/>
+        </w:rPr>
+      </w:pPr>
+    </w:p>
+    <w:p>
+      <w:pPr>
+        <w:spacing w:line="360" w:lineRule="auto"/>
+        <w:rPr>
+          <w:rFonts w:ascii="Arial" w:eastAsiaTheme="minorEastAsia" w:hAnsi="Arial" w:cs="Arial"/>
+        </w:rPr>
+      </w:pPr>
+      <m:oMathPara>
+        <m:oMath>
+          <m:r>
+            <w:rPr>
+              <w:rFonts w:ascii="Cambria Math" w:hAnsi="Cambria Math" w:cs="Arial"/>
+            </w:rPr>
+            <m:t>λ = [all scenes of location A (DAY first, NIGHT after),</m:t>
+          </m:r>
+        </m:oMath>
+      </m:oMathPara>
+    </w:p>
+    <w:p>
+      <w:pPr>
+        <w:spacing w:line="360" w:lineRule="auto"/>
+        <w:rPr>
+          <w:rFonts w:ascii="Arial" w:eastAsiaTheme="minorEastAsia" w:hAnsi="Arial" w:cs="Arial"/>
+        </w:rPr>
+      </w:pPr>
+      <m:oMathPara>
+        <m:oMath>
+          <m:r>
+            <w:rPr>
+              <w:rFonts w:ascii="Cambria Math" w:hAnsi="Cambria Math" w:cs="Arial"/>
+            </w:rPr>
+            <m:t xml:space="preserve">all scenes of location B </m:t>
+          </m:r>
+          <m:d>
+            <m:dPr>
+              <m:ctrlPr>
+                <w:rPr>
+                  <w:rFonts w:ascii="Cambria Math" w:hAnsi="Cambria Math" w:cs="Arial"/>
+                  <w:i/>
+                </w:rPr>
+              </m:ctrlPr>
+            </m:dPr>
+            <m:e>
+              <m:r>
+                <w:rPr>
+                  <w:rFonts w:ascii="Cambria Math" w:hAnsi="Cambria Math" w:cs="Arial"/>
+                </w:rPr>
+                <m:t>DAY first, NIGHT after</m:t>
+              </m:r>
+            </m:e>
+          </m:d>
+          <m:r>
+            <w:rPr>
+              <w:rFonts w:ascii="Cambria Math" w:hAnsi="Cambria Math" w:cs="Arial"/>
+            </w:rPr>
+            <m:t>,</m:t>
+          </m:r>
+        </m:oMath>
+      </m:oMathPara>
+    </w:p>
+    <w:p>
+      <w:pPr>
+        <w:spacing w:line="360" w:lineRule="auto"/>
+        <w:rPr>
+          <w:rFonts w:ascii="Arial" w:eastAsiaTheme="minorEastAsia" w:hAnsi="Arial" w:cs="Arial"/>
+        </w:rPr>
+      </w:pPr>
+      <m:oMathPara>
+        <m:oMath>
+          <m:r>
+            <w:rPr>
+              <w:rFonts w:ascii="Cambria Math" w:hAnsi="Cambria Math" w:cs="Arial"/>
+            </w:rPr>
+            <m:t>all scenes of location C (DAY first, NIGHT after), ...]</m:t>
+          </m:r>
+        </m:oMath>
+      </m:oMathPara>
+    </w:p>
+    <w:p>
+      <w:pPr>
+        <w:spacing w:line="360" w:lineRule="auto"/>
+        <w:rPr>
+          <w:rFonts w:ascii="Arial" w:eastAsiaTheme="minorEastAsia" w:hAnsi="Arial" w:cs="Arial"/>
+        </w:rPr>
+      </w:pPr>
+    </w:p>
+    <w:p>
+      <w:pPr>
+        <w:spacing w:line="360" w:lineRule="auto"/>
+        <w:rPr>
+          <w:rFonts w:ascii="Arial" w:eastAsiaTheme="minorEastAsia" w:hAnsi="Arial" w:cs="Arial"/>
+        </w:rPr>
+      </w:pPr>
+      <w:r>
+        <w:rPr>
+          <w:rFonts w:ascii="Arial" w:eastAsiaTheme="minorEastAsia" w:hAnsi="Arial" w:cs="Arial"/>
+        </w:rPr>
+        <w:t xml:space="preserve">The algorithm still works as SSGS as it selects the best feasible day in the already created ones or finds a new one if the feasibility is not met. The day is considered </w:t>
+      </w:r>
+      <w:r>
+        <w:rPr>
+          <w:rFonts w:ascii="Arial" w:eastAsiaTheme="minorEastAsia" w:hAnsi="Arial" w:cs="Arial"/>
+        </w:rPr>
+        <w:lastRenderedPageBreak/>
+        <w:t>feasible if it meets the core</w:t>
+      </w:r>
+      <w:r>
+        <w:rPr>
+          <w:rFonts w:ascii="Arial" w:eastAsiaTheme="minorEastAsia" w:hAnsi="Arial" w:cs="Arial"/>
+        </w:rPr>
+        <w:t xml:space="preserve"> resource constraints</w:t>
+      </w:r>
+      <w:r>
+        <w:rPr>
+          <w:rFonts w:ascii="Arial" w:eastAsiaTheme="minorEastAsia" w:hAnsi="Arial" w:cs="Arial"/>
+        </w:rPr>
+        <w:t xml:space="preserve"> regarding available time, European </w:t>
+      </w:r>
+      <w:r>
+        <w:rPr>
+          <w:rFonts w:ascii="Arial" w:eastAsiaTheme="minorEastAsia" w:hAnsi="Arial" w:cs="Arial"/>
+        </w:rPr>
+        <w:t xml:space="preserve">worker </w:t>
+      </w:r>
+      <w:r>
+        <w:rPr>
+          <w:rFonts w:ascii="Arial" w:eastAsiaTheme="minorEastAsia" w:hAnsi="Arial" w:cs="Arial"/>
+        </w:rPr>
+        <w:t>rest time jurisdictions, and location moves per day.</w:t>
+      </w:r>
+    </w:p>
+    <w:p>
+      <w:pPr>
+        <w:spacing w:line="360" w:lineRule="auto"/>
+        <w:rPr>
+          <w:rFonts w:ascii="Arial" w:eastAsiaTheme="minorEastAsia" w:hAnsi="Arial" w:cs="Arial"/>
+        </w:rPr>
+      </w:pPr>
+    </w:p>
+    <w:p>
+      <w:pPr>
+        <w:spacing w:line="360" w:lineRule="auto"/>
+        <w:rPr>
+          <w:rFonts w:ascii="Arial" w:eastAsiaTheme="minorEastAsia" w:hAnsi="Arial" w:cs="Arial"/>
+        </w:rPr>
+      </w:pPr>
+      <w:r>
+        <w:rPr>
+          <w:rFonts w:ascii="Arial" w:eastAsiaTheme="minorEastAsia" w:hAnsi="Arial" w:cs="Arial"/>
+        </w:rPr>
+        <w:t>The renewable resources here are time</w:t>
+      </w:r>
+      <w:r>
+        <w:rPr>
+          <w:rFonts w:ascii="Arial" w:eastAsiaTheme="minorEastAsia" w:hAnsi="Arial" w:cs="Arial"/>
+        </w:rPr>
+        <w:t>,</w:t>
+      </w:r>
+      <w:r>
+        <w:rPr>
+          <w:rFonts w:ascii="Arial" w:eastAsiaTheme="minorEastAsia" w:hAnsi="Arial" w:cs="Arial"/>
+        </w:rPr>
+        <w:t xml:space="preserve"> move counts,</w:t>
+      </w:r>
+      <w:r>
+        <w:rPr>
+          <w:rFonts w:ascii="Arial" w:eastAsiaTheme="minorEastAsia" w:hAnsi="Arial" w:cs="Arial"/>
+        </w:rPr>
+        <w:t xml:space="preserve"> and the shooting phase</w:t>
+      </w:r>
+      <w:r>
+        <w:rPr>
+          <w:rFonts w:ascii="Arial" w:eastAsiaTheme="minorEastAsia" w:hAnsi="Arial" w:cs="Arial"/>
+        </w:rPr>
+        <w:t xml:space="preserve"> as they regenerate per day. The</w:t>
+      </w:r>
+      <w:r>
+        <w:rPr>
+          <w:rFonts w:ascii="Arial" w:eastAsiaTheme="minorEastAsia" w:hAnsi="Arial" w:cs="Arial"/>
+        </w:rPr>
+        <w:t>y</w:t>
+      </w:r>
+      <w:r>
+        <w:rPr>
+          <w:rFonts w:ascii="Arial" w:eastAsiaTheme="minorEastAsia" w:hAnsi="Arial" w:cs="Arial"/>
+        </w:rPr>
+        <w:t xml:space="preserve"> set</w:t>
+      </w:r>
+      <w:r>
+        <w:rPr>
+          <w:rFonts w:ascii="Arial" w:eastAsiaTheme="minorEastAsia" w:hAnsi="Arial" w:cs="Arial"/>
+        </w:rPr>
+        <w:t xml:space="preserve"> t</w:t>
+      </w:r>
+      <w:r>
+        <w:rPr>
+          <w:rFonts w:ascii="Arial" w:eastAsiaTheme="minorEastAsia" w:hAnsi="Arial" w:cs="Arial"/>
+        </w:rPr>
+        <w:t>hree</w:t>
+      </w:r>
+      <w:r>
+        <w:rPr>
+          <w:rFonts w:ascii="Arial" w:eastAsiaTheme="minorEastAsia" w:hAnsi="Arial" w:cs="Arial"/>
+        </w:rPr>
+        <w:t xml:space="preserve"> hard rules</w:t>
+      </w:r>
+      <w:r>
+        <w:rPr>
+          <w:rFonts w:ascii="Arial" w:eastAsiaTheme="minorEastAsia" w:hAnsi="Arial" w:cs="Arial"/>
+        </w:rPr>
+        <w:t>.</w:t>
+      </w:r>
+      <w:r>
+        <w:rPr>
+          <w:rFonts w:ascii="Arial" w:eastAsiaTheme="minorEastAsia" w:hAnsi="Arial" w:cs="Arial"/>
+        </w:rPr>
+        <w:t xml:space="preserve"> </w:t>
+      </w:r>
+      <w:r>
+        <w:rPr>
+          <w:rFonts w:ascii="Arial" w:eastAsiaTheme="minorEastAsia" w:hAnsi="Arial" w:cs="Arial"/>
+        </w:rPr>
+        <w:t>D</w:t>
+      </w:r>
+      <w:r>
+        <w:rPr>
+          <w:rFonts w:ascii="Arial" w:eastAsiaTheme="minorEastAsia" w:hAnsi="Arial" w:cs="Arial"/>
+        </w:rPr>
+        <w:t>ays cannot include more than 45 eighths per day, including moving time (8 eighths per move)</w:t>
+      </w:r>
+      <w:r>
+        <w:rPr>
+          <w:rFonts w:ascii="Arial" w:eastAsiaTheme="minorEastAsia" w:hAnsi="Arial" w:cs="Arial"/>
+        </w:rPr>
+        <w:t xml:space="preserve">. The only exception </w:t>
+      </w:r>
+      <w:r>
+        <w:rPr>
+          <w:rFonts w:ascii="Arial" w:eastAsiaTheme="minorEastAsia" w:hAnsi="Arial" w:cs="Arial"/>
+        </w:rPr>
+        <w:t xml:space="preserve">to this rule is scenes larger than 45 eighths, as the </w:t>
+      </w:r>
+      <w:r>
+        <w:rPr>
+          <w:rFonts w:ascii="Arial" w:eastAsiaTheme="minorEastAsia" w:hAnsi="Arial" w:cs="Arial"/>
+          <w:i/>
+          <w:iCs/>
+        </w:rPr>
+        <w:t>Big Break!</w:t>
+      </w:r>
+      <w:r>
+        <w:rPr>
+          <w:rFonts w:ascii="Arial" w:eastAsiaTheme="minorEastAsia" w:hAnsi="Arial" w:cs="Arial"/>
+        </w:rPr>
+        <w:t xml:space="preserve"> software still cannot split a scene into two days.</w:t>
+      </w:r>
+    </w:p>
+    <w:p>
+      <w:pPr>
+        <w:spacing w:line="360" w:lineRule="auto"/>
+        <w:rPr>
+          <w:rFonts w:ascii="Arial" w:eastAsiaTheme="minorEastAsia" w:hAnsi="Arial" w:cs="Arial"/>
+        </w:rPr>
+      </w:pPr>
+      <w:r>
+        <w:rPr>
+          <w:rFonts w:ascii="Arial" w:eastAsiaTheme="minorEastAsia" w:hAnsi="Arial" w:cs="Arial"/>
+        </w:rPr>
+        <w:t>The other hard rule</w:t>
+      </w:r>
+      <w:r>
+        <w:rPr>
+          <w:rFonts w:ascii="Arial" w:eastAsiaTheme="minorEastAsia" w:hAnsi="Arial" w:cs="Arial"/>
+        </w:rPr>
+        <w:t xml:space="preserve"> is that location moves cannot be more than 3 per day.</w:t>
+      </w:r>
+      <w:r>
+        <w:rPr>
+          <w:rFonts w:ascii="Arial" w:eastAsiaTheme="minorEastAsia" w:hAnsi="Arial" w:cs="Arial"/>
+        </w:rPr>
+        <w:t xml:space="preserve"> This is set because moving locations during the day can lose a significant amount of time, but most scripts available online have various locations and large budgets. In most cases, they work with two units (crews)</w:t>
+      </w:r>
+      <w:r>
+        <w:rPr>
+          <w:rFonts w:ascii="Arial" w:eastAsiaTheme="minorEastAsia" w:hAnsi="Arial" w:cs="Arial"/>
+        </w:rPr>
+        <w:t>,</w:t>
+      </w:r>
+      <w:r>
+        <w:rPr>
+          <w:rFonts w:ascii="Arial" w:eastAsiaTheme="minorEastAsia" w:hAnsi="Arial" w:cs="Arial"/>
+        </w:rPr>
+        <w:t xml:space="preserve"> which can work simultaneously in different locations. This may be a potential feature to consider for the future development of the project.</w:t>
+      </w:r>
+    </w:p>
+    <w:p>
+      <w:pPr>
+        <w:spacing w:line="360" w:lineRule="auto"/>
+        <w:rPr>
+          <w:rFonts w:ascii="Arial" w:eastAsiaTheme="minorEastAsia" w:hAnsi="Arial" w:cs="Arial"/>
+        </w:rPr>
+      </w:pPr>
+    </w:p>
+    <w:p>
+      <w:pPr>
+        <w:spacing w:line="360" w:lineRule="auto"/>
+        <w:rPr>
+          <w:rFonts w:ascii="Arial" w:eastAsiaTheme="minorEastAsia" w:hAnsi="Arial" w:cs="Arial"/>
+        </w:rPr>
+      </w:pPr>
+      <w:r>
+        <w:rPr>
+          <w:rFonts w:ascii="Arial" w:eastAsiaTheme="minorEastAsia" w:hAnsi="Arial" w:cs="Arial"/>
+        </w:rPr>
+        <w:t xml:space="preserve">The third </w:t>
+      </w:r>
+      <w:r>
+        <w:rPr>
+          <w:rFonts w:ascii="Arial" w:eastAsiaTheme="minorEastAsia" w:hAnsi="Arial" w:cs="Arial"/>
+        </w:rPr>
+        <w:t xml:space="preserve">hard rule </w:t>
+      </w:r>
+      <w:r>
+        <w:rPr>
+          <w:rFonts w:ascii="Arial" w:eastAsiaTheme="minorEastAsia" w:hAnsi="Arial" w:cs="Arial"/>
+        </w:rPr>
+        <w:t>is that</w:t>
+      </w:r>
+      <w:r>
+        <w:rPr>
+          <w:rFonts w:ascii="Arial" w:eastAsiaTheme="minorEastAsia" w:hAnsi="Arial" w:cs="Arial"/>
+        </w:rPr>
+        <w:t xml:space="preserve"> a day scene cannot be scheduled</w:t>
+      </w:r>
+      <w:r>
+        <w:rPr>
+          <w:rFonts w:ascii="Arial" w:eastAsiaTheme="minorEastAsia" w:hAnsi="Arial" w:cs="Arial"/>
+        </w:rPr>
+        <w:t xml:space="preserve"> in a day that has already started its night phase (</w:t>
+      </w:r>
+      <w:r>
+        <w:rPr>
+          <w:rFonts w:ascii="Arial" w:eastAsiaTheme="minorEastAsia" w:hAnsi="Arial" w:cs="Arial"/>
+        </w:rPr>
+        <w:t xml:space="preserve">a day assigned with NIGHT or DAY_NIGHT). </w:t>
+      </w:r>
+      <w:r>
+        <w:rPr>
+          <w:rFonts w:ascii="Arial" w:eastAsiaTheme="minorEastAsia" w:hAnsi="Arial" w:cs="Arial"/>
+        </w:rPr>
+        <w:t>This constraint is created because night-to-day shoots are very unlikely in the film industry, and day-to-night-to-day shoots would either break the European rest laws, which require a 12-hour break between work shifts.</w:t>
+      </w:r>
+      <w:r>
+        <w:rPr>
+          <w:rFonts w:ascii="Arial" w:eastAsiaTheme="minorEastAsia" w:hAnsi="Arial" w:cs="Arial"/>
+        </w:rPr>
+        <w:t xml:space="preserve"> This makes the time-of-day a renewable resource dimension.</w:t>
+      </w:r>
+    </w:p>
+    <w:p>
+      <w:pPr>
+        <w:spacing w:line="360" w:lineRule="auto"/>
+        <w:rPr>
+          <w:rFonts w:ascii="Arial" w:eastAsiaTheme="minorEastAsia" w:hAnsi="Arial" w:cs="Arial"/>
+        </w:rPr>
+      </w:pPr>
+    </w:p>
+    <w:p>
+      <w:pPr>
+        <w:spacing w:line="360" w:lineRule="auto"/>
+        <w:rPr>
+          <w:rFonts w:ascii="Arial" w:eastAsiaTheme="minorEastAsia" w:hAnsi="Arial" w:cs="Arial"/>
+        </w:rPr>
+      </w:pPr>
+      <w:r>
+        <w:rPr>
+          <w:rFonts w:ascii="Arial" w:eastAsiaTheme="minorEastAsia" w:hAnsi="Arial" w:cs="Arial"/>
+        </w:rPr>
+        <w:t>The only feasible resource constraint that would not be necessarily considered renewable is forbidding a</w:t>
+      </w:r>
+      <w:r>
+        <w:rPr>
+          <w:rFonts w:ascii="Arial" w:eastAsiaTheme="minorEastAsia" w:hAnsi="Arial" w:cs="Arial"/>
+        </w:rPr>
+        <w:t xml:space="preserve">n </w:t>
+      </w:r>
+      <w:r>
+        <w:rPr>
+          <w:rFonts w:ascii="Arial" w:eastAsiaTheme="minorEastAsia" w:hAnsi="Arial" w:cs="Arial"/>
+        </w:rPr>
+        <w:t xml:space="preserve">exclusively day shoot after </w:t>
+      </w:r>
+      <w:r>
+        <w:rPr>
+          <w:rFonts w:ascii="Arial" w:eastAsiaTheme="minorEastAsia" w:hAnsi="Arial" w:cs="Arial"/>
+        </w:rPr>
+        <w:t>an</w:t>
+      </w:r>
+      <w:r>
+        <w:rPr>
+          <w:rFonts w:ascii="Arial" w:eastAsiaTheme="minorEastAsia" w:hAnsi="Arial" w:cs="Arial"/>
+        </w:rPr>
+        <w:t xml:space="preserve"> exclusively night shoot. It is set because of the Europeans rest laws</w:t>
+      </w:r>
+      <w:r>
+        <w:rPr>
+          <w:rFonts w:ascii="Arial" w:eastAsiaTheme="minorEastAsia" w:hAnsi="Arial" w:cs="Arial"/>
+        </w:rPr>
+        <w:t>.</w:t>
+      </w:r>
+      <w:r>
+        <w:rPr>
+          <w:rFonts w:ascii="Arial" w:eastAsiaTheme="minorEastAsia" w:hAnsi="Arial" w:cs="Arial"/>
+        </w:rPr>
+        <w:t xml:space="preserve"> The only exception when this constraint is disregarded is when a scene is not feasible in any other scene, and a new day scene needs to create a new day after an exclusively night shooting day.</w:t>
+      </w:r>
+    </w:p>
+    <w:p>
+      <w:pPr>
+        <w:spacing w:line="360" w:lineRule="auto"/>
+        <w:rPr>
+          <w:rFonts w:ascii="Arial" w:eastAsiaTheme="minorEastAsia" w:hAnsi="Arial" w:cs="Arial"/>
+        </w:rPr>
+      </w:pPr>
+    </w:p>
+    <w:p>
+      <w:pPr>
+        <w:spacing w:line="360" w:lineRule="auto"/>
+        <w:rPr>
+          <w:rFonts w:ascii="Arial" w:eastAsiaTheme="minorEastAsia" w:hAnsi="Arial" w:cs="Arial"/>
+        </w:rPr>
+      </w:pPr>
+      <w:r>
+        <w:rPr>
+          <w:rFonts w:ascii="Arial" w:eastAsiaTheme="minorEastAsia" w:hAnsi="Arial" w:cs="Arial"/>
+        </w:rPr>
+        <w:t xml:space="preserve">This algorithm solves </w:t>
+      </w:r>
+      <w:r>
+        <w:rPr>
+          <w:rFonts w:ascii="Arial" w:eastAsiaTheme="minorEastAsia" w:hAnsi="Arial" w:cs="Arial"/>
+        </w:rPr>
+        <w:t>multi</w:t>
+      </w:r>
+      <w:r>
+        <w:rPr>
+          <w:rFonts w:ascii="Arial" w:eastAsiaTheme="minorEastAsia" w:hAnsi="Arial" w:cs="Arial"/>
+        </w:rPr>
+        <w:t xml:space="preserve">-resource RCPSP with hierarchical priority constraints. A set of weighted priority rules computes a score for how well a scene can be </w:t>
+      </w:r>
+      <w:r>
+        <w:rPr>
+          <w:rFonts w:ascii="Arial" w:eastAsiaTheme="minorEastAsia" w:hAnsi="Arial" w:cs="Arial"/>
+        </w:rPr>
+        <w:lastRenderedPageBreak/>
+        <w:t>scheduled in all already created days. They follow a hierarchical weight depending on their importance – location grouping, time-of-day grouping, resource capacity, cast clustering, and order similarity.</w:t>
+      </w:r>
+    </w:p>
+    <w:p>
+      <w:pPr>
+        <w:spacing w:line="360" w:lineRule="auto"/>
+        <w:rPr>
+          <w:rFonts w:ascii="Arial" w:eastAsiaTheme="minorEastAsia" w:hAnsi="Arial" w:cs="Arial"/>
+        </w:rPr>
+      </w:pPr>
+    </w:p>
+    <w:p>
+      <w:pPr>
+        <w:spacing w:line="360" w:lineRule="auto"/>
+        <w:rPr>
+          <w:rFonts w:ascii="Arial" w:eastAsiaTheme="minorEastAsia" w:hAnsi="Arial" w:cs="Arial"/>
+        </w:rPr>
+      </w:pPr>
+      <w:r>
+        <w:rPr>
+          <w:rFonts w:ascii="Arial" w:eastAsiaTheme="minorEastAsia" w:hAnsi="Arial" w:cs="Arial"/>
+        </w:rPr>
+        <w:t xml:space="preserve">The location grouping compares the current scene to the set of locations in the day. It tokenized the scene location and each entry of the location set. If they are completely the same, it produces a large boost. If they are not completely different, </w:t>
+      </w:r>
+      <w:r>
+        <w:rPr>
+          <w:rFonts w:ascii="Arial" w:eastAsiaTheme="minorEastAsia" w:hAnsi="Arial" w:cs="Arial"/>
+        </w:rPr>
+        <w:t>it produces a small boost (JOEL’S APARTMENT/CLEMENTINE’S APARTMENT). This allows for potentially filling up the days with locations that might be created closer together.</w:t>
+      </w:r>
+      <w:r>
+        <w:rPr>
+          <w:rFonts w:ascii="Arial" w:eastAsiaTheme="minorEastAsia" w:hAnsi="Arial" w:cs="Arial"/>
+        </w:rPr>
+        <w:t xml:space="preserve"> If the locations have nothing in common, a penalty is set.</w:t>
+      </w:r>
+    </w:p>
+    <w:p>
+      <w:pPr>
+        <w:spacing w:line="360" w:lineRule="auto"/>
+        <w:rPr>
+          <w:rFonts w:ascii="Arial" w:eastAsiaTheme="minorEastAsia" w:hAnsi="Arial" w:cs="Arial"/>
+        </w:rPr>
+      </w:pPr>
+    </w:p>
+    <w:p>
+      <w:pPr>
+        <w:spacing w:line="360" w:lineRule="auto"/>
+        <w:rPr>
+          <w:rFonts w:ascii="Arial" w:eastAsiaTheme="minorEastAsia" w:hAnsi="Arial" w:cs="Arial"/>
+        </w:rPr>
+      </w:pPr>
+      <w:r>
+        <w:rPr>
+          <w:rFonts w:ascii="Arial" w:eastAsiaTheme="minorEastAsia" w:hAnsi="Arial" w:cs="Arial"/>
+        </w:rPr>
+        <w:t xml:space="preserve">The time score function returns </w:t>
+      </w:r>
+      <w:r>
+        <w:rPr>
+          <w:rFonts w:ascii="Arial" w:eastAsiaTheme="minorEastAsia" w:hAnsi="Arial" w:cs="Arial"/>
+        </w:rPr>
+        <w:t>a boost when the scene time corresponds to the overall day time so far. If it doesn’t, it returns an equal penalty.</w:t>
+      </w:r>
+    </w:p>
+    <w:p>
+      <w:pPr>
+        <w:spacing w:line="360" w:lineRule="auto"/>
+        <w:rPr>
+          <w:rFonts w:ascii="Arial" w:eastAsiaTheme="minorEastAsia" w:hAnsi="Arial" w:cs="Arial"/>
+        </w:rPr>
+      </w:pPr>
+    </w:p>
+    <w:p>
+      <w:pPr>
+        <w:spacing w:line="360" w:lineRule="auto"/>
+        <w:rPr>
+          <w:rFonts w:ascii="Arial" w:eastAsiaTheme="minorEastAsia" w:hAnsi="Arial" w:cs="Arial"/>
+        </w:rPr>
+      </w:pPr>
+      <w:r>
+        <w:rPr>
+          <w:rFonts w:ascii="Arial" w:eastAsiaTheme="minorEastAsia" w:hAnsi="Arial" w:cs="Arial"/>
+        </w:rPr>
+        <w:t>Resource capacity will be added later as the function might be readjusted.</w:t>
+      </w:r>
+    </w:p>
+    <w:p>
+      <w:pPr>
+        <w:spacing w:line="360" w:lineRule="auto"/>
+        <w:rPr>
+          <w:rFonts w:ascii="Arial" w:eastAsiaTheme="minorEastAsia" w:hAnsi="Arial" w:cs="Arial"/>
+        </w:rPr>
+      </w:pPr>
+    </w:p>
+    <w:p>
+      <w:pPr>
+        <w:spacing w:line="360" w:lineRule="auto"/>
+        <w:rPr>
+          <w:rFonts w:ascii="Arial" w:eastAsiaTheme="minorEastAsia" w:hAnsi="Arial" w:cs="Arial"/>
+        </w:rPr>
+      </w:pPr>
+      <w:r>
+        <w:rPr>
+          <w:rFonts w:ascii="Arial" w:eastAsiaTheme="minorEastAsia" w:hAnsi="Arial" w:cs="Arial"/>
+        </w:rPr>
+        <w:t>The cast overlap score checks how many of the unique characters (their canonical names) included in the scene are part of the total character set of the day. It returns the overlap and multiplies it by 20 to add more weight.</w:t>
+      </w:r>
+    </w:p>
+    <w:p>
+      <w:pPr>
+        <w:spacing w:line="360" w:lineRule="auto"/>
+        <w:rPr>
+          <w:rFonts w:ascii="Arial" w:eastAsiaTheme="minorEastAsia" w:hAnsi="Arial" w:cs="Arial"/>
+        </w:rPr>
+      </w:pPr>
+    </w:p>
+    <w:p>
+      <w:pPr>
+        <w:spacing w:line="360" w:lineRule="auto"/>
+        <w:rPr>
+          <w:rFonts w:ascii="Arial" w:eastAsiaTheme="minorEastAsia" w:hAnsi="Arial" w:cs="Arial"/>
+        </w:rPr>
+      </w:pPr>
+      <w:r>
+        <w:rPr>
+          <w:rFonts w:ascii="Arial" w:eastAsiaTheme="minorEastAsia" w:hAnsi="Arial" w:cs="Arial"/>
+        </w:rPr>
+        <w:t>The order score computes the script distance bet</w:t>
+      </w:r>
+      <w:r>
+        <w:rPr>
+          <w:rFonts w:ascii="Arial" w:eastAsiaTheme="minorEastAsia" w:hAnsi="Arial" w:cs="Arial"/>
+        </w:rPr>
+        <w:t>ween the current scenes in the day and the scene being considered.</w:t>
+      </w:r>
+      <w:r>
+        <w:rPr>
+          <w:rFonts w:ascii="Arial" w:eastAsiaTheme="minorEastAsia" w:hAnsi="Arial" w:cs="Arial"/>
+        </w:rPr>
+        <w:t xml:space="preserve"> The function takes the average script order</w:t>
+      </w:r>
+      <w:r>
+        <w:rPr>
+          <w:rFonts w:ascii="Arial" w:eastAsiaTheme="minorEastAsia" w:hAnsi="Arial" w:cs="Arial"/>
+        </w:rPr>
+        <w:t>,</w:t>
+      </w:r>
+      <w:r>
+        <w:rPr>
+          <w:rFonts w:ascii="Arial" w:eastAsiaTheme="minorEastAsia" w:hAnsi="Arial" w:cs="Arial"/>
+        </w:rPr>
+        <w:t xml:space="preserve"> which is the sum of all integer </w:t>
+      </w:r>
+      <w:r>
+        <w:rPr>
+          <w:rFonts w:ascii="Arial" w:eastAsiaTheme="minorEastAsia" w:hAnsi="Arial" w:cs="Arial"/>
+        </w:rPr>
+        <w:t xml:space="preserve">scene numbers divided by the total scene </w:t>
+      </w:r>
+      <w:r>
+        <w:rPr>
+          <w:rFonts w:ascii="Arial" w:eastAsiaTheme="minorEastAsia" w:hAnsi="Arial" w:cs="Arial"/>
+        </w:rPr>
+        <w:t xml:space="preserve">size. The candidate scene’s integer scene number is subtracted from the average. </w:t>
+      </w:r>
+      <w:r>
+        <w:rPr>
+          <w:rFonts w:ascii="Arial" w:eastAsiaTheme="minorEastAsia" w:hAnsi="Arial" w:cs="Arial"/>
+          <w:i/>
+          <w:iCs/>
+        </w:rPr>
+        <w:t>Big Break!</w:t>
+      </w:r>
+      <w:r>
+        <w:rPr>
+          <w:rFonts w:ascii="Arial" w:eastAsiaTheme="minorEastAsia" w:hAnsi="Arial" w:cs="Arial"/>
+        </w:rPr>
+        <w:t xml:space="preserve"> gets the absolute value of that and negates it, making larger distances create bigger penalties.</w:t>
+      </w:r>
     </w:p>
     <w:p>
       <w:pPr>
@@ -8738,6 +10458,7 @@
           <w:bCs/>
           <w:color w:val="auto"/>
         </w:rPr>
+        <w:lastRenderedPageBreak/>
         <w:t>Trie (Prefix Tree)</w:t>
       </w:r>
     </w:p>
@@ -8988,14 +10709,7 @@
         <w:rPr>
           <w:rFonts w:ascii="Arial" w:hAnsi="Arial" w:cs="Arial"/>
         </w:rPr>
-        <w:t xml:space="preserve"> If the character has not already occurred in the </w:t>
-      </w:r>
-      <w:r>
-        <w:rPr>
-          <w:rFonts w:ascii="Arial" w:hAnsi="Arial" w:cs="Arial"/>
-        </w:rPr>
-        <w:lastRenderedPageBreak/>
-        <w:t>Trie, a new node is attached to and returned.</w:t>
+        <w:t xml:space="preserve"> If the character has not already occurred in the Trie, a new node is attached to and returned.</w:t>
       </w:r>
       <w:r>
         <w:rPr>
@@ -9115,6 +10829,7 @@
           <w:rFonts w:ascii="Arial" w:hAnsi="Arial" w:cs="Arial"/>
           <w:noProof/>
         </w:rPr>
+        <w:lastRenderedPageBreak/>
         <w:drawing>
           <wp:anchor distT="0" distB="0" distL="114300" distR="114300" simplePos="0" relativeHeight="251726848" behindDoc="0" locked="0" layoutInCell="1" allowOverlap="1" wp14:anchorId="6A036678" wp14:editId="0EB3C8E1">
             <wp:simplePos x="0" y="0"/>
@@ -9404,7 +11119,6 @@
         <w:rPr>
           <w:rFonts w:ascii="Arial" w:hAnsi="Arial" w:cs="Arial"/>
         </w:rPr>
-        <w:lastRenderedPageBreak/>
         <w:t xml:space="preserve">In </w:t>
       </w:r>
       <w:r>
@@ -9468,6 +11182,7 @@
           <w:bCs/>
           <w:color w:val="auto"/>
         </w:rPr>
+        <w:lastRenderedPageBreak/>
         <w:t>Union-Find (Disjoint Set Union)</w:t>
       </w:r>
     </w:p>
@@ -9574,13 +11289,13 @@
           <w:noProof/>
         </w:rPr>
         <w:drawing>
-          <wp:anchor distT="0" distB="0" distL="114300" distR="114300" simplePos="0" relativeHeight="251716608" behindDoc="0" locked="0" layoutInCell="1" allowOverlap="1" wp14:anchorId="174C7C5C" wp14:editId="7A196B92">
+          <wp:anchor distT="0" distB="0" distL="114300" distR="114300" simplePos="0" relativeHeight="251716608" behindDoc="0" locked="0" layoutInCell="1" allowOverlap="1" wp14:anchorId="174C7C5C" wp14:editId="3B2AEE1F">
             <wp:simplePos x="0" y="0"/>
             <wp:positionH relativeFrom="margin">
-              <wp:posOffset>537845</wp:posOffset>
+              <wp:posOffset>522605</wp:posOffset>
             </wp:positionH>
             <wp:positionV relativeFrom="margin">
-              <wp:posOffset>2329815</wp:posOffset>
+              <wp:posOffset>2581275</wp:posOffset>
             </wp:positionV>
             <wp:extent cx="4829810" cy="1838325"/>
             <wp:effectExtent l="0" t="0" r="8890" b="9525"/>
@@ -9774,7 +11489,6 @@
         <w:rPr>
           <w:noProof/>
         </w:rPr>
-        <w:lastRenderedPageBreak/>
         <mc:AlternateContent>
           <mc:Choice Requires="wps">
             <w:drawing>
@@ -10027,7 +11741,14 @@
         <w:rPr>
           <w:rFonts w:ascii="Arial" w:hAnsi="Arial" w:cs="Arial"/>
         </w:rPr>
-        <w:t xml:space="preserve"> distance and the Jaro-Winkler algorithm. A threshold value is created </w:t>
+        <w:t xml:space="preserve"> distance and the Jaro-Winkler </w:t>
+      </w:r>
+      <w:r>
+        <w:rPr>
+          <w:rFonts w:ascii="Arial" w:hAnsi="Arial" w:cs="Arial"/>
+        </w:rPr>
+        <w:lastRenderedPageBreak/>
+        <w:t xml:space="preserve">algorithm. A threshold value is created </w:t>
       </w:r>
       <w:proofErr w:type="gramStart"/>
       <w:r>
@@ -10470,6 +12191,7 @@
                 <w:rFonts w:ascii="Arial" w:hAnsi="Arial" w:cs="Arial"/>
                 <w:lang w:val="bg-BG"/>
               </w:rPr>
+              <w:lastRenderedPageBreak/>
               <w:t>№</w:t>
             </w:r>
           </w:p>
@@ -11077,7 +12799,6 @@
               <w:rPr>
                 <w:rFonts w:ascii="Arial" w:hAnsi="Arial" w:cs="Arial"/>
               </w:rPr>
-              <w:lastRenderedPageBreak/>
               <w:t>6</w:t>
             </w:r>
           </w:p>
@@ -11501,6 +13222,7 @@
         <w:rPr>
           <w:rFonts w:ascii="Arial" w:hAnsi="Arial" w:cs="Arial"/>
         </w:rPr>
+        <w:lastRenderedPageBreak/>
         <w:t xml:space="preserve">Java runs faster than most of the interpreted languages for </w:t>
       </w:r>
       <w:proofErr w:type="gramStart"/>
@@ -11820,7 +13542,6 @@
         <w:rPr>
           <w:rFonts w:ascii="Arial" w:hAnsi="Arial" w:cs="Arial"/>
         </w:rPr>
-        <w:lastRenderedPageBreak/>
         <w:t xml:space="preserve">What is more, it integrates very well with a Java + Maven project. As previously discussed, </w:t>
       </w:r>
       <w:proofErr w:type="spellStart"/>
@@ -12181,6 +13902,7 @@
         <w:rPr>
           <w:rFonts w:ascii="Arial" w:hAnsi="Arial" w:cs="Arial"/>
         </w:rPr>
+        <w:lastRenderedPageBreak/>
         <w:t xml:space="preserve">“Class </w:t>
       </w:r>
       <w:proofErr w:type="spellStart"/>
@@ -12220,6 +13942,12 @@
           <w:rFonts w:ascii="Arial" w:hAnsi="Arial" w:cs="Arial"/>
         </w:rPr>
         <w:t>, commons.apache.org/proper/commons-text/apidocs/org/apache/commons/text/similarity/LevenshteinDistance.htm</w:t>
+      </w:r>
+      <w:r>
+        <w:rPr>
+          <w:rFonts w:ascii="Arial" w:hAnsi="Arial" w:cs="Arial"/>
+        </w:rPr>
+        <w:t>l</w:t>
       </w:r>
     </w:p>
     <w:p>
@@ -12235,7 +13963,7 @@
         <w:rPr>
           <w:rFonts w:ascii="Arial" w:hAnsi="Arial" w:cs="Arial"/>
         </w:rPr>
-        <w:t xml:space="preserve">Jurafsky, Dan, and James H. Martin. </w:t>
+        <w:t xml:space="preserve">Gómez, Mario, and Enric Plaza. “Case-based Project Scheduling.” </w:t>
       </w:r>
       <w:r>
         <w:rPr>
@@ -12243,13 +13971,13 @@
           <w:i/>
           <w:iCs/>
         </w:rPr>
-        <w:t>Speech and Language Processing an Introduction to Natural Language Processing, Computational Linguistics, and Speech Recognition with Language Models Daniel Jurafsky, James H. Martin</w:t>
-      </w:r>
-      <w:r>
-        <w:rPr>
-          <w:rFonts w:ascii="Arial" w:hAnsi="Arial" w:cs="Arial"/>
-        </w:rPr>
-        <w:t>. 3rd ed., Stanford University, 2025.</w:t>
+        <w:t>Lecture Notes in Computer Science</w:t>
+      </w:r>
+      <w:r>
+        <w:rPr>
+          <w:rFonts w:ascii="Arial" w:hAnsi="Arial" w:cs="Arial"/>
+        </w:rPr>
+        <w:t xml:space="preserve">, Sept. 2012, pp. 122–126, https://doi.org/10.1007/978-3-642-32986-9_11. </w:t>
       </w:r>
     </w:p>
     <w:p>
@@ -12261,12 +13989,41 @@
           <w:rFonts w:ascii="Arial" w:hAnsi="Arial" w:cs="Arial"/>
         </w:rPr>
       </w:pPr>
+      <w:r>
+        <w:rPr>
+          <w:rFonts w:ascii="Arial" w:hAnsi="Arial" w:cs="Arial"/>
+        </w:rPr>
+        <w:t xml:space="preserve">Jurafsky, Dan, and James H. Martin. </w:t>
+      </w:r>
+      <w:r>
+        <w:rPr>
+          <w:rFonts w:ascii="Arial" w:hAnsi="Arial" w:cs="Arial"/>
+          <w:i/>
+          <w:iCs/>
+        </w:rPr>
+        <w:t>Speech and Language Processing an Introduction to Natural Language Processing, Computational Linguistics, and Speech Recognition with Language Models Daniel Jurafsky, James H. Martin</w:t>
+      </w:r>
+      <w:r>
+        <w:rPr>
+          <w:rFonts w:ascii="Arial" w:hAnsi="Arial" w:cs="Arial"/>
+        </w:rPr>
+        <w:t>. 3rd ed., Stanford University, 2025.</w:t>
+      </w:r>
+    </w:p>
+    <w:p>
+      <w:pPr>
+        <w:pStyle w:val="NormalWeb"/>
+        <w:spacing w:line="360" w:lineRule="auto"/>
+        <w:ind w:left="720" w:hanging="720"/>
+        <w:rPr>
+          <w:rFonts w:ascii="Arial" w:hAnsi="Arial" w:cs="Arial"/>
+        </w:rPr>
+      </w:pPr>
       <w:proofErr w:type="spellStart"/>
       <w:r>
         <w:rPr>
           <w:rFonts w:ascii="Arial" w:hAnsi="Arial" w:cs="Arial"/>
         </w:rPr>
-        <w:lastRenderedPageBreak/>
         <w:t>kartik</w:t>
       </w:r>
       <w:proofErr w:type="spellEnd"/>
@@ -12411,39 +14168,7 @@
         <w:rPr>
           <w:rFonts w:ascii="Arial" w:hAnsi="Arial" w:cs="Arial"/>
         </w:rPr>
-        <w:t xml:space="preserve">, 18 Jan. 2026, www.geeksforgeeks.org/dsa/trie-insert-and-search/. </w:t>
-      </w:r>
-    </w:p>
-    <w:p>
-      <w:pPr>
-        <w:pStyle w:val="NormalWeb"/>
-        <w:spacing w:line="360" w:lineRule="auto"/>
-        <w:ind w:left="1287" w:hanging="720"/>
-        <w:rPr>
-          <w:rFonts w:ascii="Arial" w:hAnsi="Arial" w:cs="Arial"/>
-        </w:rPr>
-      </w:pPr>
-    </w:p>
-    <w:p>
-      <w:pPr>
-        <w:pStyle w:val="NormalWeb"/>
-        <w:spacing w:line="360" w:lineRule="auto"/>
-        <w:ind w:left="1287" w:hanging="720"/>
-        <w:rPr>
-          <w:rFonts w:ascii="Arial" w:hAnsi="Arial" w:cs="Arial"/>
-        </w:rPr>
-      </w:pPr>
-      <w:r>
-        <w:rPr>
-          <w:rFonts w:ascii="Arial" w:hAnsi="Arial" w:cs="Arial"/>
-        </w:rPr>
-        <w:t>How well does it work, what is working</w:t>
-      </w:r>
-      <w:r>
-        <w:rPr>
-          <w:rFonts w:ascii="Arial" w:hAnsi="Arial" w:cs="Arial"/>
-        </w:rPr>
-        <w:t xml:space="preserve">, time complexity, </w:t>
+        <w:t>, 18 Jan. 2026, www.geeksforgeeks.org/dsa/trie-insert-and-search/.</w:t>
       </w:r>
     </w:p>
     <w:sectPr>
@@ -15020,7 +16745,6 @@
     <w:next w:val="Normal"/>
     <w:link w:val="Heading5Char"/>
     <w:uiPriority w:val="9"/>
-    <w:semiHidden/>
     <w:unhideWhenUsed/>
     <w:qFormat/>
     <w:rsid w:val="00923A00"/>
@@ -15126,7 +16850,6 @@
   <w:style w:type="character" w:default="1" w:styleId="DefaultParagraphFont">
     <w:name w:val="Default Paragraph Font"/>
     <w:uiPriority w:val="1"/>
-    <w:semiHidden/>
     <w:unhideWhenUsed/>
   </w:style>
   <w:style w:type="table" w:default="1" w:styleId="TableNormal">
@@ -15207,7 +16930,6 @@
     <w:basedOn w:val="DefaultParagraphFont"/>
     <w:link w:val="Heading5"/>
     <w:uiPriority w:val="9"/>
-    <w:semiHidden/>
     <w:rsid w:val="00923A00"/>
     <w:rPr>
       <w:rFonts w:eastAsiaTheme="majorEastAsia" w:cstheme="majorBidi"/>

</xml_diff>

<commit_message>
Fixed day page length, move, and location recomputation + Fixed adding characters with moving scenes and removal of suggested characters when chosen
</commit_message>
<xml_diff>
--- a/docs/Vili-An_Doneva_Diploma_Thesis.docx
+++ b/docs/Vili-An_Doneva_Diploma_Thesis.docx
@@ -972,7 +972,6 @@
         </w:rPr>
         <w:t xml:space="preserve">cited in the text and in the Reference </w:t>
       </w:r>
-      <w:proofErr w:type="gramStart"/>
       <w:r>
         <w:rPr>
           <w:rFonts w:ascii="Arial" w:hAnsi="Arial" w:cs="Arial"/>
@@ -985,7 +984,6 @@
         </w:rPr>
         <w:t>”</w:t>
       </w:r>
-      <w:proofErr w:type="gramEnd"/>
     </w:p>
     <w:p>
       <w:pPr>
@@ -1496,21 +1494,7 @@
         <w:rPr>
           <w:rFonts w:ascii="Arial" w:hAnsi="Arial" w:cs="Arial"/>
         </w:rPr>
-        <w:t xml:space="preserve">Most cases are covered by </w:t>
-      </w:r>
-      <w:proofErr w:type="gramStart"/>
-      <w:r>
-        <w:rPr>
-          <w:rFonts w:ascii="Arial" w:hAnsi="Arial" w:cs="Arial"/>
-        </w:rPr>
-        <w:t>the heuristic</w:t>
-      </w:r>
-      <w:proofErr w:type="gramEnd"/>
-      <w:r>
-        <w:rPr>
-          <w:rFonts w:ascii="Arial" w:hAnsi="Arial" w:cs="Arial"/>
-        </w:rPr>
-        <w:t xml:space="preserve"> logic</w:t>
+        <w:t>Most cases are covered by the heuristic logic</w:t>
       </w:r>
       <w:r>
         <w:rPr>
@@ -1893,19 +1877,11 @@
         </w:rPr>
         <w:t xml:space="preserve">Big Break! </w:t>
       </w:r>
-      <w:proofErr w:type="gramStart"/>
-      <w:r>
-        <w:rPr>
-          <w:rFonts w:ascii="Arial" w:hAnsi="Arial" w:cs="Arial"/>
-        </w:rPr>
-        <w:t>as</w:t>
-      </w:r>
-      <w:proofErr w:type="gramEnd"/>
-      <w:r>
-        <w:rPr>
-          <w:rFonts w:ascii="Arial" w:hAnsi="Arial" w:cs="Arial"/>
-        </w:rPr>
-        <w:t xml:space="preserve"> my senior project is majorly connected to my interest in fil</w:t>
+      <w:r>
+        <w:rPr>
+          <w:rFonts w:ascii="Arial" w:hAnsi="Arial" w:cs="Arial"/>
+        </w:rPr>
+        <w:t>as my senior project is majorly connected to my interest in fil</w:t>
       </w:r>
       <w:r>
         <w:rPr>
@@ -2795,21 +2771,7 @@
         <w:rPr>
           <w:rFonts w:ascii="Arial" w:hAnsi="Arial" w:cs="Arial"/>
         </w:rPr>
-        <w:t xml:space="preserve">filling up the Scene class constructor with scene order number (the actual number of the scene in the order they appear), scene script numbers (the scene number written in the script), headings, locations, and times (if available). </w:t>
-      </w:r>
-      <w:proofErr w:type="gramStart"/>
-      <w:r>
-        <w:rPr>
-          <w:rFonts w:ascii="Arial" w:hAnsi="Arial" w:cs="Arial"/>
-        </w:rPr>
-        <w:t>In order to</w:t>
-      </w:r>
-      <w:proofErr w:type="gramEnd"/>
-      <w:r>
-        <w:rPr>
-          <w:rFonts w:ascii="Arial" w:hAnsi="Arial" w:cs="Arial"/>
-        </w:rPr>
-        <w:t xml:space="preserve"> find the values, it uses </w:t>
+        <w:t xml:space="preserve">filling up the Scene class constructor with scene order number (the actual number of the scene in the order they appear), scene script numbers (the scene number written in the script), headings, locations, and times (if available). In order to find the values, it uses </w:t>
       </w:r>
       <w:r>
         <w:rPr>
@@ -3691,21 +3653,7 @@
         <w:rPr>
           <w:rFonts w:ascii="Arial" w:hAnsi="Arial" w:cs="Arial"/>
         </w:rPr>
-        <w:t xml:space="preserve"> verb (grab, pick up, take, etc.), then it is most probably a prop. However, if the previous </w:t>
-      </w:r>
-      <w:proofErr w:type="gramStart"/>
-      <w:r>
-        <w:rPr>
-          <w:rFonts w:ascii="Arial" w:hAnsi="Arial" w:cs="Arial"/>
-        </w:rPr>
-        <w:t>word</w:t>
-      </w:r>
-      <w:proofErr w:type="gramEnd"/>
-      <w:r>
-        <w:rPr>
-          <w:rFonts w:ascii="Arial" w:hAnsi="Arial" w:cs="Arial"/>
-        </w:rPr>
-        <w:t xml:space="preserve"> is a preposition (on, in, behind, etc.), then the noun is most probably part of the set dressing category.</w:t>
+        <w:t xml:space="preserve"> verb (grab, pick up, take, etc.), then it is most probably a prop. However, if the previous word is a preposition (on, in, behind, etc.), then the noun is most probably part of the set dressing category.</w:t>
       </w:r>
       <w:r>
         <w:rPr>
@@ -3731,21 +3679,7 @@
         <w:rPr>
           <w:rFonts w:ascii="Arial" w:hAnsi="Arial" w:cs="Arial"/>
         </w:rPr>
-        <w:t xml:space="preserve"> NER model here will improve </w:t>
-      </w:r>
-      <w:proofErr w:type="gramStart"/>
-      <w:r>
-        <w:rPr>
-          <w:rFonts w:ascii="Arial" w:hAnsi="Arial" w:cs="Arial"/>
-        </w:rPr>
-        <w:t>the performance</w:t>
-      </w:r>
-      <w:proofErr w:type="gramEnd"/>
-      <w:r>
-        <w:rPr>
-          <w:rFonts w:ascii="Arial" w:hAnsi="Arial" w:cs="Arial"/>
-        </w:rPr>
-        <w:t xml:space="preserve"> further.</w:t>
+        <w:t xml:space="preserve"> NER model here will improve the performance further.</w:t>
       </w:r>
     </w:p>
     <w:p>
@@ -4742,14 +4676,12 @@
         </w:rPr>
         <w:t xml:space="preserve"> measures the difference between </w:t>
       </w:r>
-      <w:proofErr w:type="gramStart"/>
       <w:r>
         <w:rPr>
           <w:rFonts w:ascii="Arial" w:hAnsi="Arial" w:cs="Arial"/>
         </w:rPr>
         <w:t>two character</w:t>
       </w:r>
-      <w:proofErr w:type="gramEnd"/>
       <w:r>
         <w:rPr>
           <w:rFonts w:ascii="Arial" w:hAnsi="Arial" w:cs="Arial"/>
@@ -6266,14 +6198,7 @@
         <w:rPr>
           <w:rFonts w:ascii="Arial" w:eastAsiaTheme="minorEastAsia" w:hAnsi="Arial" w:cs="Arial"/>
         </w:rPr>
-        <w:t xml:space="preserve">as a preparation to insert it into </w:t>
-      </w:r>
-      <w:proofErr w:type="gramStart"/>
-      <w:r>
-        <w:rPr>
-          <w:rFonts w:ascii="Arial" w:eastAsiaTheme="minorEastAsia" w:hAnsi="Arial" w:cs="Arial"/>
-        </w:rPr>
-        <w:t xml:space="preserve">the </w:t>
+        <w:t xml:space="preserve">as a preparation to insert it into the </w:t>
       </w:r>
       <w:r>
         <w:rPr>
@@ -6281,16 +6206,7 @@
           <w:i/>
           <w:iCs/>
         </w:rPr>
-        <w:t>a</w:t>
-      </w:r>
-      <w:proofErr w:type="gramEnd"/>
-      <w:r>
-        <w:rPr>
-          <w:rFonts w:ascii="Arial" w:eastAsiaTheme="minorEastAsia" w:hAnsi="Arial" w:cs="Arial"/>
-          <w:i/>
-          <w:iCs/>
-        </w:rPr>
-        <w:t xml:space="preserve"> </w:t>
+        <w:t xml:space="preserve">a </w:t>
       </w:r>
       <w:r>
         <w:rPr>
@@ -7363,21 +7279,7 @@
         <w:rPr>
           <w:rFonts w:ascii="Arial" w:hAnsi="Arial" w:cs="Arial"/>
         </w:rPr>
-        <w:t xml:space="preserve"> </w:t>
-      </w:r>
-      <w:proofErr w:type="gramStart"/>
-      <w:r>
-        <w:rPr>
-          <w:rFonts w:ascii="Arial" w:hAnsi="Arial" w:cs="Arial"/>
-        </w:rPr>
-        <w:t>or</w:t>
-      </w:r>
-      <w:proofErr w:type="gramEnd"/>
-      <w:r>
-        <w:rPr>
-          <w:rFonts w:ascii="Arial" w:hAnsi="Arial" w:cs="Arial"/>
-        </w:rPr>
-        <w:t xml:space="preserve"> not</w:t>
+        <w:t xml:space="preserve"> or not</w:t>
       </w:r>
       <w:r>
         <w:rPr>
@@ -7413,21 +7315,7 @@
         <w:rPr>
           <w:rFonts w:ascii="Arial" w:hAnsi="Arial" w:cs="Arial"/>
         </w:rPr>
-        <w:t xml:space="preserve"> It is based on the Jaro </w:t>
-      </w:r>
-      <w:proofErr w:type="gramStart"/>
-      <w:r>
-        <w:rPr>
-          <w:rFonts w:ascii="Arial" w:hAnsi="Arial" w:cs="Arial"/>
-        </w:rPr>
-        <w:t>similarity</w:t>
-      </w:r>
-      <w:proofErr w:type="gramEnd"/>
-      <w:r>
-        <w:rPr>
-          <w:rFonts w:ascii="Arial" w:hAnsi="Arial" w:cs="Arial"/>
-        </w:rPr>
-        <w:t xml:space="preserve"> algorithm, including the Winkler prefix adjustment.</w:t>
+        <w:t xml:space="preserve"> It is based on the Jaro similarity algorithm, including the Winkler prefix adjustment.</w:t>
       </w:r>
       <w:r>
         <w:rPr>
@@ -7533,27 +7421,13 @@
         <w:rPr>
           <w:rFonts w:ascii="Arial" w:hAnsi="Arial" w:cs="Arial"/>
         </w:rPr>
-        <w:t xml:space="preserve">The algorithm starts with lowercasing </w:t>
-      </w:r>
-      <w:proofErr w:type="gramStart"/>
-      <w:r>
-        <w:rPr>
-          <w:rFonts w:ascii="Arial" w:hAnsi="Arial" w:cs="Arial"/>
-        </w:rPr>
-        <w:t xml:space="preserve">both of the </w:t>
-      </w:r>
-      <w:r>
-        <w:rPr>
-          <w:rFonts w:ascii="Arial" w:hAnsi="Arial" w:cs="Arial"/>
-        </w:rPr>
-        <w:t>strings</w:t>
-      </w:r>
-      <w:proofErr w:type="gramEnd"/>
-      <w:r>
-        <w:rPr>
-          <w:rFonts w:ascii="Arial" w:hAnsi="Arial" w:cs="Arial"/>
-        </w:rPr>
-        <w:t>,</w:t>
+        <w:t xml:space="preserve">The algorithm starts with lowercasing both of the </w:t>
+      </w:r>
+      <w:r>
+        <w:rPr>
+          <w:rFonts w:ascii="Arial" w:hAnsi="Arial" w:cs="Arial"/>
+        </w:rPr>
+        <w:t>strings,</w:t>
       </w:r>
       <w:r>
         <w:rPr>
@@ -7565,21 +7439,7 @@
         <w:rPr>
           <w:rFonts w:ascii="Arial" w:hAnsi="Arial" w:cs="Arial"/>
         </w:rPr>
-        <w:t xml:space="preserve"> It checks if the strings match completely and returns 1. However, in most cases, the algorithm continues. </w:t>
-      </w:r>
-      <w:proofErr w:type="gramStart"/>
-      <w:r>
-        <w:rPr>
-          <w:rFonts w:ascii="Arial" w:hAnsi="Arial" w:cs="Arial"/>
-        </w:rPr>
-        <w:t>In order for</w:t>
-      </w:r>
-      <w:proofErr w:type="gramEnd"/>
-      <w:r>
-        <w:rPr>
-          <w:rFonts w:ascii="Arial" w:hAnsi="Arial" w:cs="Arial"/>
-        </w:rPr>
-        <w:t xml:space="preserve"> the letters to match, they need to be in a similar position in both strings. This is why the algorithm calculates the maximum distance two characters</w:t>
+        <w:t xml:space="preserve"> It checks if the strings match completely and returns 1. However, in most cases, the algorithm continues. In order for the letters to match, they need to be in a similar position in both strings. This is why the algorithm calculates the maximum distance two characters</w:t>
       </w:r>
       <w:r>
         <w:rPr>
@@ -8130,19 +7990,11 @@
           <w:rFonts w:ascii="Arial" w:hAnsi="Arial" w:cs="Arial"/>
         </w:rPr>
       </w:pPr>
-      <w:proofErr w:type="gramStart"/>
-      <w:r>
-        <w:rPr>
-          <w:rFonts w:ascii="Arial" w:hAnsi="Arial" w:cs="Arial"/>
-        </w:rPr>
-        <w:t>In order to</w:t>
-      </w:r>
-      <w:proofErr w:type="gramEnd"/>
-      <w:r>
-        <w:rPr>
-          <w:rFonts w:ascii="Arial" w:hAnsi="Arial" w:cs="Arial"/>
-        </w:rPr>
-        <w:t xml:space="preserve"> find the Jaro similarity, the following formula is used:</w:t>
+      <w:r>
+        <w:rPr>
+          <w:rFonts w:ascii="Arial" w:hAnsi="Arial" w:cs="Arial"/>
+        </w:rPr>
+        <w:t>In order to find the Jaro similarity, the following formula is used:</w:t>
       </w:r>
     </w:p>
     <w:p>
@@ -8332,21 +8184,7 @@
         <w:rPr>
           <w:rFonts w:ascii="Arial" w:hAnsi="Arial" w:cs="Arial"/>
         </w:rPr>
-        <w:t xml:space="preserve">m is the number of </w:t>
-      </w:r>
-      <w:proofErr w:type="gramStart"/>
-      <w:r>
-        <w:rPr>
-          <w:rFonts w:ascii="Arial" w:hAnsi="Arial" w:cs="Arial"/>
-        </w:rPr>
-        <w:t>all matching</w:t>
-      </w:r>
-      <w:proofErr w:type="gramEnd"/>
-      <w:r>
-        <w:rPr>
-          <w:rFonts w:ascii="Arial" w:hAnsi="Arial" w:cs="Arial"/>
-        </w:rPr>
-        <w:t xml:space="preserve"> characters.</w:t>
+        <w:t>m is the number of all matching characters.</w:t>
       </w:r>
     </w:p>
     <w:p>
@@ -8362,19 +8200,11 @@
           <w:rFonts w:ascii="Arial" w:hAnsi="Arial" w:cs="Arial"/>
         </w:rPr>
       </w:pPr>
-      <w:proofErr w:type="gramStart"/>
-      <w:r>
-        <w:rPr>
-          <w:rFonts w:ascii="Arial" w:hAnsi="Arial" w:cs="Arial"/>
-        </w:rPr>
-        <w:t>t is</w:t>
-      </w:r>
-      <w:proofErr w:type="gramEnd"/>
-      <w:r>
-        <w:rPr>
-          <w:rFonts w:ascii="Arial" w:hAnsi="Arial" w:cs="Arial"/>
-        </w:rPr>
-        <w:t xml:space="preserve"> half of the number of transpositions</w:t>
+      <w:r>
+        <w:rPr>
+          <w:rFonts w:ascii="Arial" w:hAnsi="Arial" w:cs="Arial"/>
+        </w:rPr>
+        <w:t>t is half of the number of transpositions</w:t>
       </w:r>
     </w:p>
     <w:p>
@@ -8548,21 +8378,7 @@
         <w:rPr>
           <w:rFonts w:ascii="Arial" w:hAnsi="Arial" w:cs="Arial"/>
         </w:rPr>
-        <w:t xml:space="preserve">SW is the </w:t>
-      </w:r>
-      <w:proofErr w:type="gramStart"/>
-      <w:r>
-        <w:rPr>
-          <w:rFonts w:ascii="Arial" w:hAnsi="Arial" w:cs="Arial"/>
-        </w:rPr>
-        <w:t>Jaro-Winkler similarity</w:t>
-      </w:r>
-      <w:proofErr w:type="gramEnd"/>
-      <w:r>
-        <w:rPr>
-          <w:rFonts w:ascii="Arial" w:hAnsi="Arial" w:cs="Arial"/>
-        </w:rPr>
-        <w:t>.</w:t>
+        <w:t>SW is the Jaro-Winkler similarity.</w:t>
       </w:r>
     </w:p>
     <w:p>
@@ -8829,29 +8645,13 @@
           <w:i/>
           <w:iCs/>
         </w:rPr>
-        <w:t xml:space="preserve">Big </w:t>
-      </w:r>
-      <w:proofErr w:type="gramStart"/>
-      <w:r>
-        <w:rPr>
-          <w:rFonts w:ascii="Arial" w:hAnsi="Arial" w:cs="Arial"/>
-          <w:i/>
-          <w:iCs/>
-        </w:rPr>
-        <w:t>Break!</w:t>
-      </w:r>
-      <w:r>
-        <w:rPr>
-          <w:rFonts w:ascii="Arial" w:hAnsi="Arial" w:cs="Arial"/>
-        </w:rPr>
-        <w:t>,</w:t>
-      </w:r>
-      <w:proofErr w:type="gramEnd"/>
-      <w:r>
-        <w:rPr>
-          <w:rFonts w:ascii="Arial" w:hAnsi="Arial" w:cs="Arial"/>
-        </w:rPr>
-        <w:t xml:space="preserve"> the</w:t>
+        <w:t>Big Break!</w:t>
+      </w:r>
+      <w:r>
+        <w:rPr>
+          <w:rFonts w:ascii="Arial" w:hAnsi="Arial" w:cs="Arial"/>
+        </w:rPr>
+        <w:t>, the</w:t>
       </w:r>
       <w:r>
         <w:rPr>
@@ -8966,7 +8766,43 @@
         <w:rPr>
           <w:rFonts w:ascii="Arial" w:hAnsi="Arial" w:cs="Arial"/>
         </w:rPr>
-        <w:t xml:space="preserve"> Each page is relatively divided into 1/8 sections, making the whole page 8/8.</w:t>
+        <w:t xml:space="preserve"> </w:t>
+      </w:r>
+      <w:r>
+        <w:rPr>
+          <w:rFonts w:ascii="Arial" w:hAnsi="Arial" w:cs="Arial"/>
+        </w:rPr>
+        <w:t>P</w:t>
+      </w:r>
+      <w:r>
+        <w:rPr>
+          <w:rFonts w:ascii="Arial" w:hAnsi="Arial" w:cs="Arial"/>
+        </w:rPr>
+        <w:t>age</w:t>
+      </w:r>
+      <w:r>
+        <w:rPr>
+          <w:rFonts w:ascii="Arial" w:hAnsi="Arial" w:cs="Arial"/>
+        </w:rPr>
+        <w:t>s are</w:t>
+      </w:r>
+      <w:r>
+        <w:rPr>
+          <w:rFonts w:ascii="Arial" w:hAnsi="Arial" w:cs="Arial"/>
+        </w:rPr>
+        <w:t xml:space="preserve"> relatively divided into 1/8 sections</w:t>
+      </w:r>
+      <w:r>
+        <w:rPr>
+          <w:rFonts w:ascii="Arial" w:hAnsi="Arial" w:cs="Arial"/>
+        </w:rPr>
+        <w:t xml:space="preserve"> and use these eighths (sections) to compute the page count</w:t>
+      </w:r>
+      <w:r>
+        <w:rPr>
+          <w:rFonts w:ascii="Arial" w:hAnsi="Arial" w:cs="Arial"/>
+        </w:rPr>
+        <w:t>, making the whole page 8/8.</w:t>
       </w:r>
       <w:r>
         <w:rPr>
@@ -8980,64 +8816,32 @@
           <w:i/>
           <w:iCs/>
         </w:rPr>
-        <w:t xml:space="preserve">Big </w:t>
-      </w:r>
-      <w:proofErr w:type="gramStart"/>
+        <w:t xml:space="preserve">Big Break!, </w:t>
+      </w:r>
+      <w:r>
+        <w:rPr>
+          <w:rFonts w:ascii="Arial" w:hAnsi="Arial" w:cs="Arial"/>
+        </w:rPr>
+        <w:t>the</w:t>
+      </w:r>
+      <w:r>
+        <w:rPr>
+          <w:rFonts w:ascii="Arial" w:hAnsi="Arial" w:cs="Arial"/>
+        </w:rPr>
+        <w:t xml:space="preserve"> shooting days are 12-hour days, and around 5 pages are shot per day. This equates to around 40 eighths per day.</w:t>
+      </w:r>
+      <w:r>
+        <w:rPr>
+          <w:rFonts w:ascii="Arial" w:hAnsi="Arial" w:cs="Arial"/>
+        </w:rPr>
+        <w:t xml:space="preserve"> With the understanding that overtime is occasionally useful for a production, </w:t>
+      </w:r>
       <w:r>
         <w:rPr>
           <w:rFonts w:ascii="Arial" w:hAnsi="Arial" w:cs="Arial"/>
           <w:i/>
           <w:iCs/>
         </w:rPr>
-        <w:t>Break!,</w:t>
-      </w:r>
-      <w:proofErr w:type="gramEnd"/>
-      <w:r>
-        <w:rPr>
-          <w:rFonts w:ascii="Arial" w:hAnsi="Arial" w:cs="Arial"/>
-          <w:i/>
-          <w:iCs/>
-        </w:rPr>
-        <w:t xml:space="preserve"> </w:t>
-      </w:r>
-      <w:r>
-        <w:rPr>
-          <w:rFonts w:ascii="Arial" w:hAnsi="Arial" w:cs="Arial"/>
-        </w:rPr>
-        <w:t>the</w:t>
-      </w:r>
-      <w:r>
-        <w:rPr>
-          <w:rFonts w:ascii="Arial" w:hAnsi="Arial" w:cs="Arial"/>
-        </w:rPr>
-        <w:t xml:space="preserve"> shooting days are 12-hour days, and around 5 pages are shot per day. This equates to around 40 eighths per day.</w:t>
-      </w:r>
-      <w:r>
-        <w:rPr>
-          <w:rFonts w:ascii="Arial" w:hAnsi="Arial" w:cs="Arial"/>
-        </w:rPr>
-        <w:t xml:space="preserve"> With the understanding that overtime is occasionally useful for </w:t>
-      </w:r>
-      <w:proofErr w:type="gramStart"/>
-      <w:r>
-        <w:rPr>
-          <w:rFonts w:ascii="Arial" w:hAnsi="Arial" w:cs="Arial"/>
-        </w:rPr>
-        <w:t>a production</w:t>
-      </w:r>
-      <w:proofErr w:type="gramEnd"/>
-      <w:r>
-        <w:rPr>
-          <w:rFonts w:ascii="Arial" w:hAnsi="Arial" w:cs="Arial"/>
-        </w:rPr>
-        <w:t xml:space="preserve">, </w:t>
-      </w:r>
-      <w:r>
-        <w:rPr>
-          <w:rFonts w:ascii="Arial" w:hAnsi="Arial" w:cs="Arial"/>
-          <w:i/>
-          <w:iCs/>
-        </w:rPr>
         <w:t xml:space="preserve">Big Break! </w:t>
       </w:r>
       <w:r>
@@ -9092,21 +8896,19 @@
         <w:rPr>
           <w:rFonts w:ascii="Arial" w:hAnsi="Arial" w:cs="Arial"/>
         </w:rPr>
-        <w:t xml:space="preserve"> and each location move during the day takes 8 eighths or 1 page. This is not reflected in the final page count for the day, so it is more easily digestible by the user. However, it is </w:t>
-      </w:r>
-      <w:proofErr w:type="gramStart"/>
-      <w:r>
-        <w:rPr>
-          <w:rFonts w:ascii="Arial" w:hAnsi="Arial" w:cs="Arial"/>
-        </w:rPr>
-        <w:t>taken into account</w:t>
-      </w:r>
-      <w:proofErr w:type="gramEnd"/>
-      <w:r>
-        <w:rPr>
-          <w:rFonts w:ascii="Arial" w:hAnsi="Arial" w:cs="Arial"/>
-        </w:rPr>
-        <w:t xml:space="preserve"> when computing time limits per day.</w:t>
+        <w:t xml:space="preserve"> and each location move during the day </w:t>
+      </w:r>
+      <w:r>
+        <w:rPr>
+          <w:rFonts w:ascii="Arial" w:hAnsi="Arial" w:cs="Arial"/>
+        </w:rPr>
+        <w:t>costs</w:t>
+      </w:r>
+      <w:r>
+        <w:rPr>
+          <w:rFonts w:ascii="Arial" w:hAnsi="Arial" w:cs="Arial"/>
+        </w:rPr>
+        <w:t xml:space="preserve"> 8 eighths or 1 page. This is not reflected in the final page count for the day, so it is more easily digestible by the user. However, it is taken into account when computing time limits per day.</w:t>
       </w:r>
     </w:p>
     <w:p>
@@ -9142,7 +8944,19 @@
         <w:rPr>
           <w:rFonts w:ascii="Arial" w:hAnsi="Arial" w:cs="Arial"/>
         </w:rPr>
-        <w:t xml:space="preserve">, the renewable resource is the daily shooting time with capacity </w:t>
+        <w:t>, the renewable resource</w:t>
+      </w:r>
+      <w:r>
+        <w:rPr>
+          <w:rFonts w:ascii="Arial" w:hAnsi="Arial" w:cs="Arial"/>
+        </w:rPr>
+        <w:t>s are</w:t>
+      </w:r>
+      <w:r>
+        <w:rPr>
+          <w:rFonts w:ascii="Arial" w:hAnsi="Arial" w:cs="Arial"/>
+        </w:rPr>
+        <w:t xml:space="preserve"> the daily shooting time with capacity </w:t>
       </w:r>
       <m:oMath>
         <m:sSub>
@@ -9188,21 +9002,19 @@
         <w:rPr>
           <w:rFonts w:ascii="Arial" w:eastAsiaTheme="minorEastAsia" w:hAnsi="Arial" w:cs="Arial"/>
         </w:rPr>
-        <w:t xml:space="preserve"> and the number of </w:t>
-      </w:r>
-      <w:proofErr w:type="gramStart"/>
+        <w:t>,</w:t>
+      </w:r>
       <w:r>
         <w:rPr>
           <w:rFonts w:ascii="Arial" w:eastAsiaTheme="minorEastAsia" w:hAnsi="Arial" w:cs="Arial"/>
         </w:rPr>
-        <w:t>location</w:t>
-      </w:r>
-      <w:proofErr w:type="gramEnd"/>
+        <w:t xml:space="preserve"> the number of location moves allowed per day, which is currently three</w:t>
+      </w:r>
       <w:r>
         <w:rPr>
           <w:rFonts w:ascii="Arial" w:eastAsiaTheme="minorEastAsia" w:hAnsi="Arial" w:cs="Arial"/>
         </w:rPr>
-        <w:t xml:space="preserve"> moves allowed per day, which is currently three</w:t>
+        <w:t>, and the shooting time phase</w:t>
       </w:r>
       <w:r>
         <w:rPr>
@@ -9214,13 +9026,19 @@
         <w:rPr>
           <w:rFonts w:ascii="Arial" w:eastAsiaTheme="minorEastAsia" w:hAnsi="Arial" w:cs="Arial"/>
         </w:rPr>
-        <w:t>They are both</w:t>
+        <w:t xml:space="preserve">They are </w:t>
       </w:r>
       <w:r>
         <w:rPr>
           <w:rFonts w:ascii="Arial" w:eastAsiaTheme="minorEastAsia" w:hAnsi="Arial" w:cs="Arial"/>
         </w:rPr>
-        <w:t xml:space="preserve"> regenerated </w:t>
+        <w:t xml:space="preserve">all </w:t>
+      </w:r>
+      <w:r>
+        <w:rPr>
+          <w:rFonts w:ascii="Arial" w:eastAsiaTheme="minorEastAsia" w:hAnsi="Arial" w:cs="Arial"/>
+        </w:rPr>
+        <w:t xml:space="preserve">regenerated </w:t>
       </w:r>
       <w:r>
         <w:rPr>
@@ -9270,13 +9088,7 @@
         <w:rPr>
           <w:rFonts w:ascii="Arial" w:eastAsiaTheme="minorEastAsia" w:hAnsi="Arial" w:cs="Arial"/>
         </w:rPr>
-        <w:t>, it follows the script order of the grouped locations, which are sorted from day to night.</w:t>
-      </w:r>
-      <w:r>
-        <w:rPr>
-          <w:rFonts w:ascii="Arial" w:eastAsiaTheme="minorEastAsia" w:hAnsi="Arial" w:cs="Arial"/>
-        </w:rPr>
-        <w:t xml:space="preserve"> The RCPSP includes optimization functions to select the best among all possible schedules. In </w:t>
+        <w:t xml:space="preserve">, </w:t>
       </w:r>
       <w:r>
         <w:rPr>
@@ -9284,29 +9096,57 @@
           <w:i/>
           <w:iCs/>
         </w:rPr>
-        <w:t xml:space="preserve">Big </w:t>
-      </w:r>
-      <w:proofErr w:type="gramStart"/>
+        <w:t xml:space="preserve">Big Break! </w:t>
+      </w:r>
+      <w:r>
+        <w:rPr>
+          <w:rFonts w:ascii="Arial" w:eastAsiaTheme="minorEastAsia" w:hAnsi="Arial" w:cs="Arial"/>
+        </w:rPr>
+        <w:t>follows the script order of the grouped locations, which</w:t>
+      </w:r>
+      <w:r>
+        <w:rPr>
+          <w:rFonts w:ascii="Arial" w:eastAsiaTheme="minorEastAsia" w:hAnsi="Arial" w:cs="Arial"/>
+        </w:rPr>
+        <w:t xml:space="preserve"> the software internally </w:t>
+      </w:r>
+      <w:r>
+        <w:rPr>
+          <w:rFonts w:ascii="Arial" w:eastAsiaTheme="minorEastAsia" w:hAnsi="Arial" w:cs="Arial"/>
+        </w:rPr>
+        <w:t>sort</w:t>
+      </w:r>
+      <w:r>
+        <w:rPr>
+          <w:rFonts w:ascii="Arial" w:eastAsiaTheme="minorEastAsia" w:hAnsi="Arial" w:cs="Arial"/>
+        </w:rPr>
+        <w:t>s</w:t>
+      </w:r>
+      <w:r>
+        <w:rPr>
+          <w:rFonts w:ascii="Arial" w:eastAsiaTheme="minorEastAsia" w:hAnsi="Arial" w:cs="Arial"/>
+        </w:rPr>
+        <w:t xml:space="preserve"> from day to night.</w:t>
+      </w:r>
+      <w:r>
+        <w:rPr>
+          <w:rFonts w:ascii="Arial" w:eastAsiaTheme="minorEastAsia" w:hAnsi="Arial" w:cs="Arial"/>
+        </w:rPr>
+        <w:t xml:space="preserve"> The RCPSP includes optimization functions to select the best among all possible schedules. In </w:t>
+      </w:r>
       <w:r>
         <w:rPr>
           <w:rFonts w:ascii="Arial" w:eastAsiaTheme="minorEastAsia" w:hAnsi="Arial" w:cs="Arial"/>
           <w:i/>
           <w:iCs/>
         </w:rPr>
-        <w:t>Break!</w:t>
+        <w:t>Big Break!</w:t>
       </w:r>
       <w:r>
         <w:rPr>
           <w:rFonts w:ascii="Arial" w:eastAsiaTheme="minorEastAsia" w:hAnsi="Arial" w:cs="Arial"/>
         </w:rPr>
-        <w:t>,</w:t>
-      </w:r>
-      <w:proofErr w:type="gramEnd"/>
-      <w:r>
-        <w:rPr>
-          <w:rFonts w:ascii="Arial" w:eastAsiaTheme="minorEastAsia" w:hAnsi="Arial" w:cs="Arial"/>
-        </w:rPr>
-        <w:t xml:space="preserve"> </w:t>
+        <w:t xml:space="preserve">, </w:t>
       </w:r>
       <w:r>
         <w:rPr>
@@ -9632,14 +9472,19 @@
         <w:rPr>
           <w:rFonts w:ascii="Arial" w:eastAsiaTheme="minorEastAsia" w:hAnsi="Arial" w:cs="Arial"/>
         </w:rPr>
-        <w:t xml:space="preserve"> It groups the scenes by location while preserving the order of appearance of each location by using </w:t>
-      </w:r>
-      <w:proofErr w:type="gramStart"/>
+        <w:t xml:space="preserve"> It groups </w:t>
+      </w:r>
       <w:r>
         <w:rPr>
           <w:rFonts w:ascii="Arial" w:eastAsiaTheme="minorEastAsia" w:hAnsi="Arial" w:cs="Arial"/>
         </w:rPr>
-        <w:t xml:space="preserve">a </w:t>
+        <w:t xml:space="preserve">scenes by location while preserving each location's order of appearance </w:t>
+      </w:r>
+      <w:r>
+        <w:rPr>
+          <w:rFonts w:ascii="Arial" w:eastAsiaTheme="minorEastAsia" w:hAnsi="Arial" w:cs="Arial"/>
+        </w:rPr>
+        <w:t xml:space="preserve">using a </w:t>
       </w:r>
       <w:proofErr w:type="spellStart"/>
       <w:r>
@@ -9649,7 +9494,6 @@
         <w:t>LinkedHashMap</w:t>
       </w:r>
       <w:proofErr w:type="spellEnd"/>
-      <w:proofErr w:type="gramEnd"/>
       <w:r>
         <w:rPr>
           <w:rFonts w:ascii="Arial" w:eastAsiaTheme="minorEastAsia" w:hAnsi="Arial" w:cs="Arial"/>
@@ -9684,19 +9528,7 @@
         <w:rPr>
           <w:rFonts w:ascii="Arial" w:eastAsiaTheme="minorEastAsia" w:hAnsi="Arial" w:cs="Arial"/>
         </w:rPr>
-        <w:t xml:space="preserve">This creates a predefined precedence-feasible list where the next scene in the location-grouped time-sorted </w:t>
-      </w:r>
-      <w:r>
-        <w:rPr>
-          <w:rFonts w:ascii="Arial" w:eastAsiaTheme="minorEastAsia" w:hAnsi="Arial" w:cs="Arial"/>
-        </w:rPr>
-        <w:t>activity list</w:t>
-      </w:r>
-      <w:r>
-        <w:rPr>
-          <w:rFonts w:ascii="Arial" w:eastAsiaTheme="minorEastAsia" w:hAnsi="Arial" w:cs="Arial"/>
-        </w:rPr>
-        <w:t xml:space="preserve"> is taken: </w:t>
+        <w:t xml:space="preserve">This creates a predefined precedence-feasible list where the next scene in the location-grouped time-sorted activity list is taken: </w:t>
       </w:r>
       <m:oMath>
         <m:r>
@@ -9856,7 +9688,19 @@
         <w:rPr>
           <w:rFonts w:ascii="Arial" w:eastAsiaTheme="minorEastAsia" w:hAnsi="Arial" w:cs="Arial"/>
         </w:rPr>
-        <w:t xml:space="preserve">The algorithm still works as SSGS as it selects the best feasible day in the already created ones or finds a new one if the feasibility is not met. The day is considered </w:t>
+        <w:t xml:space="preserve">The algorithm still works as SSGS as it selects the best feasible day in the already created ones or </w:t>
+      </w:r>
+      <w:r>
+        <w:rPr>
+          <w:rFonts w:ascii="Arial" w:eastAsiaTheme="minorEastAsia" w:hAnsi="Arial" w:cs="Arial"/>
+        </w:rPr>
+        <w:t>adds</w:t>
+      </w:r>
+      <w:r>
+        <w:rPr>
+          <w:rFonts w:ascii="Arial" w:eastAsiaTheme="minorEastAsia" w:hAnsi="Arial" w:cs="Arial"/>
+        </w:rPr>
+        <w:t xml:space="preserve"> a new one if the feasibility is not met. The day is considered </w:t>
       </w:r>
       <w:r>
         <w:rPr>
@@ -9981,7 +9825,7 @@
         <w:rPr>
           <w:rFonts w:ascii="Arial" w:eastAsiaTheme="minorEastAsia" w:hAnsi="Arial" w:cs="Arial"/>
         </w:rPr>
-        <w:t>D</w:t>
+        <w:t>The first one is that d</w:t>
       </w:r>
       <w:r>
         <w:rPr>
@@ -10023,10 +9867,18 @@
           <w:rFonts w:ascii="Arial" w:eastAsiaTheme="minorEastAsia" w:hAnsi="Arial" w:cs="Arial"/>
         </w:rPr>
       </w:pPr>
-      <w:r>
+    </w:p>
+    <w:p>
+      <w:pPr>
+        <w:spacing w:line="360" w:lineRule="auto"/>
         <w:rPr>
           <w:rFonts w:ascii="Arial" w:eastAsiaTheme="minorEastAsia" w:hAnsi="Arial" w:cs="Arial"/>
         </w:rPr>
+      </w:pPr>
+      <w:r>
+        <w:rPr>
+          <w:rFonts w:ascii="Arial" w:eastAsiaTheme="minorEastAsia" w:hAnsi="Arial" w:cs="Arial"/>
+        </w:rPr>
         <w:t>The other hard rule</w:t>
       </w:r>
       <w:r>
@@ -10109,7 +9961,7 @@
         <w:rPr>
           <w:rFonts w:ascii="Arial" w:eastAsiaTheme="minorEastAsia" w:hAnsi="Arial" w:cs="Arial"/>
         </w:rPr>
-        <w:t>This constraint is created because night-to-day shoots are very unlikely in the film industry, and day-to-night-to-day shoots would either break the European rest laws, which require a 12-hour break between work shifts.</w:t>
+        <w:t>This constraint is created because night-to-day shoots are very unlikely in the film industry, and day-to-night-to-day shoots would break the European rest laws, which require a 12-hour break between work shifts.</w:t>
       </w:r>
       <w:r>
         <w:rPr>
@@ -10173,7 +10025,69 @@
         <w:rPr>
           <w:rFonts w:ascii="Arial" w:eastAsiaTheme="minorEastAsia" w:hAnsi="Arial" w:cs="Arial"/>
         </w:rPr>
-        <w:t xml:space="preserve"> The only exception when this constraint is disregarded is when a scene is not feasible in any other scene, and a new day scene needs to create a new day after an exclusively night shooting day.</w:t>
+        <w:t xml:space="preserve"> The only exception </w:t>
+      </w:r>
+      <w:r>
+        <w:rPr>
+          <w:rFonts w:ascii="Arial" w:eastAsiaTheme="minorEastAsia" w:hAnsi="Arial" w:cs="Arial"/>
+        </w:rPr>
+        <w:t xml:space="preserve">to this </w:t>
+      </w:r>
+      <w:r>
+        <w:rPr>
+          <w:rFonts w:ascii="Arial" w:eastAsiaTheme="minorEastAsia" w:hAnsi="Arial" w:cs="Arial"/>
+        </w:rPr>
+        <w:t xml:space="preserve">constraint is when a scene is not feasible </w:t>
+      </w:r>
+      <w:r>
+        <w:rPr>
+          <w:rFonts w:ascii="Arial" w:eastAsiaTheme="minorEastAsia" w:hAnsi="Arial" w:cs="Arial"/>
+        </w:rPr>
+        <w:t>on</w:t>
+      </w:r>
+      <w:r>
+        <w:rPr>
+          <w:rFonts w:ascii="Arial" w:eastAsiaTheme="minorEastAsia" w:hAnsi="Arial" w:cs="Arial"/>
+        </w:rPr>
+        <w:t xml:space="preserve"> any other </w:t>
+      </w:r>
+      <w:r>
+        <w:rPr>
+          <w:rFonts w:ascii="Arial" w:eastAsiaTheme="minorEastAsia" w:hAnsi="Arial" w:cs="Arial"/>
+        </w:rPr>
+        <w:t>day</w:t>
+      </w:r>
+      <w:r>
+        <w:rPr>
+          <w:rFonts w:ascii="Arial" w:eastAsiaTheme="minorEastAsia" w:hAnsi="Arial" w:cs="Arial"/>
+        </w:rPr>
+        <w:t xml:space="preserve">, and </w:t>
+      </w:r>
+      <w:r>
+        <w:rPr>
+          <w:rFonts w:ascii="Arial" w:eastAsiaTheme="minorEastAsia" w:hAnsi="Arial" w:cs="Arial"/>
+          <w:i/>
+          <w:iCs/>
+        </w:rPr>
+        <w:t>Big Break!</w:t>
+      </w:r>
+      <w:r>
+        <w:rPr>
+          <w:rFonts w:ascii="Arial" w:eastAsiaTheme="minorEastAsia" w:hAnsi="Arial" w:cs="Arial"/>
+        </w:rPr>
+        <w:t xml:space="preserve"> needs to </w:t>
+      </w:r>
+      <w:r>
+        <w:rPr>
+          <w:rFonts w:ascii="Arial" w:eastAsiaTheme="minorEastAsia" w:hAnsi="Arial" w:cs="Arial"/>
+        </w:rPr>
+        <w:t>put a new DAY scene in a new day</w:t>
+      </w:r>
+      <w:r>
+        <w:rPr>
+          <w:rFonts w:ascii="Arial" w:eastAsiaTheme="minorEastAsia" w:hAnsi="Arial" w:cs="Arial"/>
+        </w:rPr>
+        <w:t xml:space="preserve"> after an exclusively night shooting day.</w:t>
       </w:r>
     </w:p>
     <w:p>
@@ -10195,6 +10109,7 @@
         <w:rPr>
           <w:rFonts w:ascii="Arial" w:eastAsiaTheme="minorEastAsia" w:hAnsi="Arial" w:cs="Arial"/>
         </w:rPr>
+        <w:lastRenderedPageBreak/>
         <w:t xml:space="preserve">This algorithm solves </w:t>
       </w:r>
       <w:r>
@@ -10207,14 +10122,7 @@
         <w:rPr>
           <w:rFonts w:ascii="Arial" w:eastAsiaTheme="minorEastAsia" w:hAnsi="Arial" w:cs="Arial"/>
         </w:rPr>
-        <w:t xml:space="preserve">-resource RCPSP with hierarchical priority constraints. A set of weighted priority rules computes a score for how well a scene can be </w:t>
-      </w:r>
-      <w:r>
-        <w:rPr>
-          <w:rFonts w:ascii="Arial" w:eastAsiaTheme="minorEastAsia" w:hAnsi="Arial" w:cs="Arial"/>
-        </w:rPr>
-        <w:lastRenderedPageBreak/>
-        <w:t>scheduled in all already created days. They follow a hierarchical weight depending on their importance – location grouping, time-of-day grouping, resource capacity, cast clustering, and order similarity.</w:t>
+        <w:t>-resource RCPSP with hierarchical priority constraints. A set of weighted priority rules computes a score for how well a scene can be scheduled in all already created days. They follow a hierarchical weight depending on their importance – location grouping, time-of-day grouping, resource capacity, cast clustering, and order similarity.</w:t>
       </w:r>
     </w:p>
     <w:p>
@@ -10427,6 +10335,7 @@
           <w:sz w:val="24"/>
           <w:szCs w:val="24"/>
         </w:rPr>
+        <w:lastRenderedPageBreak/>
         <w:t>Data Structures</w:t>
       </w:r>
     </w:p>
@@ -10458,7 +10367,6 @@
           <w:bCs/>
           <w:color w:val="auto"/>
         </w:rPr>
-        <w:lastRenderedPageBreak/>
         <w:t>Trie (Prefix Tree)</w:t>
       </w:r>
     </w:p>
@@ -10493,82 +10401,66 @@
           <w:i/>
           <w:iCs/>
         </w:rPr>
-        <w:t xml:space="preserve">Big </w:t>
-      </w:r>
-      <w:proofErr w:type="gramStart"/>
+        <w:t>Big Break!</w:t>
+      </w:r>
+      <w:r>
+        <w:rPr>
+          <w:rFonts w:ascii="Arial" w:hAnsi="Arial" w:cs="Arial"/>
+        </w:rPr>
+        <w:t>, the Trie (Prefix Tree) data structure is used to compare extracted names to common first and last names. It avoids repeated linear searches over large name lists and supports fast prefix-based lookup.</w:t>
+      </w:r>
+    </w:p>
+    <w:p>
+      <w:pPr>
+        <w:spacing w:line="360" w:lineRule="auto"/>
+        <w:jc w:val="both"/>
+        <w:rPr>
+          <w:rFonts w:ascii="Arial" w:hAnsi="Arial" w:cs="Arial"/>
+        </w:rPr>
+      </w:pPr>
+    </w:p>
+    <w:p>
+      <w:pPr>
+        <w:spacing w:line="360" w:lineRule="auto"/>
+        <w:jc w:val="both"/>
+        <w:rPr>
+          <w:rFonts w:ascii="Arial" w:hAnsi="Arial" w:cs="Arial"/>
+        </w:rPr>
+      </w:pPr>
+      <w:r>
+        <w:rPr>
+          <w:rFonts w:ascii="Arial" w:hAnsi="Arial" w:cs="Arial"/>
+        </w:rPr>
+        <w:t>The root node acts as a starting point and does not store any character (as in a letter).</w:t>
+      </w:r>
+      <w:r>
+        <w:rPr>
+          <w:rFonts w:ascii="Arial" w:hAnsi="Arial" w:cs="Arial"/>
+        </w:rPr>
+        <w:t xml:space="preserve"> A map is created to connect a character to its next node in the tree.</w:t>
+      </w:r>
+      <w:r>
+        <w:rPr>
+          <w:rFonts w:ascii="Arial" w:hAnsi="Arial" w:cs="Arial"/>
+        </w:rPr>
+        <w:t xml:space="preserve"> A Boolean </w:t>
+      </w:r>
+      <w:proofErr w:type="spellStart"/>
       <w:r>
         <w:rPr>
           <w:rFonts w:ascii="Arial" w:hAnsi="Arial" w:cs="Arial"/>
           <w:i/>
           <w:iCs/>
         </w:rPr>
-        <w:t>Break!</w:t>
-      </w:r>
-      <w:r>
-        <w:rPr>
-          <w:rFonts w:ascii="Arial" w:hAnsi="Arial" w:cs="Arial"/>
-        </w:rPr>
-        <w:t>,</w:t>
-      </w:r>
-      <w:proofErr w:type="gramEnd"/>
-      <w:r>
-        <w:rPr>
-          <w:rFonts w:ascii="Arial" w:hAnsi="Arial" w:cs="Arial"/>
-        </w:rPr>
-        <w:t xml:space="preserve"> the Trie (Prefix Tree) data structure is used to compare extracted names to common first and last names. It avoids repeated linear searches over large name lists and supports fast prefix-based lookup.</w:t>
-      </w:r>
-    </w:p>
-    <w:p>
-      <w:pPr>
-        <w:spacing w:line="360" w:lineRule="auto"/>
-        <w:jc w:val="both"/>
-        <w:rPr>
-          <w:rFonts w:ascii="Arial" w:hAnsi="Arial" w:cs="Arial"/>
-        </w:rPr>
-      </w:pPr>
-    </w:p>
-    <w:p>
-      <w:pPr>
-        <w:spacing w:line="360" w:lineRule="auto"/>
-        <w:jc w:val="both"/>
-        <w:rPr>
-          <w:rFonts w:ascii="Arial" w:hAnsi="Arial" w:cs="Arial"/>
-        </w:rPr>
-      </w:pPr>
-      <w:r>
-        <w:rPr>
-          <w:rFonts w:ascii="Arial" w:hAnsi="Arial" w:cs="Arial"/>
-        </w:rPr>
-        <w:t>The root node acts as a starting point and does not store any character (as in a letter).</w:t>
-      </w:r>
-      <w:r>
-        <w:rPr>
-          <w:rFonts w:ascii="Arial" w:hAnsi="Arial" w:cs="Arial"/>
-        </w:rPr>
-        <w:t xml:space="preserve"> A map is created to connect a character to its next node in the tree.</w:t>
-      </w:r>
-      <w:r>
-        <w:rPr>
-          <w:rFonts w:ascii="Arial" w:hAnsi="Arial" w:cs="Arial"/>
-        </w:rPr>
-        <w:t xml:space="preserve"> A Boolean </w:t>
-      </w:r>
-      <w:proofErr w:type="spellStart"/>
+        <w:t>isWord</w:t>
+      </w:r>
+      <w:proofErr w:type="spellEnd"/>
       <w:r>
         <w:rPr>
           <w:rFonts w:ascii="Arial" w:hAnsi="Arial" w:cs="Arial"/>
           <w:i/>
           <w:iCs/>
         </w:rPr>
-        <w:t>isWord</w:t>
-      </w:r>
-      <w:proofErr w:type="spellEnd"/>
-      <w:r>
-        <w:rPr>
-          <w:rFonts w:ascii="Arial" w:hAnsi="Arial" w:cs="Arial"/>
-          <w:i/>
-          <w:iCs/>
-        </w:rPr>
         <w:t xml:space="preserve"> </w:t>
       </w:r>
       <w:r>
@@ -10581,35 +10473,7 @@
         <w:rPr>
           <w:rFonts w:ascii="Arial" w:hAnsi="Arial" w:cs="Arial"/>
         </w:rPr>
-        <w:t xml:space="preserve"> The operations executed are </w:t>
-      </w:r>
-      <w:proofErr w:type="gramStart"/>
-      <w:r>
-        <w:rPr>
-          <w:rFonts w:ascii="Arial" w:hAnsi="Arial" w:cs="Arial"/>
-        </w:rPr>
-        <w:t>insert</w:t>
-      </w:r>
-      <w:proofErr w:type="gramEnd"/>
-      <w:r>
-        <w:rPr>
-          <w:rFonts w:ascii="Arial" w:hAnsi="Arial" w:cs="Arial"/>
-        </w:rPr>
-        <w:t xml:space="preserve"> and </w:t>
-      </w:r>
-      <w:proofErr w:type="gramStart"/>
-      <w:r>
-        <w:rPr>
-          <w:rFonts w:ascii="Arial" w:hAnsi="Arial" w:cs="Arial"/>
-        </w:rPr>
-        <w:t>contain</w:t>
-      </w:r>
-      <w:proofErr w:type="gramEnd"/>
-      <w:r>
-        <w:rPr>
-          <w:rFonts w:ascii="Arial" w:hAnsi="Arial" w:cs="Arial"/>
-        </w:rPr>
-        <w:t>.</w:t>
+        <w:t xml:space="preserve"> The operations executed are insert and contain.</w:t>
       </w:r>
     </w:p>
     <w:p>
@@ -11127,25 +10991,7 @@
           <w:i/>
           <w:iCs/>
         </w:rPr>
-        <w:t xml:space="preserve">Big </w:t>
-      </w:r>
-      <w:proofErr w:type="gramStart"/>
-      <w:r>
-        <w:rPr>
-          <w:rFonts w:ascii="Arial" w:hAnsi="Arial" w:cs="Arial"/>
-          <w:i/>
-          <w:iCs/>
-        </w:rPr>
-        <w:t>Break!,</w:t>
-      </w:r>
-      <w:proofErr w:type="gramEnd"/>
-      <w:r>
-        <w:rPr>
-          <w:rFonts w:ascii="Arial" w:hAnsi="Arial" w:cs="Arial"/>
-          <w:i/>
-          <w:iCs/>
-        </w:rPr>
-        <w:t xml:space="preserve"> </w:t>
+        <w:t xml:space="preserve">Big Break!, </w:t>
       </w:r>
       <w:r>
         <w:rPr>
@@ -11748,49 +11594,7 @@
           <w:rFonts w:ascii="Arial" w:hAnsi="Arial" w:cs="Arial"/>
         </w:rPr>
         <w:lastRenderedPageBreak/>
-        <w:t xml:space="preserve">algorithm. A threshold value is created </w:t>
-      </w:r>
-      <w:proofErr w:type="gramStart"/>
-      <w:r>
-        <w:rPr>
-          <w:rFonts w:ascii="Arial" w:hAnsi="Arial" w:cs="Arial"/>
-        </w:rPr>
-        <w:t>in order to</w:t>
-      </w:r>
-      <w:proofErr w:type="gramEnd"/>
-      <w:r>
-        <w:rPr>
-          <w:rFonts w:ascii="Arial" w:hAnsi="Arial" w:cs="Arial"/>
-        </w:rPr>
-        <w:t xml:space="preserve"> catch small typos or name variations. This implementation of DSU makes the similarity transitive, meaning that if A is </w:t>
-      </w:r>
-      <w:proofErr w:type="gramStart"/>
-      <w:r>
-        <w:rPr>
-          <w:rFonts w:ascii="Arial" w:hAnsi="Arial" w:cs="Arial"/>
-        </w:rPr>
-        <w:t>similar to</w:t>
-      </w:r>
-      <w:proofErr w:type="gramEnd"/>
-      <w:r>
-        <w:rPr>
-          <w:rFonts w:ascii="Arial" w:hAnsi="Arial" w:cs="Arial"/>
-        </w:rPr>
-        <w:t xml:space="preserve"> B and B is </w:t>
-      </w:r>
-      <w:proofErr w:type="gramStart"/>
-      <w:r>
-        <w:rPr>
-          <w:rFonts w:ascii="Arial" w:hAnsi="Arial" w:cs="Arial"/>
-        </w:rPr>
-        <w:t>similar to</w:t>
-      </w:r>
-      <w:proofErr w:type="gramEnd"/>
-      <w:r>
-        <w:rPr>
-          <w:rFonts w:ascii="Arial" w:hAnsi="Arial" w:cs="Arial"/>
-        </w:rPr>
-        <w:t xml:space="preserve"> C, A and C will be part of the same cluster.</w:t>
+        <w:t>algorithm. A threshold value is created in order to catch small typos or name variations. This implementation of DSU makes the similarity transitive, meaning that if A is similar to B and B is similar to C, A and C will be part of the same cluster.</w:t>
       </w:r>
     </w:p>
     <w:p>
@@ -13223,21 +13027,7 @@
           <w:rFonts w:ascii="Arial" w:hAnsi="Arial" w:cs="Arial"/>
         </w:rPr>
         <w:lastRenderedPageBreak/>
-        <w:t xml:space="preserve">Java runs faster than most of the interpreted languages for </w:t>
-      </w:r>
-      <w:proofErr w:type="gramStart"/>
-      <w:r>
-        <w:rPr>
-          <w:rFonts w:ascii="Arial" w:hAnsi="Arial" w:cs="Arial"/>
-        </w:rPr>
-        <w:t>processing of</w:t>
-      </w:r>
-      <w:proofErr w:type="gramEnd"/>
-      <w:r>
-        <w:rPr>
-          <w:rFonts w:ascii="Arial" w:hAnsi="Arial" w:cs="Arial"/>
-        </w:rPr>
-        <w:t xml:space="preserve"> large </w:t>
+        <w:t xml:space="preserve">Java runs faster than most of the interpreted languages for processing of large </w:t>
       </w:r>
       <w:r>
         <w:rPr>
@@ -13664,21 +13454,7 @@
         <w:rPr>
           <w:rFonts w:ascii="Arial" w:hAnsi="Arial" w:cs="Arial"/>
         </w:rPr>
-        <w:t xml:space="preserve"> uses React for its </w:t>
-      </w:r>
-      <w:proofErr w:type="gramStart"/>
-      <w:r>
-        <w:rPr>
-          <w:rFonts w:ascii="Arial" w:hAnsi="Arial" w:cs="Arial"/>
-        </w:rPr>
-        <w:t>frontend</w:t>
-      </w:r>
-      <w:proofErr w:type="gramEnd"/>
-      <w:r>
-        <w:rPr>
-          <w:rFonts w:ascii="Arial" w:hAnsi="Arial" w:cs="Arial"/>
-        </w:rPr>
-        <w:t xml:space="preserve">. One of the </w:t>
+        <w:t xml:space="preserve"> uses React for its frontend. One of the </w:t>
       </w:r>
       <w:r>
         <w:rPr>
@@ -13790,21 +13566,7 @@
         <w:rPr>
           <w:rFonts w:ascii="Arial" w:hAnsi="Arial" w:cs="Arial"/>
         </w:rPr>
-        <w:t xml:space="preserve"> create </w:t>
-      </w:r>
-      <w:proofErr w:type="gramStart"/>
-      <w:r>
-        <w:rPr>
-          <w:rFonts w:ascii="Arial" w:hAnsi="Arial" w:cs="Arial"/>
-        </w:rPr>
-        <w:t>a modern</w:t>
-      </w:r>
-      <w:proofErr w:type="gramEnd"/>
-      <w:r>
-        <w:rPr>
-          <w:rFonts w:ascii="Arial" w:hAnsi="Arial" w:cs="Arial"/>
-        </w:rPr>
-        <w:t xml:space="preserve"> full-stack architecture.</w:t>
+        <w:t xml:space="preserve"> create a modern full-stack architecture.</w:t>
       </w:r>
     </w:p>
     <w:p>
@@ -16850,6 +16612,7 @@
   <w:style w:type="character" w:default="1" w:styleId="DefaultParagraphFont">
     <w:name w:val="Default Paragraph Font"/>
     <w:uiPriority w:val="1"/>
+    <w:semiHidden/>
     <w:unhideWhenUsed/>
   </w:style>
   <w:style w:type="table" w:default="1" w:styleId="TableNormal">

</xml_diff>

<commit_message>
Scheduling algorithm documentation completed
</commit_message>
<xml_diff>
--- a/docs/Vili-An_Doneva_Diploma_Thesis.docx
+++ b/docs/Vili-An_Doneva_Diploma_Thesis.docx
@@ -692,21 +692,7 @@
         <w:rPr>
           <w:rFonts w:ascii="Arial" w:hAnsi="Arial" w:cs="Arial"/>
         </w:rPr>
-        <w:t xml:space="preserve"> additionally uses a </w:t>
-      </w:r>
-      <w:proofErr w:type="spellStart"/>
-      <w:r>
-        <w:rPr>
-          <w:rFonts w:ascii="Arial" w:hAnsi="Arial" w:cs="Arial"/>
-        </w:rPr>
-        <w:t>trie</w:t>
-      </w:r>
-      <w:proofErr w:type="spellEnd"/>
-      <w:r>
-        <w:rPr>
-          <w:rFonts w:ascii="Arial" w:hAnsi="Arial" w:cs="Arial"/>
-        </w:rPr>
-        <w:t xml:space="preserve"> data structure to compare names to the common names file.</w:t>
+        <w:t xml:space="preserve"> additionally uses a trie data structure to compare names to the common names file.</w:t>
       </w:r>
       <w:r>
         <w:rPr>
@@ -736,21 +722,7 @@
         <w:rPr>
           <w:rFonts w:ascii="Arial" w:hAnsi="Arial" w:cs="Arial"/>
         </w:rPr>
-        <w:t xml:space="preserve">uses the </w:t>
-      </w:r>
-      <w:proofErr w:type="spellStart"/>
-      <w:r>
-        <w:rPr>
-          <w:rFonts w:ascii="Arial" w:hAnsi="Arial" w:cs="Arial"/>
-        </w:rPr>
-        <w:t>Levenshtein</w:t>
-      </w:r>
-      <w:proofErr w:type="spellEnd"/>
-      <w:r>
-        <w:rPr>
-          <w:rFonts w:ascii="Arial" w:hAnsi="Arial" w:cs="Arial"/>
-        </w:rPr>
-        <w:t xml:space="preserve"> distance</w:t>
+        <w:t>uses the Levenshtein distance</w:t>
       </w:r>
       <w:r>
         <w:rPr>
@@ -972,6 +944,7 @@
         </w:rPr>
         <w:t xml:space="preserve">cited in the text and in the Reference </w:t>
       </w:r>
+      <w:proofErr w:type="gramStart"/>
       <w:r>
         <w:rPr>
           <w:rFonts w:ascii="Arial" w:hAnsi="Arial" w:cs="Arial"/>
@@ -984,6 +957,7 @@
         </w:rPr>
         <w:t>”</w:t>
       </w:r>
+      <w:proofErr w:type="gramEnd"/>
     </w:p>
     <w:p>
       <w:pPr>
@@ -1388,21 +1362,7 @@
         <w:rPr>
           <w:rFonts w:ascii="Arial" w:hAnsi="Arial" w:cs="Arial"/>
         </w:rPr>
-        <w:t xml:space="preserve">The characters are extracted through heuristic methods, regex, and the pre-trained Named Entity Recognition (NER) model – </w:t>
-      </w:r>
-      <w:proofErr w:type="spellStart"/>
-      <w:r>
-        <w:rPr>
-          <w:rFonts w:ascii="Arial" w:hAnsi="Arial" w:cs="Arial"/>
-        </w:rPr>
-        <w:t>NameFinderME</w:t>
-      </w:r>
-      <w:proofErr w:type="spellEnd"/>
-      <w:r>
-        <w:rPr>
-          <w:rFonts w:ascii="Arial" w:hAnsi="Arial" w:cs="Arial"/>
-        </w:rPr>
-        <w:t xml:space="preserve">. </w:t>
+        <w:t xml:space="preserve">The characters are extracted through heuristic methods, regex, and the pre-trained Named Entity Recognition (NER) model – NameFinderME. </w:t>
       </w:r>
       <w:r>
         <w:rPr>
@@ -1494,7 +1454,21 @@
         <w:rPr>
           <w:rFonts w:ascii="Arial" w:hAnsi="Arial" w:cs="Arial"/>
         </w:rPr>
-        <w:t>Most cases are covered by the heuristic logic</w:t>
+        <w:t xml:space="preserve">Most cases are covered by </w:t>
+      </w:r>
+      <w:proofErr w:type="gramStart"/>
+      <w:r>
+        <w:rPr>
+          <w:rFonts w:ascii="Arial" w:hAnsi="Arial" w:cs="Arial"/>
+        </w:rPr>
+        <w:t>the heuristic</w:t>
+      </w:r>
+      <w:proofErr w:type="gramEnd"/>
+      <w:r>
+        <w:rPr>
+          <w:rFonts w:ascii="Arial" w:hAnsi="Arial" w:cs="Arial"/>
+        </w:rPr>
+        <w:t xml:space="preserve"> logic</w:t>
       </w:r>
       <w:r>
         <w:rPr>
@@ -1518,30 +1492,14 @@
         <w:rPr>
           <w:rFonts w:ascii="Arial" w:hAnsi="Arial" w:cs="Arial"/>
         </w:rPr>
-        <w:t xml:space="preserve"> analyzes them based on regex patterns. However, in-line names are more difficult to extract as they have no distinct position or format. This is why </w:t>
-      </w:r>
-      <w:proofErr w:type="spellStart"/>
+        <w:t xml:space="preserve"> analyzes them based on regex patterns. However, in-line names are more difficult to extract as they have no distinct position or format. This is why NameFinderME or the first-introduced logic is used. </w:t>
+      </w:r>
       <w:r>
         <w:rPr>
           <w:rFonts w:ascii="Arial" w:hAnsi="Arial" w:cs="Arial"/>
         </w:rPr>
         <w:t>NameFinderME</w:t>
       </w:r>
-      <w:proofErr w:type="spellEnd"/>
-      <w:r>
-        <w:rPr>
-          <w:rFonts w:ascii="Arial" w:hAnsi="Arial" w:cs="Arial"/>
-        </w:rPr>
-        <w:t xml:space="preserve"> or the first-introduced logic is used. </w:t>
-      </w:r>
-      <w:proofErr w:type="spellStart"/>
-      <w:r>
-        <w:rPr>
-          <w:rFonts w:ascii="Arial" w:hAnsi="Arial" w:cs="Arial"/>
-        </w:rPr>
-        <w:t>NameFinderME</w:t>
-      </w:r>
-      <w:proofErr w:type="spellEnd"/>
       <w:r>
         <w:rPr>
           <w:rFonts w:ascii="Arial" w:hAnsi="Arial" w:cs="Arial"/>
@@ -1564,16 +1522,8 @@
         <w:rPr>
           <w:rFonts w:ascii="Arial" w:hAnsi="Arial" w:cs="Arial"/>
         </w:rPr>
-        <w:t xml:space="preserve">class in the Apache </w:t>
-      </w:r>
-      <w:proofErr w:type="spellStart"/>
-      <w:r>
-        <w:rPr>
-          <w:rFonts w:ascii="Arial" w:hAnsi="Arial" w:cs="Arial"/>
-        </w:rPr>
-        <w:t>OpenNLP</w:t>
-      </w:r>
-      <w:proofErr w:type="spellEnd"/>
+        <w:t>class in the Apache OpenNLP</w:t>
+      </w:r>
       <w:r>
         <w:rPr>
           <w:rFonts w:ascii="Arial" w:hAnsi="Arial" w:cs="Arial"/>
@@ -1655,21 +1605,7 @@
         <w:rPr>
           <w:rFonts w:ascii="Arial" w:hAnsi="Arial" w:cs="Arial"/>
         </w:rPr>
-        <w:t xml:space="preserve"> the </w:t>
-      </w:r>
-      <w:proofErr w:type="spellStart"/>
-      <w:r>
-        <w:rPr>
-          <w:rFonts w:ascii="Arial" w:hAnsi="Arial" w:cs="Arial"/>
-        </w:rPr>
-        <w:t>Levenshtein</w:t>
-      </w:r>
-      <w:proofErr w:type="spellEnd"/>
-      <w:r>
-        <w:rPr>
-          <w:rFonts w:ascii="Arial" w:hAnsi="Arial" w:cs="Arial"/>
-        </w:rPr>
-        <w:t xml:space="preserve"> distance algorithm</w:t>
+        <w:t xml:space="preserve"> the Levenshtein distance algorithm</w:t>
       </w:r>
       <w:r>
         <w:rPr>
@@ -1757,29 +1693,13 @@
           <w:i/>
           <w:iCs/>
         </w:rPr>
-        <w:t xml:space="preserve">Big </w:t>
-      </w:r>
-      <w:proofErr w:type="spellStart"/>
-      <w:r>
-        <w:rPr>
-          <w:rFonts w:ascii="Arial" w:hAnsi="Arial" w:cs="Arial"/>
-          <w:i/>
-          <w:iCs/>
-        </w:rPr>
-        <w:t>Break!</w:t>
-      </w:r>
-      <w:r>
-        <w:rPr>
-          <w:rFonts w:ascii="Arial" w:hAnsi="Arial" w:cs="Arial"/>
-        </w:rPr>
-        <w:t>’s</w:t>
-      </w:r>
-      <w:proofErr w:type="spellEnd"/>
-      <w:r>
-        <w:rPr>
-          <w:rFonts w:ascii="Arial" w:hAnsi="Arial" w:cs="Arial"/>
-        </w:rPr>
-        <w:t xml:space="preserve"> scheduling depends on various </w:t>
+        <w:t>Big Break!</w:t>
+      </w:r>
+      <w:r>
+        <w:rPr>
+          <w:rFonts w:ascii="Arial" w:hAnsi="Arial" w:cs="Arial"/>
+        </w:rPr>
+        <w:t xml:space="preserve">’s scheduling depends on various </w:t>
       </w:r>
       <w:r>
         <w:rPr>
@@ -1877,11 +1797,19 @@
         </w:rPr>
         <w:t xml:space="preserve">Big Break! </w:t>
       </w:r>
-      <w:r>
-        <w:rPr>
-          <w:rFonts w:ascii="Arial" w:hAnsi="Arial" w:cs="Arial"/>
-        </w:rPr>
-        <w:t>as my senior project is majorly connected to my interest in fil</w:t>
+      <w:proofErr w:type="gramStart"/>
+      <w:r>
+        <w:rPr>
+          <w:rFonts w:ascii="Arial" w:hAnsi="Arial" w:cs="Arial"/>
+        </w:rPr>
+        <w:t>as</w:t>
+      </w:r>
+      <w:proofErr w:type="gramEnd"/>
+      <w:r>
+        <w:rPr>
+          <w:rFonts w:ascii="Arial" w:hAnsi="Arial" w:cs="Arial"/>
+        </w:rPr>
+        <w:t xml:space="preserve"> my senior project is majorly connected to my interest in fil</w:t>
       </w:r>
       <w:r>
         <w:rPr>
@@ -2623,69 +2551,27 @@
         </w:rPr>
         <w:t xml:space="preserve"> </w:t>
       </w:r>
-      <w:proofErr w:type="spellStart"/>
       <w:r>
         <w:rPr>
           <w:rFonts w:ascii="Arial" w:hAnsi="Arial" w:cs="Arial"/>
           <w:i/>
           <w:iCs/>
         </w:rPr>
-        <w:t>loadScript</w:t>
-      </w:r>
-      <w:proofErr w:type="spellEnd"/>
+        <w:t>loadScript (String filePath)</w:t>
+      </w:r>
       <w:r>
         <w:rPr>
           <w:rFonts w:ascii="Arial" w:hAnsi="Arial" w:cs="Arial"/>
           <w:i/>
           <w:iCs/>
         </w:rPr>
-        <w:t xml:space="preserve"> (String </w:t>
-      </w:r>
-      <w:proofErr w:type="spellStart"/>
-      <w:r>
-        <w:rPr>
-          <w:rFonts w:ascii="Arial" w:hAnsi="Arial" w:cs="Arial"/>
-          <w:i/>
-          <w:iCs/>
-        </w:rPr>
-        <w:t>filePath</w:t>
-      </w:r>
-      <w:proofErr w:type="spellEnd"/>
-      <w:r>
-        <w:rPr>
-          <w:rFonts w:ascii="Arial" w:hAnsi="Arial" w:cs="Arial"/>
-          <w:i/>
-          <w:iCs/>
-        </w:rPr>
-        <w:t>)</w:t>
-      </w:r>
-      <w:r>
-        <w:rPr>
-          <w:rFonts w:ascii="Arial" w:hAnsi="Arial" w:cs="Arial"/>
-          <w:i/>
-          <w:iCs/>
-        </w:rPr>
         <w:t xml:space="preserve"> </w:t>
       </w:r>
       <w:r>
         <w:rPr>
           <w:rFonts w:ascii="Arial" w:hAnsi="Arial" w:cs="Arial"/>
         </w:rPr>
-        <w:t xml:space="preserve">to access the script .txt file and to normalize spaces and breaks, and </w:t>
-      </w:r>
-      <w:proofErr w:type="spellStart"/>
-      <w:r>
-        <w:rPr>
-          <w:rFonts w:ascii="Arial" w:hAnsi="Arial" w:cs="Arial"/>
-        </w:rPr>
-        <w:t>removePageNumbers</w:t>
-      </w:r>
-      <w:proofErr w:type="spellEnd"/>
-      <w:r>
-        <w:rPr>
-          <w:rFonts w:ascii="Arial" w:hAnsi="Arial" w:cs="Arial"/>
-        </w:rPr>
-        <w:t xml:space="preserve"> (String script) to remove page headers/footers and obvious page numbers.</w:t>
+        <w:t>to access the script .txt file and to normalize spaces and breaks, and removePageNumbers (String script) to remove page headers/footers and obvious page numbers.</w:t>
       </w:r>
       <w:r>
         <w:rPr>
@@ -2705,19 +2591,11 @@
         </w:rPr>
         <w:t xml:space="preserve">List &lt;Scene&gt; </w:t>
       </w:r>
-      <w:proofErr w:type="spellStart"/>
-      <w:r>
-        <w:rPr>
-          <w:rFonts w:ascii="Arial" w:hAnsi="Arial" w:cs="Arial"/>
-        </w:rPr>
-        <w:t>splitScenes</w:t>
-      </w:r>
-      <w:proofErr w:type="spellEnd"/>
-      <w:r>
-        <w:rPr>
-          <w:rFonts w:ascii="Arial" w:hAnsi="Arial" w:cs="Arial"/>
-        </w:rPr>
-        <w:t>(String script)</w:t>
+      <w:r>
+        <w:rPr>
+          <w:rFonts w:ascii="Arial" w:hAnsi="Arial" w:cs="Arial"/>
+        </w:rPr>
+        <w:t>splitScenes(String script)</w:t>
       </w:r>
       <w:r>
         <w:rPr>
@@ -2771,7 +2649,21 @@
         <w:rPr>
           <w:rFonts w:ascii="Arial" w:hAnsi="Arial" w:cs="Arial"/>
         </w:rPr>
-        <w:t xml:space="preserve">filling up the Scene class constructor with scene order number (the actual number of the scene in the order they appear), scene script numbers (the scene number written in the script), headings, locations, and times (if available). In order to find the values, it uses </w:t>
+        <w:t xml:space="preserve">filling up the Scene class constructor with scene order number (the actual number of the scene in the order they appear), scene script numbers (the scene number written in the script), headings, locations, and times (if available). </w:t>
+      </w:r>
+      <w:proofErr w:type="gramStart"/>
+      <w:r>
+        <w:rPr>
+          <w:rFonts w:ascii="Arial" w:hAnsi="Arial" w:cs="Arial"/>
+        </w:rPr>
+        <w:t>In order to</w:t>
+      </w:r>
+      <w:proofErr w:type="gramEnd"/>
+      <w:r>
+        <w:rPr>
+          <w:rFonts w:ascii="Arial" w:hAnsi="Arial" w:cs="Arial"/>
+        </w:rPr>
+        <w:t xml:space="preserve"> find the values, it uses </w:t>
       </w:r>
       <w:r>
         <w:rPr>
@@ -2937,17 +2829,8 @@
                                 <w:sz w:val="20"/>
                                 <w:szCs w:val="20"/>
                               </w:rPr>
-                              <w:t xml:space="preserve"> </w:t>
+                              <w:t xml:space="preserve"> splitScenes</w:t>
                             </w:r>
-                            <w:proofErr w:type="spellStart"/>
-                            <w:r>
-                              <w:rPr>
-                                <w:sz w:val="20"/>
-                                <w:szCs w:val="20"/>
-                              </w:rPr>
-                              <w:t>splitScenes</w:t>
-                            </w:r>
-                            <w:proofErr w:type="spellEnd"/>
                             <w:r>
                               <w:rPr>
                                 <w:sz w:val="20"/>
@@ -3054,17 +2937,8 @@
                           <w:sz w:val="20"/>
                           <w:szCs w:val="20"/>
                         </w:rPr>
-                        <w:t xml:space="preserve"> </w:t>
+                        <w:t xml:space="preserve"> splitScenes</w:t>
                       </w:r>
-                      <w:proofErr w:type="spellStart"/>
-                      <w:r>
-                        <w:rPr>
-                          <w:sz w:val="20"/>
-                          <w:szCs w:val="20"/>
-                        </w:rPr>
-                        <w:t>splitScenes</w:t>
-                      </w:r>
-                      <w:proofErr w:type="spellEnd"/>
                       <w:r>
                         <w:rPr>
                           <w:sz w:val="20"/>
@@ -3430,21 +3304,7 @@
         <w:rPr>
           <w:rFonts w:ascii="Arial" w:hAnsi="Arial" w:cs="Arial"/>
         </w:rPr>
-        <w:t xml:space="preserve">The POS Tagger of Apache </w:t>
-      </w:r>
-      <w:proofErr w:type="spellStart"/>
-      <w:r>
-        <w:rPr>
-          <w:rFonts w:ascii="Arial" w:hAnsi="Arial" w:cs="Arial"/>
-        </w:rPr>
-        <w:t>OpenNLP</w:t>
-      </w:r>
-      <w:proofErr w:type="spellEnd"/>
-      <w:r>
-        <w:rPr>
-          <w:rFonts w:ascii="Arial" w:hAnsi="Arial" w:cs="Arial"/>
-        </w:rPr>
-        <w:t xml:space="preserve"> automatically determines grammatical roles</w:t>
+        <w:t>The POS Tagger of Apache OpenNLP automatically determines grammatical roles</w:t>
       </w:r>
       <w:r>
         <w:rPr>
@@ -3494,25 +3354,121 @@
           <w:i/>
           <w:iCs/>
         </w:rPr>
-        <w:t xml:space="preserve">String[] tags = </w:t>
-      </w:r>
-      <w:proofErr w:type="spellStart"/>
-      <w:r>
+        <w:t>String[] tags = posTagger.tag (sentence);</w:t>
+      </w:r>
+    </w:p>
+    <w:p>
+      <w:pPr>
+        <w:spacing w:line="360" w:lineRule="auto"/>
+        <w:jc w:val="both"/>
+        <w:rPr>
+          <w:rFonts w:ascii="Arial" w:hAnsi="Arial" w:cs="Arial"/>
+        </w:rPr>
+      </w:pPr>
+      <w:r>
+        <w:rPr>
+          <w:rFonts w:ascii="Arial" w:hAnsi="Arial" w:cs="Arial"/>
+        </w:rPr>
+        <w:t>Result:</w:t>
+      </w:r>
+    </w:p>
+    <w:p>
+      <w:pPr>
+        <w:spacing w:line="360" w:lineRule="auto"/>
+        <w:jc w:val="both"/>
         <w:rPr>
           <w:rFonts w:ascii="Arial" w:hAnsi="Arial" w:cs="Arial"/>
           <w:i/>
           <w:iCs/>
         </w:rPr>
-        <w:t>posTagger.tag</w:t>
-      </w:r>
-      <w:proofErr w:type="spellEnd"/>
+      </w:pPr>
       <w:r>
         <w:rPr>
           <w:rFonts w:ascii="Arial" w:hAnsi="Arial" w:cs="Arial"/>
           <w:i/>
           <w:iCs/>
         </w:rPr>
-        <w:t xml:space="preserve"> (sentence);</w:t>
+        <w:t>Elphaba/NNP</w:t>
+      </w:r>
+      <w:r>
+        <w:rPr>
+          <w:rFonts w:ascii="Arial" w:hAnsi="Arial" w:cs="Arial"/>
+          <w:i/>
+          <w:iCs/>
+        </w:rPr>
+        <w:t xml:space="preserve"> (proper noun)</w:t>
+      </w:r>
+      <w:r>
+        <w:rPr>
+          <w:rFonts w:ascii="Arial" w:hAnsi="Arial" w:cs="Arial"/>
+          <w:i/>
+          <w:iCs/>
+        </w:rPr>
+        <w:t xml:space="preserve"> looked/VBD</w:t>
+      </w:r>
+      <w:r>
+        <w:rPr>
+          <w:rFonts w:ascii="Arial" w:hAnsi="Arial" w:cs="Arial"/>
+          <w:i/>
+          <w:iCs/>
+        </w:rPr>
+        <w:t xml:space="preserve"> (verb)</w:t>
+      </w:r>
+      <w:r>
+        <w:rPr>
+          <w:rFonts w:ascii="Arial" w:hAnsi="Arial" w:cs="Arial"/>
+          <w:i/>
+          <w:iCs/>
+        </w:rPr>
+        <w:t xml:space="preserve"> in/IN</w:t>
+      </w:r>
+      <w:r>
+        <w:rPr>
+          <w:rFonts w:ascii="Arial" w:hAnsi="Arial" w:cs="Arial"/>
+          <w:i/>
+          <w:iCs/>
+        </w:rPr>
+        <w:t xml:space="preserve"> (preposition)</w:t>
+      </w:r>
+      <w:r>
+        <w:rPr>
+          <w:rFonts w:ascii="Arial" w:hAnsi="Arial" w:cs="Arial"/>
+          <w:i/>
+          <w:iCs/>
+        </w:rPr>
+        <w:t xml:space="preserve"> the/DT </w:t>
+      </w:r>
+      <w:r>
+        <w:rPr>
+          <w:rFonts w:ascii="Arial" w:hAnsi="Arial" w:cs="Arial"/>
+          <w:i/>
+          <w:iCs/>
+        </w:rPr>
+        <w:t xml:space="preserve">(determiner) </w:t>
+      </w:r>
+      <w:r>
+        <w:rPr>
+          <w:rFonts w:ascii="Arial" w:hAnsi="Arial" w:cs="Arial"/>
+          <w:i/>
+          <w:iCs/>
+        </w:rPr>
+        <w:t>mirror/NN</w:t>
+      </w:r>
+      <w:r>
+        <w:rPr>
+          <w:rFonts w:ascii="Arial" w:hAnsi="Arial" w:cs="Arial"/>
+          <w:i/>
+          <w:iCs/>
+        </w:rPr>
+        <w:t xml:space="preserve"> (noun)</w:t>
+      </w:r>
+      <w:r>
+        <w:rPr>
+          <w:rFonts w:ascii="Arial" w:hAnsi="Arial" w:cs="Arial"/>
+          <w:i/>
+          <w:iCs/>
+        </w:rPr>
+        <w:t xml:space="preserve"> ./.</w:t>
       </w:r>
     </w:p>
     <w:p>
@@ -3527,7 +3483,65 @@
         <w:rPr>
           <w:rFonts w:ascii="Arial" w:hAnsi="Arial" w:cs="Arial"/>
         </w:rPr>
-        <w:t>Result:</w:t>
+        <w:t>After having the grammatical data, the software uses it as input to the heuristic rules that determine whether a noun is a prop or a set dressing. For example, if the noun is preceded by a</w:t>
+      </w:r>
+      <w:r>
+        <w:rPr>
+          <w:rFonts w:ascii="Arial" w:hAnsi="Arial" w:cs="Arial"/>
+        </w:rPr>
+        <w:t xml:space="preserve"> manipulation</w:t>
+      </w:r>
+      <w:r>
+        <w:rPr>
+          <w:rFonts w:ascii="Arial" w:hAnsi="Arial" w:cs="Arial"/>
+        </w:rPr>
+        <w:t xml:space="preserve"> verb (grab, pick up, take, etc.), then it is most probably a prop. However, if the previous </w:t>
+      </w:r>
+      <w:proofErr w:type="gramStart"/>
+      <w:r>
+        <w:rPr>
+          <w:rFonts w:ascii="Arial" w:hAnsi="Arial" w:cs="Arial"/>
+        </w:rPr>
+        <w:t>word</w:t>
+      </w:r>
+      <w:proofErr w:type="gramEnd"/>
+      <w:r>
+        <w:rPr>
+          <w:rFonts w:ascii="Arial" w:hAnsi="Arial" w:cs="Arial"/>
+        </w:rPr>
+        <w:t xml:space="preserve"> is a preposition (on, in, behind, etc.), then the noun is most probably part of the set dressing category.</w:t>
+      </w:r>
+      <w:r>
+        <w:rPr>
+          <w:rFonts w:ascii="Arial" w:hAnsi="Arial" w:cs="Arial"/>
+        </w:rPr>
+        <w:t xml:space="preserve"> Adding a NameFinderM</w:t>
+      </w:r>
+      <w:r>
+        <w:rPr>
+          <w:rFonts w:ascii="Arial" w:hAnsi="Arial" w:cs="Arial"/>
+        </w:rPr>
+        <w:t>E</w:t>
+      </w:r>
+      <w:r>
+        <w:rPr>
+          <w:rFonts w:ascii="Arial" w:hAnsi="Arial" w:cs="Arial"/>
+        </w:rPr>
+        <w:t xml:space="preserve"> NER model here will improve </w:t>
+      </w:r>
+      <w:proofErr w:type="gramStart"/>
+      <w:r>
+        <w:rPr>
+          <w:rFonts w:ascii="Arial" w:hAnsi="Arial" w:cs="Arial"/>
+        </w:rPr>
+        <w:t>the performance</w:t>
+      </w:r>
+      <w:proofErr w:type="gramEnd"/>
+      <w:r>
+        <w:rPr>
+          <w:rFonts w:ascii="Arial" w:hAnsi="Arial" w:cs="Arial"/>
+        </w:rPr>
+        <w:t xml:space="preserve"> further.</w:t>
       </w:r>
     </w:p>
     <w:p>
@@ -3536,17 +3550,115 @@
         <w:jc w:val="both"/>
         <w:rPr>
           <w:rFonts w:ascii="Arial" w:hAnsi="Arial" w:cs="Arial"/>
+        </w:rPr>
+      </w:pPr>
+    </w:p>
+    <w:p>
+      <w:pPr>
+        <w:spacing w:line="360" w:lineRule="auto"/>
+        <w:jc w:val="both"/>
+        <w:rPr>
+          <w:rFonts w:ascii="Arial" w:hAnsi="Arial" w:cs="Arial"/>
+          <w:b/>
+          <w:bCs/>
+        </w:rPr>
+      </w:pPr>
+      <w:r>
+        <w:rPr>
+          <w:rFonts w:ascii="Arial" w:hAnsi="Arial" w:cs="Arial"/>
+          <w:b/>
+          <w:bCs/>
+        </w:rPr>
+        <w:t>The user will be able to view the characters of each scene.</w:t>
+      </w:r>
+    </w:p>
+    <w:p>
+      <w:pPr>
+        <w:spacing w:line="360" w:lineRule="auto"/>
+        <w:jc w:val="both"/>
+        <w:rPr>
+          <w:rFonts w:ascii="Arial" w:hAnsi="Arial" w:cs="Arial"/>
+        </w:rPr>
+      </w:pPr>
+      <w:r>
+        <w:rPr>
+          <w:rFonts w:ascii="Arial" w:hAnsi="Arial" w:cs="Arial"/>
+        </w:rPr>
+        <w:t>This will be updated further:</w:t>
+      </w:r>
+    </w:p>
+    <w:p>
+      <w:pPr>
+        <w:spacing w:line="360" w:lineRule="auto"/>
+        <w:jc w:val="both"/>
+        <w:rPr>
+          <w:rFonts w:ascii="Arial" w:hAnsi="Arial" w:cs="Arial"/>
+        </w:rPr>
+      </w:pPr>
+      <w:r>
+        <w:rPr>
+          <w:rFonts w:ascii="Arial" w:hAnsi="Arial" w:cs="Arial"/>
+        </w:rPr>
+        <w:t xml:space="preserve">The characters are found in the script using several extractor methods: </w:t>
+      </w:r>
+      <w:r>
+        <w:rPr>
+          <w:rFonts w:ascii="Arial" w:hAnsi="Arial" w:cs="Arial"/>
           <w:i/>
           <w:iCs/>
         </w:rPr>
-      </w:pPr>
+        <w:t>extractSpeakerCues, extractInlineName, extractPersonWord, and extractIntroCharacters</w:t>
+      </w:r>
+      <w:r>
+        <w:rPr>
+          <w:rFonts w:ascii="Arial" w:hAnsi="Arial" w:cs="Arial"/>
+        </w:rPr>
+        <w:t xml:space="preserve">. Several helper methods are also created – </w:t>
+      </w:r>
       <w:r>
         <w:rPr>
           <w:rFonts w:ascii="Arial" w:hAnsi="Arial" w:cs="Arial"/>
           <w:i/>
           <w:iCs/>
         </w:rPr>
-        <w:t>Elphaba/NNP</w:t>
+        <w:t>normalizeName, normalizeNameInline, isCharacterCue, isStopPhrase, and safeSnippet</w:t>
+      </w:r>
+      <w:r>
+        <w:rPr>
+          <w:rFonts w:ascii="Arial" w:hAnsi="Arial" w:cs="Arial"/>
+        </w:rPr>
+        <w:t>.</w:t>
+      </w:r>
+      <w:r>
+        <w:rPr>
+          <w:rFonts w:ascii="Arial" w:hAnsi="Arial" w:cs="Arial"/>
+        </w:rPr>
+        <w:t xml:space="preserve"> </w:t>
+      </w:r>
+    </w:p>
+    <w:p>
+      <w:pPr>
+        <w:spacing w:line="360" w:lineRule="auto"/>
+        <w:jc w:val="both"/>
+        <w:rPr>
+          <w:rFonts w:ascii="Arial" w:hAnsi="Arial" w:cs="Arial"/>
+        </w:rPr>
+      </w:pPr>
+    </w:p>
+    <w:p>
+      <w:pPr>
+        <w:spacing w:line="360" w:lineRule="auto"/>
+        <w:jc w:val="both"/>
+        <w:rPr>
+          <w:rFonts w:ascii="Arial" w:hAnsi="Arial" w:cs="Arial"/>
+        </w:rPr>
+      </w:pPr>
+      <w:r>
+        <w:rPr>
+          <w:rFonts w:ascii="Arial" w:hAnsi="Arial" w:cs="Arial"/>
+        </w:rPr>
+        <w:lastRenderedPageBreak/>
+        <w:t xml:space="preserve">The </w:t>
       </w:r>
       <w:r>
         <w:rPr>
@@ -3554,390 +3666,8 @@
           <w:i/>
           <w:iCs/>
         </w:rPr>
-        <w:t xml:space="preserve"> (proper noun)</w:t>
-      </w:r>
-      <w:r>
-        <w:rPr>
-          <w:rFonts w:ascii="Arial" w:hAnsi="Arial" w:cs="Arial"/>
-          <w:i/>
-          <w:iCs/>
-        </w:rPr>
-        <w:t xml:space="preserve"> looked/VBD</w:t>
-      </w:r>
-      <w:r>
-        <w:rPr>
-          <w:rFonts w:ascii="Arial" w:hAnsi="Arial" w:cs="Arial"/>
-          <w:i/>
-          <w:iCs/>
-        </w:rPr>
-        <w:t xml:space="preserve"> (verb)</w:t>
-      </w:r>
-      <w:r>
-        <w:rPr>
-          <w:rFonts w:ascii="Arial" w:hAnsi="Arial" w:cs="Arial"/>
-          <w:i/>
-          <w:iCs/>
-        </w:rPr>
-        <w:t xml:space="preserve"> in/IN</w:t>
-      </w:r>
-      <w:r>
-        <w:rPr>
-          <w:rFonts w:ascii="Arial" w:hAnsi="Arial" w:cs="Arial"/>
-          <w:i/>
-          <w:iCs/>
-        </w:rPr>
-        <w:t xml:space="preserve"> (preposition)</w:t>
-      </w:r>
-      <w:r>
-        <w:rPr>
-          <w:rFonts w:ascii="Arial" w:hAnsi="Arial" w:cs="Arial"/>
-          <w:i/>
-          <w:iCs/>
-        </w:rPr>
-        <w:t xml:space="preserve"> the/DT </w:t>
-      </w:r>
-      <w:r>
-        <w:rPr>
-          <w:rFonts w:ascii="Arial" w:hAnsi="Arial" w:cs="Arial"/>
-          <w:i/>
-          <w:iCs/>
-        </w:rPr>
-        <w:t xml:space="preserve">(determiner) </w:t>
-      </w:r>
-      <w:r>
-        <w:rPr>
-          <w:rFonts w:ascii="Arial" w:hAnsi="Arial" w:cs="Arial"/>
-          <w:i/>
-          <w:iCs/>
-        </w:rPr>
-        <w:t>mirror/NN</w:t>
-      </w:r>
-      <w:r>
-        <w:rPr>
-          <w:rFonts w:ascii="Arial" w:hAnsi="Arial" w:cs="Arial"/>
-          <w:i/>
-          <w:iCs/>
-        </w:rPr>
-        <w:t xml:space="preserve"> (noun)</w:t>
-      </w:r>
-      <w:r>
-        <w:rPr>
-          <w:rFonts w:ascii="Arial" w:hAnsi="Arial" w:cs="Arial"/>
-          <w:i/>
-          <w:iCs/>
-        </w:rPr>
-        <w:t xml:space="preserve"> ./.</w:t>
-      </w:r>
-    </w:p>
-    <w:p>
-      <w:pPr>
-        <w:spacing w:line="360" w:lineRule="auto"/>
-        <w:jc w:val="both"/>
-        <w:rPr>
-          <w:rFonts w:ascii="Arial" w:hAnsi="Arial" w:cs="Arial"/>
-        </w:rPr>
-      </w:pPr>
-      <w:r>
-        <w:rPr>
-          <w:rFonts w:ascii="Arial" w:hAnsi="Arial" w:cs="Arial"/>
-        </w:rPr>
-        <w:t>After having the grammatical data, the software uses it as input to the heuristic rules that determine whether a noun is a prop or a set dressing. For example, if the noun is preceded by a</w:t>
-      </w:r>
-      <w:r>
-        <w:rPr>
-          <w:rFonts w:ascii="Arial" w:hAnsi="Arial" w:cs="Arial"/>
-        </w:rPr>
-        <w:t xml:space="preserve"> manipulation</w:t>
-      </w:r>
-      <w:r>
-        <w:rPr>
-          <w:rFonts w:ascii="Arial" w:hAnsi="Arial" w:cs="Arial"/>
-        </w:rPr>
-        <w:t xml:space="preserve"> verb (grab, pick up, take, etc.), then it is most probably a prop. However, if the previous word is a preposition (on, in, behind, etc.), then the noun is most probably part of the set dressing category.</w:t>
-      </w:r>
-      <w:r>
-        <w:rPr>
-          <w:rFonts w:ascii="Arial" w:hAnsi="Arial" w:cs="Arial"/>
-        </w:rPr>
-        <w:t xml:space="preserve"> Adding a </w:t>
-      </w:r>
-      <w:proofErr w:type="spellStart"/>
-      <w:r>
-        <w:rPr>
-          <w:rFonts w:ascii="Arial" w:hAnsi="Arial" w:cs="Arial"/>
-        </w:rPr>
-        <w:t>NameFinderM</w:t>
-      </w:r>
-      <w:r>
-        <w:rPr>
-          <w:rFonts w:ascii="Arial" w:hAnsi="Arial" w:cs="Arial"/>
-        </w:rPr>
-        <w:t>E</w:t>
-      </w:r>
-      <w:proofErr w:type="spellEnd"/>
-      <w:r>
-        <w:rPr>
-          <w:rFonts w:ascii="Arial" w:hAnsi="Arial" w:cs="Arial"/>
-        </w:rPr>
-        <w:t xml:space="preserve"> NER model here will improve the performance further.</w:t>
-      </w:r>
-    </w:p>
-    <w:p>
-      <w:pPr>
-        <w:spacing w:line="360" w:lineRule="auto"/>
-        <w:jc w:val="both"/>
-        <w:rPr>
-          <w:rFonts w:ascii="Arial" w:hAnsi="Arial" w:cs="Arial"/>
-        </w:rPr>
-      </w:pPr>
-    </w:p>
-    <w:p>
-      <w:pPr>
-        <w:spacing w:line="360" w:lineRule="auto"/>
-        <w:jc w:val="both"/>
-        <w:rPr>
-          <w:rFonts w:ascii="Arial" w:hAnsi="Arial" w:cs="Arial"/>
-          <w:b/>
-          <w:bCs/>
-        </w:rPr>
-      </w:pPr>
-      <w:r>
-        <w:rPr>
-          <w:rFonts w:ascii="Arial" w:hAnsi="Arial" w:cs="Arial"/>
-          <w:b/>
-          <w:bCs/>
-        </w:rPr>
-        <w:t>The user will be able to view the characters of each scene.</w:t>
-      </w:r>
-    </w:p>
-    <w:p>
-      <w:pPr>
-        <w:spacing w:line="360" w:lineRule="auto"/>
-        <w:jc w:val="both"/>
-        <w:rPr>
-          <w:rFonts w:ascii="Arial" w:hAnsi="Arial" w:cs="Arial"/>
-        </w:rPr>
-      </w:pPr>
-      <w:r>
-        <w:rPr>
-          <w:rFonts w:ascii="Arial" w:hAnsi="Arial" w:cs="Arial"/>
-        </w:rPr>
-        <w:t>This will be updated further:</w:t>
-      </w:r>
-    </w:p>
-    <w:p>
-      <w:pPr>
-        <w:spacing w:line="360" w:lineRule="auto"/>
-        <w:jc w:val="both"/>
-        <w:rPr>
-          <w:rFonts w:ascii="Arial" w:hAnsi="Arial" w:cs="Arial"/>
-        </w:rPr>
-      </w:pPr>
-      <w:r>
-        <w:rPr>
-          <w:rFonts w:ascii="Arial" w:hAnsi="Arial" w:cs="Arial"/>
-        </w:rPr>
-        <w:t xml:space="preserve">The characters are found in the script using several extractor methods: </w:t>
-      </w:r>
-      <w:proofErr w:type="spellStart"/>
-      <w:r>
-        <w:rPr>
-          <w:rFonts w:ascii="Arial" w:hAnsi="Arial" w:cs="Arial"/>
-          <w:i/>
-          <w:iCs/>
-        </w:rPr>
         <w:t>extractSpeakerCues</w:t>
       </w:r>
-      <w:proofErr w:type="spellEnd"/>
-      <w:r>
-        <w:rPr>
-          <w:rFonts w:ascii="Arial" w:hAnsi="Arial" w:cs="Arial"/>
-          <w:i/>
-          <w:iCs/>
-        </w:rPr>
-        <w:t xml:space="preserve">, </w:t>
-      </w:r>
-      <w:proofErr w:type="spellStart"/>
-      <w:r>
-        <w:rPr>
-          <w:rFonts w:ascii="Arial" w:hAnsi="Arial" w:cs="Arial"/>
-          <w:i/>
-          <w:iCs/>
-        </w:rPr>
-        <w:t>extractInlineName</w:t>
-      </w:r>
-      <w:proofErr w:type="spellEnd"/>
-      <w:r>
-        <w:rPr>
-          <w:rFonts w:ascii="Arial" w:hAnsi="Arial" w:cs="Arial"/>
-          <w:i/>
-          <w:iCs/>
-        </w:rPr>
-        <w:t xml:space="preserve">, </w:t>
-      </w:r>
-      <w:proofErr w:type="spellStart"/>
-      <w:r>
-        <w:rPr>
-          <w:rFonts w:ascii="Arial" w:hAnsi="Arial" w:cs="Arial"/>
-          <w:i/>
-          <w:iCs/>
-        </w:rPr>
-        <w:t>extractPersonWord</w:t>
-      </w:r>
-      <w:proofErr w:type="spellEnd"/>
-      <w:r>
-        <w:rPr>
-          <w:rFonts w:ascii="Arial" w:hAnsi="Arial" w:cs="Arial"/>
-          <w:i/>
-          <w:iCs/>
-        </w:rPr>
-        <w:t xml:space="preserve">, and </w:t>
-      </w:r>
-      <w:proofErr w:type="spellStart"/>
-      <w:r>
-        <w:rPr>
-          <w:rFonts w:ascii="Arial" w:hAnsi="Arial" w:cs="Arial"/>
-          <w:i/>
-          <w:iCs/>
-        </w:rPr>
-        <w:t>extractIntroCharacters</w:t>
-      </w:r>
-      <w:proofErr w:type="spellEnd"/>
-      <w:r>
-        <w:rPr>
-          <w:rFonts w:ascii="Arial" w:hAnsi="Arial" w:cs="Arial"/>
-        </w:rPr>
-        <w:t xml:space="preserve">. Several helper methods are also created – </w:t>
-      </w:r>
-      <w:proofErr w:type="spellStart"/>
-      <w:r>
-        <w:rPr>
-          <w:rFonts w:ascii="Arial" w:hAnsi="Arial" w:cs="Arial"/>
-          <w:i/>
-          <w:iCs/>
-        </w:rPr>
-        <w:t>normalizeName</w:t>
-      </w:r>
-      <w:proofErr w:type="spellEnd"/>
-      <w:r>
-        <w:rPr>
-          <w:rFonts w:ascii="Arial" w:hAnsi="Arial" w:cs="Arial"/>
-          <w:i/>
-          <w:iCs/>
-        </w:rPr>
-        <w:t xml:space="preserve">, </w:t>
-      </w:r>
-      <w:proofErr w:type="spellStart"/>
-      <w:r>
-        <w:rPr>
-          <w:rFonts w:ascii="Arial" w:hAnsi="Arial" w:cs="Arial"/>
-          <w:i/>
-          <w:iCs/>
-        </w:rPr>
-        <w:t>normalizeNameInline</w:t>
-      </w:r>
-      <w:proofErr w:type="spellEnd"/>
-      <w:r>
-        <w:rPr>
-          <w:rFonts w:ascii="Arial" w:hAnsi="Arial" w:cs="Arial"/>
-          <w:i/>
-          <w:iCs/>
-        </w:rPr>
-        <w:t xml:space="preserve">, </w:t>
-      </w:r>
-      <w:proofErr w:type="spellStart"/>
-      <w:r>
-        <w:rPr>
-          <w:rFonts w:ascii="Arial" w:hAnsi="Arial" w:cs="Arial"/>
-          <w:i/>
-          <w:iCs/>
-        </w:rPr>
-        <w:t>isCharacterCue</w:t>
-      </w:r>
-      <w:proofErr w:type="spellEnd"/>
-      <w:r>
-        <w:rPr>
-          <w:rFonts w:ascii="Arial" w:hAnsi="Arial" w:cs="Arial"/>
-          <w:i/>
-          <w:iCs/>
-        </w:rPr>
-        <w:t xml:space="preserve">, </w:t>
-      </w:r>
-      <w:proofErr w:type="spellStart"/>
-      <w:r>
-        <w:rPr>
-          <w:rFonts w:ascii="Arial" w:hAnsi="Arial" w:cs="Arial"/>
-          <w:i/>
-          <w:iCs/>
-        </w:rPr>
-        <w:t>isStopPhrase</w:t>
-      </w:r>
-      <w:proofErr w:type="spellEnd"/>
-      <w:r>
-        <w:rPr>
-          <w:rFonts w:ascii="Arial" w:hAnsi="Arial" w:cs="Arial"/>
-          <w:i/>
-          <w:iCs/>
-        </w:rPr>
-        <w:t xml:space="preserve">, and </w:t>
-      </w:r>
-      <w:proofErr w:type="spellStart"/>
-      <w:r>
-        <w:rPr>
-          <w:rFonts w:ascii="Arial" w:hAnsi="Arial" w:cs="Arial"/>
-          <w:i/>
-          <w:iCs/>
-        </w:rPr>
-        <w:t>safeSnippet</w:t>
-      </w:r>
-      <w:proofErr w:type="spellEnd"/>
-      <w:r>
-        <w:rPr>
-          <w:rFonts w:ascii="Arial" w:hAnsi="Arial" w:cs="Arial"/>
-        </w:rPr>
-        <w:t>.</w:t>
-      </w:r>
-      <w:r>
-        <w:rPr>
-          <w:rFonts w:ascii="Arial" w:hAnsi="Arial" w:cs="Arial"/>
-        </w:rPr>
-        <w:t xml:space="preserve"> </w:t>
-      </w:r>
-    </w:p>
-    <w:p>
-      <w:pPr>
-        <w:spacing w:line="360" w:lineRule="auto"/>
-        <w:jc w:val="both"/>
-        <w:rPr>
-          <w:rFonts w:ascii="Arial" w:hAnsi="Arial" w:cs="Arial"/>
-        </w:rPr>
-      </w:pPr>
-    </w:p>
-    <w:p>
-      <w:pPr>
-        <w:spacing w:line="360" w:lineRule="auto"/>
-        <w:jc w:val="both"/>
-        <w:rPr>
-          <w:rFonts w:ascii="Arial" w:hAnsi="Arial" w:cs="Arial"/>
-        </w:rPr>
-      </w:pPr>
-      <w:r>
-        <w:rPr>
-          <w:rFonts w:ascii="Arial" w:hAnsi="Arial" w:cs="Arial"/>
-        </w:rPr>
-        <w:lastRenderedPageBreak/>
-        <w:t xml:space="preserve">The </w:t>
-      </w:r>
-      <w:proofErr w:type="spellStart"/>
-      <w:r>
-        <w:rPr>
-          <w:rFonts w:ascii="Arial" w:hAnsi="Arial" w:cs="Arial"/>
-          <w:i/>
-          <w:iCs/>
-        </w:rPr>
-        <w:t>extractSpeakerCues</w:t>
-      </w:r>
-      <w:proofErr w:type="spellEnd"/>
       <w:r>
         <w:rPr>
           <w:rFonts w:ascii="Arial" w:hAnsi="Arial" w:cs="Arial"/>
@@ -4047,23 +3777,7 @@
                                 <w:sz w:val="20"/>
                                 <w:szCs w:val="20"/>
                               </w:rPr>
-                              <w:t xml:space="preserve"> Pseudocode for </w:t>
-                            </w:r>
-                            <w:proofErr w:type="spellStart"/>
-                            <w:r>
-                              <w:rPr>
-                                <w:sz w:val="20"/>
-                                <w:szCs w:val="20"/>
-                              </w:rPr>
-                              <w:t>isCharacterCue</w:t>
-                            </w:r>
-                            <w:proofErr w:type="spellEnd"/>
-                            <w:r>
-                              <w:rPr>
-                                <w:sz w:val="20"/>
-                                <w:szCs w:val="20"/>
-                              </w:rPr>
-                              <w:t xml:space="preserve"> (string line)</w:t>
+                              <w:t xml:space="preserve"> Pseudocode for isCharacterCue (string line)</w:t>
                             </w:r>
                           </w:p>
                         </w:txbxContent>
@@ -4121,23 +3835,7 @@
                           <w:sz w:val="20"/>
                           <w:szCs w:val="20"/>
                         </w:rPr>
-                        <w:t xml:space="preserve"> Pseudocode for </w:t>
-                      </w:r>
-                      <w:proofErr w:type="spellStart"/>
-                      <w:r>
-                        <w:rPr>
-                          <w:sz w:val="20"/>
-                          <w:szCs w:val="20"/>
-                        </w:rPr>
-                        <w:t>isCharacterCue</w:t>
-                      </w:r>
-                      <w:proofErr w:type="spellEnd"/>
-                      <w:r>
-                        <w:rPr>
-                          <w:sz w:val="20"/>
-                          <w:szCs w:val="20"/>
-                        </w:rPr>
-                        <w:t xml:space="preserve"> (string line)</w:t>
+                        <w:t xml:space="preserve"> Pseudocode for isCharacterCue (string line)</w:t>
                       </w:r>
                     </w:p>
                   </w:txbxContent>
@@ -4229,19 +3927,11 @@
         </w:rPr>
         <w:t xml:space="preserve">the </w:t>
       </w:r>
-      <w:proofErr w:type="spellStart"/>
-      <w:r>
-        <w:rPr>
-          <w:rFonts w:ascii="Arial" w:hAnsi="Arial" w:cs="Arial"/>
-        </w:rPr>
-        <w:t>isCharacterCue</w:t>
-      </w:r>
-      <w:proofErr w:type="spellEnd"/>
-      <w:r>
-        <w:rPr>
-          <w:rFonts w:ascii="Arial" w:hAnsi="Arial" w:cs="Arial"/>
-        </w:rPr>
-        <w:t>(String line) method that is mainly responsible for obtaining characters on the initial heuristics side:</w:t>
+      <w:r>
+        <w:rPr>
+          <w:rFonts w:ascii="Arial" w:hAnsi="Arial" w:cs="Arial"/>
+        </w:rPr>
+        <w:t>isCharacterCue(String line) method that is mainly responsible for obtaining characters on the initial heuristics side:</w:t>
       </w:r>
     </w:p>
     <w:p>
@@ -4322,35 +4012,7 @@
         <w:rPr>
           <w:rFonts w:ascii="Arial" w:hAnsi="Arial" w:cs="Arial"/>
         </w:rPr>
-        <w:t xml:space="preserve">The </w:t>
-      </w:r>
-      <w:proofErr w:type="spellStart"/>
-      <w:r>
-        <w:rPr>
-          <w:rFonts w:ascii="Arial" w:hAnsi="Arial" w:cs="Arial"/>
-        </w:rPr>
-        <w:t>extractInlineNames</w:t>
-      </w:r>
-      <w:proofErr w:type="spellEnd"/>
-      <w:r>
-        <w:rPr>
-          <w:rFonts w:ascii="Arial" w:hAnsi="Arial" w:cs="Arial"/>
-        </w:rPr>
-        <w:t xml:space="preserve"> covers the scenarios of names in a dialogue or scene descriptions. It is using the pre-trained model </w:t>
-      </w:r>
-      <w:proofErr w:type="spellStart"/>
-      <w:r>
-        <w:rPr>
-          <w:rFonts w:ascii="Arial" w:hAnsi="Arial" w:cs="Arial"/>
-        </w:rPr>
-        <w:t>NameFinderME</w:t>
-      </w:r>
-      <w:proofErr w:type="spellEnd"/>
-      <w:r>
-        <w:rPr>
-          <w:rFonts w:ascii="Arial" w:hAnsi="Arial" w:cs="Arial"/>
-        </w:rPr>
-        <w:t>.</w:t>
+        <w:t>The extractInlineNames covers the scenarios of names in a dialogue or scene descriptions. It is using the pre-trained model NameFinderME.</w:t>
       </w:r>
     </w:p>
     <w:p>
@@ -4374,21 +4036,7 @@
         <w:rPr>
           <w:rFonts w:ascii="Arial" w:hAnsi="Arial" w:cs="Arial"/>
         </w:rPr>
-        <w:t xml:space="preserve">The </w:t>
-      </w:r>
-      <w:proofErr w:type="spellStart"/>
-      <w:r>
-        <w:rPr>
-          <w:rFonts w:ascii="Arial" w:hAnsi="Arial" w:cs="Arial"/>
-        </w:rPr>
-        <w:t>extractPersonWord</w:t>
-      </w:r>
-      <w:proofErr w:type="spellEnd"/>
-      <w:r>
-        <w:rPr>
-          <w:rFonts w:ascii="Arial" w:hAnsi="Arial" w:cs="Arial"/>
-        </w:rPr>
-        <w:t xml:space="preserve"> extracts characters which are not proper names for characters that are unnamed. An example of that is </w:t>
+        <w:t xml:space="preserve">The extractPersonWord extracts characters which are not proper names for characters that are unnamed. An example of that is </w:t>
       </w:r>
       <w:r>
         <w:rPr>
@@ -4469,21 +4117,7 @@
         <w:rPr>
           <w:rFonts w:ascii="Arial" w:hAnsi="Arial" w:cs="Arial"/>
         </w:rPr>
-        <w:t xml:space="preserve">The </w:t>
-      </w:r>
-      <w:proofErr w:type="spellStart"/>
-      <w:r>
-        <w:rPr>
-          <w:rFonts w:ascii="Arial" w:hAnsi="Arial" w:cs="Arial"/>
-        </w:rPr>
-        <w:t>extractIntroCharacters</w:t>
-      </w:r>
-      <w:proofErr w:type="spellEnd"/>
-      <w:r>
-        <w:rPr>
-          <w:rFonts w:ascii="Arial" w:hAnsi="Arial" w:cs="Arial"/>
-        </w:rPr>
-        <w:t xml:space="preserve"> method handles situations where the characters are first introduced, as they usually have specific formatting. This is done through matching regex patterns.</w:t>
+        <w:t>The extractIntroCharacters method handles situations where the characters are first introduced, as they usually have specific formatting. This is done through matching regex patterns.</w:t>
       </w:r>
     </w:p>
     <w:p>
@@ -4507,21 +4141,7 @@
         <w:rPr>
           <w:rFonts w:ascii="Arial" w:hAnsi="Arial" w:cs="Arial"/>
         </w:rPr>
-        <w:t xml:space="preserve">The characters are extracted, clustered, and a canonical name is chosen for all. Then, only the unique characters for each scene are reset in the Scene class. This makes them easily viewed in the schedule. However, they would have a specific confidence score threshold they need to pass through because some of the </w:t>
-      </w:r>
-      <w:proofErr w:type="spellStart"/>
-      <w:r>
-        <w:rPr>
-          <w:rFonts w:ascii="Arial" w:hAnsi="Arial" w:cs="Arial"/>
-        </w:rPr>
-        <w:t>NameFinderME</w:t>
-      </w:r>
-      <w:proofErr w:type="spellEnd"/>
-      <w:r>
-        <w:rPr>
-          <w:rFonts w:ascii="Arial" w:hAnsi="Arial" w:cs="Arial"/>
-        </w:rPr>
-        <w:t xml:space="preserve"> findings are occasionally inaccurate. Nonetheless, the goal is also for them to be editable and for the director to see the ones that did not pass the threshold as suggestions. Also, new characters could be added manually by the Assistant Director.</w:t>
+        <w:t>The characters are extracted, clustered, and a canonical name is chosen for all. Then, only the unique characters for each scene are reset in the Scene class. This makes them easily viewed in the schedule. However, they would have a specific confidence score threshold they need to pass through because some of the NameFinderME findings are occasionally inaccurate. Nonetheless, the goal is also for them to be editable and for the director to see the ones that did not pass the threshold as suggestions. Also, new characters could be added manually by the Assistant Director.</w:t>
       </w:r>
     </w:p>
     <w:p>
@@ -4614,7 +4234,6 @@
           <w:color w:val="auto"/>
         </w:rPr>
       </w:pPr>
-      <w:proofErr w:type="spellStart"/>
       <w:r>
         <w:rPr>
           <w:rFonts w:ascii="Arial" w:hAnsi="Arial" w:cs="Arial"/>
@@ -4622,17 +4241,7 @@
           <w:bCs/>
           <w:color w:val="auto"/>
         </w:rPr>
-        <w:t>Levenshtein</w:t>
-      </w:r>
-      <w:proofErr w:type="spellEnd"/>
-      <w:r>
-        <w:rPr>
-          <w:rFonts w:ascii="Arial" w:hAnsi="Arial" w:cs="Arial"/>
-          <w:b/>
-          <w:bCs/>
-          <w:color w:val="auto"/>
-        </w:rPr>
-        <w:t xml:space="preserve"> (Edit) Distance</w:t>
+        <w:t>Levenshtein (Edit) Distance</w:t>
       </w:r>
     </w:p>
     <w:p/>
@@ -4650,19 +4259,11 @@
         </w:rPr>
         <w:t xml:space="preserve">The </w:t>
       </w:r>
-      <w:proofErr w:type="spellStart"/>
-      <w:r>
-        <w:rPr>
-          <w:rFonts w:ascii="Arial" w:hAnsi="Arial" w:cs="Arial"/>
-        </w:rPr>
-        <w:t>Levenshtein</w:t>
-      </w:r>
-      <w:proofErr w:type="spellEnd"/>
-      <w:r>
-        <w:rPr>
-          <w:rFonts w:ascii="Arial" w:hAnsi="Arial" w:cs="Arial"/>
-        </w:rPr>
-        <w:t xml:space="preserve"> (edit) distance</w:t>
+      <w:r>
+        <w:rPr>
+          <w:rFonts w:ascii="Arial" w:hAnsi="Arial" w:cs="Arial"/>
+        </w:rPr>
+        <w:t>Levenshtein (edit) distance</w:t>
       </w:r>
       <w:r>
         <w:rPr>
@@ -4676,12 +4277,14 @@
         </w:rPr>
         <w:t xml:space="preserve"> measures the difference between </w:t>
       </w:r>
+      <w:proofErr w:type="gramStart"/>
       <w:r>
         <w:rPr>
           <w:rFonts w:ascii="Arial" w:hAnsi="Arial" w:cs="Arial"/>
         </w:rPr>
         <w:t>two character</w:t>
       </w:r>
+      <w:proofErr w:type="gramEnd"/>
       <w:r>
         <w:rPr>
           <w:rFonts w:ascii="Arial" w:hAnsi="Arial" w:cs="Arial"/>
@@ -4915,21 +4518,7 @@
         <w:rPr>
           <w:rFonts w:ascii="Arial" w:hAnsi="Arial" w:cs="Arial"/>
         </w:rPr>
-        <w:t xml:space="preserve"> of the essential step of the </w:t>
-      </w:r>
-      <w:proofErr w:type="spellStart"/>
-      <w:r>
-        <w:rPr>
-          <w:rFonts w:ascii="Arial" w:hAnsi="Arial" w:cs="Arial"/>
-        </w:rPr>
-        <w:t>Levenshtein</w:t>
-      </w:r>
-      <w:proofErr w:type="spellEnd"/>
-      <w:r>
-        <w:rPr>
-          <w:rFonts w:ascii="Arial" w:hAnsi="Arial" w:cs="Arial"/>
-        </w:rPr>
-        <w:t xml:space="preserve"> distance algorithm – filling the matrix:</w:t>
+        <w:t xml:space="preserve"> of the essential step of the Levenshtein distance algorithm – filling the matrix:</w:t>
       </w:r>
     </w:p>
     <w:p>
@@ -4994,15 +4583,7 @@
                               <w:t xml:space="preserve">Figure 4: </w:t>
                             </w:r>
                             <w:r>
-                              <w:t xml:space="preserve">Pseudocode of the </w:t>
-                            </w:r>
-                            <w:proofErr w:type="spellStart"/>
-                            <w:r>
-                              <w:t>Levenshtein</w:t>
-                            </w:r>
-                            <w:proofErr w:type="spellEnd"/>
-                            <w:r>
-                              <w:t xml:space="preserve"> distance algorithm</w:t>
+                              <w:t>Pseudocode of the Levenshtein distance algorithm</w:t>
                             </w:r>
                           </w:p>
                         </w:txbxContent>
@@ -5036,15 +4617,7 @@
                         <w:t xml:space="preserve">Figure 4: </w:t>
                       </w:r>
                       <w:r>
-                        <w:t xml:space="preserve">Pseudocode of the </w:t>
-                      </w:r>
-                      <w:proofErr w:type="spellStart"/>
-                      <w:r>
-                        <w:t>Levenshtein</w:t>
-                      </w:r>
-                      <w:proofErr w:type="spellEnd"/>
-                      <w:r>
-                        <w:t xml:space="preserve"> distance algorithm</w:t>
+                        <w:t>Pseudocode of the Levenshtein distance algorithm</w:t>
                       </w:r>
                     </w:p>
                   </w:txbxContent>
@@ -5790,23 +5363,7 @@
                                 <w:sz w:val="20"/>
                                 <w:szCs w:val="20"/>
                               </w:rPr>
-                              <w:t xml:space="preserve">: </w:t>
-                            </w:r>
-                            <w:proofErr w:type="spellStart"/>
-                            <w:r>
-                              <w:rPr>
-                                <w:sz w:val="20"/>
-                                <w:szCs w:val="20"/>
-                              </w:rPr>
-                              <w:t>Levenshtein</w:t>
-                            </w:r>
-                            <w:proofErr w:type="spellEnd"/>
-                            <w:r>
-                              <w:rPr>
-                                <w:sz w:val="20"/>
-                                <w:szCs w:val="20"/>
-                              </w:rPr>
-                              <w:t xml:space="preserve"> distance algorithm example matrix</w:t>
+                              <w:t>: Levenshtein distance algorithm example matrix</w:t>
                             </w:r>
                           </w:p>
                         </w:txbxContent>
@@ -5893,23 +5450,7 @@
                           <w:sz w:val="20"/>
                           <w:szCs w:val="20"/>
                         </w:rPr>
-                        <w:t xml:space="preserve">: </w:t>
-                      </w:r>
-                      <w:proofErr w:type="spellStart"/>
-                      <w:r>
-                        <w:rPr>
-                          <w:sz w:val="20"/>
-                          <w:szCs w:val="20"/>
-                        </w:rPr>
-                        <w:t>Levenshtein</w:t>
-                      </w:r>
-                      <w:proofErr w:type="spellEnd"/>
-                      <w:r>
-                        <w:rPr>
-                          <w:sz w:val="20"/>
-                          <w:szCs w:val="20"/>
-                        </w:rPr>
-                        <w:t xml:space="preserve"> distance algorithm example matrix</w:t>
+                        <w:t>: Levenshtein distance algorithm example matrix</w:t>
                       </w:r>
                     </w:p>
                   </w:txbxContent>
@@ -5952,23 +5493,13 @@
         </w:rPr>
         <w:t xml:space="preserve"> </w:t>
       </w:r>
-      <w:proofErr w:type="spellStart"/>
       <w:r>
         <w:rPr>
           <w:rFonts w:ascii="Arial" w:hAnsi="Arial" w:cs="Arial"/>
           <w:i/>
           <w:iCs/>
         </w:rPr>
-        <w:t>dp</w:t>
-      </w:r>
-      <w:proofErr w:type="spellEnd"/>
-      <w:r>
-        <w:rPr>
-          <w:rFonts w:ascii="Arial" w:hAnsi="Arial" w:cs="Arial"/>
-          <w:i/>
-          <w:iCs/>
-        </w:rPr>
-        <w:t xml:space="preserve"> </w:t>
+        <w:t xml:space="preserve">dp </w:t>
       </w:r>
       <w:r>
         <w:rPr>
@@ -6198,7 +5729,14 @@
         <w:rPr>
           <w:rFonts w:ascii="Arial" w:eastAsiaTheme="minorEastAsia" w:hAnsi="Arial" w:cs="Arial"/>
         </w:rPr>
-        <w:t xml:space="preserve">as a preparation to insert it into the </w:t>
+        <w:t xml:space="preserve">as a preparation to insert it into </w:t>
+      </w:r>
+      <w:proofErr w:type="gramStart"/>
+      <w:r>
+        <w:rPr>
+          <w:rFonts w:ascii="Arial" w:eastAsiaTheme="minorEastAsia" w:hAnsi="Arial" w:cs="Arial"/>
+        </w:rPr>
+        <w:t xml:space="preserve">the </w:t>
       </w:r>
       <w:r>
         <w:rPr>
@@ -6206,7 +5744,16 @@
           <w:i/>
           <w:iCs/>
         </w:rPr>
-        <w:t xml:space="preserve">a </w:t>
+        <w:t>a</w:t>
+      </w:r>
+      <w:proofErr w:type="gramEnd"/>
+      <w:r>
+        <w:rPr>
+          <w:rFonts w:ascii="Arial" w:eastAsiaTheme="minorEastAsia" w:hAnsi="Arial" w:cs="Arial"/>
+          <w:i/>
+          <w:iCs/>
+        </w:rPr>
+        <w:t xml:space="preserve"> </w:t>
       </w:r>
       <w:r>
         <w:rPr>
@@ -7279,7 +6826,21 @@
         <w:rPr>
           <w:rFonts w:ascii="Arial" w:hAnsi="Arial" w:cs="Arial"/>
         </w:rPr>
-        <w:t xml:space="preserve"> or not</w:t>
+        <w:t xml:space="preserve"> </w:t>
+      </w:r>
+      <w:proofErr w:type="gramStart"/>
+      <w:r>
+        <w:rPr>
+          <w:rFonts w:ascii="Arial" w:hAnsi="Arial" w:cs="Arial"/>
+        </w:rPr>
+        <w:t>or</w:t>
+      </w:r>
+      <w:proofErr w:type="gramEnd"/>
+      <w:r>
+        <w:rPr>
+          <w:rFonts w:ascii="Arial" w:hAnsi="Arial" w:cs="Arial"/>
+        </w:rPr>
+        <w:t xml:space="preserve"> not</w:t>
       </w:r>
       <w:r>
         <w:rPr>
@@ -7315,7 +6876,21 @@
         <w:rPr>
           <w:rFonts w:ascii="Arial" w:hAnsi="Arial" w:cs="Arial"/>
         </w:rPr>
-        <w:t xml:space="preserve"> It is based on the Jaro similarity algorithm, including the Winkler prefix adjustment.</w:t>
+        <w:t xml:space="preserve"> It is based on the Jaro </w:t>
+      </w:r>
+      <w:proofErr w:type="gramStart"/>
+      <w:r>
+        <w:rPr>
+          <w:rFonts w:ascii="Arial" w:hAnsi="Arial" w:cs="Arial"/>
+        </w:rPr>
+        <w:t>similarity</w:t>
+      </w:r>
+      <w:proofErr w:type="gramEnd"/>
+      <w:r>
+        <w:rPr>
+          <w:rFonts w:ascii="Arial" w:hAnsi="Arial" w:cs="Arial"/>
+        </w:rPr>
+        <w:t xml:space="preserve"> algorithm, including the Winkler prefix adjustment.</w:t>
       </w:r>
       <w:r>
         <w:rPr>
@@ -7421,13 +6996,27 @@
         <w:rPr>
           <w:rFonts w:ascii="Arial" w:hAnsi="Arial" w:cs="Arial"/>
         </w:rPr>
-        <w:t xml:space="preserve">The algorithm starts with lowercasing both of the </w:t>
-      </w:r>
-      <w:r>
-        <w:rPr>
-          <w:rFonts w:ascii="Arial" w:hAnsi="Arial" w:cs="Arial"/>
-        </w:rPr>
-        <w:t>strings,</w:t>
+        <w:t xml:space="preserve">The algorithm starts with lowercasing </w:t>
+      </w:r>
+      <w:proofErr w:type="gramStart"/>
+      <w:r>
+        <w:rPr>
+          <w:rFonts w:ascii="Arial" w:hAnsi="Arial" w:cs="Arial"/>
+        </w:rPr>
+        <w:t xml:space="preserve">both of the </w:t>
+      </w:r>
+      <w:r>
+        <w:rPr>
+          <w:rFonts w:ascii="Arial" w:hAnsi="Arial" w:cs="Arial"/>
+        </w:rPr>
+        <w:t>strings</w:t>
+      </w:r>
+      <w:proofErr w:type="gramEnd"/>
+      <w:r>
+        <w:rPr>
+          <w:rFonts w:ascii="Arial" w:hAnsi="Arial" w:cs="Arial"/>
+        </w:rPr>
+        <w:t>,</w:t>
       </w:r>
       <w:r>
         <w:rPr>
@@ -7439,7 +7028,21 @@
         <w:rPr>
           <w:rFonts w:ascii="Arial" w:hAnsi="Arial" w:cs="Arial"/>
         </w:rPr>
-        <w:t xml:space="preserve"> It checks if the strings match completely and returns 1. However, in most cases, the algorithm continues. In order for the letters to match, they need to be in a similar position in both strings. This is why the algorithm calculates the maximum distance two characters</w:t>
+        <w:t xml:space="preserve"> It checks if the strings match completely and returns 1. However, in most cases, the algorithm continues. </w:t>
+      </w:r>
+      <w:proofErr w:type="gramStart"/>
+      <w:r>
+        <w:rPr>
+          <w:rFonts w:ascii="Arial" w:hAnsi="Arial" w:cs="Arial"/>
+        </w:rPr>
+        <w:t>In order for</w:t>
+      </w:r>
+      <w:proofErr w:type="gramEnd"/>
+      <w:r>
+        <w:rPr>
+          <w:rFonts w:ascii="Arial" w:hAnsi="Arial" w:cs="Arial"/>
+        </w:rPr>
+        <w:t xml:space="preserve"> the letters to match, they need to be in a similar position in both strings. This is why the algorithm calculates the maximum distance two characters</w:t>
       </w:r>
       <w:r>
         <w:rPr>
@@ -7956,21 +7559,7 @@
         <w:rPr>
           <w:rFonts w:ascii="Arial" w:hAnsi="Arial" w:cs="Arial"/>
         </w:rPr>
-        <w:t xml:space="preserve">If the match exists, it searches for another matched string in the other </w:t>
-      </w:r>
-      <w:proofErr w:type="spellStart"/>
-      <w:r>
-        <w:rPr>
-          <w:rFonts w:ascii="Arial" w:hAnsi="Arial" w:cs="Arial"/>
-        </w:rPr>
-        <w:t>boolean</w:t>
-      </w:r>
-      <w:proofErr w:type="spellEnd"/>
-      <w:r>
-        <w:rPr>
-          <w:rFonts w:ascii="Arial" w:hAnsi="Arial" w:cs="Arial"/>
-        </w:rPr>
-        <w:t xml:space="preserve"> array. If the characters are not the same, then the transposition count increases.</w:t>
+        <w:t>If the match exists, it searches for another matched string in the other boolean array. If the characters are not the same, then the transposition count increases.</w:t>
       </w:r>
     </w:p>
     <w:p>
@@ -7990,11 +7579,19 @@
           <w:rFonts w:ascii="Arial" w:hAnsi="Arial" w:cs="Arial"/>
         </w:rPr>
       </w:pPr>
-      <w:r>
-        <w:rPr>
-          <w:rFonts w:ascii="Arial" w:hAnsi="Arial" w:cs="Arial"/>
-        </w:rPr>
-        <w:t>In order to find the Jaro similarity, the following formula is used:</w:t>
+      <w:proofErr w:type="gramStart"/>
+      <w:r>
+        <w:rPr>
+          <w:rFonts w:ascii="Arial" w:hAnsi="Arial" w:cs="Arial"/>
+        </w:rPr>
+        <w:t>In order to</w:t>
+      </w:r>
+      <w:proofErr w:type="gramEnd"/>
+      <w:r>
+        <w:rPr>
+          <w:rFonts w:ascii="Arial" w:hAnsi="Arial" w:cs="Arial"/>
+        </w:rPr>
+        <w:t xml:space="preserve"> find the Jaro similarity, the following formula is used:</w:t>
       </w:r>
     </w:p>
     <w:p>
@@ -8184,7 +7781,21 @@
         <w:rPr>
           <w:rFonts w:ascii="Arial" w:hAnsi="Arial" w:cs="Arial"/>
         </w:rPr>
-        <w:t>m is the number of all matching characters.</w:t>
+        <w:t xml:space="preserve">m is the number of </w:t>
+      </w:r>
+      <w:proofErr w:type="gramStart"/>
+      <w:r>
+        <w:rPr>
+          <w:rFonts w:ascii="Arial" w:hAnsi="Arial" w:cs="Arial"/>
+        </w:rPr>
+        <w:t>all matching</w:t>
+      </w:r>
+      <w:proofErr w:type="gramEnd"/>
+      <w:r>
+        <w:rPr>
+          <w:rFonts w:ascii="Arial" w:hAnsi="Arial" w:cs="Arial"/>
+        </w:rPr>
+        <w:t xml:space="preserve"> characters.</w:t>
       </w:r>
     </w:p>
     <w:p>
@@ -8200,11 +7811,19 @@
           <w:rFonts w:ascii="Arial" w:hAnsi="Arial" w:cs="Arial"/>
         </w:rPr>
       </w:pPr>
-      <w:r>
-        <w:rPr>
-          <w:rFonts w:ascii="Arial" w:hAnsi="Arial" w:cs="Arial"/>
-        </w:rPr>
-        <w:t>t is half of the number of transpositions</w:t>
+      <w:proofErr w:type="gramStart"/>
+      <w:r>
+        <w:rPr>
+          <w:rFonts w:ascii="Arial" w:hAnsi="Arial" w:cs="Arial"/>
+        </w:rPr>
+        <w:t>t is</w:t>
+      </w:r>
+      <w:proofErr w:type="gramEnd"/>
+      <w:r>
+        <w:rPr>
+          <w:rFonts w:ascii="Arial" w:hAnsi="Arial" w:cs="Arial"/>
+        </w:rPr>
+        <w:t xml:space="preserve"> half of the number of transpositions</w:t>
       </w:r>
     </w:p>
     <w:p>
@@ -8378,7 +7997,21 @@
         <w:rPr>
           <w:rFonts w:ascii="Arial" w:hAnsi="Arial" w:cs="Arial"/>
         </w:rPr>
-        <w:t>SW is the Jaro-Winkler similarity.</w:t>
+        <w:t xml:space="preserve">SW is the </w:t>
+      </w:r>
+      <w:proofErr w:type="gramStart"/>
+      <w:r>
+        <w:rPr>
+          <w:rFonts w:ascii="Arial" w:hAnsi="Arial" w:cs="Arial"/>
+        </w:rPr>
+        <w:t>Jaro-Winkler similarity</w:t>
+      </w:r>
+      <w:proofErr w:type="gramEnd"/>
+      <w:r>
+        <w:rPr>
+          <w:rFonts w:ascii="Arial" w:hAnsi="Arial" w:cs="Arial"/>
+        </w:rPr>
+        <w:t>.</w:t>
       </w:r>
     </w:p>
     <w:p>
@@ -8645,13 +8278,29 @@
           <w:i/>
           <w:iCs/>
         </w:rPr>
-        <w:t>Big Break!</w:t>
-      </w:r>
-      <w:r>
-        <w:rPr>
-          <w:rFonts w:ascii="Arial" w:hAnsi="Arial" w:cs="Arial"/>
-        </w:rPr>
-        <w:t>, the</w:t>
+        <w:t xml:space="preserve">Big </w:t>
+      </w:r>
+      <w:proofErr w:type="gramStart"/>
+      <w:r>
+        <w:rPr>
+          <w:rFonts w:ascii="Arial" w:hAnsi="Arial" w:cs="Arial"/>
+          <w:i/>
+          <w:iCs/>
+        </w:rPr>
+        <w:t>Break!</w:t>
+      </w:r>
+      <w:r>
+        <w:rPr>
+          <w:rFonts w:ascii="Arial" w:hAnsi="Arial" w:cs="Arial"/>
+        </w:rPr>
+        <w:t>,</w:t>
+      </w:r>
+      <w:proofErr w:type="gramEnd"/>
+      <w:r>
+        <w:rPr>
+          <w:rFonts w:ascii="Arial" w:hAnsi="Arial" w:cs="Arial"/>
+        </w:rPr>
+        <w:t xml:space="preserve"> the</w:t>
       </w:r>
       <w:r>
         <w:rPr>
@@ -8816,32 +8465,64 @@
           <w:i/>
           <w:iCs/>
         </w:rPr>
-        <w:t xml:space="preserve">Big Break!, </w:t>
-      </w:r>
-      <w:r>
-        <w:rPr>
-          <w:rFonts w:ascii="Arial" w:hAnsi="Arial" w:cs="Arial"/>
-        </w:rPr>
-        <w:t>the</w:t>
-      </w:r>
-      <w:r>
-        <w:rPr>
-          <w:rFonts w:ascii="Arial" w:hAnsi="Arial" w:cs="Arial"/>
-        </w:rPr>
-        <w:t xml:space="preserve"> shooting days are 12-hour days, and around 5 pages are shot per day. This equates to around 40 eighths per day.</w:t>
-      </w:r>
-      <w:r>
-        <w:rPr>
-          <w:rFonts w:ascii="Arial" w:hAnsi="Arial" w:cs="Arial"/>
-        </w:rPr>
-        <w:t xml:space="preserve"> With the understanding that overtime is occasionally useful for a production, </w:t>
-      </w:r>
+        <w:t xml:space="preserve">Big </w:t>
+      </w:r>
+      <w:proofErr w:type="gramStart"/>
       <w:r>
         <w:rPr>
           <w:rFonts w:ascii="Arial" w:hAnsi="Arial" w:cs="Arial"/>
           <w:i/>
           <w:iCs/>
         </w:rPr>
+        <w:t>Break!,</w:t>
+      </w:r>
+      <w:proofErr w:type="gramEnd"/>
+      <w:r>
+        <w:rPr>
+          <w:rFonts w:ascii="Arial" w:hAnsi="Arial" w:cs="Arial"/>
+          <w:i/>
+          <w:iCs/>
+        </w:rPr>
+        <w:t xml:space="preserve"> </w:t>
+      </w:r>
+      <w:r>
+        <w:rPr>
+          <w:rFonts w:ascii="Arial" w:hAnsi="Arial" w:cs="Arial"/>
+        </w:rPr>
+        <w:t>the</w:t>
+      </w:r>
+      <w:r>
+        <w:rPr>
+          <w:rFonts w:ascii="Arial" w:hAnsi="Arial" w:cs="Arial"/>
+        </w:rPr>
+        <w:t xml:space="preserve"> shooting days are 12-hour days, and around 5 pages are shot per day. This equates to around 40 eighths per day.</w:t>
+      </w:r>
+      <w:r>
+        <w:rPr>
+          <w:rFonts w:ascii="Arial" w:hAnsi="Arial" w:cs="Arial"/>
+        </w:rPr>
+        <w:t xml:space="preserve"> With the understanding that overtime is occasionally useful for </w:t>
+      </w:r>
+      <w:proofErr w:type="gramStart"/>
+      <w:r>
+        <w:rPr>
+          <w:rFonts w:ascii="Arial" w:hAnsi="Arial" w:cs="Arial"/>
+        </w:rPr>
+        <w:t>a production</w:t>
+      </w:r>
+      <w:proofErr w:type="gramEnd"/>
+      <w:r>
+        <w:rPr>
+          <w:rFonts w:ascii="Arial" w:hAnsi="Arial" w:cs="Arial"/>
+        </w:rPr>
+        <w:t xml:space="preserve">, </w:t>
+      </w:r>
+      <w:r>
+        <w:rPr>
+          <w:rFonts w:ascii="Arial" w:hAnsi="Arial" w:cs="Arial"/>
+          <w:i/>
+          <w:iCs/>
+        </w:rPr>
         <w:t xml:space="preserve">Big Break! </w:t>
       </w:r>
       <w:r>
@@ -8908,7 +8589,21 @@
         <w:rPr>
           <w:rFonts w:ascii="Arial" w:hAnsi="Arial" w:cs="Arial"/>
         </w:rPr>
-        <w:t xml:space="preserve"> 8 eighths or 1 page. This is not reflected in the final page count for the day, so it is more easily digestible by the user. However, it is taken into account when computing time limits per day.</w:t>
+        <w:t xml:space="preserve"> 8 eighths or 1 page. This is not reflected in the final page count for the day, so it is more easily digestible by the user. However, it is </w:t>
+      </w:r>
+      <w:proofErr w:type="gramStart"/>
+      <w:r>
+        <w:rPr>
+          <w:rFonts w:ascii="Arial" w:hAnsi="Arial" w:cs="Arial"/>
+        </w:rPr>
+        <w:t>taken into account</w:t>
+      </w:r>
+      <w:proofErr w:type="gramEnd"/>
+      <w:r>
+        <w:rPr>
+          <w:rFonts w:ascii="Arial" w:hAnsi="Arial" w:cs="Arial"/>
+        </w:rPr>
+        <w:t xml:space="preserve"> when computing time limits per day.</w:t>
       </w:r>
     </w:p>
     <w:p>
@@ -9140,13 +8835,29 @@
           <w:i/>
           <w:iCs/>
         </w:rPr>
-        <w:t>Big Break!</w:t>
-      </w:r>
-      <w:r>
-        <w:rPr>
-          <w:rFonts w:ascii="Arial" w:eastAsiaTheme="minorEastAsia" w:hAnsi="Arial" w:cs="Arial"/>
-        </w:rPr>
-        <w:t xml:space="preserve">, </w:t>
+        <w:t xml:space="preserve">Big </w:t>
+      </w:r>
+      <w:proofErr w:type="gramStart"/>
+      <w:r>
+        <w:rPr>
+          <w:rFonts w:ascii="Arial" w:eastAsiaTheme="minorEastAsia" w:hAnsi="Arial" w:cs="Arial"/>
+          <w:i/>
+          <w:iCs/>
+        </w:rPr>
+        <w:t>Break!</w:t>
+      </w:r>
+      <w:r>
+        <w:rPr>
+          <w:rFonts w:ascii="Arial" w:eastAsiaTheme="minorEastAsia" w:hAnsi="Arial" w:cs="Arial"/>
+        </w:rPr>
+        <w:t>,</w:t>
+      </w:r>
+      <w:proofErr w:type="gramEnd"/>
+      <w:r>
+        <w:rPr>
+          <w:rFonts w:ascii="Arial" w:eastAsiaTheme="minorEastAsia" w:hAnsi="Arial" w:cs="Arial"/>
+        </w:rPr>
+        <w:t xml:space="preserve"> </w:t>
       </w:r>
       <w:r>
         <w:rPr>
@@ -9484,16 +9195,16 @@
         <w:rPr>
           <w:rFonts w:ascii="Arial" w:eastAsiaTheme="minorEastAsia" w:hAnsi="Arial" w:cs="Arial"/>
         </w:rPr>
-        <w:t xml:space="preserve">using a </w:t>
-      </w:r>
-      <w:proofErr w:type="spellStart"/>
-      <w:r>
-        <w:rPr>
-          <w:rFonts w:ascii="Arial" w:eastAsiaTheme="minorEastAsia" w:hAnsi="Arial" w:cs="Arial"/>
-        </w:rPr>
-        <w:t>LinkedHashMap</w:t>
-      </w:r>
-      <w:proofErr w:type="spellEnd"/>
+        <w:t xml:space="preserve">using </w:t>
+      </w:r>
+      <w:proofErr w:type="gramStart"/>
+      <w:r>
+        <w:rPr>
+          <w:rFonts w:ascii="Arial" w:eastAsiaTheme="minorEastAsia" w:hAnsi="Arial" w:cs="Arial"/>
+        </w:rPr>
+        <w:t>a LinkedHashMap</w:t>
+      </w:r>
+      <w:proofErr w:type="gramEnd"/>
       <w:r>
         <w:rPr>
           <w:rFonts w:ascii="Arial" w:eastAsiaTheme="minorEastAsia" w:hAnsi="Arial" w:cs="Arial"/>
@@ -10206,7 +9917,49 @@
         <w:rPr>
           <w:rFonts w:ascii="Arial" w:eastAsiaTheme="minorEastAsia" w:hAnsi="Arial" w:cs="Arial"/>
         </w:rPr>
-        <w:t>Resource capacity will be added later as the function might be readjusted.</w:t>
+        <w:t>The resource capacity encourages fuller days while penalizing going into overtime. It computes the load of the day so far, adding to it the current scene. Then, it computes a ratio score, relative to the maximum number of pages per day before overtime (40 eighths per day). If the ratio is larger than 1.0, this means that the day has gone into overtime and a -200 penalty is introduced to the score. If the ratio is smaller than 1.0, the score is boosted by ratio * 200. This flattening of the positive score is implemented</w:t>
+      </w:r>
+      <w:r>
+        <w:rPr>
+          <w:rFonts w:ascii="Arial" w:eastAsiaTheme="minorEastAsia" w:hAnsi="Arial" w:cs="Arial"/>
+        </w:rPr>
+        <w:t xml:space="preserve"> to relate directly to the load of the day so far. In addition,</w:t>
+      </w:r>
+      <w:r>
+        <w:rPr>
+          <w:rFonts w:ascii="Arial" w:eastAsiaTheme="minorEastAsia" w:hAnsi="Arial" w:cs="Arial"/>
+        </w:rPr>
+        <w:t xml:space="preserve"> </w:t>
+      </w:r>
+      <w:r>
+        <w:rPr>
+          <w:rFonts w:ascii="Arial" w:eastAsiaTheme="minorEastAsia" w:hAnsi="Arial" w:cs="Arial"/>
+        </w:rPr>
+        <w:t>it boosts moderately</w:t>
+      </w:r>
+      <w:r>
+        <w:rPr>
+          <w:rFonts w:ascii="Arial" w:eastAsiaTheme="minorEastAsia" w:hAnsi="Arial" w:cs="Arial"/>
+        </w:rPr>
+        <w:t>,</w:t>
+      </w:r>
+      <w:r>
+        <w:rPr>
+          <w:rFonts w:ascii="Arial" w:eastAsiaTheme="minorEastAsia" w:hAnsi="Arial" w:cs="Arial"/>
+        </w:rPr>
+        <w:t xml:space="preserve"> </w:t>
+      </w:r>
+      <w:r>
+        <w:rPr>
+          <w:rFonts w:ascii="Arial" w:eastAsiaTheme="minorEastAsia" w:hAnsi="Arial" w:cs="Arial"/>
+        </w:rPr>
+        <w:t>corresponding to the priority of the</w:t>
+      </w:r>
+      <w:r>
+        <w:rPr>
+          <w:rFonts w:ascii="Arial" w:eastAsiaTheme="minorEastAsia" w:hAnsi="Arial" w:cs="Arial"/>
+        </w:rPr>
+        <w:t xml:space="preserve"> resource capacity compared to other constraints.</w:t>
       </w:r>
     </w:p>
     <w:p>
@@ -10250,6 +10003,7 @@
         <w:rPr>
           <w:rFonts w:ascii="Arial" w:eastAsiaTheme="minorEastAsia" w:hAnsi="Arial" w:cs="Arial"/>
         </w:rPr>
+        <w:lastRenderedPageBreak/>
         <w:t>The order score computes the script distance bet</w:t>
       </w:r>
       <w:r>
@@ -10301,6 +10055,160 @@
           <w:rFonts w:ascii="Arial" w:eastAsiaTheme="minorEastAsia" w:hAnsi="Arial" w:cs="Arial"/>
         </w:rPr>
         <w:t xml:space="preserve"> gets the absolute value of that and negates it, making larger distances create bigger penalties.</w:t>
+      </w:r>
+    </w:p>
+    <w:p>
+      <w:pPr>
+        <w:spacing w:line="360" w:lineRule="auto"/>
+        <w:rPr>
+          <w:rFonts w:ascii="Arial" w:eastAsiaTheme="minorEastAsia" w:hAnsi="Arial" w:cs="Arial"/>
+        </w:rPr>
+      </w:pPr>
+    </w:p>
+    <w:p>
+      <w:pPr>
+        <w:spacing w:line="360" w:lineRule="auto"/>
+        <w:rPr>
+          <w:rFonts w:ascii="Arial" w:eastAsiaTheme="minorEastAsia" w:hAnsi="Arial" w:cs="Arial"/>
+        </w:rPr>
+      </w:pPr>
+      <w:r>
+        <w:rPr>
+          <w:rFonts w:ascii="Arial" w:eastAsiaTheme="minorEastAsia" w:hAnsi="Arial" w:cs="Arial"/>
+        </w:rPr>
+        <w:t>A scene is scheduled in two ways – either by being not feasible anywhere or by choosing the day with the highest score. Both check all hard rules that were previously discussed for each day for the current scene.</w:t>
+      </w:r>
+    </w:p>
+    <w:p>
+      <w:pPr>
+        <w:spacing w:line="360" w:lineRule="auto"/>
+        <w:rPr>
+          <w:rFonts w:ascii="Arial" w:eastAsiaTheme="minorEastAsia" w:hAnsi="Arial" w:cs="Arial"/>
+        </w:rPr>
+      </w:pPr>
+    </w:p>
+    <w:p>
+      <w:pPr>
+        <w:spacing w:line="360" w:lineRule="auto"/>
+        <w:rPr>
+          <w:rFonts w:ascii="Arial" w:eastAsiaTheme="minorEastAsia" w:hAnsi="Arial" w:cs="Arial"/>
+        </w:rPr>
+      </w:pPr>
+      <w:r>
+        <w:rPr>
+          <w:rFonts w:ascii="Arial" w:eastAsiaTheme="minorEastAsia" w:hAnsi="Arial" w:cs="Arial"/>
+        </w:rPr>
+        <w:t xml:space="preserve">In the first case, </w:t>
+      </w:r>
+      <w:r>
+        <w:rPr>
+          <w:rFonts w:ascii="Arial" w:eastAsiaTheme="minorEastAsia" w:hAnsi="Arial" w:cs="Arial"/>
+        </w:rPr>
+        <w:t xml:space="preserve">the scene does not meet all the requirements of any day, so a new day is created for it. The initial shooting </w:t>
+      </w:r>
+      <w:proofErr w:type="gramStart"/>
+      <w:r>
+        <w:rPr>
+          <w:rFonts w:ascii="Arial" w:eastAsiaTheme="minorEastAsia" w:hAnsi="Arial" w:cs="Arial"/>
+        </w:rPr>
+        <w:t>day time</w:t>
+      </w:r>
+      <w:proofErr w:type="gramEnd"/>
+      <w:r>
+        <w:rPr>
+          <w:rFonts w:ascii="Arial" w:eastAsiaTheme="minorEastAsia" w:hAnsi="Arial" w:cs="Arial"/>
+        </w:rPr>
+        <w:t xml:space="preserve"> is assigned depending on whether the scene is DAY or NIGHT. </w:t>
+      </w:r>
+      <w:r>
+        <w:rPr>
+          <w:rFonts w:ascii="Arial" w:eastAsiaTheme="minorEastAsia" w:hAnsi="Arial" w:cs="Arial"/>
+        </w:rPr>
+        <w:t xml:space="preserve">It then maps </w:t>
+      </w:r>
+      <w:r>
+        <w:rPr>
+          <w:rFonts w:ascii="Arial" w:eastAsiaTheme="minorEastAsia" w:hAnsi="Arial" w:cs="Arial"/>
+        </w:rPr>
+        <w:t>high- and low-confidence character names to display-specific fields so they can be easily updated by the user via the graphical user interface.</w:t>
+      </w:r>
+      <w:r>
+        <w:rPr>
+          <w:rFonts w:ascii="Arial" w:eastAsiaTheme="minorEastAsia" w:hAnsi="Arial" w:cs="Arial"/>
+        </w:rPr>
+        <w:t xml:space="preserve"> Additionally, the move state is initially set to NO_MOVE, as no other locations have been added.</w:t>
+      </w:r>
+    </w:p>
+    <w:p>
+      <w:pPr>
+        <w:spacing w:line="360" w:lineRule="auto"/>
+        <w:rPr>
+          <w:rFonts w:ascii="Arial" w:eastAsiaTheme="minorEastAsia" w:hAnsi="Arial" w:cs="Arial"/>
+        </w:rPr>
+      </w:pPr>
+    </w:p>
+    <w:p>
+      <w:pPr>
+        <w:spacing w:line="360" w:lineRule="auto"/>
+        <w:rPr>
+          <w:rFonts w:ascii="Arial" w:eastAsiaTheme="minorEastAsia" w:hAnsi="Arial" w:cs="Arial"/>
+        </w:rPr>
+      </w:pPr>
+      <w:r>
+        <w:rPr>
+          <w:rFonts w:ascii="Arial" w:eastAsiaTheme="minorEastAsia" w:hAnsi="Arial" w:cs="Arial"/>
+        </w:rPr>
+        <w:t>In the second case, the scene fulfills the feasibility requirements of at least one day. It computes the scores of the priority constraint functions and chooses the best one for scheduling the current scene. It chec</w:t>
+      </w:r>
+      <w:r>
+        <w:rPr>
+          <w:rFonts w:ascii="Arial" w:eastAsiaTheme="minorEastAsia" w:hAnsi="Arial" w:cs="Arial"/>
+        </w:rPr>
+        <w:t xml:space="preserve">ks if the location of the scene is different from the rest and assigns its state to MOVE. Moreover, if a location move occurs, it adds 8 eighths to the current eighths of the day. The reason for that is that moving location during the shooting day takes time, but for bigger productions, it may be inevitable. In this scenario, the software checks if a NIGHT scene would cause the shooting </w:t>
+      </w:r>
+      <w:proofErr w:type="gramStart"/>
+      <w:r>
+        <w:rPr>
+          <w:rFonts w:ascii="Arial" w:eastAsiaTheme="minorEastAsia" w:hAnsi="Arial" w:cs="Arial"/>
+        </w:rPr>
+        <w:t>day time</w:t>
+      </w:r>
+      <w:proofErr w:type="gramEnd"/>
+      <w:r>
+        <w:rPr>
+          <w:rFonts w:ascii="Arial" w:eastAsiaTheme="minorEastAsia" w:hAnsi="Arial" w:cs="Arial"/>
+        </w:rPr>
+        <w:t xml:space="preserve"> to switch from DAY to DAY_NIGHT. This is realistic for film productions as it preserves time and creates smoother transitions.</w:t>
+      </w:r>
+      <w:r>
+        <w:rPr>
+          <w:rFonts w:ascii="Arial" w:eastAsiaTheme="minorEastAsia" w:hAnsi="Arial" w:cs="Arial"/>
+        </w:rPr>
+        <w:t xml:space="preserve"> Then, the high- and low-confidence characters are mapped in the same manner as case one</w:t>
+      </w:r>
+      <w:r>
+        <w:rPr>
+          <w:rFonts w:ascii="Arial" w:eastAsiaTheme="minorEastAsia" w:hAnsi="Arial" w:cs="Arial"/>
+        </w:rPr>
+        <w:t>,</w:t>
+      </w:r>
+      <w:r>
+        <w:rPr>
+          <w:rFonts w:ascii="Arial" w:eastAsiaTheme="minorEastAsia" w:hAnsi="Arial" w:cs="Arial"/>
+        </w:rPr>
+        <w:t xml:space="preserve"> and the scene is added</w:t>
+      </w:r>
+      <w:r>
+        <w:rPr>
+          <w:rFonts w:ascii="Arial" w:eastAsiaTheme="minorEastAsia" w:hAnsi="Arial" w:cs="Arial"/>
+        </w:rPr>
+        <w:t xml:space="preserve"> to the most suitable day</w:t>
+      </w:r>
+      <w:r>
+        <w:rPr>
+          <w:rFonts w:ascii="Arial" w:eastAsiaTheme="minorEastAsia" w:hAnsi="Arial" w:cs="Arial"/>
+        </w:rPr>
+        <w:t>.</w:t>
       </w:r>
     </w:p>
     <w:p>
@@ -10401,13 +10309,29 @@
           <w:i/>
           <w:iCs/>
         </w:rPr>
-        <w:t>Big Break!</w:t>
-      </w:r>
-      <w:r>
-        <w:rPr>
-          <w:rFonts w:ascii="Arial" w:hAnsi="Arial" w:cs="Arial"/>
-        </w:rPr>
-        <w:t>, the Trie (Prefix Tree) data structure is used to compare extracted names to common first and last names. It avoids repeated linear searches over large name lists and supports fast prefix-based lookup.</w:t>
+        <w:t xml:space="preserve">Big </w:t>
+      </w:r>
+      <w:proofErr w:type="gramStart"/>
+      <w:r>
+        <w:rPr>
+          <w:rFonts w:ascii="Arial" w:hAnsi="Arial" w:cs="Arial"/>
+          <w:i/>
+          <w:iCs/>
+        </w:rPr>
+        <w:t>Break!</w:t>
+      </w:r>
+      <w:r>
+        <w:rPr>
+          <w:rFonts w:ascii="Arial" w:hAnsi="Arial" w:cs="Arial"/>
+        </w:rPr>
+        <w:t>,</w:t>
+      </w:r>
+      <w:proofErr w:type="gramEnd"/>
+      <w:r>
+        <w:rPr>
+          <w:rFonts w:ascii="Arial" w:hAnsi="Arial" w:cs="Arial"/>
+        </w:rPr>
+        <w:t xml:space="preserve"> the Trie (Prefix Tree) data structure is used to compare extracted names to common first and last names. It avoids repeated linear searches over large name lists and supports fast prefix-based lookup.</w:t>
       </w:r>
     </w:p>
     <w:p>
@@ -10445,61 +10369,111 @@
         </w:rPr>
         <w:t xml:space="preserve"> A Boolean </w:t>
       </w:r>
-      <w:proofErr w:type="spellStart"/>
       <w:r>
         <w:rPr>
           <w:rFonts w:ascii="Arial" w:hAnsi="Arial" w:cs="Arial"/>
           <w:i/>
           <w:iCs/>
         </w:rPr>
-        <w:t>isWord</w:t>
-      </w:r>
-      <w:proofErr w:type="spellEnd"/>
-      <w:r>
+        <w:t xml:space="preserve">isWord </w:t>
+      </w:r>
+      <w:r>
+        <w:rPr>
+          <w:rFonts w:ascii="Arial" w:hAnsi="Arial" w:cs="Arial"/>
+        </w:rPr>
+        <w:t>variable is introduced to track whether the path from the root to the current node forms a complete, valid word.</w:t>
+      </w:r>
+      <w:r>
+        <w:rPr>
+          <w:rFonts w:ascii="Arial" w:hAnsi="Arial" w:cs="Arial"/>
+        </w:rPr>
+        <w:t xml:space="preserve"> The operations executed are </w:t>
+      </w:r>
+      <w:proofErr w:type="gramStart"/>
+      <w:r>
+        <w:rPr>
+          <w:rFonts w:ascii="Arial" w:hAnsi="Arial" w:cs="Arial"/>
+        </w:rPr>
+        <w:t>insert</w:t>
+      </w:r>
+      <w:proofErr w:type="gramEnd"/>
+      <w:r>
+        <w:rPr>
+          <w:rFonts w:ascii="Arial" w:hAnsi="Arial" w:cs="Arial"/>
+        </w:rPr>
+        <w:t xml:space="preserve"> and </w:t>
+      </w:r>
+      <w:proofErr w:type="gramStart"/>
+      <w:r>
+        <w:rPr>
+          <w:rFonts w:ascii="Arial" w:hAnsi="Arial" w:cs="Arial"/>
+        </w:rPr>
+        <w:t>contain</w:t>
+      </w:r>
+      <w:proofErr w:type="gramEnd"/>
+      <w:r>
+        <w:rPr>
+          <w:rFonts w:ascii="Arial" w:hAnsi="Arial" w:cs="Arial"/>
+        </w:rPr>
+        <w:t>.</w:t>
+      </w:r>
+    </w:p>
+    <w:p>
+      <w:pPr>
+        <w:spacing w:line="360" w:lineRule="auto"/>
+        <w:jc w:val="both"/>
+        <w:rPr>
+          <w:rFonts w:ascii="Arial" w:hAnsi="Arial" w:cs="Arial"/>
+        </w:rPr>
+      </w:pPr>
+    </w:p>
+    <w:p>
+      <w:pPr>
+        <w:spacing w:line="360" w:lineRule="auto"/>
+        <w:jc w:val="both"/>
         <w:rPr>
           <w:rFonts w:ascii="Arial" w:hAnsi="Arial" w:cs="Arial"/>
           <w:i/>
           <w:iCs/>
         </w:rPr>
-        <w:t xml:space="preserve"> </w:t>
-      </w:r>
-      <w:r>
-        <w:rPr>
-          <w:rFonts w:ascii="Arial" w:hAnsi="Arial" w:cs="Arial"/>
-        </w:rPr>
-        <w:t>variable is introduced to track whether the path from the root to the current node forms a complete, valid word.</w:t>
-      </w:r>
-      <w:r>
-        <w:rPr>
-          <w:rFonts w:ascii="Arial" w:hAnsi="Arial" w:cs="Arial"/>
-        </w:rPr>
-        <w:t xml:space="preserve"> The operations executed are insert and contain.</w:t>
-      </w:r>
-    </w:p>
-    <w:p>
-      <w:pPr>
-        <w:spacing w:line="360" w:lineRule="auto"/>
-        <w:jc w:val="both"/>
-        <w:rPr>
-          <w:rFonts w:ascii="Arial" w:hAnsi="Arial" w:cs="Arial"/>
-        </w:rPr>
-      </w:pPr>
-    </w:p>
-    <w:p>
-      <w:pPr>
-        <w:spacing w:line="360" w:lineRule="auto"/>
-        <w:jc w:val="both"/>
+      </w:pPr>
+      <w:r>
+        <w:rPr>
+          <w:rFonts w:ascii="Arial" w:hAnsi="Arial" w:cs="Arial"/>
+        </w:rPr>
+        <w:t xml:space="preserve">In the </w:t>
+      </w:r>
+      <w:r>
         <w:rPr>
           <w:rFonts w:ascii="Arial" w:hAnsi="Arial" w:cs="Arial"/>
           <w:i/>
           <w:iCs/>
         </w:rPr>
-      </w:pPr>
-      <w:r>
-        <w:rPr>
-          <w:rFonts w:ascii="Arial" w:hAnsi="Arial" w:cs="Arial"/>
-        </w:rPr>
-        <w:t xml:space="preserve">In the </w:t>
+        <w:t>insert</w:t>
+      </w:r>
+      <w:r>
+        <w:rPr>
+          <w:rFonts w:ascii="Arial" w:hAnsi="Arial" w:cs="Arial"/>
+        </w:rPr>
+        <w:t xml:space="preserve"> function, the system loops through each letter of the inserted word.</w:t>
+      </w:r>
+      <w:r>
+        <w:rPr>
+          <w:rFonts w:ascii="Arial" w:hAnsi="Arial" w:cs="Arial"/>
+        </w:rPr>
+        <w:t xml:space="preserve"> First, the root node has no characters associated with it</w:t>
+      </w:r>
+      <w:r>
+        <w:rPr>
+          <w:rFonts w:ascii="Arial" w:hAnsi="Arial" w:cs="Arial"/>
+        </w:rPr>
+        <w:t>,</w:t>
+      </w:r>
+      <w:r>
+        <w:rPr>
+          <w:rFonts w:ascii="Arial" w:hAnsi="Arial" w:cs="Arial"/>
+        </w:rPr>
+        <w:t xml:space="preserve"> and its </w:t>
       </w:r>
       <w:r>
         <w:rPr>
@@ -10507,47 +10481,69 @@
           <w:i/>
           <w:iCs/>
         </w:rPr>
-        <w:t>insert</w:t>
-      </w:r>
-      <w:r>
-        <w:rPr>
-          <w:rFonts w:ascii="Arial" w:hAnsi="Arial" w:cs="Arial"/>
-        </w:rPr>
-        <w:t xml:space="preserve"> function, the system loops through each letter of the inserted word.</w:t>
-      </w:r>
-      <w:r>
-        <w:rPr>
-          <w:rFonts w:ascii="Arial" w:hAnsi="Arial" w:cs="Arial"/>
-        </w:rPr>
-        <w:t xml:space="preserve"> First, the root node has no characters associated with it</w:t>
-      </w:r>
-      <w:r>
-        <w:rPr>
-          <w:rFonts w:ascii="Arial" w:hAnsi="Arial" w:cs="Arial"/>
-        </w:rPr>
-        <w:t>,</w:t>
-      </w:r>
-      <w:r>
-        <w:rPr>
-          <w:rFonts w:ascii="Arial" w:hAnsi="Arial" w:cs="Arial"/>
-        </w:rPr>
-        <w:t xml:space="preserve"> and its </w:t>
-      </w:r>
-      <w:proofErr w:type="spellStart"/>
+        <w:t>isWord</w:t>
+      </w:r>
+      <w:r>
+        <w:rPr>
+          <w:rFonts w:ascii="Arial" w:hAnsi="Arial" w:cs="Arial"/>
+        </w:rPr>
+        <w:t xml:space="preserve"> is </w:t>
+      </w:r>
       <w:r>
         <w:rPr>
           <w:rFonts w:ascii="Arial" w:hAnsi="Arial" w:cs="Arial"/>
           <w:i/>
           <w:iCs/>
         </w:rPr>
-        <w:t>isWord</w:t>
-      </w:r>
-      <w:proofErr w:type="spellEnd"/>
-      <w:r>
-        <w:rPr>
-          <w:rFonts w:ascii="Arial" w:hAnsi="Arial" w:cs="Arial"/>
-        </w:rPr>
-        <w:t xml:space="preserve"> is </w:t>
+        <w:t>false</w:t>
+      </w:r>
+      <w:r>
+        <w:rPr>
+          <w:rFonts w:ascii="Arial" w:hAnsi="Arial" w:cs="Arial"/>
+        </w:rPr>
+        <w:t>.</w:t>
+      </w:r>
+      <w:r>
+        <w:rPr>
+          <w:rFonts w:ascii="Arial" w:hAnsi="Arial" w:cs="Arial"/>
+        </w:rPr>
+        <w:t xml:space="preserve"> Then, each character is sequentially processed.</w:t>
+      </w:r>
+      <w:r>
+        <w:rPr>
+          <w:rFonts w:ascii="Arial" w:hAnsi="Arial" w:cs="Arial"/>
+        </w:rPr>
+        <w:t xml:space="preserve"> If the character has not already occurred in the Trie, a new node is attached to and returned.</w:t>
+      </w:r>
+      <w:r>
+        <w:rPr>
+          <w:rFonts w:ascii="Arial" w:hAnsi="Arial" w:cs="Arial"/>
+        </w:rPr>
+        <w:t xml:space="preserve"> If the character already exists, the system</w:t>
+      </w:r>
+      <w:r>
+        <w:rPr>
+          <w:rFonts w:ascii="Arial" w:hAnsi="Arial" w:cs="Arial"/>
+        </w:rPr>
+        <w:t xml:space="preserve"> </w:t>
+      </w:r>
+      <w:r>
+        <w:rPr>
+          <w:rFonts w:ascii="Arial" w:hAnsi="Arial" w:cs="Arial"/>
+        </w:rPr>
+        <w:t>returns it.</w:t>
+      </w:r>
+      <w:r>
+        <w:rPr>
+          <w:rFonts w:ascii="Arial" w:hAnsi="Arial" w:cs="Arial"/>
+        </w:rPr>
+        <w:t xml:space="preserve"> The Trie structure uses common prefixes and stores fewer characters.</w:t>
+      </w:r>
+      <w:r>
+        <w:rPr>
+          <w:rFonts w:ascii="Arial" w:hAnsi="Arial" w:cs="Arial"/>
+        </w:rPr>
+        <w:t xml:space="preserve"> After the last character, the node is marked with </w:t>
       </w:r>
       <w:r>
         <w:rPr>
@@ -10555,73 +10551,7 @@
           <w:i/>
           <w:iCs/>
         </w:rPr>
-        <w:t>false</w:t>
-      </w:r>
-      <w:r>
-        <w:rPr>
-          <w:rFonts w:ascii="Arial" w:hAnsi="Arial" w:cs="Arial"/>
-        </w:rPr>
-        <w:t>.</w:t>
-      </w:r>
-      <w:r>
-        <w:rPr>
-          <w:rFonts w:ascii="Arial" w:hAnsi="Arial" w:cs="Arial"/>
-        </w:rPr>
-        <w:t xml:space="preserve"> Then, each character is sequentially processed.</w:t>
-      </w:r>
-      <w:r>
-        <w:rPr>
-          <w:rFonts w:ascii="Arial" w:hAnsi="Arial" w:cs="Arial"/>
-        </w:rPr>
-        <w:t xml:space="preserve"> If the character has not already occurred in the Trie, a new node is attached to and returned.</w:t>
-      </w:r>
-      <w:r>
-        <w:rPr>
-          <w:rFonts w:ascii="Arial" w:hAnsi="Arial" w:cs="Arial"/>
-        </w:rPr>
-        <w:t xml:space="preserve"> If the character already exists, the system</w:t>
-      </w:r>
-      <w:r>
-        <w:rPr>
-          <w:rFonts w:ascii="Arial" w:hAnsi="Arial" w:cs="Arial"/>
-        </w:rPr>
-        <w:t xml:space="preserve"> </w:t>
-      </w:r>
-      <w:r>
-        <w:rPr>
-          <w:rFonts w:ascii="Arial" w:hAnsi="Arial" w:cs="Arial"/>
-        </w:rPr>
-        <w:t>returns it.</w:t>
-      </w:r>
-      <w:r>
-        <w:rPr>
-          <w:rFonts w:ascii="Arial" w:hAnsi="Arial" w:cs="Arial"/>
-        </w:rPr>
-        <w:t xml:space="preserve"> The Trie structure uses common prefixes and stores fewer characters.</w:t>
-      </w:r>
-      <w:r>
-        <w:rPr>
-          <w:rFonts w:ascii="Arial" w:hAnsi="Arial" w:cs="Arial"/>
-        </w:rPr>
-        <w:t xml:space="preserve"> After the last character, the node is marked with </w:t>
-      </w:r>
-      <w:proofErr w:type="spellStart"/>
-      <w:r>
-        <w:rPr>
-          <w:rFonts w:ascii="Arial" w:hAnsi="Arial" w:cs="Arial"/>
-          <w:i/>
-          <w:iCs/>
-        </w:rPr>
-        <w:t>isWord</w:t>
-      </w:r>
-      <w:proofErr w:type="spellEnd"/>
-      <w:r>
-        <w:rPr>
-          <w:rFonts w:ascii="Arial" w:hAnsi="Arial" w:cs="Arial"/>
-          <w:i/>
-          <w:iCs/>
-        </w:rPr>
-        <w:t xml:space="preserve"> </w:t>
+        <w:t xml:space="preserve">isWord </w:t>
       </w:r>
       <w:r>
         <w:rPr>
@@ -10889,29 +10819,33 @@
         </w:rPr>
         <w:t xml:space="preserve">marked by </w:t>
       </w:r>
-      <w:proofErr w:type="spellStart"/>
       <w:r>
         <w:rPr>
           <w:rFonts w:ascii="Arial" w:hAnsi="Arial" w:cs="Arial"/>
           <w:i/>
           <w:iCs/>
         </w:rPr>
-        <w:t>isWord</w:t>
-      </w:r>
-      <w:proofErr w:type="spellEnd"/>
+        <w:t>isWord = true</w:t>
+      </w:r>
+      <w:r>
+        <w:rPr>
+          <w:rFonts w:ascii="Arial" w:hAnsi="Arial" w:cs="Arial"/>
+        </w:rPr>
+        <w:t xml:space="preserve"> (the end of a word). Depending on that, it returns either </w:t>
+      </w:r>
       <w:r>
         <w:rPr>
           <w:rFonts w:ascii="Arial" w:hAnsi="Arial" w:cs="Arial"/>
           <w:i/>
           <w:iCs/>
         </w:rPr>
-        <w:t xml:space="preserve"> = true</w:t>
-      </w:r>
-      <w:r>
-        <w:rPr>
-          <w:rFonts w:ascii="Arial" w:hAnsi="Arial" w:cs="Arial"/>
-        </w:rPr>
-        <w:t xml:space="preserve"> (the end of a word). Depending on that, it returns either </w:t>
+        <w:t>true</w:t>
+      </w:r>
+      <w:r>
+        <w:rPr>
+          <w:rFonts w:ascii="Arial" w:hAnsi="Arial" w:cs="Arial"/>
+        </w:rPr>
+        <w:t xml:space="preserve"> or </w:t>
       </w:r>
       <w:r>
         <w:rPr>
@@ -10919,13 +10853,19 @@
           <w:i/>
           <w:iCs/>
         </w:rPr>
-        <w:t>true</w:t>
-      </w:r>
-      <w:r>
-        <w:rPr>
-          <w:rFonts w:ascii="Arial" w:hAnsi="Arial" w:cs="Arial"/>
-        </w:rPr>
-        <w:t xml:space="preserve"> or </w:t>
+        <w:t>false</w:t>
+      </w:r>
+      <w:r>
+        <w:rPr>
+          <w:rFonts w:ascii="Arial" w:hAnsi="Arial" w:cs="Arial"/>
+        </w:rPr>
+        <w:t>.</w:t>
+      </w:r>
+      <w:r>
+        <w:rPr>
+          <w:rFonts w:ascii="Arial" w:hAnsi="Arial" w:cs="Arial"/>
+        </w:rPr>
+        <w:t xml:space="preserve"> The </w:t>
       </w:r>
       <w:r>
         <w:rPr>
@@ -10933,19 +10873,37 @@
           <w:i/>
           <w:iCs/>
         </w:rPr>
-        <w:t>false</w:t>
-      </w:r>
-      <w:r>
-        <w:rPr>
-          <w:rFonts w:ascii="Arial" w:hAnsi="Arial" w:cs="Arial"/>
-        </w:rPr>
-        <w:t>.</w:t>
-      </w:r>
-      <w:r>
-        <w:rPr>
-          <w:rFonts w:ascii="Arial" w:hAnsi="Arial" w:cs="Arial"/>
-        </w:rPr>
-        <w:t xml:space="preserve"> The </w:t>
+        <w:t xml:space="preserve">contain </w:t>
+      </w:r>
+      <w:r>
+        <w:rPr>
+          <w:rFonts w:ascii="Arial" w:hAnsi="Arial" w:cs="Arial"/>
+        </w:rPr>
+        <w:t>operation has O(n) time complexity, where n is the length of the word to search, and it takes O(1) auxiliary space.</w:t>
+      </w:r>
+    </w:p>
+    <w:p>
+      <w:pPr>
+        <w:spacing w:line="360" w:lineRule="auto"/>
+        <w:jc w:val="both"/>
+        <w:rPr>
+          <w:rFonts w:ascii="Arial" w:hAnsi="Arial" w:cs="Arial"/>
+        </w:rPr>
+      </w:pPr>
+    </w:p>
+    <w:p>
+      <w:pPr>
+        <w:spacing w:line="360" w:lineRule="auto"/>
+        <w:jc w:val="both"/>
+        <w:rPr>
+          <w:rFonts w:ascii="Arial" w:hAnsi="Arial" w:cs="Arial"/>
+        </w:rPr>
+      </w:pPr>
+      <w:r>
+        <w:rPr>
+          <w:rFonts w:ascii="Arial" w:hAnsi="Arial" w:cs="Arial"/>
+        </w:rPr>
+        <w:t xml:space="preserve">In </w:t>
       </w:r>
       <w:r>
         <w:rPr>
@@ -10953,45 +10911,25 @@
           <w:i/>
           <w:iCs/>
         </w:rPr>
-        <w:t xml:space="preserve">contain </w:t>
-      </w:r>
-      <w:r>
-        <w:rPr>
-          <w:rFonts w:ascii="Arial" w:hAnsi="Arial" w:cs="Arial"/>
-        </w:rPr>
-        <w:t>operation has O(n) time complexity, where n is the length of the word to search, and it takes O(1) auxiliary space.</w:t>
-      </w:r>
-    </w:p>
-    <w:p>
-      <w:pPr>
-        <w:spacing w:line="360" w:lineRule="auto"/>
-        <w:jc w:val="both"/>
-        <w:rPr>
-          <w:rFonts w:ascii="Arial" w:hAnsi="Arial" w:cs="Arial"/>
-        </w:rPr>
-      </w:pPr>
-    </w:p>
-    <w:p>
-      <w:pPr>
-        <w:spacing w:line="360" w:lineRule="auto"/>
-        <w:jc w:val="both"/>
-        <w:rPr>
-          <w:rFonts w:ascii="Arial" w:hAnsi="Arial" w:cs="Arial"/>
-        </w:rPr>
-      </w:pPr>
-      <w:r>
-        <w:rPr>
-          <w:rFonts w:ascii="Arial" w:hAnsi="Arial" w:cs="Arial"/>
-        </w:rPr>
-        <w:t xml:space="preserve">In </w:t>
-      </w:r>
+        <w:t xml:space="preserve">Big </w:t>
+      </w:r>
+      <w:proofErr w:type="gramStart"/>
       <w:r>
         <w:rPr>
           <w:rFonts w:ascii="Arial" w:hAnsi="Arial" w:cs="Arial"/>
           <w:i/>
           <w:iCs/>
         </w:rPr>
-        <w:t xml:space="preserve">Big Break!, </w:t>
+        <w:t>Break!,</w:t>
+      </w:r>
+      <w:proofErr w:type="gramEnd"/>
+      <w:r>
+        <w:rPr>
+          <w:rFonts w:ascii="Arial" w:hAnsi="Arial" w:cs="Arial"/>
+          <w:i/>
+          <w:iCs/>
+        </w:rPr>
+        <w:t xml:space="preserve"> </w:t>
       </w:r>
       <w:r>
         <w:rPr>
@@ -11573,28 +11511,56 @@
         <w:rPr>
           <w:rFonts w:ascii="Arial" w:hAnsi="Arial" w:cs="Arial"/>
         </w:rPr>
-        <w:t xml:space="preserve"> If this is not the case, it checks for similarity and difference between the names using the </w:t>
-      </w:r>
-      <w:proofErr w:type="spellStart"/>
-      <w:r>
-        <w:rPr>
-          <w:rFonts w:ascii="Arial" w:hAnsi="Arial" w:cs="Arial"/>
-        </w:rPr>
-        <w:t>Levenshtein</w:t>
-      </w:r>
-      <w:proofErr w:type="spellEnd"/>
-      <w:r>
-        <w:rPr>
-          <w:rFonts w:ascii="Arial" w:hAnsi="Arial" w:cs="Arial"/>
-        </w:rPr>
-        <w:t xml:space="preserve"> distance and the Jaro-Winkler </w:t>
+        <w:t xml:space="preserve"> If this is not the case, it checks for similarity and difference between the names using the Levenshtein distance and the Jaro-Winkler </w:t>
       </w:r>
       <w:r>
         <w:rPr>
           <w:rFonts w:ascii="Arial" w:hAnsi="Arial" w:cs="Arial"/>
         </w:rPr>
         <w:lastRenderedPageBreak/>
-        <w:t>algorithm. A threshold value is created in order to catch small typos or name variations. This implementation of DSU makes the similarity transitive, meaning that if A is similar to B and B is similar to C, A and C will be part of the same cluster.</w:t>
+        <w:t xml:space="preserve">algorithm. A threshold value is created </w:t>
+      </w:r>
+      <w:proofErr w:type="gramStart"/>
+      <w:r>
+        <w:rPr>
+          <w:rFonts w:ascii="Arial" w:hAnsi="Arial" w:cs="Arial"/>
+        </w:rPr>
+        <w:t>in order to</w:t>
+      </w:r>
+      <w:proofErr w:type="gramEnd"/>
+      <w:r>
+        <w:rPr>
+          <w:rFonts w:ascii="Arial" w:hAnsi="Arial" w:cs="Arial"/>
+        </w:rPr>
+        <w:t xml:space="preserve"> catch small typos or name variations. This implementation of DSU makes the similarity transitive, meaning that if A is </w:t>
+      </w:r>
+      <w:proofErr w:type="gramStart"/>
+      <w:r>
+        <w:rPr>
+          <w:rFonts w:ascii="Arial" w:hAnsi="Arial" w:cs="Arial"/>
+        </w:rPr>
+        <w:t>similar to</w:t>
+      </w:r>
+      <w:proofErr w:type="gramEnd"/>
+      <w:r>
+        <w:rPr>
+          <w:rFonts w:ascii="Arial" w:hAnsi="Arial" w:cs="Arial"/>
+        </w:rPr>
+        <w:t xml:space="preserve"> B and B is </w:t>
+      </w:r>
+      <w:proofErr w:type="gramStart"/>
+      <w:r>
+        <w:rPr>
+          <w:rFonts w:ascii="Arial" w:hAnsi="Arial" w:cs="Arial"/>
+        </w:rPr>
+        <w:t>similar to</w:t>
+      </w:r>
+      <w:proofErr w:type="gramEnd"/>
+      <w:r>
+        <w:rPr>
+          <w:rFonts w:ascii="Arial" w:hAnsi="Arial" w:cs="Arial"/>
+        </w:rPr>
+        <w:t xml:space="preserve"> C, A and C will be part of the same cluster.</w:t>
       </w:r>
     </w:p>
     <w:p>
@@ -11826,35 +11792,7 @@
         <w:rPr>
           <w:rFonts w:ascii="Arial" w:hAnsi="Arial" w:cs="Arial"/>
         </w:rPr>
-        <w:t xml:space="preserve">I have planned to implement inheritance of an </w:t>
-      </w:r>
-      <w:proofErr w:type="spellStart"/>
-      <w:r>
-        <w:rPr>
-          <w:rFonts w:ascii="Arial" w:hAnsi="Arial" w:cs="Arial"/>
-        </w:rPr>
-        <w:t>ExtractableItem</w:t>
-      </w:r>
-      <w:proofErr w:type="spellEnd"/>
-      <w:r>
-        <w:rPr>
-          <w:rFonts w:ascii="Arial" w:hAnsi="Arial" w:cs="Arial"/>
-        </w:rPr>
-        <w:t xml:space="preserve"> parent class and Character, Prop, and </w:t>
-      </w:r>
-      <w:proofErr w:type="spellStart"/>
-      <w:r>
-        <w:rPr>
-          <w:rFonts w:ascii="Arial" w:hAnsi="Arial" w:cs="Arial"/>
-        </w:rPr>
-        <w:t>SetDressing</w:t>
-      </w:r>
-      <w:proofErr w:type="spellEnd"/>
-      <w:r>
-        <w:rPr>
-          <w:rFonts w:ascii="Arial" w:hAnsi="Arial" w:cs="Arial"/>
-        </w:rPr>
-        <w:t xml:space="preserve"> as </w:t>
+        <w:t xml:space="preserve">I have planned to implement inheritance of an ExtractableItem parent class and Character, Prop, and SetDressing as </w:t>
       </w:r>
       <w:r>
         <w:rPr>
@@ -12907,21 +12845,7 @@
         <w:rPr>
           <w:rFonts w:ascii="Arial" w:hAnsi="Arial" w:cs="Arial"/>
         </w:rPr>
-        <w:t xml:space="preserve"> because it integrates Apache </w:t>
-      </w:r>
-      <w:proofErr w:type="spellStart"/>
-      <w:r>
-        <w:rPr>
-          <w:rFonts w:ascii="Arial" w:hAnsi="Arial" w:cs="Arial"/>
-        </w:rPr>
-        <w:t>OpenNLP</w:t>
-      </w:r>
-      <w:proofErr w:type="spellEnd"/>
-      <w:r>
-        <w:rPr>
-          <w:rFonts w:ascii="Arial" w:hAnsi="Arial" w:cs="Arial"/>
-        </w:rPr>
-        <w:t xml:space="preserve"> well</w:t>
+        <w:t xml:space="preserve"> because it integrates Apache OpenNLP well</w:t>
       </w:r>
       <w:r>
         <w:rPr>
@@ -13027,7 +12951,21 @@
           <w:rFonts w:ascii="Arial" w:hAnsi="Arial" w:cs="Arial"/>
         </w:rPr>
         <w:lastRenderedPageBreak/>
-        <w:t xml:space="preserve">Java runs faster than most of the interpreted languages for processing of large </w:t>
+        <w:t xml:space="preserve">Java runs faster than most of the interpreted languages for </w:t>
+      </w:r>
+      <w:proofErr w:type="gramStart"/>
+      <w:r>
+        <w:rPr>
+          <w:rFonts w:ascii="Arial" w:hAnsi="Arial" w:cs="Arial"/>
+        </w:rPr>
+        <w:t>processing of</w:t>
+      </w:r>
+      <w:proofErr w:type="gramEnd"/>
+      <w:r>
+        <w:rPr>
+          <w:rFonts w:ascii="Arial" w:hAnsi="Arial" w:cs="Arial"/>
+        </w:rPr>
+        <w:t xml:space="preserve"> large </w:t>
       </w:r>
       <w:r>
         <w:rPr>
@@ -13152,18 +13090,8 @@
           <w:b/>
           <w:bCs/>
         </w:rPr>
-        <w:t xml:space="preserve">Apache </w:t>
-      </w:r>
-      <w:proofErr w:type="spellStart"/>
-      <w:r>
-        <w:rPr>
-          <w:rFonts w:ascii="Arial" w:hAnsi="Arial" w:cs="Arial"/>
-          <w:b/>
-          <w:bCs/>
-        </w:rPr>
-        <w:t>OpenNLP</w:t>
-      </w:r>
-      <w:proofErr w:type="spellEnd"/>
+        <w:t>Apache OpenNLP</w:t>
+      </w:r>
     </w:p>
     <w:p>
       <w:pPr>
@@ -13185,21 +13113,7 @@
         <w:rPr>
           <w:rFonts w:ascii="Arial" w:hAnsi="Arial" w:cs="Arial"/>
         </w:rPr>
-        <w:t xml:space="preserve"> uses Apache </w:t>
-      </w:r>
-      <w:proofErr w:type="spellStart"/>
-      <w:r>
-        <w:rPr>
-          <w:rFonts w:ascii="Arial" w:hAnsi="Arial" w:cs="Arial"/>
-        </w:rPr>
-        <w:t>OpenNLP</w:t>
-      </w:r>
-      <w:proofErr w:type="spellEnd"/>
-      <w:r>
-        <w:rPr>
-          <w:rFonts w:ascii="Arial" w:hAnsi="Arial" w:cs="Arial"/>
-        </w:rPr>
-        <w:t xml:space="preserve"> for tokenization, POS tagging, and </w:t>
+        <w:t xml:space="preserve"> uses Apache OpenNLP for tokenization, POS tagging, and </w:t>
       </w:r>
       <w:r>
         <w:rPr>
@@ -13271,21 +13185,7 @@
         <w:rPr>
           <w:rFonts w:ascii="Arial" w:hAnsi="Arial" w:cs="Arial"/>
         </w:rPr>
-        <w:t xml:space="preserve"> the </w:t>
-      </w:r>
-      <w:proofErr w:type="spellStart"/>
-      <w:r>
-        <w:rPr>
-          <w:rFonts w:ascii="Arial" w:hAnsi="Arial" w:cs="Arial"/>
-        </w:rPr>
-        <w:t>Levenshtein</w:t>
-      </w:r>
-      <w:proofErr w:type="spellEnd"/>
-      <w:r>
-        <w:rPr>
-          <w:rFonts w:ascii="Arial" w:hAnsi="Arial" w:cs="Arial"/>
-        </w:rPr>
-        <w:t xml:space="preserve"> distance algorithm</w:t>
+        <w:t xml:space="preserve"> the Levenshtein distance algorithm</w:t>
       </w:r>
       <w:r>
         <w:rPr>
@@ -13332,21 +13232,7 @@
         <w:rPr>
           <w:rFonts w:ascii="Arial" w:hAnsi="Arial" w:cs="Arial"/>
         </w:rPr>
-        <w:t xml:space="preserve">What is more, it integrates very well with a Java + Maven project. As previously discussed, </w:t>
-      </w:r>
-      <w:proofErr w:type="spellStart"/>
-      <w:r>
-        <w:rPr>
-          <w:rFonts w:ascii="Arial" w:hAnsi="Arial" w:cs="Arial"/>
-        </w:rPr>
-        <w:t>OpenNLP</w:t>
-      </w:r>
-      <w:proofErr w:type="spellEnd"/>
-      <w:r>
-        <w:rPr>
-          <w:rFonts w:ascii="Arial" w:hAnsi="Arial" w:cs="Arial"/>
-        </w:rPr>
-        <w:t xml:space="preserve"> is Java-native</w:t>
+        <w:t>What is more, it integrates very well with a Java + Maven project. As previously discussed, OpenNLP is Java-native</w:t>
       </w:r>
       <w:r>
         <w:rPr>
@@ -13454,7 +13340,21 @@
         <w:rPr>
           <w:rFonts w:ascii="Arial" w:hAnsi="Arial" w:cs="Arial"/>
         </w:rPr>
-        <w:t xml:space="preserve"> uses React for its frontend. One of the </w:t>
+        <w:t xml:space="preserve"> uses React for its </w:t>
+      </w:r>
+      <w:proofErr w:type="gramStart"/>
+      <w:r>
+        <w:rPr>
+          <w:rFonts w:ascii="Arial" w:hAnsi="Arial" w:cs="Arial"/>
+        </w:rPr>
+        <w:t>frontend</w:t>
+      </w:r>
+      <w:proofErr w:type="gramEnd"/>
+      <w:r>
+        <w:rPr>
+          <w:rFonts w:ascii="Arial" w:hAnsi="Arial" w:cs="Arial"/>
+        </w:rPr>
+        <w:t xml:space="preserve">. One of the </w:t>
       </w:r>
       <w:r>
         <w:rPr>
@@ -13466,21 +13366,7 @@
         <w:rPr>
           <w:rFonts w:ascii="Arial" w:hAnsi="Arial" w:cs="Arial"/>
         </w:rPr>
-        <w:t xml:space="preserve"> is that </w:t>
-      </w:r>
-      <w:proofErr w:type="spellStart"/>
-      <w:r>
-        <w:rPr>
-          <w:rFonts w:ascii="Arial" w:hAnsi="Arial" w:cs="Arial"/>
-        </w:rPr>
-        <w:t>React’s</w:t>
-      </w:r>
-      <w:proofErr w:type="spellEnd"/>
-      <w:r>
-        <w:rPr>
-          <w:rFonts w:ascii="Arial" w:hAnsi="Arial" w:cs="Arial"/>
-        </w:rPr>
-        <w:t xml:space="preserve"> component model (buttons, lists, token-highlighters) can map directly the needed UI pieces.</w:t>
+        <w:t xml:space="preserve"> is that React’s component model (buttons, lists, token-highlighters) can map directly the needed UI pieces.</w:t>
       </w:r>
     </w:p>
     <w:p>
@@ -13566,7 +13452,21 @@
         <w:rPr>
           <w:rFonts w:ascii="Arial" w:hAnsi="Arial" w:cs="Arial"/>
         </w:rPr>
-        <w:t xml:space="preserve"> create a modern full-stack architecture.</w:t>
+        <w:t xml:space="preserve"> create </w:t>
+      </w:r>
+      <w:proofErr w:type="gramStart"/>
+      <w:r>
+        <w:rPr>
+          <w:rFonts w:ascii="Arial" w:hAnsi="Arial" w:cs="Arial"/>
+        </w:rPr>
+        <w:t>a modern</w:t>
+      </w:r>
+      <w:proofErr w:type="gramEnd"/>
+      <w:r>
+        <w:rPr>
+          <w:rFonts w:ascii="Arial" w:hAnsi="Arial" w:cs="Arial"/>
+        </w:rPr>
+        <w:t xml:space="preserve"> full-stack architecture.</w:t>
       </w:r>
     </w:p>
     <w:p>
@@ -13620,21 +13520,7 @@
         <w:rPr>
           <w:rFonts w:ascii="Arial" w:hAnsi="Arial" w:cs="Arial"/>
         </w:rPr>
-        <w:t>Carter. “</w:t>
-      </w:r>
-      <w:proofErr w:type="spellStart"/>
-      <w:r>
-        <w:rPr>
-          <w:rFonts w:ascii="Arial" w:hAnsi="Arial" w:cs="Arial"/>
-        </w:rPr>
-        <w:t>Levenshtein</w:t>
-      </w:r>
-      <w:proofErr w:type="spellEnd"/>
-      <w:r>
-        <w:rPr>
-          <w:rFonts w:ascii="Arial" w:hAnsi="Arial" w:cs="Arial"/>
-        </w:rPr>
-        <w:t xml:space="preserve"> Distance Explained.” </w:t>
+        <w:t xml:space="preserve">Carter. “Levenshtein Distance Explained.” </w:t>
       </w:r>
       <w:r>
         <w:rPr>
@@ -13665,39 +13551,15 @@
           <w:rFonts w:ascii="Arial" w:hAnsi="Arial" w:cs="Arial"/>
         </w:rPr>
         <w:lastRenderedPageBreak/>
-        <w:t xml:space="preserve">“Class </w:t>
-      </w:r>
-      <w:proofErr w:type="spellStart"/>
-      <w:r>
-        <w:rPr>
-          <w:rFonts w:ascii="Arial" w:hAnsi="Arial" w:cs="Arial"/>
-        </w:rPr>
-        <w:t>Levenshteindistance</w:t>
-      </w:r>
-      <w:proofErr w:type="spellEnd"/>
-      <w:r>
-        <w:rPr>
-          <w:rFonts w:ascii="Arial" w:hAnsi="Arial" w:cs="Arial"/>
-        </w:rPr>
-        <w:t xml:space="preserve">.” </w:t>
-      </w:r>
-      <w:proofErr w:type="spellStart"/>
+        <w:t xml:space="preserve">“Class Levenshteindistance.” </w:t>
+      </w:r>
       <w:r>
         <w:rPr>
           <w:rFonts w:ascii="Arial" w:hAnsi="Arial" w:cs="Arial"/>
           <w:i/>
           <w:iCs/>
         </w:rPr>
-        <w:t>LevenshteinDistance</w:t>
-      </w:r>
-      <w:proofErr w:type="spellEnd"/>
-      <w:r>
-        <w:rPr>
-          <w:rFonts w:ascii="Arial" w:hAnsi="Arial" w:cs="Arial"/>
-          <w:i/>
-          <w:iCs/>
-        </w:rPr>
-        <w:t xml:space="preserve"> (Apache Commons Text 1.14.0 API)</w:t>
+        <w:t>LevenshteinDistance (Apache Commons Text 1.14.0 API)</w:t>
       </w:r>
       <w:r>
         <w:rPr>
@@ -13781,21 +13643,12 @@
           <w:rFonts w:ascii="Arial" w:hAnsi="Arial" w:cs="Arial"/>
         </w:rPr>
       </w:pPr>
-      <w:proofErr w:type="spellStart"/>
-      <w:r>
-        <w:rPr>
-          <w:rFonts w:ascii="Arial" w:hAnsi="Arial" w:cs="Arial"/>
-        </w:rPr>
-        <w:t>kartik</w:t>
-      </w:r>
-      <w:proofErr w:type="spellEnd"/>
-      <w:r>
-        <w:rPr>
-          <w:rFonts w:ascii="Arial" w:hAnsi="Arial" w:cs="Arial"/>
-        </w:rPr>
-        <w:t xml:space="preserve">. “Introduction to Disjoint Set (Union-Find Data Structure).” </w:t>
-      </w:r>
-      <w:proofErr w:type="spellStart"/>
+      <w:r>
+        <w:rPr>
+          <w:rFonts w:ascii="Arial" w:hAnsi="Arial" w:cs="Arial"/>
+        </w:rPr>
+        <w:t xml:space="preserve">kartik. “Introduction to Disjoint Set (Union-Find Data Structure).” </w:t>
+      </w:r>
       <w:r>
         <w:rPr>
           <w:rFonts w:ascii="Arial" w:hAnsi="Arial" w:cs="Arial"/>
@@ -13804,26 +13657,11 @@
         </w:rPr>
         <w:t>GeeksforGeeks</w:t>
       </w:r>
-      <w:proofErr w:type="spellEnd"/>
-      <w:r>
-        <w:rPr>
-          <w:rFonts w:ascii="Arial" w:hAnsi="Arial" w:cs="Arial"/>
-        </w:rPr>
-        <w:t xml:space="preserve">, </w:t>
-      </w:r>
-      <w:proofErr w:type="spellStart"/>
-      <w:r>
-        <w:rPr>
-          <w:rFonts w:ascii="Arial" w:hAnsi="Arial" w:cs="Arial"/>
-        </w:rPr>
-        <w:t>GeeksforGeeks</w:t>
-      </w:r>
-      <w:proofErr w:type="spellEnd"/>
-      <w:r>
-        <w:rPr>
-          <w:rFonts w:ascii="Arial" w:hAnsi="Arial" w:cs="Arial"/>
-        </w:rPr>
-        <w:t>, 17 Jan. 2026, www.geeksforgeeks.org/dsa/introduction-to-disjoint-set-data-structure-or-union-find-algorithm/.</w:t>
+      <w:r>
+        <w:rPr>
+          <w:rFonts w:ascii="Arial" w:hAnsi="Arial" w:cs="Arial"/>
+        </w:rPr>
+        <w:t>, GeeksforGeeks, 17 Jan. 2026, www.geeksforgeeks.org/dsa/introduction-to-disjoint-set-data-structure-or-union-find-algorithm/.</w:t>
       </w:r>
     </w:p>
     <w:p>
@@ -13841,7 +13679,6 @@
         </w:rPr>
         <w:t xml:space="preserve">Kundu, Arnab. “Jaro and Jaro-Winkler Similarity.” </w:t>
       </w:r>
-      <w:proofErr w:type="spellStart"/>
       <w:r>
         <w:rPr>
           <w:rFonts w:ascii="Arial" w:hAnsi="Arial" w:cs="Arial"/>
@@ -13850,26 +13687,11 @@
         </w:rPr>
         <w:t>GeeksforGeeks</w:t>
       </w:r>
-      <w:proofErr w:type="spellEnd"/>
-      <w:r>
-        <w:rPr>
-          <w:rFonts w:ascii="Arial" w:hAnsi="Arial" w:cs="Arial"/>
-        </w:rPr>
-        <w:t xml:space="preserve">, </w:t>
-      </w:r>
-      <w:proofErr w:type="spellStart"/>
-      <w:r>
-        <w:rPr>
-          <w:rFonts w:ascii="Arial" w:hAnsi="Arial" w:cs="Arial"/>
-        </w:rPr>
-        <w:t>GeeksforGeeks</w:t>
-      </w:r>
-      <w:proofErr w:type="spellEnd"/>
-      <w:r>
-        <w:rPr>
-          <w:rFonts w:ascii="Arial" w:hAnsi="Arial" w:cs="Arial"/>
-        </w:rPr>
-        <w:t xml:space="preserve">, 16 May 2025, </w:t>
+      <w:r>
+        <w:rPr>
+          <w:rFonts w:ascii="Arial" w:hAnsi="Arial" w:cs="Arial"/>
+        </w:rPr>
+        <w:t xml:space="preserve">, GeeksforGeeks, 16 May 2025, </w:t>
       </w:r>
       <w:hyperlink r:id="rId25" w:history="1">
         <w:r>
@@ -13902,7 +13724,6 @@
         </w:rPr>
         <w:t xml:space="preserve">VR. “Trie Data Structure.” </w:t>
       </w:r>
-      <w:proofErr w:type="spellStart"/>
       <w:r>
         <w:rPr>
           <w:rFonts w:ascii="Arial" w:hAnsi="Arial" w:cs="Arial"/>
@@ -13911,26 +13732,11 @@
         </w:rPr>
         <w:t>GeeksforGeeks</w:t>
       </w:r>
-      <w:proofErr w:type="spellEnd"/>
-      <w:r>
-        <w:rPr>
-          <w:rFonts w:ascii="Arial" w:hAnsi="Arial" w:cs="Arial"/>
-        </w:rPr>
-        <w:t xml:space="preserve">, </w:t>
-      </w:r>
-      <w:proofErr w:type="spellStart"/>
-      <w:r>
-        <w:rPr>
-          <w:rFonts w:ascii="Arial" w:hAnsi="Arial" w:cs="Arial"/>
-        </w:rPr>
-        <w:t>GeeksforGeeks</w:t>
-      </w:r>
-      <w:proofErr w:type="spellEnd"/>
-      <w:r>
-        <w:rPr>
-          <w:rFonts w:ascii="Arial" w:hAnsi="Arial" w:cs="Arial"/>
-        </w:rPr>
-        <w:t>, 18 Jan. 2026, www.geeksforgeeks.org/dsa/trie-insert-and-search/.</w:t>
+      <w:r>
+        <w:rPr>
+          <w:rFonts w:ascii="Arial" w:hAnsi="Arial" w:cs="Arial"/>
+        </w:rPr>
+        <w:t>, GeeksforGeeks, 18 Jan. 2026, www.geeksforgeeks.org/dsa/trie-insert-and-search/.</w:t>
       </w:r>
     </w:p>
     <w:sectPr>

</xml_diff>

<commit_message>
Numbered characters added, day time updated when scenes dragged, added a move weight check before choosing a best day for the schedule, boosted score for emptier days so that more scenes are scheduled there, updated documentation
</commit_message>
<xml_diff>
--- a/docs/Vili-An_Doneva_Diploma_Thesis.docx
+++ b/docs/Vili-An_Doneva_Diploma_Thesis.docx
@@ -9477,21 +9477,7 @@
         <w:rPr>
           <w:rFonts w:ascii="Arial" w:hAnsi="Arial" w:cs="Arial"/>
         </w:rPr>
-        <w:t xml:space="preserve">is responsible for the rendering of the shooting schedule, handling file upload, enabling drag-and-drop reordering, displaying scene editing modals, and sending user-triggered updates to the backend. The main technologies used are React, </w:t>
-      </w:r>
-      <w:proofErr w:type="gramStart"/>
-      <w:r>
-        <w:rPr>
-          <w:rFonts w:ascii="Arial" w:hAnsi="Arial" w:cs="Arial"/>
-        </w:rPr>
-        <w:t>JSX, @</w:t>
-      </w:r>
-      <w:proofErr w:type="gramEnd"/>
-      <w:r>
-        <w:rPr>
-          <w:rFonts w:ascii="Arial" w:hAnsi="Arial" w:cs="Arial"/>
-        </w:rPr>
-        <w:t>dnd-kit (a lightweight React-based drag-and-drop library), Fetch API for HTTP communication, and Vite (a front-end build tool and development server).</w:t>
+        <w:t>is responsible for the rendering of the shooting schedule, handling file upload, enabling drag-and-drop reordering, displaying scene editing modals, and sending user-triggered updates to the backend. The main technologies used are React, JSX, @dnd-kit (a lightweight React-based drag-and-drop library), Fetch API for HTTP communication, and Vite (a front-end build tool and development server).</w:t>
       </w:r>
     </w:p>
     <w:p>
@@ -9651,21 +9637,7 @@
         <w:rPr>
           <w:rFonts w:ascii="Arial" w:hAnsi="Arial" w:cs="Arial"/>
         </w:rPr>
-        <w:t xml:space="preserve">. After the script is processed, it returns the generated schedule to the </w:t>
-      </w:r>
-      <w:proofErr w:type="gramStart"/>
-      <w:r>
-        <w:rPr>
-          <w:rFonts w:ascii="Arial" w:hAnsi="Arial" w:cs="Arial"/>
-        </w:rPr>
-        <w:t>frontend</w:t>
-      </w:r>
-      <w:proofErr w:type="gramEnd"/>
-      <w:r>
-        <w:rPr>
-          <w:rFonts w:ascii="Arial" w:hAnsi="Arial" w:cs="Arial"/>
-        </w:rPr>
-        <w:t>.</w:t>
+        <w:t>. After the script is processed, it returns the generated schedule to the frontend.</w:t>
       </w:r>
     </w:p>
     <w:p>
@@ -9707,21 +9679,7 @@
         <w:rPr>
           <w:rFonts w:ascii="Arial" w:hAnsi="Arial" w:cs="Arial"/>
         </w:rPr>
-        <w:t xml:space="preserve">updates the script when scenes are reordered or characters are edited. </w:t>
-      </w:r>
-      <w:proofErr w:type="gramStart"/>
-      <w:r>
-        <w:rPr>
-          <w:rFonts w:ascii="Arial" w:hAnsi="Arial" w:cs="Arial"/>
-        </w:rPr>
-        <w:t>In order to</w:t>
-      </w:r>
-      <w:proofErr w:type="gramEnd"/>
-      <w:r>
-        <w:rPr>
-          <w:rFonts w:ascii="Arial" w:hAnsi="Arial" w:cs="Arial"/>
-        </w:rPr>
-        <w:t xml:space="preserve"> accomplish that, React first sends the fully updated schedule JSON (</w:t>
+        <w:t>updates the script when scenes are reordered or characters are edited. In order to accomplish that, React first sends the fully updated schedule JSON (</w:t>
       </w:r>
       <w:proofErr w:type="spellStart"/>
       <w:r>
@@ -9791,21 +9749,7 @@
         <w:rPr>
           <w:rFonts w:ascii="Arial" w:hAnsi="Arial" w:cs="Arial"/>
         </w:rPr>
-        <w:t xml:space="preserve">Data Transfer Objects (DTOs) are objects used to transfer data between the layers. They contain only data and no business logic. They protect internal logic from being exposed to the frontend, allow changes to the domain model without breaking the frontend, </w:t>
-      </w:r>
-      <w:proofErr w:type="gramStart"/>
-      <w:r>
-        <w:rPr>
-          <w:rFonts w:ascii="Arial" w:hAnsi="Arial" w:cs="Arial"/>
-        </w:rPr>
-        <w:t>prevent</w:t>
-      </w:r>
-      <w:proofErr w:type="gramEnd"/>
-      <w:r>
-        <w:rPr>
-          <w:rFonts w:ascii="Arial" w:hAnsi="Arial" w:cs="Arial"/>
-        </w:rPr>
-        <w:t xml:space="preserve"> frontend and backend over-coupling and improve security. </w:t>
+        <w:t xml:space="preserve">Data Transfer Objects (DTOs) are objects used to transfer data between the layers. They contain only data and no business logic. They protect internal logic from being exposed to the frontend, allow changes to the domain model without breaking the frontend, prevent frontend and backend over-coupling and improve security. </w:t>
       </w:r>
       <w:r>
         <w:rPr>
@@ -10009,21 +9953,7 @@
         <w:rPr>
           <w:rFonts w:ascii="Arial" w:hAnsi="Arial" w:cs="Arial"/>
         </w:rPr>
-        <w:t xml:space="preserve"> from React to Shooting Day and Scene. It updates the values and maps them back to the DTOs to display them in the </w:t>
-      </w:r>
-      <w:proofErr w:type="gramStart"/>
-      <w:r>
-        <w:rPr>
-          <w:rFonts w:ascii="Arial" w:hAnsi="Arial" w:cs="Arial"/>
-        </w:rPr>
-        <w:t>frontend</w:t>
-      </w:r>
-      <w:proofErr w:type="gramEnd"/>
-      <w:r>
-        <w:rPr>
-          <w:rFonts w:ascii="Arial" w:hAnsi="Arial" w:cs="Arial"/>
-        </w:rPr>
-        <w:t>.</w:t>
+        <w:t xml:space="preserve"> from React to Shooting Day and Scene. It updates the values and maps them back to the DTOs to display them in the frontend.</w:t>
       </w:r>
     </w:p>
     <w:p>
@@ -10401,16 +10331,52 @@
         <w:rPr>
           <w:rFonts w:ascii="Arial" w:hAnsi="Arial" w:cs="Arial"/>
         </w:rPr>
-        <w:t xml:space="preserve"> The endpoint accepts requests </w:t>
-      </w:r>
-      <w:proofErr w:type="gramStart"/>
-      <w:r>
-        <w:rPr>
-          <w:rFonts w:ascii="Arial" w:hAnsi="Arial" w:cs="Arial"/>
-        </w:rPr>
-        <w:t>of type</w:t>
-      </w:r>
-      <w:proofErr w:type="gramEnd"/>
+        <w:t xml:space="preserve"> The endpoint accepts requests of type </w:t>
+      </w:r>
+      <w:r>
+        <w:rPr>
+          <w:rFonts w:ascii="Arial" w:hAnsi="Arial" w:cs="Arial"/>
+        </w:rPr>
+        <w:t>multipart/form-data</w:t>
+      </w:r>
+      <w:r>
+        <w:rPr>
+          <w:rFonts w:ascii="Arial" w:hAnsi="Arial" w:cs="Arial"/>
+        </w:rPr>
+        <w:t xml:space="preserve">, which accepts binary file uploads. </w:t>
+      </w:r>
+      <w:r>
+        <w:rPr>
+          <w:rFonts w:ascii="Arial" w:hAnsi="Arial" w:cs="Arial"/>
+        </w:rPr>
+        <w:t xml:space="preserve">Spring Boot automatically parses the multipart request and maps the file part named "file" to a </w:t>
+      </w:r>
+      <w:proofErr w:type="spellStart"/>
+      <w:r>
+        <w:rPr>
+          <w:rFonts w:ascii="Arial" w:hAnsi="Arial" w:cs="Arial"/>
+        </w:rPr>
+        <w:t>MultipartFile</w:t>
+      </w:r>
+      <w:proofErr w:type="spellEnd"/>
+      <w:r>
+        <w:rPr>
+          <w:rFonts w:ascii="Arial" w:hAnsi="Arial" w:cs="Arial"/>
+        </w:rPr>
+        <w:t xml:space="preserve"> object via the @RequestParam</w:t>
+      </w:r>
+      <w:r>
+        <w:rPr>
+          <w:rFonts w:ascii="Arial" w:hAnsi="Arial" w:cs="Arial"/>
+        </w:rPr>
+        <w:t>(“file”)</w:t>
+      </w:r>
+      <w:r>
+        <w:rPr>
+          <w:rFonts w:ascii="Arial" w:hAnsi="Arial" w:cs="Arial"/>
+        </w:rPr>
+        <w:t xml:space="preserve"> annotation. This</w:t>
+      </w:r>
       <w:r>
         <w:rPr>
           <w:rFonts w:ascii="Arial" w:hAnsi="Arial" w:cs="Arial"/>
@@ -10421,46 +10387,90 @@
         <w:rPr>
           <w:rFonts w:ascii="Arial" w:hAnsi="Arial" w:cs="Arial"/>
         </w:rPr>
-        <w:t>multipart/form-data</w:t>
-      </w:r>
-      <w:r>
-        <w:rPr>
-          <w:rFonts w:ascii="Arial" w:hAnsi="Arial" w:cs="Arial"/>
-        </w:rPr>
-        <w:t xml:space="preserve">, which accepts binary file uploads. </w:t>
-      </w:r>
-      <w:r>
-        <w:rPr>
-          <w:rFonts w:ascii="Arial" w:hAnsi="Arial" w:cs="Arial"/>
-        </w:rPr>
-        <w:t xml:space="preserve">Spring Boot automatically parses the multipart request and maps the file part named "file" to a </w:t>
+        <w:t>provides access to the file’s metadata and binary content without requiring manual request parsing.</w:t>
+      </w:r>
+      <w:r>
+        <w:rPr>
+          <w:rFonts w:ascii="Arial" w:hAnsi="Arial" w:cs="Arial"/>
+        </w:rPr>
+        <w:t xml:space="preserve"> The system reads the file into memory using the </w:t>
       </w:r>
       <w:proofErr w:type="spellStart"/>
       <w:r>
         <w:rPr>
           <w:rFonts w:ascii="Arial" w:hAnsi="Arial" w:cs="Arial"/>
         </w:rPr>
-        <w:t>MultipartFile</w:t>
+        <w:t>getBytes</w:t>
       </w:r>
       <w:proofErr w:type="spellEnd"/>
       <w:r>
         <w:rPr>
           <w:rFonts w:ascii="Arial" w:hAnsi="Arial" w:cs="Arial"/>
         </w:rPr>
-        <w:t xml:space="preserve"> object via the @RequestParam</w:t>
-      </w:r>
-      <w:r>
-        <w:rPr>
-          <w:rFonts w:ascii="Arial" w:hAnsi="Arial" w:cs="Arial"/>
-        </w:rPr>
-        <w:t>(“file”)</w:t>
-      </w:r>
-      <w:r>
-        <w:rPr>
-          <w:rFonts w:ascii="Arial" w:hAnsi="Arial" w:cs="Arial"/>
-        </w:rPr>
-        <w:t xml:space="preserve"> annotation. This</w:t>
-      </w:r>
+        <w:t xml:space="preserve">() method and converts the byte array into a </w:t>
+      </w:r>
+      <w:r>
+        <w:rPr>
+          <w:rFonts w:ascii="Arial" w:hAnsi="Arial" w:cs="Arial"/>
+        </w:rPr>
+        <w:t>s</w:t>
+      </w:r>
+      <w:r>
+        <w:rPr>
+          <w:rFonts w:ascii="Arial" w:hAnsi="Arial" w:cs="Arial"/>
+        </w:rPr>
+        <w:t>tring object, which holds the screenplay’s text.</w:t>
+      </w:r>
+    </w:p>
+    <w:p>
+      <w:pPr>
+        <w:spacing w:line="360" w:lineRule="auto"/>
+        <w:rPr>
+          <w:rFonts w:ascii="Arial" w:hAnsi="Arial" w:cs="Arial"/>
+        </w:rPr>
+      </w:pPr>
+    </w:p>
+    <w:p>
+      <w:pPr>
+        <w:spacing w:line="360" w:lineRule="auto"/>
+        <w:rPr>
+          <w:rFonts w:ascii="Arial" w:hAnsi="Arial" w:cs="Arial"/>
+        </w:rPr>
+      </w:pPr>
+      <w:r>
+        <w:rPr>
+          <w:rFonts w:ascii="Arial" w:hAnsi="Arial" w:cs="Arial"/>
+        </w:rPr>
+        <w:t xml:space="preserve">The controller follows a layered architecture and </w:t>
+      </w:r>
+      <w:r>
+        <w:rPr>
+          <w:rFonts w:ascii="Arial" w:hAnsi="Arial" w:cs="Arial"/>
+        </w:rPr>
+        <w:t xml:space="preserve">delegates further processing of the script to the </w:t>
+      </w:r>
+      <w:proofErr w:type="spellStart"/>
+      <w:r>
+        <w:rPr>
+          <w:rFonts w:ascii="Arial" w:hAnsi="Arial" w:cs="Arial"/>
+        </w:rPr>
+        <w:t>ScriptProcessingService</w:t>
+      </w:r>
+      <w:proofErr w:type="spellEnd"/>
+      <w:r>
+        <w:rPr>
+          <w:rFonts w:ascii="Arial" w:hAnsi="Arial" w:cs="Arial"/>
+        </w:rPr>
+        <w:t xml:space="preserve">, which is responsible for script parsing and scene extraction. They are conducted through the </w:t>
+      </w:r>
+      <w:proofErr w:type="spellStart"/>
+      <w:r>
+        <w:rPr>
+          <w:rFonts w:ascii="Arial" w:hAnsi="Arial" w:cs="Arial"/>
+        </w:rPr>
+        <w:t>splitScenes</w:t>
+      </w:r>
+      <w:proofErr w:type="spellEnd"/>
       <w:r>
         <w:rPr>
           <w:rFonts w:ascii="Arial" w:hAnsi="Arial" w:cs="Arial"/>
@@ -10471,94 +10481,118 @@
         <w:rPr>
           <w:rFonts w:ascii="Arial" w:hAnsi="Arial" w:cs="Arial"/>
         </w:rPr>
-        <w:t>provides access to the file’s metadata and binary content without requiring manual request parsing.</w:t>
-      </w:r>
-      <w:r>
-        <w:rPr>
-          <w:rFonts w:ascii="Arial" w:hAnsi="Arial" w:cs="Arial"/>
-        </w:rPr>
-        <w:t xml:space="preserve"> The system reads the file into memory using the </w:t>
+        <w:t>method</w:t>
+      </w:r>
+      <w:r>
+        <w:rPr>
+          <w:rFonts w:ascii="Arial" w:hAnsi="Arial" w:cs="Arial"/>
+        </w:rPr>
+        <w:t xml:space="preserve"> of the </w:t>
       </w:r>
       <w:proofErr w:type="spellStart"/>
       <w:r>
         <w:rPr>
           <w:rFonts w:ascii="Arial" w:hAnsi="Arial" w:cs="Arial"/>
         </w:rPr>
-        <w:t>getBytes</w:t>
+        <w:t>ScriptParser</w:t>
       </w:r>
       <w:proofErr w:type="spellEnd"/>
       <w:r>
         <w:rPr>
           <w:rFonts w:ascii="Arial" w:hAnsi="Arial" w:cs="Arial"/>
         </w:rPr>
-        <w:t xml:space="preserve">() method and converts the byte array into a </w:t>
-      </w:r>
-      <w:r>
-        <w:rPr>
-          <w:rFonts w:ascii="Arial" w:hAnsi="Arial" w:cs="Arial"/>
-        </w:rPr>
-        <w:t>s</w:t>
-      </w:r>
-      <w:r>
-        <w:rPr>
-          <w:rFonts w:ascii="Arial" w:hAnsi="Arial" w:cs="Arial"/>
-        </w:rPr>
-        <w:t>tring object, which holds the screenplay’s text.</w:t>
-      </w:r>
-    </w:p>
-    <w:p>
-      <w:pPr>
-        <w:spacing w:line="360" w:lineRule="auto"/>
-        <w:rPr>
-          <w:rFonts w:ascii="Arial" w:hAnsi="Arial" w:cs="Arial"/>
-        </w:rPr>
-      </w:pPr>
-    </w:p>
-    <w:p>
-      <w:pPr>
-        <w:spacing w:line="360" w:lineRule="auto"/>
-        <w:rPr>
-          <w:rFonts w:ascii="Arial" w:hAnsi="Arial" w:cs="Arial"/>
-        </w:rPr>
-      </w:pPr>
-      <w:r>
-        <w:rPr>
-          <w:rFonts w:ascii="Arial" w:hAnsi="Arial" w:cs="Arial"/>
-        </w:rPr>
-        <w:t xml:space="preserve">The controller follows a layered architecture and </w:t>
-      </w:r>
-      <w:r>
-        <w:rPr>
-          <w:rFonts w:ascii="Arial" w:hAnsi="Arial" w:cs="Arial"/>
-        </w:rPr>
-        <w:t xml:space="preserve">delegates further processing of the script to the </w:t>
+        <w:t xml:space="preserve"> class, which calls the </w:t>
       </w:r>
       <w:proofErr w:type="spellStart"/>
       <w:r>
         <w:rPr>
           <w:rFonts w:ascii="Arial" w:hAnsi="Arial" w:cs="Arial"/>
         </w:rPr>
-        <w:t>ScriptProcessingService</w:t>
+        <w:t>removePageNumbers</w:t>
       </w:r>
       <w:proofErr w:type="spellEnd"/>
       <w:r>
         <w:rPr>
           <w:rFonts w:ascii="Arial" w:hAnsi="Arial" w:cs="Arial"/>
         </w:rPr>
-        <w:t xml:space="preserve">, which is responsible for script parsing and scene extraction. They are conducted through the </w:t>
+        <w:t xml:space="preserve"> </w:t>
+      </w:r>
+      <w:r>
+        <w:rPr>
+          <w:rFonts w:ascii="Arial" w:hAnsi="Arial" w:cs="Arial"/>
+        </w:rPr>
+        <w:t>method</w:t>
+      </w:r>
+      <w:r>
+        <w:rPr>
+          <w:rFonts w:ascii="Arial" w:hAnsi="Arial" w:cs="Arial"/>
+        </w:rPr>
+        <w:t xml:space="preserve"> of the same class.</w:t>
+      </w:r>
+    </w:p>
+    <w:p>
+      <w:pPr>
+        <w:spacing w:line="360" w:lineRule="auto"/>
+        <w:rPr>
+          <w:rFonts w:ascii="Arial" w:hAnsi="Arial" w:cs="Arial"/>
+        </w:rPr>
+      </w:pPr>
+    </w:p>
+    <w:p>
+      <w:pPr>
+        <w:spacing w:line="360" w:lineRule="auto"/>
+        <w:rPr>
+          <w:rFonts w:ascii="Arial" w:hAnsi="Arial" w:cs="Arial"/>
+        </w:rPr>
+      </w:pPr>
+      <w:r>
+        <w:rPr>
+          <w:rFonts w:ascii="Arial" w:hAnsi="Arial" w:cs="Arial"/>
+        </w:rPr>
+        <w:t>Before the segmentation</w:t>
+      </w:r>
+      <w:r>
+        <w:rPr>
+          <w:rFonts w:ascii="Arial" w:hAnsi="Arial" w:cs="Arial"/>
+        </w:rPr>
+        <w:t xml:space="preserve"> of scenes</w:t>
+      </w:r>
+      <w:r>
+        <w:rPr>
+          <w:rFonts w:ascii="Arial" w:hAnsi="Arial" w:cs="Arial"/>
+        </w:rPr>
+        <w:t xml:space="preserve">, </w:t>
+      </w:r>
+      <w:r>
+        <w:rPr>
+          <w:rFonts w:ascii="Arial" w:hAnsi="Arial" w:cs="Arial"/>
+        </w:rPr>
+        <w:t>page numbers are removed as they might make the identification of scenes through regular expressions more complicated.</w:t>
+      </w:r>
+      <w:r>
+        <w:rPr>
+          <w:rFonts w:ascii="Arial" w:hAnsi="Arial" w:cs="Arial"/>
+        </w:rPr>
+        <w:t xml:space="preserve"> The </w:t>
       </w:r>
       <w:proofErr w:type="spellStart"/>
       <w:r>
         <w:rPr>
           <w:rFonts w:ascii="Arial" w:hAnsi="Arial" w:cs="Arial"/>
         </w:rPr>
-        <w:t>splitScenes</w:t>
+        <w:t>removePageNumbers</w:t>
       </w:r>
       <w:proofErr w:type="spellEnd"/>
       <w:r>
         <w:rPr>
           <w:rFonts w:ascii="Arial" w:hAnsi="Arial" w:cs="Arial"/>
         </w:rPr>
+        <w:t>(String script)</w:t>
+      </w:r>
+      <w:r>
+        <w:rPr>
+          <w:rFonts w:ascii="Arial" w:hAnsi="Arial" w:cs="Arial"/>
+        </w:rPr>
         <w:t xml:space="preserve"> </w:t>
       </w:r>
       <w:r>
@@ -10571,101 +10605,13 @@
         <w:rPr>
           <w:rFonts w:ascii="Arial" w:hAnsi="Arial" w:cs="Arial"/>
         </w:rPr>
-        <w:t xml:space="preserve"> of the </w:t>
-      </w:r>
-      <w:proofErr w:type="spellStart"/>
-      <w:r>
-        <w:rPr>
-          <w:rFonts w:ascii="Arial" w:hAnsi="Arial" w:cs="Arial"/>
-        </w:rPr>
-        <w:t>ScriptParser</w:t>
-      </w:r>
-      <w:proofErr w:type="spellEnd"/>
-      <w:r>
-        <w:rPr>
-          <w:rFonts w:ascii="Arial" w:hAnsi="Arial" w:cs="Arial"/>
-        </w:rPr>
-        <w:t xml:space="preserve"> class, which </w:t>
-      </w:r>
-      <w:proofErr w:type="gramStart"/>
-      <w:r>
-        <w:rPr>
-          <w:rFonts w:ascii="Arial" w:hAnsi="Arial" w:cs="Arial"/>
-        </w:rPr>
-        <w:t>calls</w:t>
-      </w:r>
-      <w:proofErr w:type="gramEnd"/>
-      <w:r>
-        <w:rPr>
-          <w:rFonts w:ascii="Arial" w:hAnsi="Arial" w:cs="Arial"/>
-        </w:rPr>
-        <w:t xml:space="preserve"> the </w:t>
-      </w:r>
-      <w:proofErr w:type="spellStart"/>
-      <w:r>
-        <w:rPr>
-          <w:rFonts w:ascii="Arial" w:hAnsi="Arial" w:cs="Arial"/>
-        </w:rPr>
-        <w:t>removePageNumbers</w:t>
-      </w:r>
-      <w:proofErr w:type="spellEnd"/>
-      <w:r>
-        <w:rPr>
-          <w:rFonts w:ascii="Arial" w:hAnsi="Arial" w:cs="Arial"/>
-        </w:rPr>
-        <w:t xml:space="preserve"> </w:t>
-      </w:r>
-      <w:r>
-        <w:rPr>
-          <w:rFonts w:ascii="Arial" w:hAnsi="Arial" w:cs="Arial"/>
-        </w:rPr>
-        <w:t>method</w:t>
-      </w:r>
-      <w:r>
-        <w:rPr>
-          <w:rFonts w:ascii="Arial" w:hAnsi="Arial" w:cs="Arial"/>
-        </w:rPr>
-        <w:t xml:space="preserve"> of the same class.</w:t>
-      </w:r>
-    </w:p>
-    <w:p>
-      <w:pPr>
-        <w:spacing w:line="360" w:lineRule="auto"/>
-        <w:rPr>
-          <w:rFonts w:ascii="Arial" w:hAnsi="Arial" w:cs="Arial"/>
-        </w:rPr>
-      </w:pPr>
-    </w:p>
-    <w:p>
-      <w:pPr>
-        <w:spacing w:line="360" w:lineRule="auto"/>
-        <w:rPr>
-          <w:rFonts w:ascii="Arial" w:hAnsi="Arial" w:cs="Arial"/>
-        </w:rPr>
-      </w:pPr>
-      <w:r>
-        <w:rPr>
-          <w:rFonts w:ascii="Arial" w:hAnsi="Arial" w:cs="Arial"/>
-        </w:rPr>
-        <w:t>Before the segmentation</w:t>
-      </w:r>
-      <w:r>
-        <w:rPr>
-          <w:rFonts w:ascii="Arial" w:hAnsi="Arial" w:cs="Arial"/>
-        </w:rPr>
-        <w:t xml:space="preserve"> of scenes</w:t>
-      </w:r>
-      <w:r>
-        <w:rPr>
-          <w:rFonts w:ascii="Arial" w:hAnsi="Arial" w:cs="Arial"/>
-        </w:rPr>
-        <w:t xml:space="preserve">, </w:t>
-      </w:r>
-      <w:r>
-        <w:rPr>
-          <w:rFonts w:ascii="Arial" w:hAnsi="Arial" w:cs="Arial"/>
-        </w:rPr>
-        <w:t>page numbers are removed as they might make the identification of scenes through regular expressions more complicated.</w:t>
+        <w:t xml:space="preserve"> splits the script’s string into lines. As the software goes through each line and trims it, it encounters two cases of numbers in a screenplay. The first one is the </w:t>
+      </w:r>
+      <w:r>
+        <w:rPr>
+          <w:rFonts w:ascii="Arial" w:hAnsi="Arial" w:cs="Arial"/>
+        </w:rPr>
+        <w:t>line of repeated numbers that may serve as a header or a footer page number.</w:t>
       </w:r>
       <w:r>
         <w:rPr>
@@ -10673,50 +10619,6 @@
         </w:rPr>
         <w:t xml:space="preserve"> The </w:t>
       </w:r>
-      <w:proofErr w:type="spellStart"/>
-      <w:r>
-        <w:rPr>
-          <w:rFonts w:ascii="Arial" w:hAnsi="Arial" w:cs="Arial"/>
-        </w:rPr>
-        <w:t>removePageNumbers</w:t>
-      </w:r>
-      <w:proofErr w:type="spellEnd"/>
-      <w:r>
-        <w:rPr>
-          <w:rFonts w:ascii="Arial" w:hAnsi="Arial" w:cs="Arial"/>
-        </w:rPr>
-        <w:t>(String script)</w:t>
-      </w:r>
-      <w:r>
-        <w:rPr>
-          <w:rFonts w:ascii="Arial" w:hAnsi="Arial" w:cs="Arial"/>
-        </w:rPr>
-        <w:t xml:space="preserve"> </w:t>
-      </w:r>
-      <w:r>
-        <w:rPr>
-          <w:rFonts w:ascii="Arial" w:hAnsi="Arial" w:cs="Arial"/>
-        </w:rPr>
-        <w:t>method</w:t>
-      </w:r>
-      <w:r>
-        <w:rPr>
-          <w:rFonts w:ascii="Arial" w:hAnsi="Arial" w:cs="Arial"/>
-        </w:rPr>
-        <w:t xml:space="preserve"> splits the script’s string into lines. As the software goes through each line and trims it, it encounters two cases of numbers in a screenplay. The first one is the </w:t>
-      </w:r>
-      <w:r>
-        <w:rPr>
-          <w:rFonts w:ascii="Arial" w:hAnsi="Arial" w:cs="Arial"/>
-        </w:rPr>
-        <w:t>line of repeated numbers that may serve as a header or a footer page number.</w:t>
-      </w:r>
-      <w:r>
-        <w:rPr>
-          <w:rFonts w:ascii="Arial" w:hAnsi="Arial" w:cs="Arial"/>
-        </w:rPr>
-        <w:t xml:space="preserve"> The </w:t>
-      </w:r>
       <w:r>
         <w:rPr>
           <w:rFonts w:ascii="Arial" w:hAnsi="Arial" w:cs="Arial"/>
@@ -10751,21 +10653,7 @@
         <w:rPr>
           <w:rFonts w:ascii="Arial" w:hAnsi="Arial" w:cs="Arial"/>
         </w:rPr>
-        <w:t xml:space="preserve"> </w:t>
-      </w:r>
-      <w:proofErr w:type="gramStart"/>
-      <w:r>
-        <w:rPr>
-          <w:rFonts w:ascii="Arial" w:hAnsi="Arial" w:cs="Arial"/>
-        </w:rPr>
-        <w:t xml:space="preserve">allows </w:t>
-      </w:r>
-      <w:proofErr w:type="gramEnd"/>
-      <w:r>
-        <w:rPr>
-          <w:rFonts w:ascii="Arial" w:hAnsi="Arial" w:cs="Arial"/>
-        </w:rPr>
-        <w:t>. and * after the number</w:t>
+        <w:t xml:space="preserve"> allows . and * after the number</w:t>
       </w:r>
       <w:r>
         <w:rPr>
@@ -11184,14 +11072,7 @@
         <w:rPr>
           <w:rFonts w:ascii="Arial" w:hAnsi="Arial" w:cs="Arial"/>
         </w:rPr>
-        <w:t xml:space="preserve"> iterates through each line, trims it from any leading or trailing spaces, but </w:t>
-      </w:r>
-      <w:proofErr w:type="gramStart"/>
-      <w:r>
-        <w:rPr>
-          <w:rFonts w:ascii="Arial" w:hAnsi="Arial" w:cs="Arial"/>
-        </w:rPr>
-        <w:t xml:space="preserve">still </w:t>
+        <w:t xml:space="preserve"> iterates through each line, trims it from any leading or trailing spaces, but still </w:t>
       </w:r>
       <w:r>
         <w:rPr>
@@ -11199,7 +11080,6 @@
         </w:rPr>
         <w:t>keeps</w:t>
       </w:r>
-      <w:proofErr w:type="gramEnd"/>
       <w:r>
         <w:rPr>
           <w:rFonts w:ascii="Arial" w:hAnsi="Arial" w:cs="Arial"/>
@@ -11240,21 +11120,7 @@
         <w:rPr>
           <w:rFonts w:ascii="Arial" w:hAnsi="Arial" w:cs="Arial"/>
         </w:rPr>
-        <w:t xml:space="preserve">. It counts all the empty lines inside the content of a scene as part of the total count of lines </w:t>
-      </w:r>
-      <w:proofErr w:type="gramStart"/>
-      <w:r>
-        <w:rPr>
-          <w:rFonts w:ascii="Arial" w:hAnsi="Arial" w:cs="Arial"/>
-        </w:rPr>
-        <w:t>in order to</w:t>
-      </w:r>
-      <w:proofErr w:type="gramEnd"/>
-      <w:r>
-        <w:rPr>
-          <w:rFonts w:ascii="Arial" w:hAnsi="Arial" w:cs="Arial"/>
-        </w:rPr>
-        <w:t xml:space="preserve"> mirror the original page formatting better.</w:t>
+        <w:t>. It counts all the empty lines inside the content of a scene as part of the total count of lines in order to mirror the original page formatting better.</w:t>
       </w:r>
       <w:r>
         <w:rPr>
@@ -12293,21 +12159,7 @@
         <w:rPr>
           <w:rFonts w:ascii="Arial" w:hAnsi="Arial" w:cs="Arial"/>
         </w:rPr>
-        <w:t xml:space="preserve">It is used as a scene ID when the user edits the characters or the scene order, and it is essential for communication between the backend and frontend. It is also used when computing the order score of the scheduler that computes the distance between scenes </w:t>
-      </w:r>
-      <w:proofErr w:type="gramStart"/>
-      <w:r>
-        <w:rPr>
-          <w:rFonts w:ascii="Arial" w:hAnsi="Arial" w:cs="Arial"/>
-        </w:rPr>
-        <w:t>in order to</w:t>
-      </w:r>
-      <w:proofErr w:type="gramEnd"/>
-      <w:r>
-        <w:rPr>
-          <w:rFonts w:ascii="Arial" w:hAnsi="Arial" w:cs="Arial"/>
-        </w:rPr>
-        <w:t xml:space="preserve"> encourage continuity.</w:t>
+        <w:t>It is used as a scene ID when the user edits the characters or the scene order, and it is essential for communication between the backend and frontend. It is also used when computing the order score of the scheduler that computes the distance between scenes in order to encourage continuity.</w:t>
       </w:r>
     </w:p>
     <w:p>
@@ -12366,149 +12218,199 @@
           <w:i/>
           <w:iCs/>
         </w:rPr>
-        <w:t xml:space="preserve">Big </w:t>
-      </w:r>
-      <w:proofErr w:type="gramStart"/>
+        <w:t>Big Break!</w:t>
+      </w:r>
+      <w:r>
+        <w:rPr>
+          <w:rFonts w:ascii="Arial" w:hAnsi="Arial" w:cs="Arial"/>
+        </w:rPr>
+        <w:t>, it</w:t>
+      </w:r>
+      <w:r>
+        <w:rPr>
+          <w:rFonts w:ascii="Arial" w:hAnsi="Arial" w:cs="Arial"/>
+        </w:rPr>
+        <w:t xml:space="preserve"> is computed</w:t>
+      </w:r>
+      <w:r>
+        <w:rPr>
+          <w:rFonts w:ascii="Arial" w:hAnsi="Arial" w:cs="Arial"/>
+        </w:rPr>
+        <w:t xml:space="preserve"> before creating the new scene</w:t>
+      </w:r>
+      <w:r>
+        <w:rPr>
+          <w:rFonts w:ascii="Arial" w:hAnsi="Arial" w:cs="Arial"/>
+        </w:rPr>
+        <w:t xml:space="preserve"> by dividing the total number of content lines in the scene by 55.0 (the relative number of lines contained in one page). This is multiplied by 8</w:t>
+      </w:r>
+      <w:r>
+        <w:rPr>
+          <w:rFonts w:ascii="Arial" w:hAnsi="Arial" w:cs="Arial"/>
+        </w:rPr>
+        <w:t xml:space="preserve"> and rounded</w:t>
+      </w:r>
+      <w:r>
+        <w:rPr>
+          <w:rFonts w:ascii="Arial" w:hAnsi="Arial" w:cs="Arial"/>
+        </w:rPr>
+        <w:t xml:space="preserve">, as </w:t>
+      </w:r>
+      <w:r>
+        <w:rPr>
+          <w:rFonts w:ascii="Arial" w:hAnsi="Arial" w:cs="Arial"/>
+        </w:rPr>
+        <w:t xml:space="preserve">the scene length would be displayed in eighths in the UI, but working with integers of eighths is easier for computation. This means that an integer number will be set into </w:t>
+      </w:r>
+      <w:proofErr w:type="spellStart"/>
+      <w:r>
+        <w:rPr>
+          <w:rFonts w:ascii="Arial" w:hAnsi="Arial" w:cs="Arial"/>
+        </w:rPr>
+        <w:t>sceneLengthEights</w:t>
+      </w:r>
+      <w:proofErr w:type="spellEnd"/>
+      <w:r>
+        <w:rPr>
+          <w:rFonts w:ascii="Arial" w:hAnsi="Arial" w:cs="Arial"/>
+        </w:rPr>
+        <w:t>. For example, if the number set is 17, this would be converted into 2 1/8 pages (17 / 8 = 2</w:t>
+      </w:r>
+      <w:r>
+        <w:rPr>
+          <w:rFonts w:ascii="Arial" w:hAnsi="Arial" w:cs="Arial"/>
+        </w:rPr>
+        <w:t xml:space="preserve"> (integer division)</w:t>
+      </w:r>
+      <w:r>
+        <w:rPr>
+          <w:rFonts w:ascii="Arial" w:hAnsi="Arial" w:cs="Arial"/>
+        </w:rPr>
+        <w:t xml:space="preserve"> and 17 % 8</w:t>
+      </w:r>
+      <w:r>
+        <w:rPr>
+          <w:rFonts w:ascii="Arial" w:hAnsi="Arial" w:cs="Arial"/>
+        </w:rPr>
+        <w:t xml:space="preserve"> (remainder division)</w:t>
+      </w:r>
+      <w:r>
+        <w:rPr>
+          <w:rFonts w:ascii="Arial" w:hAnsi="Arial" w:cs="Arial"/>
+        </w:rPr>
+        <w:t xml:space="preserve"> = 1) in the UI.</w:t>
+      </w:r>
+      <w:r>
+        <w:rPr>
+          <w:rFonts w:ascii="Arial" w:hAnsi="Arial" w:cs="Arial"/>
+        </w:rPr>
+        <w:t xml:space="preserve"> If the scene length in eighths is rounded to 0, it is reassigned to 1, as shooting even a very small scene takes time, and it should be computed when scheduling.</w:t>
+      </w:r>
+    </w:p>
+    <w:p>
+      <w:pPr>
+        <w:spacing w:line="360" w:lineRule="auto"/>
+        <w:rPr>
+          <w:rFonts w:ascii="Arial" w:hAnsi="Arial" w:cs="Arial"/>
+        </w:rPr>
+      </w:pPr>
+    </w:p>
+    <w:p>
+      <w:pPr>
+        <w:spacing w:line="360" w:lineRule="auto"/>
+        <w:rPr>
+          <w:rFonts w:ascii="Arial" w:hAnsi="Arial" w:cs="Arial"/>
+        </w:rPr>
+      </w:pPr>
+      <w:r>
+        <w:rPr>
+          <w:rFonts w:ascii="Arial" w:hAnsi="Arial" w:cs="Arial"/>
+        </w:rPr>
+        <w:t>After</w:t>
+      </w:r>
+      <w:r>
+        <w:rPr>
+          <w:rFonts w:ascii="Arial" w:hAnsi="Arial" w:cs="Arial"/>
+        </w:rPr>
+        <w:t>,</w:t>
+      </w:r>
+      <w:r>
+        <w:rPr>
+          <w:rFonts w:ascii="Arial" w:hAnsi="Arial" w:cs="Arial"/>
+        </w:rPr>
+        <w:t xml:space="preserve"> a new Scene object is created with</w:t>
+      </w:r>
+      <w:r>
+        <w:rPr>
+          <w:rFonts w:ascii="Arial" w:hAnsi="Arial" w:cs="Arial"/>
+        </w:rPr>
+        <w:t xml:space="preserve"> arguments that have mostly been computed in the previous iteration of the loop. </w:t>
+      </w:r>
       <w:r>
         <w:rPr>
           <w:rFonts w:ascii="Arial" w:hAnsi="Arial" w:cs="Arial"/>
           <w:i/>
           <w:iCs/>
         </w:rPr>
-        <w:t>Break!</w:t>
-      </w:r>
-      <w:r>
-        <w:rPr>
-          <w:rFonts w:ascii="Arial" w:hAnsi="Arial" w:cs="Arial"/>
-        </w:rPr>
-        <w:t>,</w:t>
-      </w:r>
-      <w:proofErr w:type="gramEnd"/>
-      <w:r>
-        <w:rPr>
-          <w:rFonts w:ascii="Arial" w:hAnsi="Arial" w:cs="Arial"/>
-        </w:rPr>
-        <w:t xml:space="preserve"> it</w:t>
-      </w:r>
-      <w:r>
-        <w:rPr>
-          <w:rFonts w:ascii="Arial" w:hAnsi="Arial" w:cs="Arial"/>
-        </w:rPr>
-        <w:t xml:space="preserve"> is computed</w:t>
-      </w:r>
-      <w:r>
-        <w:rPr>
-          <w:rFonts w:ascii="Arial" w:hAnsi="Arial" w:cs="Arial"/>
-        </w:rPr>
-        <w:t xml:space="preserve"> before creating the new scene</w:t>
-      </w:r>
-      <w:r>
-        <w:rPr>
-          <w:rFonts w:ascii="Arial" w:hAnsi="Arial" w:cs="Arial"/>
-        </w:rPr>
-        <w:t xml:space="preserve"> by dividing the total number of content lines in the scene by 55.0 (the relative number of lines contained in one page). This is multiplied by 8</w:t>
-      </w:r>
-      <w:r>
-        <w:rPr>
-          <w:rFonts w:ascii="Arial" w:hAnsi="Arial" w:cs="Arial"/>
-        </w:rPr>
-        <w:t xml:space="preserve"> and rounded</w:t>
-      </w:r>
-      <w:r>
-        <w:rPr>
-          <w:rFonts w:ascii="Arial" w:hAnsi="Arial" w:cs="Arial"/>
-        </w:rPr>
-        <w:t xml:space="preserve">, as </w:t>
-      </w:r>
-      <w:r>
-        <w:rPr>
-          <w:rFonts w:ascii="Arial" w:hAnsi="Arial" w:cs="Arial"/>
-        </w:rPr>
-        <w:t xml:space="preserve">the scene length would be displayed in eighths in the UI, but working with integers of eighths is easier for computation. This means that an integer number will be set into </w:t>
-      </w:r>
-      <w:proofErr w:type="spellStart"/>
-      <w:r>
-        <w:rPr>
-          <w:rFonts w:ascii="Arial" w:hAnsi="Arial" w:cs="Arial"/>
-        </w:rPr>
-        <w:t>sceneLengthEights</w:t>
-      </w:r>
-      <w:proofErr w:type="spellEnd"/>
-      <w:r>
-        <w:rPr>
-          <w:rFonts w:ascii="Arial" w:hAnsi="Arial" w:cs="Arial"/>
-        </w:rPr>
-        <w:t>. For example, if the number set is 17, this would be converted into 2 1/8 pages (17 / 8 = 2</w:t>
-      </w:r>
-      <w:r>
-        <w:rPr>
-          <w:rFonts w:ascii="Arial" w:hAnsi="Arial" w:cs="Arial"/>
-        </w:rPr>
-        <w:t xml:space="preserve"> (integer division)</w:t>
-      </w:r>
-      <w:r>
-        <w:rPr>
-          <w:rFonts w:ascii="Arial" w:hAnsi="Arial" w:cs="Arial"/>
-        </w:rPr>
-        <w:t xml:space="preserve"> and 17 % 8</w:t>
-      </w:r>
-      <w:r>
-        <w:rPr>
-          <w:rFonts w:ascii="Arial" w:hAnsi="Arial" w:cs="Arial"/>
-        </w:rPr>
-        <w:t xml:space="preserve"> (remainder division)</w:t>
-      </w:r>
-      <w:r>
-        <w:rPr>
-          <w:rFonts w:ascii="Arial" w:hAnsi="Arial" w:cs="Arial"/>
-        </w:rPr>
-        <w:t xml:space="preserve"> = 1) in the UI.</w:t>
-      </w:r>
-      <w:r>
-        <w:rPr>
-          <w:rFonts w:ascii="Arial" w:hAnsi="Arial" w:cs="Arial"/>
-        </w:rPr>
-        <w:t xml:space="preserve"> If the scene length in eighths is rounded to 0, it is reassigned to 1, as shooting even a very small scene takes time, and it should be computed when scheduling.</w:t>
-      </w:r>
-    </w:p>
-    <w:p>
-      <w:pPr>
-        <w:spacing w:line="360" w:lineRule="auto"/>
-        <w:rPr>
-          <w:rFonts w:ascii="Arial" w:hAnsi="Arial" w:cs="Arial"/>
-        </w:rPr>
-      </w:pPr>
-    </w:p>
-    <w:p>
-      <w:pPr>
-        <w:spacing w:line="360" w:lineRule="auto"/>
-        <w:rPr>
-          <w:rFonts w:ascii="Arial" w:hAnsi="Arial" w:cs="Arial"/>
-        </w:rPr>
-      </w:pPr>
-      <w:r>
-        <w:rPr>
-          <w:rFonts w:ascii="Arial" w:hAnsi="Arial" w:cs="Arial"/>
-        </w:rPr>
-        <w:t>After</w:t>
-      </w:r>
-      <w:r>
-        <w:rPr>
-          <w:rFonts w:ascii="Arial" w:hAnsi="Arial" w:cs="Arial"/>
-        </w:rPr>
-        <w:t>,</w:t>
-      </w:r>
-      <w:r>
-        <w:rPr>
-          <w:rFonts w:ascii="Arial" w:hAnsi="Arial" w:cs="Arial"/>
-        </w:rPr>
-        <w:t xml:space="preserve"> a new Scene object is created with</w:t>
-      </w:r>
-      <w:r>
-        <w:rPr>
-          <w:rFonts w:ascii="Arial" w:hAnsi="Arial" w:cs="Arial"/>
-        </w:rPr>
-        <w:t xml:space="preserve"> arguments that have mostly been computed in the previous iteration of the loop. </w:t>
+        <w:t>Big Break!</w:t>
+      </w:r>
+      <w:r>
+        <w:rPr>
+          <w:rFonts w:ascii="Arial" w:hAnsi="Arial" w:cs="Arial"/>
+        </w:rPr>
+        <w:t xml:space="preserve"> assigns these arguments to the constructor - t</w:t>
+      </w:r>
+      <w:r>
+        <w:rPr>
+          <w:rFonts w:ascii="Arial" w:hAnsi="Arial" w:cs="Arial"/>
+        </w:rPr>
+        <w:t xml:space="preserve">he scene’s integer order number, the scene’s </w:t>
+      </w:r>
+      <w:r>
+        <w:rPr>
+          <w:rFonts w:ascii="Arial" w:hAnsi="Arial" w:cs="Arial"/>
+        </w:rPr>
+        <w:t>st</w:t>
+      </w:r>
+      <w:r>
+        <w:rPr>
+          <w:rFonts w:ascii="Arial" w:hAnsi="Arial" w:cs="Arial"/>
+        </w:rPr>
+        <w:t xml:space="preserve">ring number, </w:t>
+      </w:r>
+      <w:r>
+        <w:rPr>
+          <w:rFonts w:ascii="Arial" w:hAnsi="Arial" w:cs="Arial"/>
+        </w:rPr>
+        <w:t>the full heading line, the content, the location keyword, the location, the time, and the scene length in eighths. The Scene object is added to the list of scenes to maintain the insertion order.</w:t>
+      </w:r>
+      <w:r>
+        <w:rPr>
+          <w:rFonts w:ascii="Arial" w:hAnsi="Arial" w:cs="Arial"/>
+        </w:rPr>
+        <w:t xml:space="preserve"> After adding the scene, all the argument variables are either set to null or zero to accommodate the scene of the current iteration.</w:t>
+      </w:r>
+    </w:p>
+    <w:p>
+      <w:pPr>
+        <w:spacing w:line="360" w:lineRule="auto"/>
+        <w:rPr>
+          <w:rFonts w:ascii="Arial" w:hAnsi="Arial" w:cs="Arial"/>
+        </w:rPr>
+      </w:pPr>
+    </w:p>
+    <w:p>
+      <w:pPr>
+        <w:spacing w:line="360" w:lineRule="auto"/>
+        <w:rPr>
+          <w:rFonts w:ascii="Arial" w:hAnsi="Arial" w:cs="Arial"/>
+        </w:rPr>
+      </w:pPr>
+      <w:r>
+        <w:rPr>
+          <w:rFonts w:ascii="Arial" w:hAnsi="Arial" w:cs="Arial"/>
+        </w:rPr>
+        <w:t xml:space="preserve">Setting the scene number for the current scene is the next step in the algorithm. </w:t>
       </w:r>
       <w:r>
         <w:rPr>
@@ -12522,59 +12424,155 @@
         <w:rPr>
           <w:rFonts w:ascii="Arial" w:hAnsi="Arial" w:cs="Arial"/>
         </w:rPr>
-        <w:t xml:space="preserve"> assigns these arguments to the constructor - t</w:t>
-      </w:r>
-      <w:r>
-        <w:rPr>
-          <w:rFonts w:ascii="Arial" w:hAnsi="Arial" w:cs="Arial"/>
-        </w:rPr>
-        <w:t xml:space="preserve">he scene’s integer order number, the scene’s </w:t>
-      </w:r>
-      <w:r>
-        <w:rPr>
-          <w:rFonts w:ascii="Arial" w:hAnsi="Arial" w:cs="Arial"/>
-        </w:rPr>
-        <w:t>st</w:t>
-      </w:r>
-      <w:r>
-        <w:rPr>
-          <w:rFonts w:ascii="Arial" w:hAnsi="Arial" w:cs="Arial"/>
-        </w:rPr>
-        <w:t xml:space="preserve">ring number, </w:t>
-      </w:r>
-      <w:r>
-        <w:rPr>
-          <w:rFonts w:ascii="Arial" w:hAnsi="Arial" w:cs="Arial"/>
-        </w:rPr>
-        <w:t>the full heading line, the content, the location keyword, the location, the time, and the scene length in eighths. The Scene object is added to the list of scenes to maintain the insertion order.</w:t>
-      </w:r>
-      <w:r>
-        <w:rPr>
-          <w:rFonts w:ascii="Arial" w:hAnsi="Arial" w:cs="Arial"/>
-        </w:rPr>
-        <w:t xml:space="preserve"> After adding the scene, all the argument variables are either set to null or zero to accommodate the scene of the current iteration.</w:t>
-      </w:r>
-    </w:p>
-    <w:p>
-      <w:pPr>
-        <w:spacing w:line="360" w:lineRule="auto"/>
-        <w:rPr>
-          <w:rFonts w:ascii="Arial" w:hAnsi="Arial" w:cs="Arial"/>
-        </w:rPr>
-      </w:pPr>
-    </w:p>
-    <w:p>
-      <w:pPr>
-        <w:spacing w:line="360" w:lineRule="auto"/>
-        <w:rPr>
-          <w:rFonts w:ascii="Arial" w:hAnsi="Arial" w:cs="Arial"/>
-        </w:rPr>
-      </w:pPr>
-      <w:r>
-        <w:rPr>
-          <w:rFonts w:ascii="Arial" w:hAnsi="Arial" w:cs="Arial"/>
-        </w:rPr>
-        <w:t xml:space="preserve">Setting the scene number for the current scene is the next step in the algorithm. </w:t>
+        <w:t xml:space="preserve"> </w:t>
+      </w:r>
+      <w:r>
+        <w:rPr>
+          <w:rFonts w:ascii="Arial" w:hAnsi="Arial" w:cs="Arial"/>
+        </w:rPr>
+        <w:t>prioritizes the scene closest to the heading, meaning that scene numbers in-line with the heading have a higher priority than the pending scene number from a line above the heading. This is why it first checks the scene number’s heading regex group and assigns it if it exists. In case the group is equal to null, it checks the pending scene number and sets it. If both are null, it leaves the scene number empty.</w:t>
+      </w:r>
+    </w:p>
+    <w:p>
+      <w:pPr>
+        <w:spacing w:line="360" w:lineRule="auto"/>
+        <w:rPr>
+          <w:rFonts w:ascii="Arial" w:hAnsi="Arial" w:cs="Arial"/>
+        </w:rPr>
+      </w:pPr>
+    </w:p>
+    <w:p>
+      <w:pPr>
+        <w:spacing w:line="360" w:lineRule="auto"/>
+        <w:rPr>
+          <w:rFonts w:ascii="Arial" w:hAnsi="Arial" w:cs="Arial"/>
+        </w:rPr>
+      </w:pPr>
+      <w:r>
+        <w:rPr>
+          <w:rFonts w:ascii="Arial" w:hAnsi="Arial" w:cs="Arial"/>
+        </w:rPr>
+        <w:t xml:space="preserve">In this case, </w:t>
+      </w:r>
+      <w:r>
+        <w:rPr>
+          <w:rFonts w:ascii="Arial" w:hAnsi="Arial" w:cs="Arial"/>
+        </w:rPr>
+        <w:t>the software checks if a second scene number exists after the heading’s time and assigns it to the scene number.</w:t>
+      </w:r>
+      <w:r>
+        <w:rPr>
+          <w:rFonts w:ascii="Arial" w:hAnsi="Arial" w:cs="Arial"/>
+        </w:rPr>
+        <w:t xml:space="preserve"> However, if the scene number is not empty but it is different from the trailing scene number, the first one is chosen.</w:t>
+      </w:r>
+      <w:r>
+        <w:rPr>
+          <w:rFonts w:ascii="Arial" w:hAnsi="Arial" w:cs="Arial"/>
+        </w:rPr>
+        <w:t xml:space="preserve"> If there is no scene number</w:t>
+      </w:r>
+      <w:r>
+        <w:rPr>
+          <w:rFonts w:ascii="Arial" w:hAnsi="Arial" w:cs="Arial"/>
+        </w:rPr>
+        <w:t xml:space="preserve"> at all</w:t>
+      </w:r>
+      <w:r>
+        <w:rPr>
+          <w:rFonts w:ascii="Arial" w:hAnsi="Arial" w:cs="Arial"/>
+        </w:rPr>
+        <w:t xml:space="preserve"> for this scene, a fallback counter value is assigned to it. It starts at 1 and is incremented according to the last numeric value of the scene number the parser has encountered. In this way, if a scene number is omitted or there are no scene numbers in the screenplay, the scenes would still be numbered in order.</w:t>
+      </w:r>
+    </w:p>
+    <w:p>
+      <w:pPr>
+        <w:spacing w:line="360" w:lineRule="auto"/>
+        <w:rPr>
+          <w:rFonts w:ascii="Arial" w:hAnsi="Arial" w:cs="Arial"/>
+        </w:rPr>
+      </w:pPr>
+    </w:p>
+    <w:p>
+      <w:pPr>
+        <w:spacing w:line="360" w:lineRule="auto"/>
+        <w:rPr>
+          <w:rFonts w:ascii="Arial" w:hAnsi="Arial" w:cs="Arial"/>
+        </w:rPr>
+      </w:pPr>
+      <w:r>
+        <w:rPr>
+          <w:rFonts w:ascii="Arial" w:hAnsi="Arial" w:cs="Arial"/>
+        </w:rPr>
+        <w:t xml:space="preserve">After the scene number is set, </w:t>
+      </w:r>
+      <w:r>
+        <w:rPr>
+          <w:rFonts w:ascii="Arial" w:hAnsi="Arial" w:cs="Arial"/>
+        </w:rPr>
+        <w:t>the uppercased location keyword, location, and time are extracted from the regex groups</w:t>
+      </w:r>
+      <w:r>
+        <w:rPr>
+          <w:rFonts w:ascii="Arial" w:hAnsi="Arial" w:cs="Arial"/>
+        </w:rPr>
+        <w:t xml:space="preserve"> (</w:t>
+      </w:r>
+      <w:proofErr w:type="spellStart"/>
+      <w:r>
+        <w:rPr>
+          <w:rFonts w:ascii="Arial" w:hAnsi="Arial" w:cs="Arial"/>
+        </w:rPr>
+        <w:t>Jurafsky</w:t>
+      </w:r>
+      <w:proofErr w:type="spellEnd"/>
+      <w:r>
+        <w:rPr>
+          <w:rFonts w:ascii="Arial" w:hAnsi="Arial" w:cs="Arial"/>
+        </w:rPr>
+        <w:t xml:space="preserve"> and James)</w:t>
+      </w:r>
+      <w:r>
+        <w:rPr>
+          <w:rFonts w:ascii="Arial" w:hAnsi="Arial" w:cs="Arial"/>
+        </w:rPr>
+        <w:t>. The location is normalized by removing any trailing scene numbers, leading dots and spaces at the start, and trims leftover whitespace.</w:t>
+      </w:r>
+      <w:r>
+        <w:rPr>
+          <w:rFonts w:ascii="Arial" w:hAnsi="Arial" w:cs="Arial"/>
+        </w:rPr>
+        <w:t xml:space="preserve"> It creates a displayed heading variable and assigns to it the location keyword, the location normalized if it exists and the time if it is not empty.</w:t>
+      </w:r>
+      <w:r>
+        <w:rPr>
+          <w:rFonts w:ascii="Arial" w:hAnsi="Arial" w:cs="Arial"/>
+        </w:rPr>
+        <w:t xml:space="preserve"> This will be displayed in the UI as the heading.</w:t>
+      </w:r>
+      <w:r>
+        <w:rPr>
+          <w:rFonts w:ascii="Arial" w:hAnsi="Arial" w:cs="Arial"/>
+        </w:rPr>
+        <w:t xml:space="preserve"> It sets all the local scene variables to the ones</w:t>
+      </w:r>
+      <w:r>
+        <w:rPr>
+          <w:rFonts w:ascii="Arial" w:hAnsi="Arial" w:cs="Arial"/>
+        </w:rPr>
+        <w:t xml:space="preserve"> outside the loop</w:t>
+      </w:r>
+      <w:r>
+        <w:rPr>
+          <w:rFonts w:ascii="Arial" w:hAnsi="Arial" w:cs="Arial"/>
+        </w:rPr>
+        <w:t>,</w:t>
+      </w:r>
+      <w:r>
+        <w:rPr>
+          <w:rFonts w:ascii="Arial" w:hAnsi="Arial" w:cs="Arial"/>
+        </w:rPr>
+        <w:t xml:space="preserve"> so </w:t>
       </w:r>
       <w:r>
         <w:rPr>
@@ -12582,8 +12580,22 @@
           <w:i/>
           <w:iCs/>
         </w:rPr>
-        <w:t>Big Break!</w:t>
-      </w:r>
+        <w:t xml:space="preserve">Big Break! </w:t>
+      </w:r>
+      <w:r>
+        <w:rPr>
+          <w:rFonts w:ascii="Arial" w:hAnsi="Arial" w:cs="Arial"/>
+        </w:rPr>
+        <w:t xml:space="preserve">can create the current scene and add it to the </w:t>
+      </w:r>
+      <w:proofErr w:type="spellStart"/>
+      <w:r>
+        <w:rPr>
+          <w:rFonts w:ascii="Arial" w:hAnsi="Arial" w:cs="Arial"/>
+        </w:rPr>
+        <w:t>ArrayList</w:t>
+      </w:r>
+      <w:proofErr w:type="spellEnd"/>
       <w:r>
         <w:rPr>
           <w:rFonts w:ascii="Arial" w:hAnsi="Arial" w:cs="Arial"/>
@@ -12594,149 +12606,35 @@
         <w:rPr>
           <w:rFonts w:ascii="Arial" w:hAnsi="Arial" w:cs="Arial"/>
         </w:rPr>
-        <w:t>prioritizes the scene closest to the heading, meaning that scene numbers in-line with the heading have a higher priority than the pending scene number from a line above the heading. This is why it first checks the scene number’s heading regex group and assigns it if it exists. In case the group is equal to null, it checks the pending scene number and sets it. If both are null, it leaves the scene number empty.</w:t>
-      </w:r>
-    </w:p>
-    <w:p>
-      <w:pPr>
-        <w:spacing w:line="360" w:lineRule="auto"/>
-        <w:rPr>
-          <w:rFonts w:ascii="Arial" w:hAnsi="Arial" w:cs="Arial"/>
-        </w:rPr>
-      </w:pPr>
-    </w:p>
-    <w:p>
-      <w:pPr>
-        <w:spacing w:line="360" w:lineRule="auto"/>
-        <w:rPr>
-          <w:rFonts w:ascii="Arial" w:hAnsi="Arial" w:cs="Arial"/>
-        </w:rPr>
-      </w:pPr>
-      <w:r>
-        <w:rPr>
-          <w:rFonts w:ascii="Arial" w:hAnsi="Arial" w:cs="Arial"/>
-        </w:rPr>
-        <w:t xml:space="preserve">In this case, </w:t>
-      </w:r>
-      <w:r>
-        <w:rPr>
-          <w:rFonts w:ascii="Arial" w:hAnsi="Arial" w:cs="Arial"/>
-        </w:rPr>
-        <w:t>the software checks if a second scene number exists after the heading’s time and assigns it to the scene number.</w:t>
-      </w:r>
-      <w:r>
-        <w:rPr>
-          <w:rFonts w:ascii="Arial" w:hAnsi="Arial" w:cs="Arial"/>
-        </w:rPr>
-        <w:t xml:space="preserve"> However, if the scene number is not empty but it is different from the trailing scene number, the first one is chosen.</w:t>
-      </w:r>
-      <w:r>
-        <w:rPr>
-          <w:rFonts w:ascii="Arial" w:hAnsi="Arial" w:cs="Arial"/>
-        </w:rPr>
-        <w:t xml:space="preserve"> If there is no scene number</w:t>
-      </w:r>
-      <w:r>
-        <w:rPr>
-          <w:rFonts w:ascii="Arial" w:hAnsi="Arial" w:cs="Arial"/>
-        </w:rPr>
-        <w:t xml:space="preserve"> at all</w:t>
-      </w:r>
-      <w:r>
-        <w:rPr>
-          <w:rFonts w:ascii="Arial" w:hAnsi="Arial" w:cs="Arial"/>
-        </w:rPr>
-        <w:t xml:space="preserve"> for this scene, a fallback counter value is assigned to it. It starts at 1 and is incremented according to the last numeric value of the scene number the parser has encountered. In this way, if a scene number is omitted or there are no scene numbers in the screenplay, the scenes would still be numbered in order.</w:t>
-      </w:r>
-    </w:p>
-    <w:p>
-      <w:pPr>
-        <w:spacing w:line="360" w:lineRule="auto"/>
-        <w:rPr>
-          <w:rFonts w:ascii="Arial" w:hAnsi="Arial" w:cs="Arial"/>
-        </w:rPr>
-      </w:pPr>
-    </w:p>
-    <w:p>
-      <w:pPr>
-        <w:spacing w:line="360" w:lineRule="auto"/>
-        <w:rPr>
-          <w:rFonts w:ascii="Arial" w:hAnsi="Arial" w:cs="Arial"/>
-        </w:rPr>
-      </w:pPr>
-      <w:r>
-        <w:rPr>
-          <w:rFonts w:ascii="Arial" w:hAnsi="Arial" w:cs="Arial"/>
-        </w:rPr>
-        <w:t xml:space="preserve">After the scene number is set, </w:t>
-      </w:r>
-      <w:r>
-        <w:rPr>
-          <w:rFonts w:ascii="Arial" w:hAnsi="Arial" w:cs="Arial"/>
-        </w:rPr>
-        <w:t>the uppercased location keyword, location, and time are extracted from the regex groups</w:t>
-      </w:r>
-      <w:r>
-        <w:rPr>
-          <w:rFonts w:ascii="Arial" w:hAnsi="Arial" w:cs="Arial"/>
-        </w:rPr>
-        <w:t xml:space="preserve"> (</w:t>
-      </w:r>
-      <w:proofErr w:type="spellStart"/>
-      <w:r>
-        <w:rPr>
-          <w:rFonts w:ascii="Arial" w:hAnsi="Arial" w:cs="Arial"/>
-        </w:rPr>
-        <w:t>Jurafsky</w:t>
-      </w:r>
-      <w:proofErr w:type="spellEnd"/>
-      <w:r>
-        <w:rPr>
-          <w:rFonts w:ascii="Arial" w:hAnsi="Arial" w:cs="Arial"/>
-        </w:rPr>
-        <w:t xml:space="preserve"> and James)</w:t>
-      </w:r>
-      <w:r>
-        <w:rPr>
-          <w:rFonts w:ascii="Arial" w:hAnsi="Arial" w:cs="Arial"/>
-        </w:rPr>
-        <w:t>. The location is normalized by removing any trailing scene numbers, leading dots and spaces at the start, and trims leftover whitespace.</w:t>
-      </w:r>
-      <w:r>
-        <w:rPr>
-          <w:rFonts w:ascii="Arial" w:hAnsi="Arial" w:cs="Arial"/>
-        </w:rPr>
-        <w:t xml:space="preserve"> It creates a displayed heading variable and assigns to it the location keyword, the location normalized if it exists and the time if it is not empty.</w:t>
-      </w:r>
-      <w:r>
-        <w:rPr>
-          <w:rFonts w:ascii="Arial" w:hAnsi="Arial" w:cs="Arial"/>
-        </w:rPr>
-        <w:t xml:space="preserve"> This will be displayed in the UI as the heading.</w:t>
-      </w:r>
-      <w:r>
-        <w:rPr>
-          <w:rFonts w:ascii="Arial" w:hAnsi="Arial" w:cs="Arial"/>
-        </w:rPr>
-        <w:t xml:space="preserve"> It sets all the local scene variables to the ones</w:t>
-      </w:r>
-      <w:r>
-        <w:rPr>
-          <w:rFonts w:ascii="Arial" w:hAnsi="Arial" w:cs="Arial"/>
-        </w:rPr>
-        <w:t xml:space="preserve"> outside the loop</w:t>
-      </w:r>
-      <w:r>
-        <w:rPr>
-          <w:rFonts w:ascii="Arial" w:hAnsi="Arial" w:cs="Arial"/>
-        </w:rPr>
-        <w:t>,</w:t>
-      </w:r>
-      <w:r>
-        <w:rPr>
-          <w:rFonts w:ascii="Arial" w:hAnsi="Arial" w:cs="Arial"/>
-        </w:rPr>
-        <w:t xml:space="preserve"> so </w:t>
+        <w:t>when the next heading line is encountered</w:t>
+      </w:r>
+      <w:r>
+        <w:rPr>
+          <w:rFonts w:ascii="Arial" w:hAnsi="Arial" w:cs="Arial"/>
+        </w:rPr>
+        <w:t>.</w:t>
+      </w:r>
+    </w:p>
+    <w:p>
+      <w:pPr>
+        <w:spacing w:line="360" w:lineRule="auto"/>
+        <w:rPr>
+          <w:rFonts w:ascii="Arial" w:hAnsi="Arial" w:cs="Arial"/>
+        </w:rPr>
+      </w:pPr>
+    </w:p>
+    <w:p>
+      <w:pPr>
+        <w:spacing w:line="360" w:lineRule="auto"/>
+        <w:rPr>
+          <w:rFonts w:ascii="Arial" w:hAnsi="Arial" w:cs="Arial"/>
+        </w:rPr>
+      </w:pPr>
+      <w:r>
+        <w:rPr>
+          <w:rFonts w:ascii="Arial" w:hAnsi="Arial" w:cs="Arial"/>
+        </w:rPr>
+        <w:t xml:space="preserve">As seen in </w:t>
       </w:r>
       <w:r>
         <w:rPr>
@@ -12744,61 +12642,7 @@
           <w:i/>
           <w:iCs/>
         </w:rPr>
-        <w:t xml:space="preserve">Big Break! </w:t>
-      </w:r>
-      <w:r>
-        <w:rPr>
-          <w:rFonts w:ascii="Arial" w:hAnsi="Arial" w:cs="Arial"/>
-        </w:rPr>
-        <w:t xml:space="preserve">can create the current scene and add it to the </w:t>
-      </w:r>
-      <w:proofErr w:type="spellStart"/>
-      <w:r>
-        <w:rPr>
-          <w:rFonts w:ascii="Arial" w:hAnsi="Arial" w:cs="Arial"/>
-        </w:rPr>
-        <w:t>ArrayList</w:t>
-      </w:r>
-      <w:proofErr w:type="spellEnd"/>
-      <w:r>
-        <w:rPr>
-          <w:rFonts w:ascii="Arial" w:hAnsi="Arial" w:cs="Arial"/>
-        </w:rPr>
-        <w:t xml:space="preserve"> </w:t>
-      </w:r>
-      <w:r>
-        <w:rPr>
-          <w:rFonts w:ascii="Arial" w:hAnsi="Arial" w:cs="Arial"/>
-        </w:rPr>
-        <w:t>when the next heading line is encountered</w:t>
-      </w:r>
-      <w:r>
-        <w:rPr>
-          <w:rFonts w:ascii="Arial" w:hAnsi="Arial" w:cs="Arial"/>
-        </w:rPr>
-        <w:t>.</w:t>
-      </w:r>
-    </w:p>
-    <w:p>
-      <w:pPr>
-        <w:spacing w:line="360" w:lineRule="auto"/>
-        <w:rPr>
-          <w:rFonts w:ascii="Arial" w:hAnsi="Arial" w:cs="Arial"/>
-        </w:rPr>
-      </w:pPr>
-    </w:p>
-    <w:p>
-      <w:pPr>
-        <w:spacing w:line="360" w:lineRule="auto"/>
-        <w:rPr>
-          <w:rFonts w:ascii="Arial" w:hAnsi="Arial" w:cs="Arial"/>
-        </w:rPr>
-      </w:pPr>
-      <w:r>
-        <w:rPr>
-          <w:rFonts w:ascii="Arial" w:hAnsi="Arial" w:cs="Arial"/>
-        </w:rPr>
-        <w:t xml:space="preserve">As seen in </w:t>
+        <w:t xml:space="preserve">Figure </w:t>
       </w:r>
       <w:r>
         <w:rPr>
@@ -12806,7 +12650,7 @@
           <w:i/>
           <w:iCs/>
         </w:rPr>
-        <w:t xml:space="preserve">Figure </w:t>
+        <w:t>2</w:t>
       </w:r>
       <w:r>
         <w:rPr>
@@ -12814,14 +12658,6 @@
           <w:i/>
           <w:iCs/>
         </w:rPr>
-        <w:t>2</w:t>
-      </w:r>
-      <w:r>
-        <w:rPr>
-          <w:rFonts w:ascii="Arial" w:hAnsi="Arial" w:cs="Arial"/>
-          <w:i/>
-          <w:iCs/>
-        </w:rPr>
         <w:t xml:space="preserve">, </w:t>
       </w:r>
       <w:r>
@@ -12852,35 +12688,7 @@
         <w:rPr>
           <w:rFonts w:ascii="Arial" w:hAnsi="Arial" w:cs="Arial"/>
         </w:rPr>
-        <w:t xml:space="preserve"> If the current content is not empty (meaning not the first content line of the scene’s content), a new line is appended </w:t>
-      </w:r>
-      <w:proofErr w:type="gramStart"/>
-      <w:r>
-        <w:rPr>
-          <w:rFonts w:ascii="Arial" w:hAnsi="Arial" w:cs="Arial"/>
-        </w:rPr>
-        <w:t>in order to</w:t>
-      </w:r>
-      <w:proofErr w:type="gramEnd"/>
-      <w:r>
-        <w:rPr>
-          <w:rFonts w:ascii="Arial" w:hAnsi="Arial" w:cs="Arial"/>
-        </w:rPr>
-        <w:t xml:space="preserve"> preserve the original formatting of </w:t>
-      </w:r>
-      <w:proofErr w:type="gramStart"/>
-      <w:r>
-        <w:rPr>
-          <w:rFonts w:ascii="Arial" w:hAnsi="Arial" w:cs="Arial"/>
-        </w:rPr>
-        <w:t>lines</w:t>
-      </w:r>
-      <w:proofErr w:type="gramEnd"/>
-      <w:r>
-        <w:rPr>
-          <w:rFonts w:ascii="Arial" w:hAnsi="Arial" w:cs="Arial"/>
-        </w:rPr>
-        <w:t xml:space="preserve"> and </w:t>
+        <w:t xml:space="preserve"> If the current content is not empty (meaning not the first content line of the scene’s content), a new line is appended in order to preserve the original formatting of lines and </w:t>
       </w:r>
       <w:r>
         <w:rPr>
@@ -13312,21 +13120,7 @@
         <w:rPr>
           <w:rFonts w:ascii="Arial" w:hAnsi="Arial" w:cs="Arial"/>
         </w:rPr>
-        <w:t xml:space="preserve"> </w:t>
-      </w:r>
-      <w:proofErr w:type="gramStart"/>
-      <w:r>
-        <w:rPr>
-          <w:rFonts w:ascii="Arial" w:hAnsi="Arial" w:cs="Arial"/>
-        </w:rPr>
-        <w:t>is</w:t>
-      </w:r>
-      <w:proofErr w:type="gramEnd"/>
-      <w:r>
-        <w:rPr>
-          <w:rFonts w:ascii="Arial" w:hAnsi="Arial" w:cs="Arial"/>
-        </w:rPr>
-        <w:t xml:space="preserve"> created to store the produce Character objects. The content of each scene is split into lines</w:t>
+        <w:t xml:space="preserve"> is created to store the produce Character objects. The content of each scene is split into lines</w:t>
       </w:r>
       <w:r>
         <w:rPr>
@@ -13574,7 +13368,37 @@
         <w:rPr>
           <w:rFonts w:ascii="Arial" w:hAnsi="Arial" w:cs="Arial"/>
         </w:rPr>
-        <w:t xml:space="preserve"> an optional line description between parentheses (case-insensitive) and</w:t>
+        <w:t xml:space="preserve"> </w:t>
+      </w:r>
+      <w:r>
+        <w:rPr>
+          <w:rFonts w:ascii="Arial" w:hAnsi="Arial" w:cs="Arial"/>
+        </w:rPr>
+        <w:t xml:space="preserve">an optionally numbered character, </w:t>
+      </w:r>
+      <w:r>
+        <w:rPr>
+          <w:rFonts w:ascii="Arial" w:hAnsi="Arial" w:cs="Arial"/>
+        </w:rPr>
+        <w:t>an optional line description between parentheses (case-insensitive)</w:t>
+      </w:r>
+      <w:r>
+        <w:rPr>
+          <w:rFonts w:ascii="Arial" w:hAnsi="Arial" w:cs="Arial"/>
+        </w:rPr>
+        <w:t>,</w:t>
+      </w:r>
+      <w:r>
+        <w:rPr>
+          <w:rFonts w:ascii="Arial" w:hAnsi="Arial" w:cs="Arial"/>
+        </w:rPr>
+        <w:t xml:space="preserve"> and</w:t>
+      </w:r>
+      <w:r>
+        <w:rPr>
+          <w:rFonts w:ascii="Arial" w:hAnsi="Arial" w:cs="Arial"/>
+        </w:rPr>
+        <w:t xml:space="preserve"> required</w:t>
       </w:r>
       <w:r>
         <w:rPr>
@@ -14081,21 +13905,7 @@
         <w:rPr>
           <w:rFonts w:ascii="Arial" w:hAnsi="Arial" w:cs="Arial"/>
         </w:rPr>
-        <w:t xml:space="preserve">. In a new variable, it stores only the uppercased letters of the name </w:t>
-      </w:r>
-      <w:proofErr w:type="gramStart"/>
-      <w:r>
-        <w:rPr>
-          <w:rFonts w:ascii="Arial" w:hAnsi="Arial" w:cs="Arial"/>
-        </w:rPr>
-        <w:t>in order to</w:t>
-      </w:r>
-      <w:proofErr w:type="gramEnd"/>
-      <w:r>
-        <w:rPr>
-          <w:rFonts w:ascii="Arial" w:hAnsi="Arial" w:cs="Arial"/>
-        </w:rPr>
-        <w:t xml:space="preserve"> accurately compare with the lists. If there is nothing left, it skips to the next token. The comparison part checks if the uppercased token is contained in the STAGE_VERBS</w:t>
+        <w:t>. In a new variable, it stores only the uppercased letters of the name in order to accurately compare with the lists. If there is nothing left, it skips to the next token. The comparison part checks if the uppercased token is contained in the STAGE_VERBS</w:t>
       </w:r>
       <w:r>
         <w:rPr>
@@ -14155,21 +13965,7 @@
         <w:rPr>
           <w:rFonts w:ascii="Arial" w:hAnsi="Arial" w:cs="Arial"/>
         </w:rPr>
-        <w:t xml:space="preserve">The confidence score of a character corresponds to how certain the system is that they are a character. A starting confidence score is assigned to each character depending on which regular expression they match. The score </w:t>
-      </w:r>
-      <w:proofErr w:type="gramStart"/>
-      <w:r>
-        <w:rPr>
-          <w:rFonts w:ascii="Arial" w:hAnsi="Arial" w:cs="Arial"/>
-        </w:rPr>
-        <w:t>is in the range</w:t>
-      </w:r>
-      <w:proofErr w:type="gramEnd"/>
-      <w:r>
-        <w:rPr>
-          <w:rFonts w:ascii="Arial" w:hAnsi="Arial" w:cs="Arial"/>
-        </w:rPr>
-        <w:t xml:space="preserve"> 0-1. For the character with speaker parentheticals, the confidence score starts at 0.65 </w:t>
+        <w:t xml:space="preserve">The confidence score of a character corresponds to how certain the system is that they are a character. A starting confidence score is assigned to each character depending on which regular expression they match. The score is in the range 0-1. For the character with speaker parentheticals, the confidence score starts at 0.65 </w:t>
       </w:r>
       <w:r>
         <w:rPr>
@@ -14181,41 +13977,13 @@
         <w:rPr>
           <w:rFonts w:ascii="Arial" w:hAnsi="Arial" w:cs="Arial"/>
         </w:rPr>
-        <w:t xml:space="preserve"> One of the confidence boosts can be provided by matching files to </w:t>
-      </w:r>
-      <w:proofErr w:type="gramStart"/>
-      <w:r>
-        <w:rPr>
-          <w:rFonts w:ascii="Arial" w:hAnsi="Arial" w:cs="Arial"/>
-        </w:rPr>
-        <w:t>first-name</w:t>
-      </w:r>
-      <w:proofErr w:type="gramEnd"/>
-      <w:r>
-        <w:rPr>
-          <w:rFonts w:ascii="Arial" w:hAnsi="Arial" w:cs="Arial"/>
-        </w:rPr>
-        <w:t xml:space="preserve"> and last-name text file databases.</w:t>
-      </w:r>
-      <w:r>
-        <w:rPr>
-          <w:rFonts w:ascii="Arial" w:hAnsi="Arial" w:cs="Arial"/>
-        </w:rPr>
-        <w:t xml:space="preserve"> Both </w:t>
-      </w:r>
-      <w:proofErr w:type="gramStart"/>
-      <w:r>
-        <w:rPr>
-          <w:rFonts w:ascii="Arial" w:hAnsi="Arial" w:cs="Arial"/>
-        </w:rPr>
-        <w:t>first-name</w:t>
-      </w:r>
-      <w:proofErr w:type="gramEnd"/>
-      <w:r>
-        <w:rPr>
-          <w:rFonts w:ascii="Arial" w:hAnsi="Arial" w:cs="Arial"/>
-        </w:rPr>
-        <w:t xml:space="preserve"> and last-name matches add a 0.4 confidence boost per name. As the confidence score cannot be larger than 1.0, the minimum value of the total boost and 1.0 is added to the original score.</w:t>
+        <w:t xml:space="preserve"> One of the confidence boosts can be provided by matching files to first-name and last-name text file databases.</w:t>
+      </w:r>
+      <w:r>
+        <w:rPr>
+          <w:rFonts w:ascii="Arial" w:hAnsi="Arial" w:cs="Arial"/>
+        </w:rPr>
+        <w:t xml:space="preserve"> Both first-name and last-name matches add a 0.4 confidence boost per name. As the confidence score cannot be larger than 1.0, the minimum value of the total boost and 1.0 is added to the original score.</w:t>
       </w:r>
       <w:r>
         <w:rPr>
@@ -14249,21 +14017,7 @@
         <w:rPr>
           <w:rFonts w:ascii="Arial" w:hAnsi="Arial" w:cs="Arial"/>
         </w:rPr>
-        <w:t xml:space="preserve">After potentially boosting the confidence score, the name is once again tokenized in the same manner </w:t>
-      </w:r>
-      <w:proofErr w:type="gramStart"/>
-      <w:r>
-        <w:rPr>
-          <w:rFonts w:ascii="Arial" w:hAnsi="Arial" w:cs="Arial"/>
-        </w:rPr>
-        <w:t>in order to</w:t>
-      </w:r>
-      <w:proofErr w:type="gramEnd"/>
-      <w:r>
-        <w:rPr>
-          <w:rFonts w:ascii="Arial" w:hAnsi="Arial" w:cs="Arial"/>
-        </w:rPr>
-        <w:t xml:space="preserve"> check if it is contained in the PERSON_WORD set. This set includes words related to humans, such as “MAN”, “WOMAN”, “TEACHER”, “DOCTOR”, etc.</w:t>
+        <w:t>After potentially boosting the confidence score, the name is once again tokenized in the same manner in order to check if it is contained in the PERSON_WORD set. This set includes words related to humans, such as “MAN”, “WOMAN”, “TEACHER”, “DOCTOR”, etc.</w:t>
       </w:r>
       <w:r>
         <w:rPr>
@@ -14500,21 +14254,7 @@
         <w:rPr>
           <w:rFonts w:ascii="Arial" w:hAnsi="Arial" w:cs="Arial"/>
         </w:rPr>
-        <w:t xml:space="preserve"> considers the line a speaker cue. </w:t>
-      </w:r>
-      <w:proofErr w:type="gramStart"/>
-      <w:r>
-        <w:rPr>
-          <w:rFonts w:ascii="Arial" w:hAnsi="Arial" w:cs="Arial"/>
-        </w:rPr>
-        <w:t>Similar to</w:t>
-      </w:r>
-      <w:proofErr w:type="gramEnd"/>
-      <w:r>
-        <w:rPr>
-          <w:rFonts w:ascii="Arial" w:hAnsi="Arial" w:cs="Arial"/>
-        </w:rPr>
-        <w:t xml:space="preserve"> the previous regular expression, it allows honorific prefixes</w:t>
+        <w:t xml:space="preserve"> considers the line a speaker cue. Similar to the previous regular expression, it allows honorific prefixes</w:t>
       </w:r>
       <w:r>
         <w:rPr>
@@ -14532,7 +14272,19 @@
         <w:rPr>
           <w:rFonts w:ascii="Arial" w:hAnsi="Arial" w:cs="Arial"/>
         </w:rPr>
-        <w:t>, and optional case-insensitive descriptions in parentheses</w:t>
+        <w:t xml:space="preserve">, </w:t>
+      </w:r>
+      <w:r>
+        <w:rPr>
+          <w:rFonts w:ascii="Arial" w:hAnsi="Arial" w:cs="Arial"/>
+        </w:rPr>
+        <w:t>an optional number for the character (e.g., “MALE EMPLOYEE #2”), and</w:t>
+      </w:r>
+      <w:r>
+        <w:rPr>
+          <w:rFonts w:ascii="Arial" w:hAnsi="Arial" w:cs="Arial"/>
+        </w:rPr>
+        <w:t xml:space="preserve"> optional case-insensitive descriptions in parentheses</w:t>
       </w:r>
       <w:r>
         <w:rPr>
@@ -14696,13 +14448,8 @@
                             <w:r>
                               <w:t xml:space="preserve">: </w:t>
                             </w:r>
-                            <w:proofErr w:type="spellStart"/>
                             <w:r>
-                              <w:t>isCharacterCue</w:t>
-                            </w:r>
-                            <w:proofErr w:type="spellEnd"/>
-                            <w:r>
-                              <w:t xml:space="preserve"> Flowchart</w:t>
+                              <w:t>isCharacterCue Flowchart</w:t>
                             </w:r>
                             <w:r>
                               <w:t xml:space="preserve"> (drawn with draw.io)</w:t>
@@ -14745,13 +14492,8 @@
                       <w:r>
                         <w:t xml:space="preserve">: </w:t>
                       </w:r>
-                      <w:proofErr w:type="spellStart"/>
                       <w:r>
-                        <w:t>isCharacterCue</w:t>
-                      </w:r>
-                      <w:proofErr w:type="spellEnd"/>
-                      <w:r>
-                        <w:t xml:space="preserve"> Flowchart</w:t>
+                        <w:t>isCharacterCue Flowchart</w:t>
                       </w:r>
                       <w:r>
                         <w:t xml:space="preserve"> (drawn with draw.io)</w:t>
@@ -14911,14 +14653,134 @@
         <w:rPr>
           <w:rFonts w:ascii="Arial" w:hAnsi="Arial" w:cs="Arial"/>
         </w:rPr>
-        <w:t xml:space="preserve">The system creates local variables for a name </w:t>
+        <w:t>The system creates local variables for a name token counter, total token count,</w:t>
+      </w:r>
+      <w:r>
+        <w:rPr>
+          <w:rFonts w:ascii="Arial" w:hAnsi="Arial" w:cs="Arial"/>
+        </w:rPr>
+        <w:t xml:space="preserve"> allowed punctuation</w:t>
+      </w:r>
+      <w:r>
+        <w:rPr>
+          <w:rFonts w:ascii="Arial" w:hAnsi="Arial" w:cs="Arial"/>
+        </w:rPr>
+        <w:t xml:space="preserve"> counter</w:t>
+      </w:r>
+      <w:r>
+        <w:rPr>
+          <w:rFonts w:ascii="Arial" w:hAnsi="Arial" w:cs="Arial"/>
+        </w:rPr>
+        <w:t xml:space="preserve"> (including parentheses </w:t>
       </w:r>
       <w:r>
         <w:rPr>
           <w:rFonts w:ascii="Arial" w:hAnsi="Arial" w:cs="Arial"/>
         </w:rPr>
         <w:lastRenderedPageBreak/>
-        <w:t xml:space="preserve">token counter, total token count, </w:t>
+        <w:t xml:space="preserve">and </w:t>
+      </w:r>
+      <w:r>
+        <w:rPr>
+          <w:rFonts w:ascii="Arial" w:hAnsi="Arial" w:cs="Arial"/>
+          <w:i/>
+          <w:iCs/>
+        </w:rPr>
+        <w:t>#</w:t>
+      </w:r>
+      <w:r>
+        <w:rPr>
+          <w:rFonts w:ascii="Arial" w:hAnsi="Arial" w:cs="Arial"/>
+        </w:rPr>
+        <w:t>)</w:t>
+      </w:r>
+      <w:r>
+        <w:rPr>
+          <w:rFonts w:ascii="Arial" w:hAnsi="Arial" w:cs="Arial"/>
+        </w:rPr>
+        <w:t>, and an initial threshold percentage of the name token to total token ratio</w:t>
+      </w:r>
+      <w:r>
+        <w:rPr>
+          <w:rFonts w:ascii="Arial" w:hAnsi="Arial" w:cs="Arial"/>
+        </w:rPr>
+        <w:t xml:space="preserve"> (without counting </w:t>
+      </w:r>
+      <w:r>
+        <w:rPr>
+          <w:rFonts w:ascii="Arial" w:hAnsi="Arial" w:cs="Arial"/>
+        </w:rPr>
+        <w:t>the allowed punctuation</w:t>
+      </w:r>
+      <w:r>
+        <w:rPr>
+          <w:rFonts w:ascii="Arial" w:hAnsi="Arial" w:cs="Arial"/>
+        </w:rPr>
+        <w:t>)</w:t>
+      </w:r>
+      <w:r>
+        <w:rPr>
+          <w:rFonts w:ascii="Arial" w:hAnsi="Arial" w:cs="Arial"/>
+        </w:rPr>
+        <w:t>.</w:t>
+      </w:r>
+    </w:p>
+    <w:p>
+      <w:pPr>
+        <w:spacing w:line="360" w:lineRule="auto"/>
+        <w:rPr>
+          <w:rFonts w:ascii="Arial" w:hAnsi="Arial" w:cs="Arial"/>
+        </w:rPr>
+      </w:pPr>
+    </w:p>
+    <w:p>
+      <w:pPr>
+        <w:spacing w:line="360" w:lineRule="auto"/>
+        <w:rPr>
+          <w:rFonts w:ascii="Arial" w:hAnsi="Arial" w:cs="Arial"/>
+        </w:rPr>
+      </w:pPr>
+      <w:r>
+        <w:rPr>
+          <w:rFonts w:ascii="Arial" w:hAnsi="Arial" w:cs="Arial"/>
+        </w:rPr>
+        <w:t xml:space="preserve">The system </w:t>
+      </w:r>
+      <w:r>
+        <w:rPr>
+          <w:rFonts w:ascii="Arial" w:hAnsi="Arial" w:cs="Arial"/>
+        </w:rPr>
+        <w:t>iterates over each string token in</w:t>
+      </w:r>
+      <w:r>
+        <w:rPr>
+          <w:rFonts w:ascii="Arial" w:hAnsi="Arial" w:cs="Arial"/>
+        </w:rPr>
+        <w:t xml:space="preserve"> the array</w:t>
+      </w:r>
+      <w:r>
+        <w:rPr>
+          <w:rFonts w:ascii="Arial" w:hAnsi="Arial" w:cs="Arial"/>
+        </w:rPr>
+        <w:t>, as seen in the flowchart</w:t>
+      </w:r>
+      <w:r>
+        <w:rPr>
+          <w:rFonts w:ascii="Arial" w:hAnsi="Arial" w:cs="Arial"/>
+        </w:rPr>
+        <w:t>. It checks if any of the strings match an opening</w:t>
+      </w:r>
+      <w:r>
+        <w:rPr>
+          <w:rFonts w:ascii="Arial" w:hAnsi="Arial" w:cs="Arial"/>
+        </w:rPr>
+        <w:t>,</w:t>
+      </w:r>
+      <w:r>
+        <w:rPr>
+          <w:rFonts w:ascii="Arial" w:hAnsi="Arial" w:cs="Arial"/>
+        </w:rPr>
+        <w:t xml:space="preserve"> closing </w:t>
       </w:r>
       <w:r>
         <w:rPr>
@@ -14930,13 +14792,193 @@
         <w:rPr>
           <w:rFonts w:ascii="Arial" w:hAnsi="Arial" w:cs="Arial"/>
         </w:rPr>
-        <w:t>-use counter, and an initial threshold percentage of the name token to total token ratio</w:t>
-      </w:r>
-      <w:r>
-        <w:rPr>
-          <w:rFonts w:ascii="Arial" w:hAnsi="Arial" w:cs="Arial"/>
-        </w:rPr>
-        <w:t xml:space="preserve"> (without counting </w:t>
+        <w:t xml:space="preserve">, or </w:t>
+      </w:r>
+      <w:r>
+        <w:rPr>
+          <w:rFonts w:ascii="Arial" w:hAnsi="Arial" w:cs="Arial"/>
+          <w:i/>
+          <w:iCs/>
+        </w:rPr>
+        <w:t>#</w:t>
+      </w:r>
+      <w:r>
+        <w:rPr>
+          <w:rFonts w:ascii="Arial" w:hAnsi="Arial" w:cs="Arial"/>
+        </w:rPr>
+        <w:t xml:space="preserve">. In this case, it assigns them a lower </w:t>
+      </w:r>
+      <w:r>
+        <w:rPr>
+          <w:rFonts w:ascii="Arial" w:hAnsi="Arial" w:cs="Arial"/>
+        </w:rPr>
+        <w:t xml:space="preserve">ratio of 50% </w:t>
+      </w:r>
+      <w:r>
+        <w:rPr>
+          <w:rFonts w:ascii="Arial" w:hAnsi="Arial" w:cs="Arial"/>
+        </w:rPr>
+        <w:t>of the name tokens to all tokens</w:t>
+      </w:r>
+      <w:r>
+        <w:rPr>
+          <w:rFonts w:ascii="Arial" w:hAnsi="Arial" w:cs="Arial"/>
+        </w:rPr>
+        <w:t xml:space="preserve"> (without the </w:t>
+      </w:r>
+      <w:r>
+        <w:rPr>
+          <w:rFonts w:ascii="Arial" w:hAnsi="Arial" w:cs="Arial"/>
+        </w:rPr>
+        <w:t>allowed punctuation</w:t>
+      </w:r>
+      <w:r>
+        <w:rPr>
+          <w:rFonts w:ascii="Arial" w:hAnsi="Arial" w:cs="Arial"/>
+        </w:rPr>
+        <w:t xml:space="preserve"> count)</w:t>
+      </w:r>
+      <w:r>
+        <w:rPr>
+          <w:rFonts w:ascii="Arial" w:hAnsi="Arial" w:cs="Arial"/>
+        </w:rPr>
+        <w:t>.</w:t>
+      </w:r>
+      <w:r>
+        <w:rPr>
+          <w:rFonts w:ascii="Arial" w:hAnsi="Arial" w:cs="Arial"/>
+        </w:rPr>
+        <w:t xml:space="preserve"> The system normalizes the token for matching. </w:t>
+      </w:r>
+      <w:r>
+        <w:rPr>
+          <w:rFonts w:ascii="Arial" w:hAnsi="Arial" w:cs="Arial"/>
+        </w:rPr>
+        <w:t>It checks if the string matches the NAME_TOKEN regular expression</w:t>
+      </w:r>
+      <w:r>
+        <w:rPr>
+          <w:rFonts w:ascii="Arial" w:hAnsi="Arial" w:cs="Arial"/>
+        </w:rPr>
+        <w:t>,</w:t>
+      </w:r>
+      <w:r>
+        <w:rPr>
+          <w:rFonts w:ascii="Arial" w:hAnsi="Arial" w:cs="Arial"/>
+        </w:rPr>
+        <w:t xml:space="preserve"> which </w:t>
+      </w:r>
+      <w:r>
+        <w:rPr>
+          <w:rFonts w:ascii="Arial" w:hAnsi="Arial" w:cs="Arial"/>
+        </w:rPr>
+        <w:t>catches</w:t>
+      </w:r>
+      <w:r>
+        <w:rPr>
+          <w:rFonts w:ascii="Arial" w:hAnsi="Arial" w:cs="Arial"/>
+        </w:rPr>
+        <w:t xml:space="preserve"> only fully uppercased words</w:t>
+      </w:r>
+      <w:r>
+        <w:rPr>
+          <w:rFonts w:ascii="Arial" w:hAnsi="Arial" w:cs="Arial"/>
+        </w:rPr>
+        <w:t>. If a name token is found, the name counter increments.</w:t>
+      </w:r>
+    </w:p>
+    <w:p>
+      <w:pPr>
+        <w:spacing w:line="360" w:lineRule="auto"/>
+        <w:rPr>
+          <w:rFonts w:ascii="Arial" w:hAnsi="Arial" w:cs="Arial"/>
+        </w:rPr>
+      </w:pPr>
+    </w:p>
+    <w:p>
+      <w:pPr>
+        <w:spacing w:line="360" w:lineRule="auto"/>
+        <w:rPr>
+          <w:rFonts w:ascii="Arial" w:hAnsi="Arial" w:cs="Arial"/>
+        </w:rPr>
+      </w:pPr>
+      <w:r>
+        <w:rPr>
+          <w:rFonts w:ascii="Arial" w:hAnsi="Arial" w:cs="Arial"/>
+        </w:rPr>
+        <w:t xml:space="preserve">After looping through all tokens of the line, the helper method returns false if there are no name tokens present. </w:t>
+      </w:r>
+      <w:r>
+        <w:rPr>
+          <w:rFonts w:ascii="Arial" w:hAnsi="Arial" w:cs="Arial"/>
+        </w:rPr>
+        <w:t>In</w:t>
+      </w:r>
+      <w:r>
+        <w:rPr>
+          <w:rFonts w:ascii="Arial" w:hAnsi="Arial" w:cs="Arial"/>
+        </w:rPr>
+        <w:t xml:space="preserve"> order to return true, the line should have name tokens primarily and not be too long. Here, the system checks the ratio of name tokens to all tokens (without counting </w:t>
+      </w:r>
+      <w:r>
+        <w:rPr>
+          <w:rFonts w:ascii="Arial" w:hAnsi="Arial" w:cs="Arial"/>
+        </w:rPr>
+        <w:t>the allowed punctuation</w:t>
+      </w:r>
+      <w:r>
+        <w:rPr>
+          <w:rFonts w:ascii="Arial" w:hAnsi="Arial" w:cs="Arial"/>
+        </w:rPr>
+        <w:t>) that was set previously.</w:t>
+      </w:r>
+      <w:r>
+        <w:rPr>
+          <w:rFonts w:ascii="Arial" w:hAnsi="Arial" w:cs="Arial"/>
+        </w:rPr>
+        <w:t xml:space="preserve"> T</w:t>
+      </w:r>
+      <w:r>
+        <w:rPr>
+          <w:rFonts w:ascii="Arial" w:hAnsi="Arial" w:cs="Arial"/>
+        </w:rPr>
+        <w:t>his threshold is lowered</w:t>
+      </w:r>
+      <w:r>
+        <w:rPr>
+          <w:rFonts w:ascii="Arial" w:hAnsi="Arial" w:cs="Arial"/>
+        </w:rPr>
+        <w:t xml:space="preserve"> from 65 to 50%</w:t>
+      </w:r>
+      <w:r>
+        <w:rPr>
+          <w:rFonts w:ascii="Arial" w:hAnsi="Arial" w:cs="Arial"/>
+        </w:rPr>
+        <w:t xml:space="preserve"> for lines with</w:t>
+      </w:r>
+      <w:r>
+        <w:rPr>
+          <w:rFonts w:ascii="Arial" w:hAnsi="Arial" w:cs="Arial"/>
+        </w:rPr>
+        <w:t xml:space="preserve"> </w:t>
+      </w:r>
+      <w:r>
+        <w:rPr>
+          <w:rFonts w:ascii="Arial" w:hAnsi="Arial" w:cs="Arial"/>
+        </w:rPr>
+        <w:t>allowed punctuation</w:t>
+      </w:r>
+      <w:r>
+        <w:rPr>
+          <w:rFonts w:ascii="Arial" w:hAnsi="Arial" w:cs="Arial"/>
+        </w:rPr>
+        <w:t>. The reason is that</w:t>
+      </w:r>
+      <w:r>
+        <w:rPr>
+          <w:rFonts w:ascii="Arial" w:hAnsi="Arial" w:cs="Arial"/>
+        </w:rPr>
+        <w:t xml:space="preserve"> </w:t>
       </w:r>
       <w:r>
         <w:rPr>
@@ -14948,233 +14990,49 @@
         <w:rPr>
           <w:rFonts w:ascii="Arial" w:hAnsi="Arial" w:cs="Arial"/>
         </w:rPr>
-        <w:t>)</w:t>
-      </w:r>
-      <w:r>
-        <w:rPr>
-          <w:rFonts w:ascii="Arial" w:hAnsi="Arial" w:cs="Arial"/>
-        </w:rPr>
-        <w:t>.</w:t>
-      </w:r>
-    </w:p>
-    <w:p>
-      <w:pPr>
-        <w:spacing w:line="360" w:lineRule="auto"/>
-        <w:rPr>
-          <w:rFonts w:ascii="Arial" w:hAnsi="Arial" w:cs="Arial"/>
-        </w:rPr>
-      </w:pPr>
-    </w:p>
-    <w:p>
-      <w:pPr>
-        <w:spacing w:line="360" w:lineRule="auto"/>
-        <w:rPr>
-          <w:rFonts w:ascii="Arial" w:hAnsi="Arial" w:cs="Arial"/>
-        </w:rPr>
-      </w:pPr>
-      <w:r>
-        <w:rPr>
-          <w:rFonts w:ascii="Arial" w:hAnsi="Arial" w:cs="Arial"/>
-        </w:rPr>
-        <w:t xml:space="preserve">The system </w:t>
-      </w:r>
-      <w:r>
-        <w:rPr>
-          <w:rFonts w:ascii="Arial" w:hAnsi="Arial" w:cs="Arial"/>
-        </w:rPr>
-        <w:t>iterates over each string token in</w:t>
-      </w:r>
-      <w:r>
-        <w:rPr>
-          <w:rFonts w:ascii="Arial" w:hAnsi="Arial" w:cs="Arial"/>
-        </w:rPr>
-        <w:t xml:space="preserve"> the array</w:t>
-      </w:r>
-      <w:r>
-        <w:rPr>
-          <w:rFonts w:ascii="Arial" w:hAnsi="Arial" w:cs="Arial"/>
-        </w:rPr>
-        <w:t>, as seen in the flowchart</w:t>
-      </w:r>
-      <w:r>
-        <w:rPr>
-          <w:rFonts w:ascii="Arial" w:hAnsi="Arial" w:cs="Arial"/>
-        </w:rPr>
-        <w:t xml:space="preserve">. It checks if any of the strings match an opening or closing </w:t>
-      </w:r>
-      <w:r>
-        <w:rPr>
-          <w:rFonts w:ascii="Arial" w:hAnsi="Arial" w:cs="Arial"/>
-        </w:rPr>
-        <w:t>parenthesis</w:t>
-      </w:r>
-      <w:r>
-        <w:rPr>
-          <w:rFonts w:ascii="Arial" w:hAnsi="Arial" w:cs="Arial"/>
-        </w:rPr>
-        <w:t xml:space="preserve">. In this case, it assigns them a lower </w:t>
-      </w:r>
-      <w:r>
-        <w:rPr>
-          <w:rFonts w:ascii="Arial" w:hAnsi="Arial" w:cs="Arial"/>
-        </w:rPr>
-        <w:t xml:space="preserve">ratio of 50% </w:t>
-      </w:r>
-      <w:r>
-        <w:rPr>
-          <w:rFonts w:ascii="Arial" w:hAnsi="Arial" w:cs="Arial"/>
-        </w:rPr>
-        <w:t>of the name tokens to all tokens</w:t>
-      </w:r>
-      <w:r>
-        <w:rPr>
-          <w:rFonts w:ascii="Arial" w:hAnsi="Arial" w:cs="Arial"/>
-        </w:rPr>
-        <w:t xml:space="preserve"> (without the </w:t>
-      </w:r>
-      <w:r>
-        <w:rPr>
-          <w:rFonts w:ascii="Arial" w:hAnsi="Arial" w:cs="Arial"/>
-        </w:rPr>
-        <w:t>parentheses</w:t>
-      </w:r>
-      <w:r>
-        <w:rPr>
-          <w:rFonts w:ascii="Arial" w:hAnsi="Arial" w:cs="Arial"/>
-        </w:rPr>
-        <w:t xml:space="preserve"> count)</w:t>
-      </w:r>
-      <w:r>
-        <w:rPr>
-          <w:rFonts w:ascii="Arial" w:hAnsi="Arial" w:cs="Arial"/>
-        </w:rPr>
-        <w:t>.</w:t>
-      </w:r>
-      <w:r>
-        <w:rPr>
-          <w:rFonts w:ascii="Arial" w:hAnsi="Arial" w:cs="Arial"/>
-        </w:rPr>
-        <w:t xml:space="preserve"> The system normalizes the token for matching. </w:t>
-      </w:r>
-      <w:r>
-        <w:rPr>
-          <w:rFonts w:ascii="Arial" w:hAnsi="Arial" w:cs="Arial"/>
-        </w:rPr>
-        <w:t>It checks if the string matches the NAME_TOKEN regular expression</w:t>
-      </w:r>
-      <w:r>
-        <w:rPr>
-          <w:rFonts w:ascii="Arial" w:hAnsi="Arial" w:cs="Arial"/>
-        </w:rPr>
-        <w:t>,</w:t>
-      </w:r>
-      <w:r>
-        <w:rPr>
-          <w:rFonts w:ascii="Arial" w:hAnsi="Arial" w:cs="Arial"/>
-        </w:rPr>
-        <w:t xml:space="preserve"> which </w:t>
-      </w:r>
-      <w:r>
-        <w:rPr>
-          <w:rFonts w:ascii="Arial" w:hAnsi="Arial" w:cs="Arial"/>
-        </w:rPr>
-        <w:t>catches</w:t>
-      </w:r>
-      <w:r>
-        <w:rPr>
-          <w:rFonts w:ascii="Arial" w:hAnsi="Arial" w:cs="Arial"/>
-        </w:rPr>
-        <w:t xml:space="preserve"> only fully uppercased words</w:t>
-      </w:r>
-      <w:r>
-        <w:rPr>
-          <w:rFonts w:ascii="Arial" w:hAnsi="Arial" w:cs="Arial"/>
-        </w:rPr>
-        <w:t>. If a name token is found, the name counter increments.</w:t>
-      </w:r>
-    </w:p>
-    <w:p>
-      <w:pPr>
-        <w:spacing w:line="360" w:lineRule="auto"/>
-        <w:rPr>
-          <w:rFonts w:ascii="Arial" w:hAnsi="Arial" w:cs="Arial"/>
-        </w:rPr>
-      </w:pPr>
-    </w:p>
-    <w:p>
-      <w:pPr>
-        <w:spacing w:line="360" w:lineRule="auto"/>
-        <w:rPr>
-          <w:rFonts w:ascii="Arial" w:hAnsi="Arial" w:cs="Arial"/>
-        </w:rPr>
-      </w:pPr>
-      <w:r>
-        <w:rPr>
-          <w:rFonts w:ascii="Arial" w:hAnsi="Arial" w:cs="Arial"/>
-        </w:rPr>
-        <w:t xml:space="preserve">After looping through all tokens of the line, the helper method returns false if there are no name tokens present. </w:t>
-      </w:r>
-      <w:proofErr w:type="gramStart"/>
-      <w:r>
-        <w:rPr>
-          <w:rFonts w:ascii="Arial" w:hAnsi="Arial" w:cs="Arial"/>
-        </w:rPr>
-        <w:t>In</w:t>
-      </w:r>
-      <w:r>
-        <w:rPr>
-          <w:rFonts w:ascii="Arial" w:hAnsi="Arial" w:cs="Arial"/>
-        </w:rPr>
-        <w:t xml:space="preserve"> order to</w:t>
-      </w:r>
-      <w:proofErr w:type="gramEnd"/>
-      <w:r>
-        <w:rPr>
-          <w:rFonts w:ascii="Arial" w:hAnsi="Arial" w:cs="Arial"/>
-        </w:rPr>
-        <w:t xml:space="preserve"> return true, the line should have name tokens primarily and not be too long. Here, the system checks the ratio of name tokens to all tokens (without counting </w:t>
-      </w:r>
-      <w:r>
-        <w:rPr>
-          <w:rFonts w:ascii="Arial" w:hAnsi="Arial" w:cs="Arial"/>
-        </w:rPr>
-        <w:t>parentheses</w:t>
-      </w:r>
-      <w:r>
-        <w:rPr>
-          <w:rFonts w:ascii="Arial" w:hAnsi="Arial" w:cs="Arial"/>
-        </w:rPr>
-        <w:t>) that was set previously.</w:t>
-      </w:r>
-      <w:r>
-        <w:rPr>
-          <w:rFonts w:ascii="Arial" w:hAnsi="Arial" w:cs="Arial"/>
-        </w:rPr>
-        <w:t xml:space="preserve"> T</w:t>
-      </w:r>
-      <w:r>
-        <w:rPr>
-          <w:rFonts w:ascii="Arial" w:hAnsi="Arial" w:cs="Arial"/>
-        </w:rPr>
-        <w:t>his threshold is lowered</w:t>
-      </w:r>
-      <w:r>
-        <w:rPr>
-          <w:rFonts w:ascii="Arial" w:hAnsi="Arial" w:cs="Arial"/>
-        </w:rPr>
-        <w:t xml:space="preserve"> from 65 to 50%</w:t>
-      </w:r>
-      <w:r>
-        <w:rPr>
-          <w:rFonts w:ascii="Arial" w:hAnsi="Arial" w:cs="Arial"/>
-        </w:rPr>
-        <w:t xml:space="preserve"> for lines with</w:t>
-      </w:r>
-      <w:r>
-        <w:rPr>
-          <w:rFonts w:ascii="Arial" w:hAnsi="Arial" w:cs="Arial"/>
-        </w:rPr>
-        <w:t xml:space="preserve"> parentheses. The reason is that</w:t>
+        <w:t xml:space="preserve"> count for two separate tokens</w:t>
+      </w:r>
+      <w:r>
+        <w:rPr>
+          <w:rFonts w:ascii="Arial" w:hAnsi="Arial" w:cs="Arial"/>
+        </w:rPr>
+        <w:t xml:space="preserve"> and # and a number as well</w:t>
+      </w:r>
+      <w:r>
+        <w:rPr>
+          <w:rFonts w:ascii="Arial" w:hAnsi="Arial" w:cs="Arial"/>
+        </w:rPr>
+        <w:t xml:space="preserve">, which makes it difficult for </w:t>
+      </w:r>
+      <w:r>
+        <w:rPr>
+          <w:rFonts w:ascii="Arial" w:hAnsi="Arial" w:cs="Arial"/>
+        </w:rPr>
+        <w:t xml:space="preserve">speaker cue </w:t>
+      </w:r>
+      <w:r>
+        <w:rPr>
+          <w:rFonts w:ascii="Arial" w:hAnsi="Arial" w:cs="Arial"/>
+        </w:rPr>
+        <w:t xml:space="preserve">lines like “BOB (laughing)” </w:t>
+      </w:r>
+      <w:r>
+        <w:rPr>
+          <w:rFonts w:ascii="Arial" w:hAnsi="Arial" w:cs="Arial"/>
+        </w:rPr>
+        <w:t xml:space="preserve">or “FEMALE WORKER #3” </w:t>
+      </w:r>
+      <w:r>
+        <w:rPr>
+          <w:rFonts w:ascii="Arial" w:hAnsi="Arial" w:cs="Arial"/>
+        </w:rPr>
+        <w:t>to pass, even though th</w:t>
+      </w:r>
+      <w:r>
+        <w:rPr>
+          <w:rFonts w:ascii="Arial" w:hAnsi="Arial" w:cs="Arial"/>
+        </w:rPr>
+        <w:t>ey</w:t>
       </w:r>
       <w:r>
         <w:rPr>
@@ -15186,31 +15044,31 @@
         <w:rPr>
           <w:rFonts w:ascii="Arial" w:hAnsi="Arial" w:cs="Arial"/>
         </w:rPr>
-        <w:t>parentheses</w:t>
-      </w:r>
-      <w:r>
-        <w:rPr>
-          <w:rFonts w:ascii="Arial" w:hAnsi="Arial" w:cs="Arial"/>
-        </w:rPr>
-        <w:t xml:space="preserve"> count for two separate tokens, which makes it difficult for </w:t>
-      </w:r>
-      <w:r>
-        <w:rPr>
-          <w:rFonts w:ascii="Arial" w:hAnsi="Arial" w:cs="Arial"/>
-        </w:rPr>
-        <w:t xml:space="preserve">speaker cue </w:t>
-      </w:r>
-      <w:r>
-        <w:rPr>
-          <w:rFonts w:ascii="Arial" w:hAnsi="Arial" w:cs="Arial"/>
-        </w:rPr>
-        <w:t>lines like “BOB (laughing)” to pass, even though this is a common screenplay practice.</w:t>
-      </w:r>
-      <w:r>
-        <w:rPr>
-          <w:rFonts w:ascii="Arial" w:hAnsi="Arial" w:cs="Arial"/>
-        </w:rPr>
-        <w:t xml:space="preserve"> The total token count without the parentheses should also be less than or equal to 5, as longer lines are most likely not speaker cues.</w:t>
+        <w:t>are</w:t>
+      </w:r>
+      <w:r>
+        <w:rPr>
+          <w:rFonts w:ascii="Arial" w:hAnsi="Arial" w:cs="Arial"/>
+        </w:rPr>
+        <w:t xml:space="preserve"> a common screenplay practice.</w:t>
+      </w:r>
+      <w:r>
+        <w:rPr>
+          <w:rFonts w:ascii="Arial" w:hAnsi="Arial" w:cs="Arial"/>
+        </w:rPr>
+        <w:t xml:space="preserve"> The total token count without the</w:t>
+      </w:r>
+      <w:r>
+        <w:rPr>
+          <w:rFonts w:ascii="Arial" w:hAnsi="Arial" w:cs="Arial"/>
+        </w:rPr>
+        <w:t xml:space="preserve"> allowed punctuation </w:t>
+      </w:r>
+      <w:r>
+        <w:rPr>
+          <w:rFonts w:ascii="Arial" w:hAnsi="Arial" w:cs="Arial"/>
+        </w:rPr>
+        <w:t>should also be less than or equal to 5, as longer lines are most likely not speaker cues.</w:t>
       </w:r>
       <w:r>
         <w:rPr>
@@ -15264,21 +15122,7 @@
         <w:rPr>
           <w:rFonts w:ascii="Arial" w:hAnsi="Arial" w:cs="Arial"/>
         </w:rPr>
-        <w:t xml:space="preserve">If both the helper </w:t>
-      </w:r>
-      <w:proofErr w:type="gramStart"/>
-      <w:r>
-        <w:rPr>
-          <w:rFonts w:ascii="Arial" w:hAnsi="Arial" w:cs="Arial"/>
-        </w:rPr>
-        <w:t>method returns</w:t>
-      </w:r>
-      <w:proofErr w:type="gramEnd"/>
-      <w:r>
-        <w:rPr>
-          <w:rFonts w:ascii="Arial" w:hAnsi="Arial" w:cs="Arial"/>
-        </w:rPr>
-        <w:t xml:space="preserve"> that the line is a character cue and the regular expression finds a match, the line enters the statement. The algorithm checks if the next not-empty line (if not the end of the script) is a speaker cue using the </w:t>
+        <w:t xml:space="preserve">If both the helper method returns that the line is a character cue and the regular expression finds a match, the line enters the statement. The algorithm checks if the next not-empty line (if not the end of the script) is a speaker cue using the </w:t>
       </w:r>
       <w:proofErr w:type="spellStart"/>
       <w:r>
@@ -15407,21 +15251,7 @@
         <w:rPr>
           <w:rFonts w:ascii="Arial" w:hAnsi="Arial" w:cs="Arial"/>
         </w:rPr>
-        <w:t xml:space="preserve">is set to 40% certainty. If the names match the name-files databases, the score is </w:t>
-      </w:r>
-      <w:proofErr w:type="gramStart"/>
-      <w:r>
-        <w:rPr>
-          <w:rFonts w:ascii="Arial" w:hAnsi="Arial" w:cs="Arial"/>
-        </w:rPr>
-        <w:t>incremented</w:t>
-      </w:r>
-      <w:proofErr w:type="gramEnd"/>
-      <w:r>
-        <w:rPr>
-          <w:rFonts w:ascii="Arial" w:hAnsi="Arial" w:cs="Arial"/>
-        </w:rPr>
-        <w:t xml:space="preserve"> by another 40% for each match. To introduce another possible score boost, the normalized candidate name is tokenized. The system checks if it contains common person-related words which are part of the PERSON_WORD set. These are nouns or adjectives which may relate to a person’s nationality, gender, race, occupation, age, etc. In the future, this list can be expanded and placed in a separate .txt database file and checked using a Trie data structure.</w:t>
+        <w:t>is set to 40% certainty. If the names match the name-files databases, the score is incremented by another 40% for each match. To introduce another possible score boost, the normalized candidate name is tokenized. The system checks if it contains common person-related words which are part of the PERSON_WORD set. These are nouns or adjectives which may relate to a person’s nationality, gender, race, occupation, age, etc. In the future, this list can be expanded and placed in a separate .txt database file and checked using a Trie data structure.</w:t>
       </w:r>
       <w:r>
         <w:rPr>
@@ -15518,21 +15348,7 @@
         <w:rPr>
           <w:rFonts w:ascii="Arial" w:hAnsi="Arial" w:cs="Arial"/>
         </w:rPr>
-        <w:t xml:space="preserve">Then, there is another line loop which contains regex matching, tokenization of short lines, next non-empty line checks, and set lookups, which equals time complexity of O(L) where L is the number of lines in a content block. This is </w:t>
-      </w:r>
-      <w:proofErr w:type="gramStart"/>
-      <w:r>
-        <w:rPr>
-          <w:rFonts w:ascii="Arial" w:hAnsi="Arial" w:cs="Arial"/>
-        </w:rPr>
-        <w:t>due to the fact that</w:t>
-      </w:r>
-      <w:proofErr w:type="gramEnd"/>
-      <w:r>
-        <w:rPr>
-          <w:rFonts w:ascii="Arial" w:hAnsi="Arial" w:cs="Arial"/>
-        </w:rPr>
-        <w:t xml:space="preserve"> the operations after the regex matching are either constant or very short. However, the number of lines is smaller than the number of characters in </w:t>
+        <w:t xml:space="preserve">Then, there is another line loop which contains regex matching, tokenization of short lines, next non-empty line checks, and set lookups, which equals time complexity of O(L) where L is the number of lines in a content block. This is due to the fact that the operations after the regex matching are either constant or very short. However, the number of lines is smaller than the number of characters in </w:t>
       </w:r>
       <w:r>
         <w:rPr>
@@ -15633,21 +15449,7 @@
         <w:rPr>
           <w:rFonts w:ascii="Arial" w:hAnsi="Arial" w:cs="Arial"/>
         </w:rPr>
-        <w:t xml:space="preserve"> </w:t>
-      </w:r>
-      <w:proofErr w:type="gramStart"/>
-      <w:r>
-        <w:rPr>
-          <w:rFonts w:ascii="Arial" w:hAnsi="Arial" w:cs="Arial"/>
-        </w:rPr>
-        <w:t>Similar to</w:t>
-      </w:r>
-      <w:proofErr w:type="gramEnd"/>
-      <w:r>
-        <w:rPr>
-          <w:rFonts w:ascii="Arial" w:hAnsi="Arial" w:cs="Arial"/>
-        </w:rPr>
-        <w:t xml:space="preserve"> the speaker cue method, an </w:t>
+        <w:t xml:space="preserve"> Similar to the speaker cue method, an </w:t>
       </w:r>
       <w:proofErr w:type="spellStart"/>
       <w:r>
@@ -15673,27 +15475,13 @@
         <w:rPr>
           <w:rFonts w:ascii="Arial" w:hAnsi="Arial" w:cs="Arial"/>
         </w:rPr>
-        <w:t xml:space="preserve"> and is not </w:t>
-      </w:r>
-      <w:proofErr w:type="gramStart"/>
-      <w:r>
-        <w:rPr>
-          <w:rFonts w:ascii="Arial" w:hAnsi="Arial" w:cs="Arial"/>
-        </w:rPr>
-        <w:t>empty</w:t>
-      </w:r>
-      <w:r>
-        <w:rPr>
-          <w:rFonts w:ascii="Arial" w:hAnsi="Arial" w:cs="Arial"/>
-        </w:rPr>
-        <w:t>, and</w:t>
-      </w:r>
-      <w:proofErr w:type="gramEnd"/>
-      <w:r>
-        <w:rPr>
-          <w:rFonts w:ascii="Arial" w:hAnsi="Arial" w:cs="Arial"/>
-        </w:rPr>
-        <w:t xml:space="preserve"> splits the lines (preserving empty lines).</w:t>
+        <w:t xml:space="preserve"> and is not empty</w:t>
+      </w:r>
+      <w:r>
+        <w:rPr>
+          <w:rFonts w:ascii="Arial" w:hAnsi="Arial" w:cs="Arial"/>
+        </w:rPr>
+        <w:t>, and splits the lines (preserving empty lines).</w:t>
       </w:r>
     </w:p>
     <w:p>
@@ -15721,21 +15509,7 @@
         <w:rPr>
           <w:rFonts w:ascii="Arial" w:hAnsi="Arial" w:cs="Arial"/>
         </w:rPr>
-        <w:t xml:space="preserve">done </w:t>
-      </w:r>
-      <w:proofErr w:type="gramStart"/>
-      <w:r>
-        <w:rPr>
-          <w:rFonts w:ascii="Arial" w:hAnsi="Arial" w:cs="Arial"/>
-        </w:rPr>
-        <w:t>in order to</w:t>
-      </w:r>
-      <w:proofErr w:type="gramEnd"/>
-      <w:r>
-        <w:rPr>
-          <w:rFonts w:ascii="Arial" w:hAnsi="Arial" w:cs="Arial"/>
-        </w:rPr>
-        <w:t xml:space="preserve"> match a character cue line properly using the </w:t>
+        <w:t xml:space="preserve">done in order to match a character cue line properly using the </w:t>
       </w:r>
       <w:proofErr w:type="spellStart"/>
       <w:r>
@@ -16011,21 +15785,7 @@
         <w:rPr>
           <w:rFonts w:ascii="Arial" w:hAnsi="Arial" w:cs="Arial"/>
         </w:rPr>
-        <w:t xml:space="preserve"> helper function, extraction type “NAMEFINDER_ME”, the context snippet, and the confidence score (max 1.0). The normalization is </w:t>
-      </w:r>
-      <w:proofErr w:type="gramStart"/>
-      <w:r>
-        <w:rPr>
-          <w:rFonts w:ascii="Arial" w:hAnsi="Arial" w:cs="Arial"/>
-        </w:rPr>
-        <w:t>similar to</w:t>
-      </w:r>
-      <w:proofErr w:type="gramEnd"/>
-      <w:r>
-        <w:rPr>
-          <w:rFonts w:ascii="Arial" w:hAnsi="Arial" w:cs="Arial"/>
-        </w:rPr>
-        <w:t xml:space="preserve"> the speaker-cue one – converting to readable apostrophes, collapsing spaces, removing stray leading and trailing punctuation and accidental scene numbers. The main difference is that it is converted to uppercase for easier clustering. The Character object is added to the result list, and after all matches are iterated, the </w:t>
+        <w:t xml:space="preserve"> helper function, extraction type “NAMEFINDER_ME”, the context snippet, and the confidence score (max 1.0). The normalization is similar to the speaker-cue one – converting to readable apostrophes, collapsing spaces, removing stray leading and trailing punctuation and accidental scene numbers. The main difference is that it is converted to uppercase for easier clustering. The Character object is added to the result list, and after all matches are iterated, the </w:t>
       </w:r>
       <w:proofErr w:type="spellStart"/>
       <w:r>
@@ -16039,21 +15799,7 @@
         <w:rPr>
           <w:rFonts w:ascii="Arial" w:hAnsi="Arial" w:cs="Arial"/>
         </w:rPr>
-        <w:t xml:space="preserve"> method </w:t>
-      </w:r>
-      <w:proofErr w:type="gramStart"/>
-      <w:r>
-        <w:rPr>
-          <w:rFonts w:ascii="Arial" w:hAnsi="Arial" w:cs="Arial"/>
-        </w:rPr>
-        <w:t>returns</w:t>
-      </w:r>
-      <w:proofErr w:type="gramEnd"/>
-      <w:r>
-        <w:rPr>
-          <w:rFonts w:ascii="Arial" w:hAnsi="Arial" w:cs="Arial"/>
-        </w:rPr>
-        <w:t xml:space="preserve"> the final list.</w:t>
+        <w:t xml:space="preserve"> method returns the final list.</w:t>
       </w:r>
     </w:p>
     <w:p>
@@ -16212,21 +15958,7 @@
         <w:rPr>
           <w:rFonts w:ascii="Arial" w:hAnsi="Arial" w:cs="Arial"/>
         </w:rPr>
-        <w:t xml:space="preserve"> time complexity and the snap loop one </w:t>
-      </w:r>
-      <w:proofErr w:type="gramStart"/>
-      <w:r>
-        <w:rPr>
-          <w:rFonts w:ascii="Arial" w:hAnsi="Arial" w:cs="Arial"/>
-        </w:rPr>
-        <w:t>are</w:t>
-      </w:r>
-      <w:proofErr w:type="gramEnd"/>
-      <w:r>
-        <w:rPr>
-          <w:rFonts w:ascii="Arial" w:hAnsi="Arial" w:cs="Arial"/>
-        </w:rPr>
-        <w:t xml:space="preserve"> both also O(T). </w:t>
+        <w:t xml:space="preserve"> time complexity and the snap loop one are both also O(T). </w:t>
       </w:r>
       <w:r>
         <w:rPr>
@@ -16509,27 +16241,7 @@
           <w:bCs/>
           <w:color w:val="auto"/>
         </w:rPr>
-        <w:t xml:space="preserve">Introduction </w:t>
-      </w:r>
-      <w:proofErr w:type="gramStart"/>
-      <w:r>
-        <w:rPr>
-          <w:rFonts w:ascii="Arial" w:hAnsi="Arial" w:cs="Arial"/>
-          <w:b/>
-          <w:bCs/>
-          <w:color w:val="auto"/>
-        </w:rPr>
-        <w:t>Phrase</w:t>
-      </w:r>
-      <w:proofErr w:type="gramEnd"/>
-      <w:r>
-        <w:rPr>
-          <w:rFonts w:ascii="Arial" w:hAnsi="Arial" w:cs="Arial"/>
-          <w:b/>
-          <w:bCs/>
-          <w:color w:val="auto"/>
-        </w:rPr>
-        <w:t xml:space="preserve"> Characters</w:t>
+        <w:t>Introduction Phrase Characters</w:t>
       </w:r>
       <w:bookmarkEnd w:id="16"/>
     </w:p>
@@ -16709,7 +16421,6 @@
         <w:t xml:space="preserve">at 1.0. It is added to the </w:t>
       </w:r>
       <w:proofErr w:type="spellStart"/>
-      <w:proofErr w:type="gramStart"/>
       <w:r>
         <w:rPr>
           <w:rFonts w:ascii="Arial" w:hAnsi="Arial" w:cs="Arial"/>
@@ -16717,7 +16428,6 @@
         <w:t>arrayList</w:t>
       </w:r>
       <w:proofErr w:type="spellEnd"/>
-      <w:proofErr w:type="gramEnd"/>
       <w:r>
         <w:rPr>
           <w:rFonts w:ascii="Arial" w:hAnsi="Arial" w:cs="Arial"/>
@@ -16728,21 +16438,7 @@
         <w:rPr>
           <w:rFonts w:ascii="Arial" w:hAnsi="Arial" w:cs="Arial"/>
         </w:rPr>
-        <w:t xml:space="preserve"> If a line matches this case, it never goes to the second one </w:t>
-      </w:r>
-      <w:proofErr w:type="gramStart"/>
-      <w:r>
-        <w:rPr>
-          <w:rFonts w:ascii="Arial" w:hAnsi="Arial" w:cs="Arial"/>
-        </w:rPr>
-        <w:t>in order to</w:t>
-      </w:r>
-      <w:proofErr w:type="gramEnd"/>
-      <w:r>
-        <w:rPr>
-          <w:rFonts w:ascii="Arial" w:hAnsi="Arial" w:cs="Arial"/>
-        </w:rPr>
-        <w:t xml:space="preserve"> prevent duplicates.</w:t>
+        <w:t xml:space="preserve"> If a line matches this case, it never goes to the second one in order to prevent duplicates.</w:t>
       </w:r>
     </w:p>
     <w:p>
@@ -16828,21 +16524,7 @@
         <w:rPr>
           <w:rFonts w:ascii="Arial" w:hAnsi="Arial" w:cs="Arial"/>
         </w:rPr>
-        <w:t xml:space="preserve"> </w:t>
-      </w:r>
-      <w:proofErr w:type="gramStart"/>
-      <w:r>
-        <w:rPr>
-          <w:rFonts w:ascii="Arial" w:hAnsi="Arial" w:cs="Arial"/>
-        </w:rPr>
-        <w:t>in order to</w:t>
-      </w:r>
-      <w:proofErr w:type="gramEnd"/>
-      <w:r>
-        <w:rPr>
-          <w:rFonts w:ascii="Arial" w:hAnsi="Arial" w:cs="Arial"/>
-        </w:rPr>
-        <w:t xml:space="preserve"> be relatively realistic. After the number</w:t>
+        <w:t xml:space="preserve"> in order to be relatively realistic. After the number</w:t>
       </w:r>
       <w:r>
         <w:rPr>
@@ -17075,91 +16757,61 @@
           <w:i/>
           <w:iCs/>
         </w:rPr>
-        <w:t xml:space="preserve">Big </w:t>
-      </w:r>
-      <w:proofErr w:type="gramStart"/>
+        <w:t>Big Break!</w:t>
+      </w:r>
+      <w:r>
+        <w:rPr>
+          <w:rFonts w:ascii="Arial" w:hAnsi="Arial" w:cs="Arial"/>
+        </w:rPr>
+        <w:t>, the Trie (Prefix Tree) data structure is used to compare the extracted name to common first and last names. It avoids repeated linear searches over large name lists and supports fast prefix-based lookup.</w:t>
+      </w:r>
+    </w:p>
+    <w:p>
+      <w:pPr>
+        <w:spacing w:line="360" w:lineRule="auto"/>
+        <w:jc w:val="both"/>
+        <w:rPr>
+          <w:rFonts w:ascii="Arial" w:hAnsi="Arial" w:cs="Arial"/>
+        </w:rPr>
+      </w:pPr>
+    </w:p>
+    <w:p>
+      <w:pPr>
+        <w:spacing w:line="360" w:lineRule="auto"/>
+        <w:jc w:val="both"/>
+        <w:rPr>
+          <w:rFonts w:ascii="Arial" w:hAnsi="Arial" w:cs="Arial"/>
+        </w:rPr>
+      </w:pPr>
+      <w:r>
+        <w:rPr>
+          <w:rFonts w:ascii="Arial" w:hAnsi="Arial" w:cs="Arial"/>
+        </w:rPr>
+        <w:t xml:space="preserve">The root node acts as a starting point and does not store any characters (as in letters). A map is created to connect a character (letter) to its next node in the tree. A Boolean </w:t>
+      </w:r>
+      <w:proofErr w:type="spellStart"/>
       <w:r>
         <w:rPr>
           <w:rFonts w:ascii="Arial" w:hAnsi="Arial" w:cs="Arial"/>
           <w:i/>
           <w:iCs/>
         </w:rPr>
-        <w:t>Break!</w:t>
-      </w:r>
-      <w:r>
-        <w:rPr>
-          <w:rFonts w:ascii="Arial" w:hAnsi="Arial" w:cs="Arial"/>
-        </w:rPr>
-        <w:t>,</w:t>
-      </w:r>
-      <w:proofErr w:type="gramEnd"/>
-      <w:r>
-        <w:rPr>
-          <w:rFonts w:ascii="Arial" w:hAnsi="Arial" w:cs="Arial"/>
-        </w:rPr>
-        <w:t xml:space="preserve"> the Trie (Prefix Tree) data structure is used to compare the extracted name to common first and last names. It avoids repeated linear searches over large name lists and supports fast prefix-based lookup.</w:t>
-      </w:r>
-    </w:p>
-    <w:p>
-      <w:pPr>
-        <w:spacing w:line="360" w:lineRule="auto"/>
-        <w:jc w:val="both"/>
-        <w:rPr>
-          <w:rFonts w:ascii="Arial" w:hAnsi="Arial" w:cs="Arial"/>
-        </w:rPr>
-      </w:pPr>
-    </w:p>
-    <w:p>
-      <w:pPr>
-        <w:spacing w:line="360" w:lineRule="auto"/>
-        <w:jc w:val="both"/>
-        <w:rPr>
-          <w:rFonts w:ascii="Arial" w:hAnsi="Arial" w:cs="Arial"/>
-        </w:rPr>
-      </w:pPr>
-      <w:r>
-        <w:rPr>
-          <w:rFonts w:ascii="Arial" w:hAnsi="Arial" w:cs="Arial"/>
-        </w:rPr>
-        <w:t xml:space="preserve">The root node acts as a starting point and does not store any characters (as in letters). A map is created to connect a character (letter) to its next node in the tree. A Boolean </w:t>
-      </w:r>
-      <w:proofErr w:type="spellStart"/>
+        <w:t>isWord</w:t>
+      </w:r>
+      <w:proofErr w:type="spellEnd"/>
       <w:r>
         <w:rPr>
           <w:rFonts w:ascii="Arial" w:hAnsi="Arial" w:cs="Arial"/>
           <w:i/>
           <w:iCs/>
         </w:rPr>
-        <w:t>isWord</w:t>
-      </w:r>
-      <w:proofErr w:type="spellEnd"/>
-      <w:r>
-        <w:rPr>
-          <w:rFonts w:ascii="Arial" w:hAnsi="Arial" w:cs="Arial"/>
-          <w:i/>
-          <w:iCs/>
-        </w:rPr>
         <w:t xml:space="preserve"> </w:t>
       </w:r>
       <w:r>
         <w:rPr>
           <w:rFonts w:ascii="Arial" w:hAnsi="Arial" w:cs="Arial"/>
         </w:rPr>
-        <w:t xml:space="preserve">variable is introduced to track whether the path from the root to the current node forms a complete, valid word. The operations executed are </w:t>
-      </w:r>
-      <w:proofErr w:type="gramStart"/>
-      <w:r>
-        <w:rPr>
-          <w:rFonts w:ascii="Arial" w:hAnsi="Arial" w:cs="Arial"/>
-        </w:rPr>
-        <w:t>insert</w:t>
-      </w:r>
-      <w:proofErr w:type="gramEnd"/>
-      <w:r>
-        <w:rPr>
-          <w:rFonts w:ascii="Arial" w:hAnsi="Arial" w:cs="Arial"/>
-        </w:rPr>
-        <w:t xml:space="preserve"> and contain</w:t>
+        <w:t>variable is introduced to track whether the path from the root to the current node forms a complete, valid word. The operations executed are insert and contain</w:t>
       </w:r>
       <w:r>
         <w:rPr>
@@ -17442,21 +17094,7 @@
         <w:rPr>
           <w:rFonts w:ascii="Arial" w:hAnsi="Arial" w:cs="Arial"/>
         </w:rPr>
-        <w:t xml:space="preserve">. </w:t>
-      </w:r>
-      <w:proofErr w:type="gramStart"/>
-      <w:r>
-        <w:rPr>
-          <w:rFonts w:ascii="Arial" w:hAnsi="Arial" w:cs="Arial"/>
-        </w:rPr>
-        <w:t>The time</w:t>
-      </w:r>
-      <w:proofErr w:type="gramEnd"/>
-      <w:r>
-        <w:rPr>
-          <w:rFonts w:ascii="Arial" w:hAnsi="Arial" w:cs="Arial"/>
-        </w:rPr>
-        <w:t xml:space="preserve"> complexity of this operation is O(n), where n is the length of the word to insert, and the auxiliary space it takes is O(n) as well</w:t>
+        <w:t>. The time complexity of this operation is O(n), where n is the length of the word to insert, and the auxiliary space it takes is O(n) as well</w:t>
       </w:r>
       <w:r>
         <w:rPr>
@@ -17540,7 +17178,6 @@
         </w:rPr>
         <w:t xml:space="preserve">In the </w:t>
       </w:r>
-      <w:proofErr w:type="gramStart"/>
       <w:r>
         <w:rPr>
           <w:rFonts w:ascii="Arial" w:hAnsi="Arial" w:cs="Arial"/>
@@ -17549,7 +17186,6 @@
         </w:rPr>
         <w:t>contain</w:t>
       </w:r>
-      <w:proofErr w:type="gramEnd"/>
       <w:r>
         <w:rPr>
           <w:rFonts w:ascii="Arial" w:hAnsi="Arial" w:cs="Arial"/>
@@ -18585,21 +18221,7 @@
         <w:rPr>
           <w:rFonts w:ascii="Arial" w:hAnsi="Arial" w:cs="Arial"/>
         </w:rPr>
-        <w:t xml:space="preserve">. A threshold value is created </w:t>
-      </w:r>
-      <w:proofErr w:type="gramStart"/>
-      <w:r>
-        <w:rPr>
-          <w:rFonts w:ascii="Arial" w:hAnsi="Arial" w:cs="Arial"/>
-        </w:rPr>
-        <w:t>in order to</w:t>
-      </w:r>
-      <w:proofErr w:type="gramEnd"/>
-      <w:r>
-        <w:rPr>
-          <w:rFonts w:ascii="Arial" w:hAnsi="Arial" w:cs="Arial"/>
-        </w:rPr>
-        <w:t xml:space="preserve"> catch small typos or name </w:t>
+        <w:t xml:space="preserve">. A threshold value is created in order to catch small typos or name </w:t>
       </w:r>
       <w:r>
         <w:rPr>
@@ -18687,35 +18309,7 @@
         <w:rPr>
           <w:rFonts w:ascii="Arial" w:hAnsi="Arial" w:cs="Arial"/>
         </w:rPr>
-        <w:t xml:space="preserve"> This implementation of DSU makes the similarity transitive, meaning that if A is </w:t>
-      </w:r>
-      <w:proofErr w:type="gramStart"/>
-      <w:r>
-        <w:rPr>
-          <w:rFonts w:ascii="Arial" w:hAnsi="Arial" w:cs="Arial"/>
-        </w:rPr>
-        <w:t>similar to</w:t>
-      </w:r>
-      <w:proofErr w:type="gramEnd"/>
-      <w:r>
-        <w:rPr>
-          <w:rFonts w:ascii="Arial" w:hAnsi="Arial" w:cs="Arial"/>
-        </w:rPr>
-        <w:t xml:space="preserve"> B and B is </w:t>
-      </w:r>
-      <w:proofErr w:type="gramStart"/>
-      <w:r>
-        <w:rPr>
-          <w:rFonts w:ascii="Arial" w:hAnsi="Arial" w:cs="Arial"/>
-        </w:rPr>
-        <w:t>similar to</w:t>
-      </w:r>
-      <w:proofErr w:type="gramEnd"/>
-      <w:r>
-        <w:rPr>
-          <w:rFonts w:ascii="Arial" w:hAnsi="Arial" w:cs="Arial"/>
-        </w:rPr>
-        <w:t xml:space="preserve"> C, A and C will be part of the same </w:t>
+        <w:t xml:space="preserve"> This implementation of DSU makes the similarity transitive, meaning that if A is similar to B and B is similar to C, A and C will be part of the same </w:t>
       </w:r>
       <w:r>
         <w:rPr>
@@ -18769,16 +18363,8 @@
         <w:rPr>
           <w:rFonts w:ascii="Arial" w:hAnsi="Arial" w:cs="Arial"/>
         </w:rPr>
-        <w:t xml:space="preserve">clusters are extracted from the parent pointer </w:t>
-      </w:r>
-      <w:proofErr w:type="gramStart"/>
-      <w:r>
-        <w:rPr>
-          <w:rFonts w:ascii="Arial" w:hAnsi="Arial" w:cs="Arial"/>
-        </w:rPr>
-        <w:t>tree</w:t>
-      </w:r>
-      <w:proofErr w:type="gramEnd"/>
+        <w:t>clusters are extracted from the parent pointer tree</w:t>
+      </w:r>
       <w:r>
         <w:rPr>
           <w:rFonts w:ascii="Arial" w:hAnsi="Arial" w:cs="Arial"/>
@@ -20479,14 +20065,12 @@
         </w:rPr>
         <w:t xml:space="preserve"> measures the difference between </w:t>
       </w:r>
-      <w:proofErr w:type="gramStart"/>
       <w:r>
         <w:rPr>
           <w:rFonts w:ascii="Arial" w:hAnsi="Arial" w:cs="Arial"/>
         </w:rPr>
         <w:t>two character</w:t>
       </w:r>
-      <w:proofErr w:type="gramEnd"/>
       <w:r>
         <w:rPr>
           <w:rFonts w:ascii="Arial" w:hAnsi="Arial" w:cs="Arial"/>
@@ -20818,13 +20402,8 @@
                             <w:r>
                               <w:t xml:space="preserve">Pseudocode of the </w:t>
                             </w:r>
-                            <w:proofErr w:type="spellStart"/>
                             <w:r>
-                              <w:t>Levenshtein</w:t>
-                            </w:r>
-                            <w:proofErr w:type="spellEnd"/>
-                            <w:r>
-                              <w:t xml:space="preserve"> distance algorithm</w:t>
+                              <w:t>Levenshtein distance algorithm</w:t>
                             </w:r>
                           </w:p>
                         </w:txbxContent>
@@ -20866,13 +20445,8 @@
                       <w:r>
                         <w:t xml:space="preserve">Pseudocode of the </w:t>
                       </w:r>
-                      <w:proofErr w:type="spellStart"/>
                       <w:r>
-                        <w:t>Levenshtein</w:t>
-                      </w:r>
-                      <w:proofErr w:type="spellEnd"/>
-                      <w:r>
-                        <w:t xml:space="preserve"> distance algorithm</w:t>
+                        <w:t>Levenshtein distance algorithm</w:t>
                       </w:r>
                     </w:p>
                   </w:txbxContent>
@@ -21634,7 +21208,6 @@
                               </w:rPr>
                               <w:t xml:space="preserve">: </w:t>
                             </w:r>
-                            <w:proofErr w:type="spellStart"/>
                             <w:r>
                               <w:rPr>
                                 <w:sz w:val="20"/>
@@ -21642,7 +21215,6 @@
                               </w:rPr>
                               <w:t>Levenshtein</w:t>
                             </w:r>
-                            <w:proofErr w:type="spellEnd"/>
                             <w:r>
                               <w:rPr>
                                 <w:sz w:val="20"/>
@@ -21744,7 +21316,6 @@
                         </w:rPr>
                         <w:t xml:space="preserve">: </w:t>
                       </w:r>
-                      <w:proofErr w:type="spellStart"/>
                       <w:r>
                         <w:rPr>
                           <w:sz w:val="20"/>
@@ -21752,7 +21323,6 @@
                         </w:rPr>
                         <w:t>Levenshtein</w:t>
                       </w:r>
-                      <w:proofErr w:type="spellEnd"/>
                       <w:r>
                         <w:rPr>
                           <w:sz w:val="20"/>
@@ -22053,14 +21623,7 @@
         <w:rPr>
           <w:rFonts w:ascii="Arial" w:eastAsiaTheme="minorEastAsia" w:hAnsi="Arial" w:cs="Arial"/>
         </w:rPr>
-        <w:t xml:space="preserve">as a preparation to insert it into </w:t>
-      </w:r>
-      <w:proofErr w:type="gramStart"/>
-      <w:r>
-        <w:rPr>
-          <w:rFonts w:ascii="Arial" w:eastAsiaTheme="minorEastAsia" w:hAnsi="Arial" w:cs="Arial"/>
-        </w:rPr>
-        <w:t xml:space="preserve">the </w:t>
+        <w:t xml:space="preserve">as a preparation to insert it into the </w:t>
       </w:r>
       <w:r>
         <w:rPr>
@@ -22068,16 +21631,7 @@
           <w:i/>
           <w:iCs/>
         </w:rPr>
-        <w:t>a</w:t>
-      </w:r>
-      <w:proofErr w:type="gramEnd"/>
-      <w:r>
-        <w:rPr>
-          <w:rFonts w:ascii="Arial" w:eastAsiaTheme="minorEastAsia" w:hAnsi="Arial" w:cs="Arial"/>
-          <w:i/>
-          <w:iCs/>
-        </w:rPr>
-        <w:t xml:space="preserve"> </w:t>
+        <w:t xml:space="preserve">a </w:t>
       </w:r>
       <w:r>
         <w:rPr>
@@ -23076,21 +22630,7 @@
         <w:rPr>
           <w:rFonts w:ascii="Arial" w:eastAsiaTheme="minorEastAsia" w:hAnsi="Arial" w:cs="Arial"/>
         </w:rPr>
-        <w:t xml:space="preserve">. The algorithm has already explored all the different paths to determine each value of the matrix as the minimal edit cost. This makes the last </w:t>
-      </w:r>
-      <w:proofErr w:type="gramStart"/>
-      <w:r>
-        <w:rPr>
-          <w:rFonts w:ascii="Arial" w:eastAsiaTheme="minorEastAsia" w:hAnsi="Arial" w:cs="Arial"/>
-        </w:rPr>
-        <w:t>value</w:t>
-      </w:r>
-      <w:proofErr w:type="gramEnd"/>
-      <w:r>
-        <w:rPr>
-          <w:rFonts w:ascii="Arial" w:eastAsiaTheme="minorEastAsia" w:hAnsi="Arial" w:cs="Arial"/>
-        </w:rPr>
-        <w:t xml:space="preserve"> a product of all the minimal edits, resulting in having the ultimate value of the matrix as the total distance of changing </w:t>
+        <w:t xml:space="preserve">. The algorithm has already explored all the different paths to determine each value of the matrix as the minimal edit cost. This makes the last value a product of all the minimal edits, resulting in having the ultimate value of the matrix as the total distance of changing </w:t>
       </w:r>
       <w:proofErr w:type="spellStart"/>
       <w:r>
@@ -23203,21 +22743,7 @@
         <w:rPr>
           <w:rFonts w:ascii="Arial" w:hAnsi="Arial" w:cs="Arial"/>
         </w:rPr>
-        <w:t xml:space="preserve"> </w:t>
-      </w:r>
-      <w:proofErr w:type="gramStart"/>
-      <w:r>
-        <w:rPr>
-          <w:rFonts w:ascii="Arial" w:hAnsi="Arial" w:cs="Arial"/>
-        </w:rPr>
-        <w:t>or</w:t>
-      </w:r>
-      <w:proofErr w:type="gramEnd"/>
-      <w:r>
-        <w:rPr>
-          <w:rFonts w:ascii="Arial" w:hAnsi="Arial" w:cs="Arial"/>
-        </w:rPr>
-        <w:t xml:space="preserve"> not</w:t>
+        <w:t xml:space="preserve"> or not</w:t>
       </w:r>
       <w:r>
         <w:rPr>
@@ -23383,27 +22909,13 @@
         <w:rPr>
           <w:rFonts w:ascii="Arial" w:hAnsi="Arial" w:cs="Arial"/>
         </w:rPr>
-        <w:t xml:space="preserve">The algorithm starts with lowercasing </w:t>
-      </w:r>
-      <w:proofErr w:type="gramStart"/>
-      <w:r>
-        <w:rPr>
-          <w:rFonts w:ascii="Arial" w:hAnsi="Arial" w:cs="Arial"/>
-        </w:rPr>
-        <w:t xml:space="preserve">both of the </w:t>
-      </w:r>
-      <w:r>
-        <w:rPr>
-          <w:rFonts w:ascii="Arial" w:hAnsi="Arial" w:cs="Arial"/>
-        </w:rPr>
-        <w:t>strings</w:t>
-      </w:r>
-      <w:proofErr w:type="gramEnd"/>
-      <w:r>
-        <w:rPr>
-          <w:rFonts w:ascii="Arial" w:hAnsi="Arial" w:cs="Arial"/>
-        </w:rPr>
-        <w:t>,</w:t>
+        <w:t xml:space="preserve">The algorithm starts with lowercasing both of the </w:t>
+      </w:r>
+      <w:r>
+        <w:rPr>
+          <w:rFonts w:ascii="Arial" w:hAnsi="Arial" w:cs="Arial"/>
+        </w:rPr>
+        <w:t>strings,</w:t>
       </w:r>
       <w:r>
         <w:rPr>
@@ -23415,21 +22927,7 @@
         <w:rPr>
           <w:rFonts w:ascii="Arial" w:hAnsi="Arial" w:cs="Arial"/>
         </w:rPr>
-        <w:t xml:space="preserve"> It checks if the strings match completely and returns 1. However, in most cases, the algorithm continues. </w:t>
-      </w:r>
-      <w:proofErr w:type="gramStart"/>
-      <w:r>
-        <w:rPr>
-          <w:rFonts w:ascii="Arial" w:hAnsi="Arial" w:cs="Arial"/>
-        </w:rPr>
-        <w:t>In order for</w:t>
-      </w:r>
-      <w:proofErr w:type="gramEnd"/>
-      <w:r>
-        <w:rPr>
-          <w:rFonts w:ascii="Arial" w:hAnsi="Arial" w:cs="Arial"/>
-        </w:rPr>
-        <w:t xml:space="preserve"> the letters to match, they need to be in a similar position in both strings. This is why the algorithm calculates the maximum distance two characters</w:t>
+        <w:t xml:space="preserve"> It checks if the strings match completely and returns 1. However, in most cases, the algorithm continues. In order for the letters to match, they need to be in a similar position in both strings. This is why the algorithm calculates the maximum distance two characters</w:t>
       </w:r>
       <w:r>
         <w:rPr>
@@ -23967,19 +23465,11 @@
         </w:rPr>
         <w:t xml:space="preserve"> </w:t>
       </w:r>
-      <w:proofErr w:type="gramStart"/>
-      <w:r>
-        <w:rPr>
-          <w:rFonts w:ascii="Arial" w:hAnsi="Arial" w:cs="Arial"/>
-        </w:rPr>
-        <w:t>In order to</w:t>
-      </w:r>
-      <w:proofErr w:type="gramEnd"/>
-      <w:r>
-        <w:rPr>
-          <w:rFonts w:ascii="Arial" w:hAnsi="Arial" w:cs="Arial"/>
-        </w:rPr>
-        <w:t xml:space="preserve"> find the Jaro similarity, the following formula is used:</w:t>
+      <w:r>
+        <w:rPr>
+          <w:rFonts w:ascii="Arial" w:hAnsi="Arial" w:cs="Arial"/>
+        </w:rPr>
+        <w:t>In order to find the Jaro similarity, the following formula is used:</w:t>
       </w:r>
     </w:p>
     <w:p>
@@ -24169,21 +23659,7 @@
         <w:rPr>
           <w:rFonts w:ascii="Arial" w:hAnsi="Arial" w:cs="Arial"/>
         </w:rPr>
-        <w:t xml:space="preserve">m is the number of </w:t>
-      </w:r>
-      <w:proofErr w:type="gramStart"/>
-      <w:r>
-        <w:rPr>
-          <w:rFonts w:ascii="Arial" w:hAnsi="Arial" w:cs="Arial"/>
-        </w:rPr>
-        <w:t>all matching</w:t>
-      </w:r>
-      <w:proofErr w:type="gramEnd"/>
-      <w:r>
-        <w:rPr>
-          <w:rFonts w:ascii="Arial" w:hAnsi="Arial" w:cs="Arial"/>
-        </w:rPr>
-        <w:t xml:space="preserve"> characters.</w:t>
+        <w:t>m is the number of all matching characters.</w:t>
       </w:r>
     </w:p>
     <w:p>
@@ -24199,19 +23675,11 @@
           <w:rFonts w:ascii="Arial" w:hAnsi="Arial" w:cs="Arial"/>
         </w:rPr>
       </w:pPr>
-      <w:proofErr w:type="gramStart"/>
-      <w:r>
-        <w:rPr>
-          <w:rFonts w:ascii="Arial" w:hAnsi="Arial" w:cs="Arial"/>
-        </w:rPr>
-        <w:t>t is</w:t>
-      </w:r>
-      <w:proofErr w:type="gramEnd"/>
-      <w:r>
-        <w:rPr>
-          <w:rFonts w:ascii="Arial" w:hAnsi="Arial" w:cs="Arial"/>
-        </w:rPr>
-        <w:t xml:space="preserve"> half of the number of transpositions</w:t>
+      <w:r>
+        <w:rPr>
+          <w:rFonts w:ascii="Arial" w:hAnsi="Arial" w:cs="Arial"/>
+        </w:rPr>
+        <w:t>t is half of the number of transpositions</w:t>
       </w:r>
     </w:p>
     <w:p>
@@ -24409,21 +23877,7 @@
           <w:rFonts w:ascii="Arial" w:hAnsi="Arial" w:cs="Arial"/>
         </w:rPr>
         <w:lastRenderedPageBreak/>
-        <w:t xml:space="preserve">SW is the </w:t>
-      </w:r>
-      <w:proofErr w:type="gramStart"/>
-      <w:r>
-        <w:rPr>
-          <w:rFonts w:ascii="Arial" w:hAnsi="Arial" w:cs="Arial"/>
-        </w:rPr>
-        <w:t>Jaro-Winkler similarity</w:t>
-      </w:r>
-      <w:proofErr w:type="gramEnd"/>
-      <w:r>
-        <w:rPr>
-          <w:rFonts w:ascii="Arial" w:hAnsi="Arial" w:cs="Arial"/>
-        </w:rPr>
-        <w:t>.</w:t>
+        <w:t>SW is the Jaro-Winkler similarity.</w:t>
       </w:r>
     </w:p>
     <w:p>
@@ -24708,29 +24162,13 @@
           <w:i/>
           <w:iCs/>
         </w:rPr>
-        <w:t xml:space="preserve">Big </w:t>
-      </w:r>
-      <w:proofErr w:type="gramStart"/>
-      <w:r>
-        <w:rPr>
-          <w:rFonts w:ascii="Arial" w:hAnsi="Arial" w:cs="Arial"/>
-          <w:i/>
-          <w:iCs/>
-        </w:rPr>
-        <w:t>Break!</w:t>
-      </w:r>
-      <w:r>
-        <w:rPr>
-          <w:rFonts w:ascii="Arial" w:hAnsi="Arial" w:cs="Arial"/>
-        </w:rPr>
-        <w:t>,</w:t>
-      </w:r>
-      <w:proofErr w:type="gramEnd"/>
-      <w:r>
-        <w:rPr>
-          <w:rFonts w:ascii="Arial" w:hAnsi="Arial" w:cs="Arial"/>
-        </w:rPr>
-        <w:t xml:space="preserve"> the</w:t>
+        <w:t>Big Break!</w:t>
+      </w:r>
+      <w:r>
+        <w:rPr>
+          <w:rFonts w:ascii="Arial" w:hAnsi="Arial" w:cs="Arial"/>
+        </w:rPr>
+        <w:t>, the</w:t>
       </w:r>
       <w:r>
         <w:rPr>
@@ -24918,71 +24356,39 @@
           <w:i/>
           <w:iCs/>
         </w:rPr>
-        <w:t xml:space="preserve">Big </w:t>
-      </w:r>
-      <w:proofErr w:type="gramStart"/>
+        <w:t xml:space="preserve">Big Break!, </w:t>
+      </w:r>
+      <w:r>
+        <w:rPr>
+          <w:rFonts w:ascii="Arial" w:hAnsi="Arial" w:cs="Arial"/>
+        </w:rPr>
+        <w:t>the</w:t>
+      </w:r>
+      <w:r>
+        <w:rPr>
+          <w:rFonts w:ascii="Arial" w:hAnsi="Arial" w:cs="Arial"/>
+        </w:rPr>
+        <w:t xml:space="preserve"> shooting days are 12-hour days, </w:t>
+      </w:r>
+      <w:r>
+        <w:rPr>
+          <w:rFonts w:ascii="Arial" w:hAnsi="Arial" w:cs="Arial"/>
+        </w:rPr>
+        <w:lastRenderedPageBreak/>
+        <w:t>and around 5 pages are shot per day. This equates to around 40 eighths per day.</w:t>
+      </w:r>
+      <w:r>
+        <w:rPr>
+          <w:rFonts w:ascii="Arial" w:hAnsi="Arial" w:cs="Arial"/>
+        </w:rPr>
+        <w:t xml:space="preserve"> With the understanding that overtime is occasionally useful for a production, </w:t>
+      </w:r>
       <w:r>
         <w:rPr>
           <w:rFonts w:ascii="Arial" w:hAnsi="Arial" w:cs="Arial"/>
           <w:i/>
           <w:iCs/>
         </w:rPr>
-        <w:t>Break!,</w:t>
-      </w:r>
-      <w:proofErr w:type="gramEnd"/>
-      <w:r>
-        <w:rPr>
-          <w:rFonts w:ascii="Arial" w:hAnsi="Arial" w:cs="Arial"/>
-          <w:i/>
-          <w:iCs/>
-        </w:rPr>
-        <w:t xml:space="preserve"> </w:t>
-      </w:r>
-      <w:r>
-        <w:rPr>
-          <w:rFonts w:ascii="Arial" w:hAnsi="Arial" w:cs="Arial"/>
-        </w:rPr>
-        <w:t>the</w:t>
-      </w:r>
-      <w:r>
-        <w:rPr>
-          <w:rFonts w:ascii="Arial" w:hAnsi="Arial" w:cs="Arial"/>
-        </w:rPr>
-        <w:t xml:space="preserve"> shooting days are 12-hour days, </w:t>
-      </w:r>
-      <w:r>
-        <w:rPr>
-          <w:rFonts w:ascii="Arial" w:hAnsi="Arial" w:cs="Arial"/>
-        </w:rPr>
-        <w:lastRenderedPageBreak/>
-        <w:t>and around 5 pages are shot per day. This equates to around 40 eighths per day.</w:t>
-      </w:r>
-      <w:r>
-        <w:rPr>
-          <w:rFonts w:ascii="Arial" w:hAnsi="Arial" w:cs="Arial"/>
-        </w:rPr>
-        <w:t xml:space="preserve"> With the understanding that overtime is occasionally useful for </w:t>
-      </w:r>
-      <w:proofErr w:type="gramStart"/>
-      <w:r>
-        <w:rPr>
-          <w:rFonts w:ascii="Arial" w:hAnsi="Arial" w:cs="Arial"/>
-        </w:rPr>
-        <w:t>a production</w:t>
-      </w:r>
-      <w:proofErr w:type="gramEnd"/>
-      <w:r>
-        <w:rPr>
-          <w:rFonts w:ascii="Arial" w:hAnsi="Arial" w:cs="Arial"/>
-        </w:rPr>
-        <w:t xml:space="preserve">, </w:t>
-      </w:r>
-      <w:r>
-        <w:rPr>
-          <w:rFonts w:ascii="Arial" w:hAnsi="Arial" w:cs="Arial"/>
-          <w:i/>
-          <w:iCs/>
-        </w:rPr>
         <w:t xml:space="preserve">Big Break! </w:t>
       </w:r>
       <w:r>
@@ -25049,21 +24455,7 @@
         <w:rPr>
           <w:rFonts w:ascii="Arial" w:hAnsi="Arial" w:cs="Arial"/>
         </w:rPr>
-        <w:t xml:space="preserve"> 8 eighths or 1 page. This is not reflected in the final page count for the day, so it is more easily digestible by the user. However, it is </w:t>
-      </w:r>
-      <w:proofErr w:type="gramStart"/>
-      <w:r>
-        <w:rPr>
-          <w:rFonts w:ascii="Arial" w:hAnsi="Arial" w:cs="Arial"/>
-        </w:rPr>
-        <w:t>taken into account</w:t>
-      </w:r>
-      <w:proofErr w:type="gramEnd"/>
-      <w:r>
-        <w:rPr>
-          <w:rFonts w:ascii="Arial" w:hAnsi="Arial" w:cs="Arial"/>
-        </w:rPr>
-        <w:t xml:space="preserve"> when computing time limits per day.</w:t>
+        <w:t xml:space="preserve"> 8 eighths or 1 page. This is not reflected in the final page count for the day, so it is more easily digestible by the user. However, it is taken into account when computing time limits per day.</w:t>
       </w:r>
     </w:p>
     <w:p>
@@ -25163,21 +24555,7 @@
         <w:rPr>
           <w:rFonts w:ascii="Arial" w:eastAsiaTheme="minorEastAsia" w:hAnsi="Arial" w:cs="Arial"/>
         </w:rPr>
-        <w:t xml:space="preserve"> the number of </w:t>
-      </w:r>
-      <w:proofErr w:type="gramStart"/>
-      <w:r>
-        <w:rPr>
-          <w:rFonts w:ascii="Arial" w:eastAsiaTheme="minorEastAsia" w:hAnsi="Arial" w:cs="Arial"/>
-        </w:rPr>
-        <w:t>location</w:t>
-      </w:r>
-      <w:proofErr w:type="gramEnd"/>
-      <w:r>
-        <w:rPr>
-          <w:rFonts w:ascii="Arial" w:eastAsiaTheme="minorEastAsia" w:hAnsi="Arial" w:cs="Arial"/>
-        </w:rPr>
-        <w:t xml:space="preserve"> moves allowed per day, which is currently three</w:t>
+        <w:t xml:space="preserve"> the number of location moves allowed per day, which is currently three</w:t>
       </w:r>
       <w:r>
         <w:rPr>
@@ -25381,29 +24759,13 @@
           <w:i/>
           <w:iCs/>
         </w:rPr>
-        <w:t xml:space="preserve">Big </w:t>
-      </w:r>
-      <w:proofErr w:type="gramStart"/>
+        <w:t>Big Break!</w:t>
+      </w:r>
       <w:r>
         <w:rPr>
           <w:rFonts w:ascii="Arial" w:eastAsiaTheme="minorEastAsia" w:hAnsi="Arial" w:cs="Arial"/>
-          <w:i/>
-          <w:iCs/>
-        </w:rPr>
-        <w:t>Break!</w:t>
-      </w:r>
-      <w:r>
-        <w:rPr>
-          <w:rFonts w:ascii="Arial" w:eastAsiaTheme="minorEastAsia" w:hAnsi="Arial" w:cs="Arial"/>
-        </w:rPr>
-        <w:t>,</w:t>
-      </w:r>
-      <w:proofErr w:type="gramEnd"/>
-      <w:r>
-        <w:rPr>
-          <w:rFonts w:ascii="Arial" w:eastAsiaTheme="minorEastAsia" w:hAnsi="Arial" w:cs="Arial"/>
-        </w:rPr>
-        <w:t xml:space="preserve"> </w:t>
+        </w:rPr>
+        <w:t xml:space="preserve">, </w:t>
       </w:r>
       <w:r>
         <w:rPr>
@@ -25813,24 +25175,16 @@
         <w:rPr>
           <w:rFonts w:ascii="Arial" w:eastAsiaTheme="minorEastAsia" w:hAnsi="Arial" w:cs="Arial"/>
         </w:rPr>
-        <w:t xml:space="preserve">using </w:t>
-      </w:r>
-      <w:proofErr w:type="gramStart"/>
+        <w:t xml:space="preserve">using a </w:t>
+      </w:r>
+      <w:proofErr w:type="spellStart"/>
       <w:r>
         <w:rPr>
           <w:rFonts w:ascii="Arial" w:eastAsiaTheme="minorEastAsia" w:hAnsi="Arial" w:cs="Arial"/>
         </w:rPr>
-        <w:t xml:space="preserve">a </w:t>
-      </w:r>
-      <w:proofErr w:type="spellStart"/>
-      <w:r>
-        <w:rPr>
-          <w:rFonts w:ascii="Arial" w:eastAsiaTheme="minorEastAsia" w:hAnsi="Arial" w:cs="Arial"/>
-        </w:rPr>
         <w:t>LinkedHashMap</w:t>
       </w:r>
       <w:proofErr w:type="spellEnd"/>
-      <w:proofErr w:type="gramEnd"/>
       <w:r>
         <w:rPr>
           <w:rFonts w:ascii="Arial" w:eastAsiaTheme="minorEastAsia" w:hAnsi="Arial" w:cs="Arial"/>
@@ -26863,91 +26217,103 @@
         <w:rPr>
           <w:rFonts w:ascii="Arial" w:eastAsiaTheme="minorEastAsia" w:hAnsi="Arial" w:cs="Arial"/>
         </w:rPr>
-        <w:t xml:space="preserve"> </w:t>
-      </w:r>
-      <w:proofErr w:type="gramStart"/>
+        <w:t xml:space="preserve"> returns </w:t>
+      </w:r>
       <w:r>
         <w:rPr>
           <w:rFonts w:ascii="Arial" w:eastAsiaTheme="minorEastAsia" w:hAnsi="Arial" w:cs="Arial"/>
         </w:rPr>
-        <w:t>returns</w:t>
-      </w:r>
-      <w:proofErr w:type="gramEnd"/>
-      <w:r>
+        <w:t>a boost when the scene time corresponds to the overall day time so far. If it doesn’t, it returns an equal penalty.</w:t>
+      </w:r>
+    </w:p>
+    <w:p>
+      <w:pPr>
+        <w:spacing w:line="360" w:lineRule="auto"/>
         <w:rPr>
           <w:rFonts w:ascii="Arial" w:eastAsiaTheme="minorEastAsia" w:hAnsi="Arial" w:cs="Arial"/>
         </w:rPr>
-        <w:t xml:space="preserve"> </w:t>
-      </w:r>
-      <w:r>
+      </w:pPr>
+    </w:p>
+    <w:p>
+      <w:pPr>
+        <w:spacing w:line="360" w:lineRule="auto"/>
         <w:rPr>
           <w:rFonts w:ascii="Arial" w:eastAsiaTheme="minorEastAsia" w:hAnsi="Arial" w:cs="Arial"/>
         </w:rPr>
-        <w:t>a boost when the scene time corresponds to the overall day time so far. If it doesn’t, it returns an equal penalty.</w:t>
-      </w:r>
-    </w:p>
-    <w:p>
-      <w:pPr>
-        <w:spacing w:line="360" w:lineRule="auto"/>
+      </w:pPr>
+      <w:r>
         <w:rPr>
           <w:rFonts w:ascii="Arial" w:eastAsiaTheme="minorEastAsia" w:hAnsi="Arial" w:cs="Arial"/>
         </w:rPr>
-      </w:pPr>
-    </w:p>
-    <w:p>
-      <w:pPr>
-        <w:spacing w:line="360" w:lineRule="auto"/>
+        <w:t>The resource capacity encourages fuller days while penalizing going into overtime</w:t>
+      </w:r>
+      <w:r>
         <w:rPr>
           <w:rFonts w:ascii="Arial" w:eastAsiaTheme="minorEastAsia" w:hAnsi="Arial" w:cs="Arial"/>
         </w:rPr>
-      </w:pPr>
+        <w:t xml:space="preserve"> and encouraging filling emptier days</w:t>
+      </w:r>
       <w:r>
         <w:rPr>
           <w:rFonts w:ascii="Arial" w:eastAsiaTheme="minorEastAsia" w:hAnsi="Arial" w:cs="Arial"/>
         </w:rPr>
-        <w:t>The resource capacity encourages fuller days while penalizing going into overtime. It computes the load of the day so far, adding to it the current scene. Then, it computes a ratio score, relative to the maximum number of pages per day before overtime (40 eighths per day). If the ratio is larger than 1.0, this means that the day has gone into overtime and a -200 penalty is introduced to the score. If the ratio is smaller than 1.0, the score is boosted by ratio * 200. This flattening of the positive score is implemented</w:t>
+        <w:t xml:space="preserve">. </w:t>
       </w:r>
       <w:r>
         <w:rPr>
           <w:rFonts w:ascii="Arial" w:eastAsiaTheme="minorEastAsia" w:hAnsi="Arial" w:cs="Arial"/>
         </w:rPr>
-        <w:t xml:space="preserve"> to relate directly to the load of the day so far. In addition,</w:t>
+        <w:t>It</w:t>
       </w:r>
       <w:r>
         <w:rPr>
           <w:rFonts w:ascii="Arial" w:eastAsiaTheme="minorEastAsia" w:hAnsi="Arial" w:cs="Arial"/>
         </w:rPr>
-        <w:t xml:space="preserve"> </w:t>
+        <w:t xml:space="preserve"> computes a ratio score, relative to the maximum number of pages per day before overtime (40 eighths per day). If the ratio is larger than 1.0, this means that the day has gone into overtime and a -200 penalty is introduced to the score. If the ratio is smaller than </w:t>
       </w:r>
       <w:r>
         <w:rPr>
           <w:rFonts w:ascii="Arial" w:eastAsiaTheme="minorEastAsia" w:hAnsi="Arial" w:cs="Arial"/>
         </w:rPr>
-        <w:t>it boosts moderately</w:t>
+        <w:t>0.</w:t>
       </w:r>
       <w:r>
         <w:rPr>
           <w:rFonts w:ascii="Arial" w:eastAsiaTheme="minorEastAsia" w:hAnsi="Arial" w:cs="Arial"/>
         </w:rPr>
-        <w:t>,</w:t>
+        <w:t>5</w:t>
       </w:r>
       <w:r>
         <w:rPr>
           <w:rFonts w:ascii="Arial" w:eastAsiaTheme="minorEastAsia" w:hAnsi="Arial" w:cs="Arial"/>
         </w:rPr>
-        <w:t xml:space="preserve"> </w:t>
+        <w:t>0</w:t>
       </w:r>
       <w:r>
         <w:rPr>
           <w:rFonts w:ascii="Arial" w:eastAsiaTheme="minorEastAsia" w:hAnsi="Arial" w:cs="Arial"/>
         </w:rPr>
-        <w:t>corresponding to the priority of the</w:t>
+        <w:t xml:space="preserve">, the score is boosted by 200. </w:t>
       </w:r>
       <w:r>
         <w:rPr>
           <w:rFonts w:ascii="Arial" w:eastAsiaTheme="minorEastAsia" w:hAnsi="Arial" w:cs="Arial"/>
         </w:rPr>
-        <w:t xml:space="preserve"> resource capacity compared to other constraints.</w:t>
+        <w:t xml:space="preserve">This makes the schedule more balanced as fewer days are overpacked or </w:t>
+      </w:r>
+      <w:proofErr w:type="spellStart"/>
+      <w:r>
+        <w:rPr>
+          <w:rFonts w:ascii="Arial" w:eastAsiaTheme="minorEastAsia" w:hAnsi="Arial" w:cs="Arial"/>
+        </w:rPr>
+        <w:t>underpacked</w:t>
+      </w:r>
+      <w:proofErr w:type="spellEnd"/>
+      <w:r>
+        <w:rPr>
+          <w:rFonts w:ascii="Arial" w:eastAsiaTheme="minorEastAsia" w:hAnsi="Arial" w:cs="Arial"/>
+        </w:rPr>
+        <w:t>.</w:t>
       </w:r>
     </w:p>
     <w:p>
@@ -27304,21 +26670,7 @@
         <w:rPr>
           <w:rFonts w:ascii="Arial" w:eastAsiaTheme="minorEastAsia" w:hAnsi="Arial" w:cs="Arial"/>
         </w:rPr>
-        <w:t xml:space="preserve">. The initial shooting </w:t>
-      </w:r>
-      <w:proofErr w:type="gramStart"/>
-      <w:r>
-        <w:rPr>
-          <w:rFonts w:ascii="Arial" w:eastAsiaTheme="minorEastAsia" w:hAnsi="Arial" w:cs="Arial"/>
-        </w:rPr>
-        <w:t>day time</w:t>
-      </w:r>
-      <w:proofErr w:type="gramEnd"/>
-      <w:r>
-        <w:rPr>
-          <w:rFonts w:ascii="Arial" w:eastAsiaTheme="minorEastAsia" w:hAnsi="Arial" w:cs="Arial"/>
-        </w:rPr>
-        <w:t xml:space="preserve"> </w:t>
+        <w:t xml:space="preserve">. The initial shooting day time </w:t>
       </w:r>
       <w:r>
         <w:rPr>
@@ -27455,21 +26807,7 @@
         <w:rPr>
           <w:rFonts w:ascii="Arial" w:eastAsiaTheme="minorEastAsia" w:hAnsi="Arial" w:cs="Arial"/>
         </w:rPr>
-        <w:t xml:space="preserve">ks if the location of the scene is different from the rest and assigns its state to MOVE. Moreover, if a location move occurs, it adds 8 eighths to the current eighths of the day. The reason for that is that moving location during the shooting day takes time, but for bigger productions, it may be inevitable. In this scenario, the software checks if a NIGHT scene would cause the shooting </w:t>
-      </w:r>
-      <w:proofErr w:type="gramStart"/>
-      <w:r>
-        <w:rPr>
-          <w:rFonts w:ascii="Arial" w:eastAsiaTheme="minorEastAsia" w:hAnsi="Arial" w:cs="Arial"/>
-        </w:rPr>
-        <w:t>day time</w:t>
-      </w:r>
-      <w:proofErr w:type="gramEnd"/>
-      <w:r>
-        <w:rPr>
-          <w:rFonts w:ascii="Arial" w:eastAsiaTheme="minorEastAsia" w:hAnsi="Arial" w:cs="Arial"/>
-        </w:rPr>
-        <w:t xml:space="preserve"> to switch from DAY to DAY_NIGHT. This is realistic for film productions as it preserves time and creates smoother transitions.</w:t>
+        <w:t>ks if the location of the scene is different from the rest and assigns its state to MOVE. Moreover, if a location move occurs, it adds 8 eighths to the current eighths of the day. The reason for that is that moving location during the shooting day takes time, but for bigger productions, it may be inevitable. In this scenario, the software checks if a NIGHT scene would cause the shooting day time to switch from DAY to DAY_NIGHT. This is realistic for film productions as it preserves time and creates smoother transitions.</w:t>
       </w:r>
       <w:r>
         <w:rPr>
@@ -28492,6 +27830,132 @@
         <w:rPr>
           <w:rFonts w:ascii="Arial" w:hAnsi="Arial" w:cs="Arial"/>
         </w:rPr>
+        <w:t xml:space="preserve">During the character editing process, the </w:t>
+      </w:r>
+      <w:proofErr w:type="spellStart"/>
+      <w:r>
+        <w:rPr>
+          <w:rFonts w:ascii="Arial" w:hAnsi="Arial" w:cs="Arial"/>
+        </w:rPr>
+        <w:t>saveScene</w:t>
+      </w:r>
+      <w:proofErr w:type="spellEnd"/>
+      <w:r>
+        <w:rPr>
+          <w:rFonts w:ascii="Arial" w:hAnsi="Arial" w:cs="Arial"/>
+        </w:rPr>
+        <w:t xml:space="preserve"> function performs a sanitization step to ensure data consistency before persisting changes. First, the high-confidence character </w:t>
+      </w:r>
+      <w:r>
+        <w:rPr>
+          <w:rFonts w:ascii="Arial" w:hAnsi="Arial" w:cs="Arial"/>
+        </w:rPr>
+        <w:t>array</w:t>
+      </w:r>
+      <w:r>
+        <w:rPr>
+          <w:rFonts w:ascii="Arial" w:hAnsi="Arial" w:cs="Arial"/>
+        </w:rPr>
+        <w:t xml:space="preserve"> is converted into a </w:t>
+      </w:r>
+      <w:r>
+        <w:rPr>
+          <w:rFonts w:ascii="Arial" w:hAnsi="Arial" w:cs="Arial"/>
+        </w:rPr>
+        <w:t>s</w:t>
+      </w:r>
+      <w:r>
+        <w:rPr>
+          <w:rFonts w:ascii="Arial" w:hAnsi="Arial" w:cs="Arial"/>
+        </w:rPr>
+        <w:t>et</w:t>
+      </w:r>
+      <w:r>
+        <w:rPr>
+          <w:rFonts w:ascii="Arial" w:hAnsi="Arial" w:cs="Arial"/>
+        </w:rPr>
+        <w:t xml:space="preserve"> (as JSON cannot handle sets)</w:t>
+      </w:r>
+      <w:r>
+        <w:rPr>
+          <w:rFonts w:ascii="Arial" w:hAnsi="Arial" w:cs="Arial"/>
+        </w:rPr>
+        <w:t xml:space="preserve">, which automatically removes duplicate names and guarantees uniqueness. Next, the low-confidence character suggestions are filtered so that any name already </w:t>
+      </w:r>
+      <w:r>
+        <w:rPr>
+          <w:rFonts w:ascii="Arial" w:hAnsi="Arial" w:cs="Arial"/>
+        </w:rPr>
+        <w:t>added</w:t>
+      </w:r>
+      <w:r>
+        <w:rPr>
+          <w:rFonts w:ascii="Arial" w:hAnsi="Arial" w:cs="Arial"/>
+        </w:rPr>
+        <w:t xml:space="preserve"> to the high-confidence list is removed from the suggestions, preventing overlap between the two categories. The cleaned scene object then replaces its previous version within the copied schedule structure, maintaining immutability principles. After this validation, the updated schedule is sent to the backend via a POST /</w:t>
+      </w:r>
+      <w:proofErr w:type="spellStart"/>
+      <w:r>
+        <w:rPr>
+          <w:rFonts w:ascii="Arial" w:hAnsi="Arial" w:cs="Arial"/>
+        </w:rPr>
+        <w:t>api</w:t>
+      </w:r>
+      <w:proofErr w:type="spellEnd"/>
+      <w:r>
+        <w:rPr>
+          <w:rFonts w:ascii="Arial" w:hAnsi="Arial" w:cs="Arial"/>
+        </w:rPr>
+        <w:t xml:space="preserve">/update-schedule request. Once the backend responds with the authoritative version of the updated schedule, the React state is refreshed using </w:t>
+      </w:r>
+      <w:proofErr w:type="spellStart"/>
+      <w:r>
+        <w:rPr>
+          <w:rFonts w:ascii="Arial" w:hAnsi="Arial" w:cs="Arial"/>
+        </w:rPr>
+        <w:t>setSchedule</w:t>
+      </w:r>
+      <w:proofErr w:type="spellEnd"/>
+      <w:r>
+        <w:rPr>
+          <w:rFonts w:ascii="Arial" w:hAnsi="Arial" w:cs="Arial"/>
+        </w:rPr>
+        <w:t xml:space="preserve">, and the modal is closed. This process ensures that only structured, duplicate-free, and logically consistent data is </w:t>
+      </w:r>
+      <w:r>
+        <w:rPr>
+          <w:rFonts w:ascii="Arial" w:hAnsi="Arial" w:cs="Arial"/>
+        </w:rPr>
+        <w:t>stored and displayed</w:t>
+      </w:r>
+      <w:r>
+        <w:rPr>
+          <w:rFonts w:ascii="Arial" w:hAnsi="Arial" w:cs="Arial"/>
+        </w:rPr>
+        <w:t>.</w:t>
+      </w:r>
+    </w:p>
+    <w:p>
+      <w:pPr>
+        <w:spacing w:line="360" w:lineRule="auto"/>
+        <w:jc w:val="both"/>
+        <w:rPr>
+          <w:rFonts w:ascii="Arial" w:hAnsi="Arial" w:cs="Arial"/>
+        </w:rPr>
+      </w:pPr>
+    </w:p>
+    <w:p>
+      <w:pPr>
+        <w:spacing w:line="360" w:lineRule="auto"/>
+        <w:jc w:val="both"/>
+        <w:rPr>
+          <w:rFonts w:ascii="Arial" w:hAnsi="Arial" w:cs="Arial"/>
+        </w:rPr>
+      </w:pPr>
+      <w:r>
+        <w:rPr>
+          <w:rFonts w:ascii="Arial" w:hAnsi="Arial" w:cs="Arial"/>
+        </w:rPr>
         <w:t xml:space="preserve">The drag-and-drop is implemented using </w:t>
       </w:r>
       <w:proofErr w:type="gramStart"/>
@@ -28610,7 +28074,14 @@
         <w:rPr>
           <w:rFonts w:ascii="Arial" w:hAnsi="Arial" w:cs="Arial"/>
         </w:rPr>
-        <w:t xml:space="preserve">, which ensures that items are treated as a vertical list and automatically </w:t>
+        <w:t xml:space="preserve">, which ensures that items are treated as a </w:t>
+      </w:r>
+      <w:r>
+        <w:rPr>
+          <w:rFonts w:ascii="Arial" w:hAnsi="Arial" w:cs="Arial"/>
+        </w:rPr>
+        <w:lastRenderedPageBreak/>
+        <w:t xml:space="preserve">vertical list and automatically </w:t>
       </w:r>
       <w:r>
         <w:rPr>
@@ -28637,139 +28108,6 @@
           <w:rFonts w:ascii="Arial" w:hAnsi="Arial" w:cs="Arial"/>
         </w:rPr>
         <w:t xml:space="preserve"> hook, which makes the row draggable and aware of its position within the list. The hook provides drag listeners and HTML attributes that enable interaction, as well as transformation and transition styles that control how the element visually moves during dragging.</w:t>
-      </w:r>
-    </w:p>
-    <w:p>
-      <w:pPr>
-        <w:spacing w:line="360" w:lineRule="auto"/>
-        <w:jc w:val="both"/>
-        <w:rPr>
-          <w:rFonts w:ascii="Arial" w:hAnsi="Arial" w:cs="Arial"/>
-        </w:rPr>
-      </w:pPr>
-    </w:p>
-    <w:p>
-      <w:pPr>
-        <w:spacing w:line="360" w:lineRule="auto"/>
-        <w:jc w:val="both"/>
-        <w:rPr>
-          <w:rFonts w:ascii="Arial" w:hAnsi="Arial" w:cs="Arial"/>
-        </w:rPr>
-      </w:pPr>
-      <w:r>
-        <w:rPr>
-          <w:rFonts w:ascii="Arial" w:hAnsi="Arial" w:cs="Arial"/>
-        </w:rPr>
-        <w:t xml:space="preserve">During the character editing process, the </w:t>
-      </w:r>
-      <w:proofErr w:type="spellStart"/>
-      <w:r>
-        <w:rPr>
-          <w:rFonts w:ascii="Arial" w:hAnsi="Arial" w:cs="Arial"/>
-        </w:rPr>
-        <w:t>saveScene</w:t>
-      </w:r>
-      <w:proofErr w:type="spellEnd"/>
-      <w:r>
-        <w:rPr>
-          <w:rFonts w:ascii="Arial" w:hAnsi="Arial" w:cs="Arial"/>
-        </w:rPr>
-        <w:t xml:space="preserve"> function performs a sanitization step to ensure data consistency before persisting changes. First, the high-confidence character </w:t>
-      </w:r>
-      <w:r>
-        <w:rPr>
-          <w:rFonts w:ascii="Arial" w:hAnsi="Arial" w:cs="Arial"/>
-        </w:rPr>
-        <w:t>array</w:t>
-      </w:r>
-      <w:r>
-        <w:rPr>
-          <w:rFonts w:ascii="Arial" w:hAnsi="Arial" w:cs="Arial"/>
-        </w:rPr>
-        <w:t xml:space="preserve"> is converted into a </w:t>
-      </w:r>
-      <w:r>
-        <w:rPr>
-          <w:rFonts w:ascii="Arial" w:hAnsi="Arial" w:cs="Arial"/>
-        </w:rPr>
-        <w:t>s</w:t>
-      </w:r>
-      <w:r>
-        <w:rPr>
-          <w:rFonts w:ascii="Arial" w:hAnsi="Arial" w:cs="Arial"/>
-        </w:rPr>
-        <w:t>et</w:t>
-      </w:r>
-      <w:r>
-        <w:rPr>
-          <w:rFonts w:ascii="Arial" w:hAnsi="Arial" w:cs="Arial"/>
-        </w:rPr>
-        <w:t xml:space="preserve"> (as JSON cannot handle sets)</w:t>
-      </w:r>
-      <w:r>
-        <w:rPr>
-          <w:rFonts w:ascii="Arial" w:hAnsi="Arial" w:cs="Arial"/>
-        </w:rPr>
-        <w:t xml:space="preserve">, which automatically removes duplicate names and guarantees uniqueness. Next, the low-confidence character suggestions are filtered so that any name already </w:t>
-      </w:r>
-      <w:r>
-        <w:rPr>
-          <w:rFonts w:ascii="Arial" w:hAnsi="Arial" w:cs="Arial"/>
-        </w:rPr>
-        <w:t>added</w:t>
-      </w:r>
-      <w:r>
-        <w:rPr>
-          <w:rFonts w:ascii="Arial" w:hAnsi="Arial" w:cs="Arial"/>
-        </w:rPr>
-        <w:t xml:space="preserve"> to the high-confidence list is removed from the suggestions, preventing overlap between the two categories. The cleaned scene object then replaces its previous version within the copied schedule structure, maintaining immutability principles. After this validation, the </w:t>
-      </w:r>
-      <w:r>
-        <w:rPr>
-          <w:rFonts w:ascii="Arial" w:hAnsi="Arial" w:cs="Arial"/>
-        </w:rPr>
-        <w:lastRenderedPageBreak/>
-        <w:t>updated schedule is sent to the backend via a POST /</w:t>
-      </w:r>
-      <w:proofErr w:type="spellStart"/>
-      <w:r>
-        <w:rPr>
-          <w:rFonts w:ascii="Arial" w:hAnsi="Arial" w:cs="Arial"/>
-        </w:rPr>
-        <w:t>api</w:t>
-      </w:r>
-      <w:proofErr w:type="spellEnd"/>
-      <w:r>
-        <w:rPr>
-          <w:rFonts w:ascii="Arial" w:hAnsi="Arial" w:cs="Arial"/>
-        </w:rPr>
-        <w:t xml:space="preserve">/update-schedule request. Once the backend responds with the authoritative version of the updated schedule, the React state is refreshed using </w:t>
-      </w:r>
-      <w:proofErr w:type="spellStart"/>
-      <w:r>
-        <w:rPr>
-          <w:rFonts w:ascii="Arial" w:hAnsi="Arial" w:cs="Arial"/>
-        </w:rPr>
-        <w:t>setSchedule</w:t>
-      </w:r>
-      <w:proofErr w:type="spellEnd"/>
-      <w:r>
-        <w:rPr>
-          <w:rFonts w:ascii="Arial" w:hAnsi="Arial" w:cs="Arial"/>
-        </w:rPr>
-        <w:t xml:space="preserve">, and the modal is closed. This process ensures that only structured, duplicate-free, and logically consistent data is </w:t>
-      </w:r>
-      <w:r>
-        <w:rPr>
-          <w:rFonts w:ascii="Arial" w:hAnsi="Arial" w:cs="Arial"/>
-        </w:rPr>
-        <w:t>stored and displayed</w:t>
-      </w:r>
-      <w:r>
-        <w:rPr>
-          <w:rFonts w:ascii="Arial" w:hAnsi="Arial" w:cs="Arial"/>
-        </w:rPr>
-        <w:t>.</w:t>
       </w:r>
     </w:p>
     <w:p>
@@ -31732,7 +31070,7 @@
           <w:noProof/>
         </w:rPr>
         <w:drawing>
-          <wp:anchor distT="0" distB="0" distL="114300" distR="114300" simplePos="0" relativeHeight="251767808" behindDoc="0" locked="0" layoutInCell="1" allowOverlap="1" wp14:anchorId="47E80063" wp14:editId="48AC9BE0">
+          <wp:anchor distT="0" distB="0" distL="114300" distR="114300" simplePos="0" relativeHeight="251767808" behindDoc="0" locked="0" layoutInCell="1" allowOverlap="1" wp14:anchorId="47E80063" wp14:editId="33D28848">
             <wp:simplePos x="0" y="0"/>
             <wp:positionH relativeFrom="margin">
               <wp:align>left</wp:align>

</xml_diff>